<commit_message>
refactoring DataBaseService (Parziale) e minor update
</commit_message>
<xml_diff>
--- a/documentation.docx
+++ b/documentation.docx
@@ -2,6 +2,19 @@
 <file path=word/document.xml><?xml version="1.0" encoding="utf-8"?>
 <w:document xmlns:wpc="http://schemas.microsoft.com/office/word/2010/wordprocessingCanvas" xmlns:cx="http://schemas.microsoft.com/office/drawing/2014/chartex" xmlns:cx1="http://schemas.microsoft.com/office/drawing/2015/9/8/chartex" xmlns:cx2="http://schemas.microsoft.com/office/drawing/2015/10/21/chartex" xmlns:cx3="http://schemas.microsoft.com/office/drawing/2016/5/9/chartex" xmlns:cx4="http://schemas.microsoft.com/office/drawing/2016/5/10/chartex" xmlns:cx5="http://schemas.microsoft.com/office/drawing/2016/5/11/chartex" xmlns:cx6="http://schemas.microsoft.com/office/drawing/2016/5/12/chartex" xmlns:cx7="http://schemas.microsoft.com/office/drawing/2016/5/13/chartex" xmlns:cx8="http://schemas.microsoft.com/office/drawing/2016/5/14/chartex" xmlns:mc="http://schemas.openxmlformats.org/markup-compatibility/2006" xmlns:aink="http://schemas.microsoft.com/office/drawing/2016/ink" xmlns:am3d="http://schemas.microsoft.com/office/drawing/2017/model3d" xmlns:o="urn:schemas-microsoft-com:office:office" xmlns:oel="http://schemas.microsoft.com/office/2019/extlst" xmlns:r="http://schemas.openxmlformats.org/officeDocument/2006/relationships" xmlns:m="http://schemas.openxmlformats.org/officeDocument/2006/math" xmlns:v="urn:schemas-microsoft-com:vml" xmlns:wp14="http://schemas.microsoft.com/office/word/2010/wordprocessingDrawing" xmlns:wp="http://schemas.openxmlformats.org/drawingml/2006/wordprocessingDrawing" xmlns:w10="urn:schemas-microsoft-com:office:word" xmlns:w="http://schemas.openxmlformats.org/wordprocessingml/2006/main" xmlns:w14="http://schemas.microsoft.com/office/word/2010/wordml" xmlns:w15="http://schemas.microsoft.com/office/word/2012/wordml" xmlns:w16cex="http://schemas.microsoft.com/office/word/2018/wordml/cex" xmlns:w16cid="http://schemas.microsoft.com/office/word/2016/wordml/cid" xmlns:w16="http://schemas.microsoft.com/office/word/2018/wordml" xmlns:w16du="http://schemas.microsoft.com/office/word/2023/wordml/word16du" xmlns:w16sdtdh="http://schemas.microsoft.com/office/word/2020/wordml/sdtdatahash" xmlns:w16sdtfl="http://schemas.microsoft.com/office/word/2024/wordml/sdtformatlock" xmlns:w16se="http://schemas.microsoft.com/office/word/2015/wordml/symex" xmlns:wpg="http://schemas.microsoft.com/office/word/2010/wordprocessingGroup" xmlns:wpi="http://schemas.microsoft.com/office/word/2010/wordprocessingInk" xmlns:wne="http://schemas.microsoft.com/office/word/2006/wordml" xmlns:wps="http://schemas.microsoft.com/office/word/2010/wordprocessingShape" mc:Ignorable="w14 w15 w16se w16cid w16 w16cex w16sdtdh w16sdtfl w16du wp14">
   <w:body>
+    <w:p>
+      <w:pPr>
+        <w:pStyle w:val="NoSpacing"/>
+        <w:rPr>
+          <w:rFonts w:eastAsiaTheme="minorHAnsi"/>
+          <w:kern w:val="2"/>
+          <w:sz w:val="2"/>
+          <w:szCs w:val="2"/>
+          <w:lang w:eastAsia="en-US"/>
+          <w14:ligatures w14:val="standardContextual"/>
+        </w:rPr>
+      </w:pPr>
+    </w:p>
     <w:sdt>
       <w:sdtPr>
         <w:rPr>
@@ -521,7 +534,7 @@
             <mc:AlternateContent>
               <mc:Choice Requires="wpg">
                 <w:drawing>
-                  <wp:anchor distT="0" distB="0" distL="114300" distR="114300" simplePos="0" relativeHeight="251660288" behindDoc="1" locked="0" layoutInCell="1" allowOverlap="1" wp14:anchorId="723A618B" wp14:editId="1F324AE1">
+                  <wp:anchor distT="0" distB="0" distL="114300" distR="114300" simplePos="0" relativeHeight="251660288" behindDoc="1" locked="0" layoutInCell="1" allowOverlap="1" wp14:anchorId="723A618B" wp14:editId="6CCBCA8C">
                     <wp:simplePos x="0" y="0"/>
                     <wp:positionH relativeFrom="page">
                       <wp:posOffset>1666874</wp:posOffset>
@@ -1003,23 +1016,23 @@
                   </wp:anchor>
                 </w:drawing>
               </mc:Choice>
-              <mc:Fallback xmlns:a="http://schemas.openxmlformats.org/drawingml/2006/main" xmlns:a14="http://schemas.microsoft.com/office/drawing/2010/main" xmlns:pic="http://schemas.openxmlformats.org/drawingml/2006/picture">
+              <mc:Fallback>
                 <w:pict>
-                  <v:group id="Gruppo 2" style="position:absolute;margin-left:131.25pt;margin-top:197.85pt;width:468.75pt;height:531.15pt;z-index:-251656192;mso-position-horizontal-relative:page;mso-position-vertical-relative:page" coordsize="43291,44910" o:spid="_x0000_s1026" w14:anchorId="23558F9B" o:gfxdata="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">
+                  <v:group w14:anchorId="2FE89BBD" id="Gruppo 2" o:spid="_x0000_s1026" style="position:absolute;margin-left:131.25pt;margin-top:197.85pt;width:468.75pt;height:531.15pt;z-index:-251656192;mso-position-horizontal-relative:page;mso-position-vertical-relative:page" coordsize="43291,44910" o:gfxdata="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">
                     <o:lock v:ext="edit" aspectratio="t"/>
-                    <v:shape id="Figura a mano libera 64" style="position:absolute;left:15017;width:28274;height:28352;visibility:visible;mso-wrap-style:square;v-text-anchor:top" coordsize="1781,1786" o:spid="_x0000_s1027" filled="f" stroked="f" path="m4,1786l,1782,1776,r5,5l4,1786xe" o:gfxdata="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">
+                    <v:shape id="Figura a mano libera 64" o:spid="_x0000_s1027" style="position:absolute;left:15017;width:28274;height:28352;visibility:visible;mso-wrap-style:square;v-text-anchor:top" coordsize="1781,1786" o:gfxdata="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" path="m4,1786l,1782,1776,r5,5l4,1786xe" filled="f" stroked="f">
                       <v:path arrowok="t" o:connecttype="custom" o:connectlocs="6350,2835275;0,2828925;2819400,0;2827338,7938;6350,2835275" o:connectangles="0,0,0,0,0"/>
                     </v:shape>
-                    <v:shape id="Figura a mano libera 65" style="position:absolute;left:7826;top:2270;width:35465;height:35464;visibility:visible;mso-wrap-style:square;v-text-anchor:top" coordsize="2234,2234" o:spid="_x0000_s1028" filled="f" stroked="f" path="m5,2234l,2229,2229,r5,5l5,2234xe" o:gfxdata="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">
+                    <v:shape id="Figura a mano libera 65" o:spid="_x0000_s1028" style="position:absolute;left:7826;top:2270;width:35465;height:35464;visibility:visible;mso-wrap-style:square;v-text-anchor:top" coordsize="2234,2234" o:gfxdata="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" path="m5,2234l,2229,2229,r5,5l5,2234xe" filled="f" stroked="f">
                       <v:path arrowok="t" o:connecttype="custom" o:connectlocs="7938,3546475;0,3538538;3538538,0;3546475,7938;7938,3546475" o:connectangles="0,0,0,0,0"/>
                     </v:shape>
-                    <v:shape id="Figura a mano libera 66" style="position:absolute;left:8413;top:1095;width:34878;height:34877;visibility:visible;mso-wrap-style:square;v-text-anchor:top" coordsize="2197,2197" o:spid="_x0000_s1029" filled="f" stroked="f" path="m9,2197l,2193,2188,r9,10l9,2197xe" o:gfxdata="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">
+                    <v:shape id="Figura a mano libera 66" o:spid="_x0000_s1029" style="position:absolute;left:8413;top:1095;width:34878;height:34877;visibility:visible;mso-wrap-style:square;v-text-anchor:top" coordsize="2197,2197" o:gfxdata="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" path="m9,2197l,2193,2188,r9,10l9,2197xe" filled="f" stroked="f">
                       <v:path arrowok="t" o:connecttype="custom" o:connectlocs="14288,3487738;0,3481388;3473450,0;3487738,15875;14288,3487738" o:connectangles="0,0,0,0,0"/>
                     </v:shape>
-                    <v:shape id="Figura a mano libera 67" style="position:absolute;left:12160;top:4984;width:31131;height:31211;visibility:visible;mso-wrap-style:square;v-text-anchor:top" coordsize="1961,1966" o:spid="_x0000_s1030" filled="f" stroked="f" path="m9,1966l,1957,1952,r9,9l9,1966xe" o:gfxdata="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">
+                    <v:shape id="Figura a mano libera 67" o:spid="_x0000_s1030" style="position:absolute;left:12160;top:4984;width:31131;height:31211;visibility:visible;mso-wrap-style:square;v-text-anchor:top" coordsize="1961,1966" o:gfxdata="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" path="m9,1966l,1957,1952,r9,9l9,1966xe" filled="f" stroked="f">
                       <v:path arrowok="t" o:connecttype="custom" o:connectlocs="14288,3121025;0,3106738;3098800,0;3113088,14288;14288,3121025" o:connectangles="0,0,0,0,0"/>
                     </v:shape>
-                    <v:shape id="Figura a mano libera 68" style="position:absolute;top:1539;width:43291;height:43371;visibility:visible;mso-wrap-style:square;v-text-anchor:top" coordsize="2727,2732" o:spid="_x0000_s1031" filled="f" stroked="f" path="m,2732r,-4l2722,r5,5l,2732xe" o:gfxdata="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">
+                    <v:shape id="Figura a mano libera 68" o:spid="_x0000_s1031" style="position:absolute;top:1539;width:43291;height:43371;visibility:visible;mso-wrap-style:square;v-text-anchor:top" coordsize="2727,2732" o:gfxdata="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" path="m,2732r,-4l2722,r5,5l,2732xe" filled="f" stroked="f">
                       <v:path arrowok="t" o:connecttype="custom" o:connectlocs="0,4337050;0,4330700;4321175,0;4329113,7938;0,4337050" o:connectangles="0,0,0,0,0"/>
                     </v:shape>
                     <w10:wrap anchorx="page" anchory="page"/>
@@ -2404,21 +2417,7 @@
         <w:rPr>
           <w:lang w:val="en-GB"/>
         </w:rPr>
-        <w:t xml:space="preserve"> is necessary a DB to connect (technically the software can start also without that, but is simply useless</w:t>
-      </w:r>
-      <w:proofErr w:type="gramStart"/>
-      <w:r>
-        <w:rPr>
-          <w:lang w:val="en-GB"/>
-        </w:rPr>
-        <w:t>);</w:t>
-      </w:r>
-      <w:proofErr w:type="gramEnd"/>
-      <w:r>
-        <w:rPr>
-          <w:lang w:val="en-GB"/>
-        </w:rPr>
-        <w:t xml:space="preserve"> </w:t>
+        <w:t xml:space="preserve"> is necessary a DB to connect (technically the software can start also without that, but is simply useless); </w:t>
       </w:r>
     </w:p>
     <w:p>
@@ -2462,16 +2461,8 @@
         <w:rPr>
           <w:lang w:val="en-GB"/>
         </w:rPr>
-        <w:t xml:space="preserve">, so it’s not necessary a large amount of </w:t>
-      </w:r>
-      <w:proofErr w:type="gramStart"/>
-      <w:r>
-        <w:rPr>
-          <w:lang w:val="en-GB"/>
-        </w:rPr>
-        <w:t>storage;</w:t>
-      </w:r>
-      <w:proofErr w:type="gramEnd"/>
+        <w:t>, so it’s not necessary a large amount of storage;</w:t>
+      </w:r>
     </w:p>
     <w:p>
       <w:pPr>
@@ -4115,27 +4106,13 @@
         <w:rPr>
           <w:lang w:val="en-GB"/>
         </w:rPr>
-        <w:t xml:space="preserve">view a financial </w:t>
-      </w:r>
-      <w:proofErr w:type="gramStart"/>
-      <w:r>
-        <w:rPr>
-          <w:lang w:val="en-GB"/>
-        </w:rPr>
-        <w:t xml:space="preserve">report </w:t>
-      </w:r>
-      <w:r>
-        <w:rPr>
-          <w:lang w:val="en-GB"/>
-        </w:rPr>
-        <w:t>”</w:t>
-      </w:r>
-      <w:proofErr w:type="gramEnd"/>
-      <w:r>
-        <w:rPr>
-          <w:lang w:val="en-GB"/>
-        </w:rPr>
-        <w:t xml:space="preserve"> </w:t>
+        <w:t xml:space="preserve">view a financial report </w:t>
+      </w:r>
+      <w:r>
+        <w:rPr>
+          <w:lang w:val="en-GB"/>
+        </w:rPr>
+        <w:t xml:space="preserve">” </w:t>
       </w:r>
     </w:p>
     <w:p>
@@ -4200,19 +4177,11 @@
         </w:rPr>
         <w:t xml:space="preserve">system </w:t>
       </w:r>
-      <w:proofErr w:type="gramStart"/>
-      <w:r>
-        <w:rPr>
-          <w:lang w:val="en-GB"/>
-        </w:rPr>
-        <w:t>give</w:t>
-      </w:r>
-      <w:proofErr w:type="gramEnd"/>
-      <w:r>
-        <w:rPr>
-          <w:lang w:val="en-GB"/>
-        </w:rPr>
-        <w:t xml:space="preserve"> at the manager a specific view of the </w:t>
+      <w:r>
+        <w:rPr>
+          <w:lang w:val="en-GB"/>
+        </w:rPr>
+        <w:t xml:space="preserve">give at the manager a specific view of the </w:t>
       </w:r>
       <w:r>
         <w:rPr>
@@ -4315,17 +4284,20 @@
       </w:pPr>
       <w:bookmarkStart w:id="18" w:name="_Toc219416018"/>
       <w:r>
+        <w:rPr>
+          <w:noProof/>
+        </w:rPr>
         <w:lastRenderedPageBreak/>
         <w:drawing>
-          <wp:anchor distT="0" distB="0" distL="114300" distR="114300" simplePos="0" relativeHeight="251662336" behindDoc="1" locked="0" layoutInCell="1" allowOverlap="1" wp14:anchorId="6FDDEC9D" wp14:editId="72BA2EA6">
+          <wp:anchor distT="0" distB="0" distL="114300" distR="114300" simplePos="0" relativeHeight="251662336" behindDoc="1" locked="1" layoutInCell="1" allowOverlap="1" wp14:anchorId="6FDDEC9D" wp14:editId="7E7941A7">
             <wp:simplePos x="0" y="0"/>
             <wp:positionH relativeFrom="column">
-              <wp:posOffset>-681990</wp:posOffset>
+              <wp:posOffset>-694055</wp:posOffset>
             </wp:positionH>
-            <wp:positionV relativeFrom="paragraph">
-              <wp:posOffset>262255</wp:posOffset>
+            <wp:positionV relativeFrom="page">
+              <wp:posOffset>1167765</wp:posOffset>
             </wp:positionV>
-            <wp:extent cx="7511415" cy="6172200"/>
+            <wp:extent cx="7512685" cy="6173470"/>
             <wp:effectExtent l="0" t="0" r="0" b="0"/>
             <wp:wrapNone/>
             <wp:docPr id="1071546346" name="Picture 13" descr="A screenshot of a computer&#10;&#10;AI-generated content may be incorrect."/>
@@ -4357,7 +4329,7 @@
                   <pic:spPr bwMode="auto">
                     <a:xfrm>
                       <a:off x="0" y="0"/>
-                      <a:ext cx="7511415" cy="6172200"/>
+                      <a:ext cx="7512685" cy="6173470"/>
                     </a:xfrm>
                     <a:prstGeom prst="rect">
                       <a:avLst/>
@@ -4370,6 +4342,12 @@
                 </pic:pic>
               </a:graphicData>
             </a:graphic>
+            <wp14:sizeRelH relativeFrom="margin">
+              <wp14:pctWidth>0</wp14:pctWidth>
+            </wp14:sizeRelH>
+            <wp14:sizeRelV relativeFrom="margin">
+              <wp14:pctHeight>0</wp14:pctHeight>
+            </wp14:sizeRelV>
           </wp:anchor>
         </w:drawing>
       </w:r>
@@ -4405,6 +4383,2557 @@
       </w:pPr>
       <w:r>
         <w:rPr>
+          <w:noProof/>
+          <w:sz w:val="2"/>
+          <w:szCs w:val="2"/>
+        </w:rPr>
+        <mc:AlternateContent>
+          <mc:Choice Requires="wpi">
+            <w:drawing>
+              <wp:anchor distT="0" distB="0" distL="114300" distR="114300" simplePos="0" relativeHeight="251792384" behindDoc="0" locked="0" layoutInCell="1" allowOverlap="1" wp14:anchorId="7770E1B7" wp14:editId="6ACA3911">
+                <wp:simplePos x="0" y="0"/>
+                <wp:positionH relativeFrom="column">
+                  <wp:posOffset>4525645</wp:posOffset>
+                </wp:positionH>
+                <wp:positionV relativeFrom="paragraph">
+                  <wp:posOffset>1262380</wp:posOffset>
+                </wp:positionV>
+                <wp:extent cx="120440" cy="165100"/>
+                <wp:effectExtent l="57150" t="57150" r="32385" b="44450"/>
+                <wp:wrapNone/>
+                <wp:docPr id="119272470" name="Ink 178"/>
+                <wp:cNvGraphicFramePr/>
+                <a:graphic xmlns:a="http://schemas.openxmlformats.org/drawingml/2006/main">
+                  <a:graphicData uri="http://schemas.microsoft.com/office/word/2010/wordprocessingInk">
+                    <w14:contentPart bwMode="auto" r:id="rId14">
+                      <w14:nvContentPartPr>
+                        <w14:cNvContentPartPr/>
+                      </w14:nvContentPartPr>
+                      <w14:xfrm>
+                        <a:off x="0" y="0"/>
+                        <a:ext cx="120440" cy="165100"/>
+                      </w14:xfrm>
+                    </w14:contentPart>
+                  </a:graphicData>
+                </a:graphic>
+              </wp:anchor>
+            </w:drawing>
+          </mc:Choice>
+          <mc:Fallback>
+            <w:pict>
+              <v:shapetype w14:anchorId="6AD18F8D" id="_x0000_t75" coordsize="21600,21600" o:spt="75" o:preferrelative="t" path="m@4@5l@4@11@9@11@9@5xe" filled="f" stroked="f">
+                <v:stroke joinstyle="miter"/>
+                <v:formulas>
+                  <v:f eqn="if lineDrawn pixelLineWidth 0"/>
+                  <v:f eqn="sum @0 1 0"/>
+                  <v:f eqn="sum 0 0 @1"/>
+                  <v:f eqn="prod @2 1 2"/>
+                  <v:f eqn="prod @3 21600 pixelWidth"/>
+                  <v:f eqn="prod @3 21600 pixelHeight"/>
+                  <v:f eqn="sum @0 0 1"/>
+                  <v:f eqn="prod @6 1 2"/>
+                  <v:f eqn="prod @7 21600 pixelWidth"/>
+                  <v:f eqn="sum @8 21600 0"/>
+                  <v:f eqn="prod @7 21600 pixelHeight"/>
+                  <v:f eqn="sum @10 21600 0"/>
+                </v:formulas>
+                <v:path o:extrusionok="f" gradientshapeok="t" o:connecttype="rect"/>
+                <o:lock v:ext="edit" aspectratio="t"/>
+              </v:shapetype>
+              <v:shape id="Ink 178" o:spid="_x0000_s1026" type="#_x0000_t75" style="position:absolute;margin-left:355.65pt;margin-top:98.7pt;width:10.9pt;height:14.4pt;z-index:251792384;visibility:visible;mso-wrap-style:square;mso-wrap-distance-left:9pt;mso-wrap-distance-top:0;mso-wrap-distance-right:9pt;mso-wrap-distance-bottom:0;mso-position-horizontal:absolute;mso-position-horizontal-relative:text;mso-position-vertical:absolute;mso-position-vertical-relative:text" o:gfxdata="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">
+                <v:imagedata r:id="rId15" o:title=""/>
+              </v:shape>
+            </w:pict>
+          </mc:Fallback>
+        </mc:AlternateContent>
+      </w:r>
+      <w:r>
+        <w:rPr>
+          <w:noProof/>
+          <w:sz w:val="2"/>
+          <w:szCs w:val="2"/>
+        </w:rPr>
+        <mc:AlternateContent>
+          <mc:Choice Requires="wpi">
+            <w:drawing>
+              <wp:anchor distT="0" distB="0" distL="114300" distR="114300" simplePos="0" relativeHeight="251789312" behindDoc="0" locked="0" layoutInCell="1" allowOverlap="1" wp14:anchorId="729E12DF" wp14:editId="49225859">
+                <wp:simplePos x="0" y="0"/>
+                <wp:positionH relativeFrom="column">
+                  <wp:posOffset>3603625</wp:posOffset>
+                </wp:positionH>
+                <wp:positionV relativeFrom="paragraph">
+                  <wp:posOffset>2809875</wp:posOffset>
+                </wp:positionV>
+                <wp:extent cx="8255" cy="112395"/>
+                <wp:effectExtent l="38100" t="38100" r="48895" b="40005"/>
+                <wp:wrapNone/>
+                <wp:docPr id="342610909" name="Ink 173"/>
+                <wp:cNvGraphicFramePr/>
+                <a:graphic xmlns:a="http://schemas.openxmlformats.org/drawingml/2006/main">
+                  <a:graphicData uri="http://schemas.microsoft.com/office/word/2010/wordprocessingInk">
+                    <w14:contentPart bwMode="auto" r:id="rId16">
+                      <w14:nvContentPartPr>
+                        <w14:cNvContentPartPr/>
+                      </w14:nvContentPartPr>
+                      <w14:xfrm>
+                        <a:off x="0" y="0"/>
+                        <a:ext cx="8255" cy="112395"/>
+                      </w14:xfrm>
+                    </w14:contentPart>
+                  </a:graphicData>
+                </a:graphic>
+              </wp:anchor>
+            </w:drawing>
+          </mc:Choice>
+          <mc:Fallback>
+            <w:pict>
+              <v:shape w14:anchorId="1F4B95A2" id="Ink 173" o:spid="_x0000_s1026" type="#_x0000_t75" style="position:absolute;margin-left:283.45pt;margin-top:220.9pt;width:1.25pt;height:9.55pt;z-index:251789312;visibility:visible;mso-wrap-style:square;mso-wrap-distance-left:9pt;mso-wrap-distance-top:0;mso-wrap-distance-right:9pt;mso-wrap-distance-bottom:0;mso-position-horizontal:absolute;mso-position-horizontal-relative:text;mso-position-vertical:absolute;mso-position-vertical-relative:text" o:gfxdata="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">
+                <v:imagedata r:id="rId17" o:title=""/>
+              </v:shape>
+            </w:pict>
+          </mc:Fallback>
+        </mc:AlternateContent>
+      </w:r>
+      <w:r>
+        <w:rPr>
+          <w:noProof/>
+          <w:sz w:val="2"/>
+          <w:szCs w:val="2"/>
+        </w:rPr>
+        <mc:AlternateContent>
+          <mc:Choice Requires="wpi">
+            <w:drawing>
+              <wp:anchor distT="0" distB="0" distL="114300" distR="114300" simplePos="0" relativeHeight="251786240" behindDoc="0" locked="0" layoutInCell="1" allowOverlap="1" wp14:anchorId="3F2AAE4B" wp14:editId="315A5418">
+                <wp:simplePos x="0" y="0"/>
+                <wp:positionH relativeFrom="column">
+                  <wp:posOffset>3634331</wp:posOffset>
+                </wp:positionH>
+                <wp:positionV relativeFrom="paragraph">
+                  <wp:posOffset>1444443</wp:posOffset>
+                </wp:positionV>
+                <wp:extent cx="77400" cy="72720"/>
+                <wp:effectExtent l="38100" t="38100" r="37465" b="41910"/>
+                <wp:wrapNone/>
+                <wp:docPr id="1167476458" name="Ink 168"/>
+                <wp:cNvGraphicFramePr/>
+                <a:graphic xmlns:a="http://schemas.openxmlformats.org/drawingml/2006/main">
+                  <a:graphicData uri="http://schemas.microsoft.com/office/word/2010/wordprocessingInk">
+                    <w14:contentPart bwMode="auto" r:id="rId18">
+                      <w14:nvContentPartPr>
+                        <w14:cNvContentPartPr/>
+                      </w14:nvContentPartPr>
+                      <w14:xfrm>
+                        <a:off x="0" y="0"/>
+                        <a:ext cx="77400" cy="72720"/>
+                      </w14:xfrm>
+                    </w14:contentPart>
+                  </a:graphicData>
+                </a:graphic>
+              </wp:anchor>
+            </w:drawing>
+          </mc:Choice>
+          <mc:Fallback>
+            <w:pict>
+              <v:shape w14:anchorId="1706B17F" id="Ink 168" o:spid="_x0000_s1026" type="#_x0000_t75" style="position:absolute;margin-left:285.8pt;margin-top:113.4pt;width:6.8pt;height:6.45pt;z-index:251786240;visibility:visible;mso-wrap-style:square;mso-wrap-distance-left:9pt;mso-wrap-distance-top:0;mso-wrap-distance-right:9pt;mso-wrap-distance-bottom:0;mso-position-horizontal:absolute;mso-position-horizontal-relative:text;mso-position-vertical:absolute;mso-position-vertical-relative:text" o:gfxdata="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">
+                <v:imagedata r:id="rId19" o:title=""/>
+              </v:shape>
+            </w:pict>
+          </mc:Fallback>
+        </mc:AlternateContent>
+      </w:r>
+      <w:r>
+        <w:rPr>
+          <w:noProof/>
+          <w:sz w:val="2"/>
+          <w:szCs w:val="2"/>
+        </w:rPr>
+        <mc:AlternateContent>
+          <mc:Choice Requires="wpi">
+            <w:drawing>
+              <wp:anchor distT="0" distB="0" distL="114300" distR="114300" simplePos="0" relativeHeight="251785216" behindDoc="0" locked="0" layoutInCell="1" allowOverlap="1" wp14:anchorId="4BCAC40F" wp14:editId="6AB205EF">
+                <wp:simplePos x="0" y="0"/>
+                <wp:positionH relativeFrom="column">
+                  <wp:posOffset>604571</wp:posOffset>
+                </wp:positionH>
+                <wp:positionV relativeFrom="paragraph">
+                  <wp:posOffset>4672447</wp:posOffset>
+                </wp:positionV>
+                <wp:extent cx="32760" cy="86400"/>
+                <wp:effectExtent l="38100" t="38100" r="43815" b="46990"/>
+                <wp:wrapNone/>
+                <wp:docPr id="455675409" name="Ink 167"/>
+                <wp:cNvGraphicFramePr/>
+                <a:graphic xmlns:a="http://schemas.openxmlformats.org/drawingml/2006/main">
+                  <a:graphicData uri="http://schemas.microsoft.com/office/word/2010/wordprocessingInk">
+                    <w14:contentPart bwMode="auto" r:id="rId20">
+                      <w14:nvContentPartPr>
+                        <w14:cNvContentPartPr/>
+                      </w14:nvContentPartPr>
+                      <w14:xfrm>
+                        <a:off x="0" y="0"/>
+                        <a:ext cx="32760" cy="86400"/>
+                      </w14:xfrm>
+                    </w14:contentPart>
+                  </a:graphicData>
+                </a:graphic>
+              </wp:anchor>
+            </w:drawing>
+          </mc:Choice>
+          <mc:Fallback>
+            <w:pict>
+              <v:shape w14:anchorId="0225A1F4" id="Ink 167" o:spid="_x0000_s1026" type="#_x0000_t75" style="position:absolute;margin-left:47.25pt;margin-top:367.55pt;width:3.3pt;height:7.5pt;z-index:251785216;visibility:visible;mso-wrap-style:square;mso-wrap-distance-left:9pt;mso-wrap-distance-top:0;mso-wrap-distance-right:9pt;mso-wrap-distance-bottom:0;mso-position-horizontal:absolute;mso-position-horizontal-relative:text;mso-position-vertical:absolute;mso-position-vertical-relative:text" o:gfxdata="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">
+                <v:imagedata r:id="rId21" o:title=""/>
+              </v:shape>
+            </w:pict>
+          </mc:Fallback>
+        </mc:AlternateContent>
+      </w:r>
+      <w:r>
+        <w:rPr>
+          <w:noProof/>
+          <w:sz w:val="2"/>
+          <w:szCs w:val="2"/>
+        </w:rPr>
+        <mc:AlternateContent>
+          <mc:Choice Requires="wpi">
+            <w:drawing>
+              <wp:anchor distT="0" distB="0" distL="114300" distR="114300" simplePos="0" relativeHeight="251784192" behindDoc="0" locked="0" layoutInCell="1" allowOverlap="1" wp14:anchorId="038021E3" wp14:editId="21641949">
+                <wp:simplePos x="0" y="0"/>
+                <wp:positionH relativeFrom="column">
+                  <wp:posOffset>629051</wp:posOffset>
+                </wp:positionH>
+                <wp:positionV relativeFrom="paragraph">
+                  <wp:posOffset>3067207</wp:posOffset>
+                </wp:positionV>
+                <wp:extent cx="45720" cy="62280"/>
+                <wp:effectExtent l="38100" t="38100" r="30480" b="33020"/>
+                <wp:wrapNone/>
+                <wp:docPr id="463360369" name="Ink 163"/>
+                <wp:cNvGraphicFramePr/>
+                <a:graphic xmlns:a="http://schemas.openxmlformats.org/drawingml/2006/main">
+                  <a:graphicData uri="http://schemas.microsoft.com/office/word/2010/wordprocessingInk">
+                    <w14:contentPart bwMode="auto" r:id="rId22">
+                      <w14:nvContentPartPr>
+                        <w14:cNvContentPartPr/>
+                      </w14:nvContentPartPr>
+                      <w14:xfrm>
+                        <a:off x="0" y="0"/>
+                        <a:ext cx="45720" cy="62280"/>
+                      </w14:xfrm>
+                    </w14:contentPart>
+                  </a:graphicData>
+                </a:graphic>
+              </wp:anchor>
+            </w:drawing>
+          </mc:Choice>
+          <mc:Fallback>
+            <w:pict>
+              <v:shape w14:anchorId="6550B75E" id="Ink 163" o:spid="_x0000_s1026" type="#_x0000_t75" style="position:absolute;margin-left:49.2pt;margin-top:241.15pt;width:4.3pt;height:5.6pt;z-index:251784192;visibility:visible;mso-wrap-style:square;mso-wrap-distance-left:9pt;mso-wrap-distance-top:0;mso-wrap-distance-right:9pt;mso-wrap-distance-bottom:0;mso-position-horizontal:absolute;mso-position-horizontal-relative:text;mso-position-vertical:absolute;mso-position-vertical-relative:text" o:gfxdata="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">
+                <v:imagedata r:id="rId23" o:title=""/>
+              </v:shape>
+            </w:pict>
+          </mc:Fallback>
+        </mc:AlternateContent>
+      </w:r>
+      <w:r>
+        <w:rPr>
+          <w:noProof/>
+          <w:sz w:val="2"/>
+          <w:szCs w:val="2"/>
+        </w:rPr>
+        <mc:AlternateContent>
+          <mc:Choice Requires="wpi">
+            <w:drawing>
+              <wp:anchor distT="0" distB="0" distL="114300" distR="114300" simplePos="0" relativeHeight="251783168" behindDoc="0" locked="0" layoutInCell="1" allowOverlap="1" wp14:anchorId="0CB77D39" wp14:editId="2735D8B5">
+                <wp:simplePos x="0" y="0"/>
+                <wp:positionH relativeFrom="column">
+                  <wp:posOffset>594995</wp:posOffset>
+                </wp:positionH>
+                <wp:positionV relativeFrom="paragraph">
+                  <wp:posOffset>3057525</wp:posOffset>
+                </wp:positionV>
+                <wp:extent cx="6840" cy="83880"/>
+                <wp:effectExtent l="38100" t="38100" r="31750" b="30480"/>
+                <wp:wrapNone/>
+                <wp:docPr id="8827630" name="Ink 161"/>
+                <wp:cNvGraphicFramePr/>
+                <a:graphic xmlns:a="http://schemas.openxmlformats.org/drawingml/2006/main">
+                  <a:graphicData uri="http://schemas.microsoft.com/office/word/2010/wordprocessingInk">
+                    <w14:contentPart bwMode="auto" r:id="rId24">
+                      <w14:nvContentPartPr>
+                        <w14:cNvContentPartPr/>
+                      </w14:nvContentPartPr>
+                      <w14:xfrm>
+                        <a:off x="0" y="0"/>
+                        <a:ext cx="6840" cy="83820"/>
+                      </w14:xfrm>
+                    </w14:contentPart>
+                  </a:graphicData>
+                </a:graphic>
+                <wp14:sizeRelH relativeFrom="margin">
+                  <wp14:pctWidth>0</wp14:pctWidth>
+                </wp14:sizeRelH>
+              </wp:anchor>
+            </w:drawing>
+          </mc:Choice>
+          <mc:Fallback>
+            <w:pict>
+              <v:shape w14:anchorId="7E9FB250" id="Ink 161" o:spid="_x0000_s1026" type="#_x0000_t75" style="position:absolute;margin-left:46.5pt;margin-top:240.4pt;width:1.25pt;height:7.3pt;z-index:251783168;visibility:visible;mso-wrap-style:square;mso-width-percent:0;mso-wrap-distance-left:9pt;mso-wrap-distance-top:0;mso-wrap-distance-right:9pt;mso-wrap-distance-bottom:0;mso-position-horizontal:absolute;mso-position-horizontal-relative:text;mso-position-vertical:absolute;mso-position-vertical-relative:text;mso-width-percent:0;mso-width-relative:margin" o:gfxdata="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">
+                <v:imagedata r:id="rId25" o:title=""/>
+              </v:shape>
+            </w:pict>
+          </mc:Fallback>
+        </mc:AlternateContent>
+      </w:r>
+      <w:r>
+        <w:rPr>
+          <w:noProof/>
+          <w:sz w:val="2"/>
+          <w:szCs w:val="2"/>
+        </w:rPr>
+        <mc:AlternateContent>
+          <mc:Choice Requires="wpi">
+            <w:drawing>
+              <wp:anchor distT="0" distB="0" distL="114300" distR="114300" simplePos="0" relativeHeight="251779072" behindDoc="0" locked="0" layoutInCell="1" allowOverlap="1" wp14:anchorId="4DBCFCC5" wp14:editId="7C2B1083">
+                <wp:simplePos x="0" y="0"/>
+                <wp:positionH relativeFrom="column">
+                  <wp:posOffset>-360045</wp:posOffset>
+                </wp:positionH>
+                <wp:positionV relativeFrom="paragraph">
+                  <wp:posOffset>2577465</wp:posOffset>
+                </wp:positionV>
+                <wp:extent cx="8255" cy="146685"/>
+                <wp:effectExtent l="38100" t="38100" r="48895" b="43815"/>
+                <wp:wrapNone/>
+                <wp:docPr id="141553834" name="Ink 154"/>
+                <wp:cNvGraphicFramePr/>
+                <a:graphic xmlns:a="http://schemas.openxmlformats.org/drawingml/2006/main">
+                  <a:graphicData uri="http://schemas.microsoft.com/office/word/2010/wordprocessingInk">
+                    <w14:contentPart bwMode="auto" r:id="rId26">
+                      <w14:nvContentPartPr>
+                        <w14:cNvContentPartPr/>
+                      </w14:nvContentPartPr>
+                      <w14:xfrm>
+                        <a:off x="0" y="0"/>
+                        <a:ext cx="8255" cy="146685"/>
+                      </w14:xfrm>
+                    </w14:contentPart>
+                  </a:graphicData>
+                </a:graphic>
+              </wp:anchor>
+            </w:drawing>
+          </mc:Choice>
+          <mc:Fallback>
+            <w:pict>
+              <v:shape w14:anchorId="162DA715" id="Ink 154" o:spid="_x0000_s1026" type="#_x0000_t75" style="position:absolute;margin-left:-28.7pt;margin-top:202.6pt;width:1.3pt;height:12.25pt;z-index:251779072;visibility:visible;mso-wrap-style:square;mso-wrap-distance-left:9pt;mso-wrap-distance-top:0;mso-wrap-distance-right:9pt;mso-wrap-distance-bottom:0;mso-position-horizontal:absolute;mso-position-horizontal-relative:text;mso-position-vertical:absolute;mso-position-vertical-relative:text" o:gfxdata="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">
+                <v:imagedata r:id="rId27" o:title=""/>
+              </v:shape>
+            </w:pict>
+          </mc:Fallback>
+        </mc:AlternateContent>
+      </w:r>
+      <w:r>
+        <w:rPr>
+          <w:noProof/>
+          <w:sz w:val="2"/>
+          <w:szCs w:val="2"/>
+        </w:rPr>
+        <mc:AlternateContent>
+          <mc:Choice Requires="wpi">
+            <w:drawing>
+              <wp:anchor distT="0" distB="0" distL="114300" distR="114300" simplePos="0" relativeHeight="251776000" behindDoc="0" locked="0" layoutInCell="1" allowOverlap="1" wp14:anchorId="3B23BAB5" wp14:editId="46408118">
+                <wp:simplePos x="0" y="0"/>
+                <wp:positionH relativeFrom="column">
+                  <wp:posOffset>-391795</wp:posOffset>
+                </wp:positionH>
+                <wp:positionV relativeFrom="paragraph">
+                  <wp:posOffset>3355975</wp:posOffset>
+                </wp:positionV>
+                <wp:extent cx="62230" cy="63655"/>
+                <wp:effectExtent l="38100" t="38100" r="33020" b="31750"/>
+                <wp:wrapNone/>
+                <wp:docPr id="65089184" name="Ink 146"/>
+                <wp:cNvGraphicFramePr/>
+                <a:graphic xmlns:a="http://schemas.openxmlformats.org/drawingml/2006/main">
+                  <a:graphicData uri="http://schemas.microsoft.com/office/word/2010/wordprocessingInk">
+                    <w14:contentPart bwMode="auto" r:id="rId28">
+                      <w14:nvContentPartPr>
+                        <w14:cNvContentPartPr/>
+                      </w14:nvContentPartPr>
+                      <w14:xfrm>
+                        <a:off x="0" y="0"/>
+                        <a:ext cx="62230" cy="63655"/>
+                      </w14:xfrm>
+                    </w14:contentPart>
+                  </a:graphicData>
+                </a:graphic>
+              </wp:anchor>
+            </w:drawing>
+          </mc:Choice>
+          <mc:Fallback>
+            <w:pict>
+              <v:shape w14:anchorId="7132698C" id="Ink 146" o:spid="_x0000_s1026" type="#_x0000_t75" style="position:absolute;margin-left:-31.2pt;margin-top:263.9pt;width:5.6pt;height:5.7pt;z-index:251776000;visibility:visible;mso-wrap-style:square;mso-wrap-distance-left:9pt;mso-wrap-distance-top:0;mso-wrap-distance-right:9pt;mso-wrap-distance-bottom:0;mso-position-horizontal:absolute;mso-position-horizontal-relative:text;mso-position-vertical:absolute;mso-position-vertical-relative:text" o:gfxdata="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">
+                <v:imagedata r:id="rId29" o:title=""/>
+              </v:shape>
+            </w:pict>
+          </mc:Fallback>
+        </mc:AlternateContent>
+      </w:r>
+      <w:r>
+        <w:rPr>
+          <w:noProof/>
+          <w:sz w:val="2"/>
+          <w:szCs w:val="2"/>
+        </w:rPr>
+        <mc:AlternateContent>
+          <mc:Choice Requires="wpi">
+            <w:drawing>
+              <wp:anchor distT="0" distB="0" distL="114300" distR="114300" simplePos="0" relativeHeight="251772928" behindDoc="0" locked="0" layoutInCell="1" allowOverlap="1" wp14:anchorId="2DE522B7" wp14:editId="154B967B">
+                <wp:simplePos x="0" y="0"/>
+                <wp:positionH relativeFrom="column">
+                  <wp:posOffset>3021251</wp:posOffset>
+                </wp:positionH>
+                <wp:positionV relativeFrom="paragraph">
+                  <wp:posOffset>4650115</wp:posOffset>
+                </wp:positionV>
+                <wp:extent cx="43560" cy="102240"/>
+                <wp:effectExtent l="38100" t="38100" r="52070" b="50165"/>
+                <wp:wrapNone/>
+                <wp:docPr id="38561539" name="Ink 143"/>
+                <wp:cNvGraphicFramePr/>
+                <a:graphic xmlns:a="http://schemas.openxmlformats.org/drawingml/2006/main">
+                  <a:graphicData uri="http://schemas.microsoft.com/office/word/2010/wordprocessingInk">
+                    <w14:contentPart bwMode="auto" r:id="rId30">
+                      <w14:nvContentPartPr>
+                        <w14:cNvContentPartPr/>
+                      </w14:nvContentPartPr>
+                      <w14:xfrm>
+                        <a:off x="0" y="0"/>
+                        <a:ext cx="43560" cy="102240"/>
+                      </w14:xfrm>
+                    </w14:contentPart>
+                  </a:graphicData>
+                </a:graphic>
+              </wp:anchor>
+            </w:drawing>
+          </mc:Choice>
+          <mc:Fallback>
+            <w:pict>
+              <v:shape w14:anchorId="0F5FE9EC" id="Ink 143" o:spid="_x0000_s1026" type="#_x0000_t75" style="position:absolute;margin-left:237.4pt;margin-top:365.65pt;width:4.45pt;height:9pt;z-index:251772928;visibility:visible;mso-wrap-style:square;mso-wrap-distance-left:9pt;mso-wrap-distance-top:0;mso-wrap-distance-right:9pt;mso-wrap-distance-bottom:0;mso-position-horizontal:absolute;mso-position-horizontal-relative:text;mso-position-vertical:absolute;mso-position-vertical-relative:text" o:gfxdata="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">
+                <v:imagedata r:id="rId31" o:title=""/>
+              </v:shape>
+            </w:pict>
+          </mc:Fallback>
+        </mc:AlternateContent>
+      </w:r>
+      <w:r>
+        <w:rPr>
+          <w:noProof/>
+          <w:sz w:val="2"/>
+          <w:szCs w:val="2"/>
+        </w:rPr>
+        <mc:AlternateContent>
+          <mc:Choice Requires="wpi">
+            <w:drawing>
+              <wp:anchor distT="0" distB="0" distL="114300" distR="114300" simplePos="0" relativeHeight="251771904" behindDoc="0" locked="0" layoutInCell="1" allowOverlap="1" wp14:anchorId="12150928" wp14:editId="656F8B2C">
+                <wp:simplePos x="0" y="0"/>
+                <wp:positionH relativeFrom="column">
+                  <wp:posOffset>1230611</wp:posOffset>
+                </wp:positionH>
+                <wp:positionV relativeFrom="paragraph">
+                  <wp:posOffset>4424546</wp:posOffset>
+                </wp:positionV>
+                <wp:extent cx="61560" cy="86040"/>
+                <wp:effectExtent l="38100" t="38100" r="34290" b="47625"/>
+                <wp:wrapNone/>
+                <wp:docPr id="935427198" name="Ink 142"/>
+                <wp:cNvGraphicFramePr/>
+                <a:graphic xmlns:a="http://schemas.openxmlformats.org/drawingml/2006/main">
+                  <a:graphicData uri="http://schemas.microsoft.com/office/word/2010/wordprocessingInk">
+                    <w14:contentPart bwMode="auto" r:id="rId32">
+                      <w14:nvContentPartPr>
+                        <w14:cNvContentPartPr/>
+                      </w14:nvContentPartPr>
+                      <w14:xfrm>
+                        <a:off x="0" y="0"/>
+                        <a:ext cx="61560" cy="86040"/>
+                      </w14:xfrm>
+                    </w14:contentPart>
+                  </a:graphicData>
+                </a:graphic>
+              </wp:anchor>
+            </w:drawing>
+          </mc:Choice>
+          <mc:Fallback>
+            <w:pict>
+              <v:shape w14:anchorId="65D996AB" id="Ink 142" o:spid="_x0000_s1026" type="#_x0000_t75" style="position:absolute;margin-left:96.4pt;margin-top:347.9pt;width:5.85pt;height:7.75pt;z-index:251771904;visibility:visible;mso-wrap-style:square;mso-wrap-distance-left:9pt;mso-wrap-distance-top:0;mso-wrap-distance-right:9pt;mso-wrap-distance-bottom:0;mso-position-horizontal:absolute;mso-position-horizontal-relative:text;mso-position-vertical:absolute;mso-position-vertical-relative:text" o:gfxdata="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">
+                <v:imagedata r:id="rId33" o:title=""/>
+              </v:shape>
+            </w:pict>
+          </mc:Fallback>
+        </mc:AlternateContent>
+      </w:r>
+      <w:r>
+        <w:rPr>
+          <w:noProof/>
+          <w:sz w:val="2"/>
+          <w:szCs w:val="2"/>
+        </w:rPr>
+        <mc:AlternateContent>
+          <mc:Choice Requires="wpi">
+            <w:drawing>
+              <wp:anchor distT="0" distB="0" distL="114300" distR="114300" simplePos="0" relativeHeight="251770880" behindDoc="0" locked="0" layoutInCell="1" allowOverlap="1" wp14:anchorId="265480FC" wp14:editId="10605F46">
+                <wp:simplePos x="0" y="0"/>
+                <wp:positionH relativeFrom="column">
+                  <wp:posOffset>2269931</wp:posOffset>
+                </wp:positionH>
+                <wp:positionV relativeFrom="paragraph">
+                  <wp:posOffset>4413026</wp:posOffset>
+                </wp:positionV>
+                <wp:extent cx="33480" cy="81720"/>
+                <wp:effectExtent l="38100" t="38100" r="43180" b="52070"/>
+                <wp:wrapNone/>
+                <wp:docPr id="220642537" name="Ink 141"/>
+                <wp:cNvGraphicFramePr/>
+                <a:graphic xmlns:a="http://schemas.openxmlformats.org/drawingml/2006/main">
+                  <a:graphicData uri="http://schemas.microsoft.com/office/word/2010/wordprocessingInk">
+                    <w14:contentPart bwMode="auto" r:id="rId34">
+                      <w14:nvContentPartPr>
+                        <w14:cNvContentPartPr/>
+                      </w14:nvContentPartPr>
+                      <w14:xfrm>
+                        <a:off x="0" y="0"/>
+                        <a:ext cx="33480" cy="81720"/>
+                      </w14:xfrm>
+                    </w14:contentPart>
+                  </a:graphicData>
+                </a:graphic>
+              </wp:anchor>
+            </w:drawing>
+          </mc:Choice>
+          <mc:Fallback>
+            <w:pict>
+              <v:shape w14:anchorId="1F869423" id="Ink 141" o:spid="_x0000_s1026" type="#_x0000_t75" style="position:absolute;margin-left:178.25pt;margin-top:347pt;width:3.65pt;height:7.45pt;z-index:251770880;visibility:visible;mso-wrap-style:square;mso-wrap-distance-left:9pt;mso-wrap-distance-top:0;mso-wrap-distance-right:9pt;mso-wrap-distance-bottom:0;mso-position-horizontal:absolute;mso-position-horizontal-relative:text;mso-position-vertical:absolute;mso-position-vertical-relative:text" o:gfxdata="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">
+                <v:imagedata r:id="rId35" o:title=""/>
+              </v:shape>
+            </w:pict>
+          </mc:Fallback>
+        </mc:AlternateContent>
+      </w:r>
+      <w:r>
+        <w:rPr>
+          <w:noProof/>
+          <w:sz w:val="2"/>
+          <w:szCs w:val="2"/>
+        </w:rPr>
+        <mc:AlternateContent>
+          <mc:Choice Requires="wpi">
+            <w:drawing>
+              <wp:anchor distT="0" distB="0" distL="114300" distR="114300" simplePos="0" relativeHeight="251769856" behindDoc="0" locked="0" layoutInCell="1" allowOverlap="1" wp14:anchorId="1A1C5F4A" wp14:editId="73B1AA28">
+                <wp:simplePos x="0" y="0"/>
+                <wp:positionH relativeFrom="column">
+                  <wp:posOffset>2026920</wp:posOffset>
+                </wp:positionH>
+                <wp:positionV relativeFrom="paragraph">
+                  <wp:posOffset>3192780</wp:posOffset>
+                </wp:positionV>
+                <wp:extent cx="33805" cy="69500"/>
+                <wp:effectExtent l="38100" t="38100" r="42545" b="45085"/>
+                <wp:wrapNone/>
+                <wp:docPr id="484915158" name="Ink 140"/>
+                <wp:cNvGraphicFramePr/>
+                <a:graphic xmlns:a="http://schemas.openxmlformats.org/drawingml/2006/main">
+                  <a:graphicData uri="http://schemas.microsoft.com/office/word/2010/wordprocessingInk">
+                    <w14:contentPart bwMode="auto" r:id="rId36">
+                      <w14:nvContentPartPr>
+                        <w14:cNvContentPartPr/>
+                      </w14:nvContentPartPr>
+                      <w14:xfrm>
+                        <a:off x="0" y="0"/>
+                        <a:ext cx="33805" cy="69500"/>
+                      </w14:xfrm>
+                    </w14:contentPart>
+                  </a:graphicData>
+                </a:graphic>
+              </wp:anchor>
+            </w:drawing>
+          </mc:Choice>
+          <mc:Fallback>
+            <w:pict>
+              <v:shape w14:anchorId="63874146" id="Ink 140" o:spid="_x0000_s1026" type="#_x0000_t75" style="position:absolute;margin-left:159.1pt;margin-top:250.9pt;width:3.65pt;height:6.45pt;z-index:251769856;visibility:visible;mso-wrap-style:square;mso-wrap-distance-left:9pt;mso-wrap-distance-top:0;mso-wrap-distance-right:9pt;mso-wrap-distance-bottom:0;mso-position-horizontal:absolute;mso-position-horizontal-relative:text;mso-position-vertical:absolute;mso-position-vertical-relative:text" o:gfxdata="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">
+                <v:imagedata r:id="rId37" o:title=""/>
+              </v:shape>
+            </w:pict>
+          </mc:Fallback>
+        </mc:AlternateContent>
+      </w:r>
+      <w:r>
+        <w:rPr>
+          <w:noProof/>
+          <w:sz w:val="2"/>
+          <w:szCs w:val="2"/>
+        </w:rPr>
+        <mc:AlternateContent>
+          <mc:Choice Requires="wpi">
+            <w:drawing>
+              <wp:anchor distT="0" distB="0" distL="114300" distR="114300" simplePos="0" relativeHeight="251766784" behindDoc="0" locked="0" layoutInCell="1" allowOverlap="1" wp14:anchorId="2CC33288" wp14:editId="11D34795">
+                <wp:simplePos x="0" y="0"/>
+                <wp:positionH relativeFrom="column">
+                  <wp:posOffset>2811145</wp:posOffset>
+                </wp:positionH>
+                <wp:positionV relativeFrom="paragraph">
+                  <wp:posOffset>3129915</wp:posOffset>
+                </wp:positionV>
+                <wp:extent cx="64285" cy="68580"/>
+                <wp:effectExtent l="38100" t="38100" r="50165" b="45720"/>
+                <wp:wrapNone/>
+                <wp:docPr id="1411675708" name="Ink 137"/>
+                <wp:cNvGraphicFramePr/>
+                <a:graphic xmlns:a="http://schemas.openxmlformats.org/drawingml/2006/main">
+                  <a:graphicData uri="http://schemas.microsoft.com/office/word/2010/wordprocessingInk">
+                    <w14:contentPart bwMode="auto" r:id="rId38">
+                      <w14:nvContentPartPr>
+                        <w14:cNvContentPartPr/>
+                      </w14:nvContentPartPr>
+                      <w14:xfrm>
+                        <a:off x="0" y="0"/>
+                        <a:ext cx="64285" cy="68580"/>
+                      </w14:xfrm>
+                    </w14:contentPart>
+                  </a:graphicData>
+                </a:graphic>
+              </wp:anchor>
+            </w:drawing>
+          </mc:Choice>
+          <mc:Fallback>
+            <w:pict>
+              <v:shape w14:anchorId="4CBC2FAB" id="Ink 137" o:spid="_x0000_s1026" type="#_x0000_t75" style="position:absolute;margin-left:220.85pt;margin-top:245.95pt;width:6pt;height:6.35pt;z-index:251766784;visibility:visible;mso-wrap-style:square;mso-wrap-distance-left:9pt;mso-wrap-distance-top:0;mso-wrap-distance-right:9pt;mso-wrap-distance-bottom:0;mso-position-horizontal:absolute;mso-position-horizontal-relative:text;mso-position-vertical:absolute;mso-position-vertical-relative:text" o:gfxdata="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">
+                <v:imagedata r:id="rId39" o:title=""/>
+              </v:shape>
+            </w:pict>
+          </mc:Fallback>
+        </mc:AlternateContent>
+      </w:r>
+      <w:r>
+        <w:rPr>
+          <w:noProof/>
+          <w:sz w:val="2"/>
+          <w:szCs w:val="2"/>
+        </w:rPr>
+        <mc:AlternateContent>
+          <mc:Choice Requires="wpi">
+            <w:drawing>
+              <wp:anchor distT="0" distB="0" distL="114300" distR="114300" simplePos="0" relativeHeight="251756544" behindDoc="0" locked="0" layoutInCell="1" allowOverlap="1" wp14:anchorId="10E079EE" wp14:editId="7845E89E">
+                <wp:simplePos x="0" y="0"/>
+                <wp:positionH relativeFrom="column">
+                  <wp:posOffset>2538730</wp:posOffset>
+                </wp:positionH>
+                <wp:positionV relativeFrom="paragraph">
+                  <wp:posOffset>1441450</wp:posOffset>
+                </wp:positionV>
+                <wp:extent cx="106865" cy="145415"/>
+                <wp:effectExtent l="38100" t="38100" r="26670" b="45085"/>
+                <wp:wrapNone/>
+                <wp:docPr id="2075056405" name="Ink 124"/>
+                <wp:cNvGraphicFramePr/>
+                <a:graphic xmlns:a="http://schemas.openxmlformats.org/drawingml/2006/main">
+                  <a:graphicData uri="http://schemas.microsoft.com/office/word/2010/wordprocessingInk">
+                    <w14:contentPart bwMode="auto" r:id="rId40">
+                      <w14:nvContentPartPr>
+                        <w14:cNvContentPartPr/>
+                      </w14:nvContentPartPr>
+                      <w14:xfrm>
+                        <a:off x="0" y="0"/>
+                        <a:ext cx="106865" cy="145415"/>
+                      </w14:xfrm>
+                    </w14:contentPart>
+                  </a:graphicData>
+                </a:graphic>
+              </wp:anchor>
+            </w:drawing>
+          </mc:Choice>
+          <mc:Fallback>
+            <w:pict>
+              <v:shape w14:anchorId="529FB732" id="Ink 124" o:spid="_x0000_s1026" type="#_x0000_t75" style="position:absolute;margin-left:199.4pt;margin-top:113pt;width:9.4pt;height:12.4pt;z-index:251756544;visibility:visible;mso-wrap-style:square;mso-wrap-distance-left:9pt;mso-wrap-distance-top:0;mso-wrap-distance-right:9pt;mso-wrap-distance-bottom:0;mso-position-horizontal:absolute;mso-position-horizontal-relative:text;mso-position-vertical:absolute;mso-position-vertical-relative:text" o:gfxdata="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">
+                <v:imagedata r:id="rId41" o:title=""/>
+              </v:shape>
+            </w:pict>
+          </mc:Fallback>
+        </mc:AlternateContent>
+      </w:r>
+      <w:r>
+        <w:rPr>
+          <w:noProof/>
+          <w:sz w:val="2"/>
+          <w:szCs w:val="2"/>
+        </w:rPr>
+        <mc:AlternateContent>
+          <mc:Choice Requires="wpi">
+            <w:drawing>
+              <wp:anchor distT="0" distB="0" distL="114300" distR="114300" simplePos="0" relativeHeight="251753472" behindDoc="0" locked="0" layoutInCell="1" allowOverlap="1" wp14:anchorId="4A0B36CD" wp14:editId="0B05C589">
+                <wp:simplePos x="0" y="0"/>
+                <wp:positionH relativeFrom="column">
+                  <wp:posOffset>1311251</wp:posOffset>
+                </wp:positionH>
+                <wp:positionV relativeFrom="paragraph">
+                  <wp:posOffset>1316306</wp:posOffset>
+                </wp:positionV>
+                <wp:extent cx="137160" cy="215640"/>
+                <wp:effectExtent l="38100" t="38100" r="34290" b="51435"/>
+                <wp:wrapNone/>
+                <wp:docPr id="19633485" name="Ink 121"/>
+                <wp:cNvGraphicFramePr/>
+                <a:graphic xmlns:a="http://schemas.openxmlformats.org/drawingml/2006/main">
+                  <a:graphicData uri="http://schemas.microsoft.com/office/word/2010/wordprocessingInk">
+                    <w14:contentPart bwMode="auto" r:id="rId42">
+                      <w14:nvContentPartPr>
+                        <w14:cNvContentPartPr/>
+                      </w14:nvContentPartPr>
+                      <w14:xfrm>
+                        <a:off x="0" y="0"/>
+                        <a:ext cx="137160" cy="215640"/>
+                      </w14:xfrm>
+                    </w14:contentPart>
+                  </a:graphicData>
+                </a:graphic>
+              </wp:anchor>
+            </w:drawing>
+          </mc:Choice>
+          <mc:Fallback>
+            <w:pict>
+              <v:shape w14:anchorId="5C7E14FC" id="Ink 121" o:spid="_x0000_s1026" type="#_x0000_t75" style="position:absolute;margin-left:102.75pt;margin-top:103.15pt;width:11.75pt;height:18pt;z-index:251753472;visibility:visible;mso-wrap-style:square;mso-wrap-distance-left:9pt;mso-wrap-distance-top:0;mso-wrap-distance-right:9pt;mso-wrap-distance-bottom:0;mso-position-horizontal:absolute;mso-position-horizontal-relative:text;mso-position-vertical:absolute;mso-position-vertical-relative:text" o:gfxdata="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">
+                <v:imagedata r:id="rId43" o:title=""/>
+              </v:shape>
+            </w:pict>
+          </mc:Fallback>
+        </mc:AlternateContent>
+      </w:r>
+      <w:r>
+        <w:rPr>
+          <w:noProof/>
+          <w:sz w:val="2"/>
+          <w:szCs w:val="2"/>
+        </w:rPr>
+        <mc:AlternateContent>
+          <mc:Choice Requires="wpi">
+            <w:drawing>
+              <wp:anchor distT="0" distB="0" distL="114300" distR="114300" simplePos="0" relativeHeight="251752448" behindDoc="0" locked="0" layoutInCell="1" allowOverlap="1" wp14:anchorId="3077E0CC" wp14:editId="14800FF6">
+                <wp:simplePos x="0" y="0"/>
+                <wp:positionH relativeFrom="column">
+                  <wp:posOffset>1270000</wp:posOffset>
+                </wp:positionH>
+                <wp:positionV relativeFrom="paragraph">
+                  <wp:posOffset>1424830</wp:posOffset>
+                </wp:positionV>
+                <wp:extent cx="120240" cy="101160"/>
+                <wp:effectExtent l="38100" t="38100" r="32385" b="51435"/>
+                <wp:wrapNone/>
+                <wp:docPr id="277637227" name="Ink 120"/>
+                <wp:cNvGraphicFramePr/>
+                <a:graphic xmlns:a="http://schemas.openxmlformats.org/drawingml/2006/main">
+                  <a:graphicData uri="http://schemas.microsoft.com/office/word/2010/wordprocessingInk">
+                    <w14:contentPart bwMode="auto" r:id="rId44">
+                      <w14:nvContentPartPr>
+                        <w14:cNvContentPartPr/>
+                      </w14:nvContentPartPr>
+                      <w14:xfrm>
+                        <a:off x="0" y="0"/>
+                        <a:ext cx="120240" cy="101160"/>
+                      </w14:xfrm>
+                    </w14:contentPart>
+                  </a:graphicData>
+                </a:graphic>
+                <wp14:sizeRelH relativeFrom="margin">
+                  <wp14:pctWidth>0</wp14:pctWidth>
+                </wp14:sizeRelH>
+                <wp14:sizeRelV relativeFrom="margin">
+                  <wp14:pctHeight>0</wp14:pctHeight>
+                </wp14:sizeRelV>
+              </wp:anchor>
+            </w:drawing>
+          </mc:Choice>
+          <mc:Fallback>
+            <w:pict>
+              <v:shape w14:anchorId="54714DE2" id="Ink 120" o:spid="_x0000_s1026" type="#_x0000_t75" style="position:absolute;margin-left:99.5pt;margin-top:111.7pt;width:10.45pt;height:8.95pt;z-index:251752448;visibility:visible;mso-wrap-style:square;mso-width-percent:0;mso-height-percent:0;mso-wrap-distance-left:9pt;mso-wrap-distance-top:0;mso-wrap-distance-right:9pt;mso-wrap-distance-bottom:0;mso-position-horizontal:absolute;mso-position-horizontal-relative:text;mso-position-vertical:absolute;mso-position-vertical-relative:text;mso-width-percent:0;mso-height-percent:0;mso-width-relative:margin;mso-height-relative:margin" o:gfxdata="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">
+                <v:imagedata r:id="rId45" o:title=""/>
+              </v:shape>
+            </w:pict>
+          </mc:Fallback>
+        </mc:AlternateContent>
+      </w:r>
+      <w:r>
+        <w:rPr>
+          <w:noProof/>
+          <w:sz w:val="2"/>
+          <w:szCs w:val="2"/>
+        </w:rPr>
+        <mc:AlternateContent>
+          <mc:Choice Requires="wpi">
+            <w:drawing>
+              <wp:anchor distT="0" distB="0" distL="114300" distR="114300" simplePos="0" relativeHeight="251748352" behindDoc="0" locked="0" layoutInCell="1" allowOverlap="1" wp14:anchorId="3FCC405B" wp14:editId="5ECC497B">
+                <wp:simplePos x="0" y="0"/>
+                <wp:positionH relativeFrom="column">
+                  <wp:posOffset>1450340</wp:posOffset>
+                </wp:positionH>
+                <wp:positionV relativeFrom="paragraph">
+                  <wp:posOffset>4859655</wp:posOffset>
+                </wp:positionV>
+                <wp:extent cx="535940" cy="184675"/>
+                <wp:effectExtent l="38100" t="38100" r="16510" b="44450"/>
+                <wp:wrapNone/>
+                <wp:docPr id="460141797" name="Ink 115"/>
+                <wp:cNvGraphicFramePr/>
+                <a:graphic xmlns:a="http://schemas.openxmlformats.org/drawingml/2006/main">
+                  <a:graphicData uri="http://schemas.microsoft.com/office/word/2010/wordprocessingInk">
+                    <w14:contentPart bwMode="auto" r:id="rId46">
+                      <w14:nvContentPartPr>
+                        <w14:cNvContentPartPr/>
+                      </w14:nvContentPartPr>
+                      <w14:xfrm>
+                        <a:off x="0" y="0"/>
+                        <a:ext cx="535940" cy="184675"/>
+                      </w14:xfrm>
+                    </w14:contentPart>
+                  </a:graphicData>
+                </a:graphic>
+              </wp:anchor>
+            </w:drawing>
+          </mc:Choice>
+          <mc:Fallback>
+            <w:pict>
+              <v:shape w14:anchorId="696D65DF" id="Ink 115" o:spid="_x0000_s1026" type="#_x0000_t75" style="position:absolute;margin-left:113.7pt;margin-top:382.15pt;width:43.15pt;height:15.55pt;z-index:251748352;visibility:visible;mso-wrap-style:square;mso-wrap-distance-left:9pt;mso-wrap-distance-top:0;mso-wrap-distance-right:9pt;mso-wrap-distance-bottom:0;mso-position-horizontal:absolute;mso-position-horizontal-relative:text;mso-position-vertical:absolute;mso-position-vertical-relative:text" o:gfxdata="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">
+                <v:imagedata r:id="rId47" o:title=""/>
+              </v:shape>
+            </w:pict>
+          </mc:Fallback>
+        </mc:AlternateContent>
+      </w:r>
+      <w:r>
+        <w:rPr>
+          <w:noProof/>
+          <w:sz w:val="2"/>
+          <w:szCs w:val="2"/>
+        </w:rPr>
+        <mc:AlternateContent>
+          <mc:Choice Requires="wpi">
+            <w:drawing>
+              <wp:anchor distT="0" distB="0" distL="114300" distR="114300" simplePos="0" relativeHeight="251745280" behindDoc="0" locked="0" layoutInCell="1" allowOverlap="1" wp14:anchorId="661CA1FD" wp14:editId="0A99E13C">
+                <wp:simplePos x="0" y="0"/>
+                <wp:positionH relativeFrom="column">
+                  <wp:posOffset>1381091</wp:posOffset>
+                </wp:positionH>
+                <wp:positionV relativeFrom="paragraph">
+                  <wp:posOffset>5002010</wp:posOffset>
+                </wp:positionV>
+                <wp:extent cx="95760" cy="7560"/>
+                <wp:effectExtent l="19050" t="38100" r="38100" b="50165"/>
+                <wp:wrapNone/>
+                <wp:docPr id="1295579036" name="Ink 110"/>
+                <wp:cNvGraphicFramePr/>
+                <a:graphic xmlns:a="http://schemas.openxmlformats.org/drawingml/2006/main">
+                  <a:graphicData uri="http://schemas.microsoft.com/office/word/2010/wordprocessingInk">
+                    <w14:contentPart bwMode="auto" r:id="rId48">
+                      <w14:nvContentPartPr>
+                        <w14:cNvContentPartPr/>
+                      </w14:nvContentPartPr>
+                      <w14:xfrm>
+                        <a:off x="0" y="0"/>
+                        <a:ext cx="95760" cy="7560"/>
+                      </w14:xfrm>
+                    </w14:contentPart>
+                  </a:graphicData>
+                </a:graphic>
+              </wp:anchor>
+            </w:drawing>
+          </mc:Choice>
+          <mc:Fallback>
+            <w:pict>
+              <v:shape w14:anchorId="6361B7ED" id="Ink 110" o:spid="_x0000_s1026" type="#_x0000_t75" style="position:absolute;margin-left:108.25pt;margin-top:393.35pt;width:8.55pt;height:1.6pt;z-index:251745280;visibility:visible;mso-wrap-style:square;mso-wrap-distance-left:9pt;mso-wrap-distance-top:0;mso-wrap-distance-right:9pt;mso-wrap-distance-bottom:0;mso-position-horizontal:absolute;mso-position-horizontal-relative:text;mso-position-vertical:absolute;mso-position-vertical-relative:text" o:gfxdata="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">
+                <v:imagedata r:id="rId49" o:title=""/>
+              </v:shape>
+            </w:pict>
+          </mc:Fallback>
+        </mc:AlternateContent>
+      </w:r>
+      <w:r>
+        <w:rPr>
+          <w:noProof/>
+          <w:sz w:val="2"/>
+          <w:szCs w:val="2"/>
+        </w:rPr>
+        <mc:AlternateContent>
+          <mc:Choice Requires="wpi">
+            <w:drawing>
+              <wp:anchor distT="0" distB="0" distL="114300" distR="114300" simplePos="0" relativeHeight="251744256" behindDoc="0" locked="0" layoutInCell="1" allowOverlap="1" wp14:anchorId="313F7F58" wp14:editId="792061A6">
+                <wp:simplePos x="0" y="0"/>
+                <wp:positionH relativeFrom="column">
+                  <wp:posOffset>1252931</wp:posOffset>
+                </wp:positionH>
+                <wp:positionV relativeFrom="paragraph">
+                  <wp:posOffset>4892930</wp:posOffset>
+                </wp:positionV>
+                <wp:extent cx="64080" cy="65520"/>
+                <wp:effectExtent l="38100" t="38100" r="31750" b="48895"/>
+                <wp:wrapNone/>
+                <wp:docPr id="1640607465" name="Ink 109"/>
+                <wp:cNvGraphicFramePr/>
+                <a:graphic xmlns:a="http://schemas.openxmlformats.org/drawingml/2006/main">
+                  <a:graphicData uri="http://schemas.microsoft.com/office/word/2010/wordprocessingInk">
+                    <w14:contentPart bwMode="auto" r:id="rId50">
+                      <w14:nvContentPartPr>
+                        <w14:cNvContentPartPr/>
+                      </w14:nvContentPartPr>
+                      <w14:xfrm>
+                        <a:off x="0" y="0"/>
+                        <a:ext cx="64080" cy="65520"/>
+                      </w14:xfrm>
+                    </w14:contentPart>
+                  </a:graphicData>
+                </a:graphic>
+              </wp:anchor>
+            </w:drawing>
+          </mc:Choice>
+          <mc:Fallback>
+            <w:pict>
+              <v:shape w14:anchorId="75204089" id="Ink 109" o:spid="_x0000_s1026" type="#_x0000_t75" style="position:absolute;margin-left:98.15pt;margin-top:384.75pt;width:6.05pt;height:6.1pt;z-index:251744256;visibility:visible;mso-wrap-style:square;mso-wrap-distance-left:9pt;mso-wrap-distance-top:0;mso-wrap-distance-right:9pt;mso-wrap-distance-bottom:0;mso-position-horizontal:absolute;mso-position-horizontal-relative:text;mso-position-vertical:absolute;mso-position-vertical-relative:text" o:gfxdata="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">
+                <v:imagedata r:id="rId51" o:title=""/>
+              </v:shape>
+            </w:pict>
+          </mc:Fallback>
+        </mc:AlternateContent>
+      </w:r>
+      <w:r>
+        <w:rPr>
+          <w:noProof/>
+          <w:sz w:val="2"/>
+          <w:szCs w:val="2"/>
+        </w:rPr>
+        <mc:AlternateContent>
+          <mc:Choice Requires="wpi">
+            <w:drawing>
+              <wp:anchor distT="0" distB="0" distL="114300" distR="114300" simplePos="0" relativeHeight="251743232" behindDoc="0" locked="0" layoutInCell="1" allowOverlap="1" wp14:anchorId="03DAC3D0" wp14:editId="394469B8">
+                <wp:simplePos x="0" y="0"/>
+                <wp:positionH relativeFrom="column">
+                  <wp:posOffset>1279211</wp:posOffset>
+                </wp:positionH>
+                <wp:positionV relativeFrom="paragraph">
+                  <wp:posOffset>3787370</wp:posOffset>
+                </wp:positionV>
+                <wp:extent cx="155160" cy="1172880"/>
+                <wp:effectExtent l="38100" t="38100" r="35560" b="46355"/>
+                <wp:wrapNone/>
+                <wp:docPr id="604396572" name="Ink 108"/>
+                <wp:cNvGraphicFramePr/>
+                <a:graphic xmlns:a="http://schemas.openxmlformats.org/drawingml/2006/main">
+                  <a:graphicData uri="http://schemas.microsoft.com/office/word/2010/wordprocessingInk">
+                    <w14:contentPart bwMode="auto" r:id="rId52">
+                      <w14:nvContentPartPr>
+                        <w14:cNvContentPartPr/>
+                      </w14:nvContentPartPr>
+                      <w14:xfrm>
+                        <a:off x="0" y="0"/>
+                        <a:ext cx="155160" cy="1172880"/>
+                      </w14:xfrm>
+                    </w14:contentPart>
+                  </a:graphicData>
+                </a:graphic>
+              </wp:anchor>
+            </w:drawing>
+          </mc:Choice>
+          <mc:Fallback>
+            <w:pict>
+              <v:shape w14:anchorId="41CD80C2" id="Ink 108" o:spid="_x0000_s1026" type="#_x0000_t75" style="position:absolute;margin-left:100.25pt;margin-top:297.7pt;width:13.2pt;height:93.3pt;z-index:251743232;visibility:visible;mso-wrap-style:square;mso-wrap-distance-left:9pt;mso-wrap-distance-top:0;mso-wrap-distance-right:9pt;mso-wrap-distance-bottom:0;mso-position-horizontal:absolute;mso-position-horizontal-relative:text;mso-position-vertical:absolute;mso-position-vertical-relative:text" o:gfxdata="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">
+                <v:imagedata r:id="rId53" o:title=""/>
+              </v:shape>
+            </w:pict>
+          </mc:Fallback>
+        </mc:AlternateContent>
+      </w:r>
+      <w:r>
+        <w:rPr>
+          <w:noProof/>
+          <w:sz w:val="2"/>
+          <w:szCs w:val="2"/>
+        </w:rPr>
+        <mc:AlternateContent>
+          <mc:Choice Requires="wpi">
+            <w:drawing>
+              <wp:anchor distT="0" distB="0" distL="114300" distR="114300" simplePos="0" relativeHeight="251741184" behindDoc="0" locked="0" layoutInCell="1" allowOverlap="1" wp14:anchorId="1294180C" wp14:editId="3736E558">
+                <wp:simplePos x="0" y="0"/>
+                <wp:positionH relativeFrom="column">
+                  <wp:posOffset>473449</wp:posOffset>
+                </wp:positionH>
+                <wp:positionV relativeFrom="paragraph">
+                  <wp:posOffset>4567397</wp:posOffset>
+                </wp:positionV>
+                <wp:extent cx="331920" cy="12600"/>
+                <wp:effectExtent l="38100" t="38100" r="49530" b="45085"/>
+                <wp:wrapNone/>
+                <wp:docPr id="1841470731" name="Ink 106"/>
+                <wp:cNvGraphicFramePr/>
+                <a:graphic xmlns:a="http://schemas.openxmlformats.org/drawingml/2006/main">
+                  <a:graphicData uri="http://schemas.microsoft.com/office/word/2010/wordprocessingInk">
+                    <w14:contentPart bwMode="auto" r:id="rId54">
+                      <w14:nvContentPartPr>
+                        <w14:cNvContentPartPr/>
+                      </w14:nvContentPartPr>
+                      <w14:xfrm>
+                        <a:off x="0" y="0"/>
+                        <a:ext cx="331920" cy="12600"/>
+                      </w14:xfrm>
+                    </w14:contentPart>
+                  </a:graphicData>
+                </a:graphic>
+              </wp:anchor>
+            </w:drawing>
+          </mc:Choice>
+          <mc:Fallback>
+            <w:pict>
+              <v:shape w14:anchorId="5B49554D" id="Ink 106" o:spid="_x0000_s1026" type="#_x0000_t75" style="position:absolute;margin-left:36.8pt;margin-top:359.2pt;width:27.15pt;height:2pt;z-index:251741184;visibility:visible;mso-wrap-style:square;mso-wrap-distance-left:9pt;mso-wrap-distance-top:0;mso-wrap-distance-right:9pt;mso-wrap-distance-bottom:0;mso-position-horizontal:absolute;mso-position-horizontal-relative:text;mso-position-vertical:absolute;mso-position-vertical-relative:text" o:gfxdata="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">
+                <v:imagedata r:id="rId55" o:title=""/>
+              </v:shape>
+            </w:pict>
+          </mc:Fallback>
+        </mc:AlternateContent>
+      </w:r>
+      <w:r>
+        <w:rPr>
+          <w:noProof/>
+          <w:sz w:val="2"/>
+          <w:szCs w:val="2"/>
+        </w:rPr>
+        <mc:AlternateContent>
+          <mc:Choice Requires="wpi">
+            <w:drawing>
+              <wp:anchor distT="0" distB="0" distL="114300" distR="114300" simplePos="0" relativeHeight="251739136" behindDoc="0" locked="0" layoutInCell="1" allowOverlap="1" wp14:anchorId="4970B438" wp14:editId="46828B4A">
+                <wp:simplePos x="0" y="0"/>
+                <wp:positionH relativeFrom="column">
+                  <wp:posOffset>507365</wp:posOffset>
+                </wp:positionH>
+                <wp:positionV relativeFrom="paragraph">
+                  <wp:posOffset>4883785</wp:posOffset>
+                </wp:positionV>
+                <wp:extent cx="57085" cy="56515"/>
+                <wp:effectExtent l="38100" t="38100" r="19685" b="38735"/>
+                <wp:wrapNone/>
+                <wp:docPr id="1200007565" name="Ink 102"/>
+                <wp:cNvGraphicFramePr/>
+                <a:graphic xmlns:a="http://schemas.openxmlformats.org/drawingml/2006/main">
+                  <a:graphicData uri="http://schemas.microsoft.com/office/word/2010/wordprocessingInk">
+                    <w14:contentPart bwMode="auto" r:id="rId56">
+                      <w14:nvContentPartPr>
+                        <w14:cNvContentPartPr/>
+                      </w14:nvContentPartPr>
+                      <w14:xfrm>
+                        <a:off x="0" y="0"/>
+                        <a:ext cx="57085" cy="56515"/>
+                      </w14:xfrm>
+                    </w14:contentPart>
+                  </a:graphicData>
+                </a:graphic>
+              </wp:anchor>
+            </w:drawing>
+          </mc:Choice>
+          <mc:Fallback>
+            <w:pict>
+              <v:shape w14:anchorId="60F84A37" id="Ink 102" o:spid="_x0000_s1026" type="#_x0000_t75" style="position:absolute;margin-left:39.45pt;margin-top:384.05pt;width:5.5pt;height:5.4pt;z-index:251739136;visibility:visible;mso-wrap-style:square;mso-wrap-distance-left:9pt;mso-wrap-distance-top:0;mso-wrap-distance-right:9pt;mso-wrap-distance-bottom:0;mso-position-horizontal:absolute;mso-position-horizontal-relative:text;mso-position-vertical:absolute;mso-position-vertical-relative:text" o:gfxdata="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">
+                <v:imagedata r:id="rId57" o:title=""/>
+              </v:shape>
+            </w:pict>
+          </mc:Fallback>
+        </mc:AlternateContent>
+      </w:r>
+      <w:r>
+        <w:rPr>
+          <w:noProof/>
+          <w:sz w:val="2"/>
+          <w:szCs w:val="2"/>
+        </w:rPr>
+        <mc:AlternateContent>
+          <mc:Choice Requires="wpi">
+            <w:drawing>
+              <wp:anchor distT="0" distB="0" distL="114300" distR="114300" simplePos="0" relativeHeight="251736064" behindDoc="0" locked="0" layoutInCell="1" allowOverlap="1" wp14:anchorId="4976D1C8" wp14:editId="6AE558BF">
+                <wp:simplePos x="0" y="0"/>
+                <wp:positionH relativeFrom="column">
+                  <wp:posOffset>526369</wp:posOffset>
+                </wp:positionH>
+                <wp:positionV relativeFrom="paragraph">
+                  <wp:posOffset>4571055</wp:posOffset>
+                </wp:positionV>
+                <wp:extent cx="81720" cy="359280"/>
+                <wp:effectExtent l="38100" t="38100" r="52070" b="41275"/>
+                <wp:wrapNone/>
+                <wp:docPr id="155636824" name="Ink 99"/>
+                <wp:cNvGraphicFramePr/>
+                <a:graphic xmlns:a="http://schemas.openxmlformats.org/drawingml/2006/main">
+                  <a:graphicData uri="http://schemas.microsoft.com/office/word/2010/wordprocessingInk">
+                    <w14:contentPart bwMode="auto" r:id="rId58">
+                      <w14:nvContentPartPr>
+                        <w14:cNvContentPartPr/>
+                      </w14:nvContentPartPr>
+                      <w14:xfrm>
+                        <a:off x="0" y="0"/>
+                        <a:ext cx="81720" cy="359280"/>
+                      </w14:xfrm>
+                    </w14:contentPart>
+                  </a:graphicData>
+                </a:graphic>
+              </wp:anchor>
+            </w:drawing>
+          </mc:Choice>
+          <mc:Fallback>
+            <w:pict>
+              <v:shape w14:anchorId="4A831650" id="Ink 99" o:spid="_x0000_s1026" type="#_x0000_t75" style="position:absolute;margin-left:40.95pt;margin-top:359.45pt;width:7.45pt;height:29.3pt;z-index:251736064;visibility:visible;mso-wrap-style:square;mso-wrap-distance-left:9pt;mso-wrap-distance-top:0;mso-wrap-distance-right:9pt;mso-wrap-distance-bottom:0;mso-position-horizontal:absolute;mso-position-horizontal-relative:text;mso-position-vertical:absolute;mso-position-vertical-relative:text" o:gfxdata="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">
+                <v:imagedata r:id="rId59" o:title=""/>
+              </v:shape>
+            </w:pict>
+          </mc:Fallback>
+        </mc:AlternateContent>
+      </w:r>
+      <w:r>
+        <w:rPr>
+          <w:noProof/>
+          <w:sz w:val="2"/>
+          <w:szCs w:val="2"/>
+        </w:rPr>
+        <mc:AlternateContent>
+          <mc:Choice Requires="wpi">
+            <w:drawing>
+              <wp:anchor distT="0" distB="0" distL="114300" distR="114300" simplePos="0" relativeHeight="251734016" behindDoc="0" locked="0" layoutInCell="1" allowOverlap="1" wp14:anchorId="38FC4C32" wp14:editId="670C4C83">
+                <wp:simplePos x="0" y="0"/>
+                <wp:positionH relativeFrom="column">
+                  <wp:posOffset>572770</wp:posOffset>
+                </wp:positionH>
+                <wp:positionV relativeFrom="paragraph">
+                  <wp:posOffset>3369945</wp:posOffset>
+                </wp:positionV>
+                <wp:extent cx="53975" cy="52705"/>
+                <wp:effectExtent l="38100" t="38100" r="41275" b="42545"/>
+                <wp:wrapNone/>
+                <wp:docPr id="2115453758" name="Ink 97"/>
+                <wp:cNvGraphicFramePr/>
+                <a:graphic xmlns:a="http://schemas.openxmlformats.org/drawingml/2006/main">
+                  <a:graphicData uri="http://schemas.microsoft.com/office/word/2010/wordprocessingInk">
+                    <w14:contentPart bwMode="auto" r:id="rId60">
+                      <w14:nvContentPartPr>
+                        <w14:cNvContentPartPr/>
+                      </w14:nvContentPartPr>
+                      <w14:xfrm>
+                        <a:off x="0" y="0"/>
+                        <a:ext cx="53975" cy="52705"/>
+                      </w14:xfrm>
+                    </w14:contentPart>
+                  </a:graphicData>
+                </a:graphic>
+              </wp:anchor>
+            </w:drawing>
+          </mc:Choice>
+          <mc:Fallback>
+            <w:pict>
+              <v:shape w14:anchorId="714969C3" id="Ink 97" o:spid="_x0000_s1026" type="#_x0000_t75" style="position:absolute;margin-left:44.6pt;margin-top:264.85pt;width:5.2pt;height:5.1pt;z-index:251734016;visibility:visible;mso-wrap-style:square;mso-wrap-distance-left:9pt;mso-wrap-distance-top:0;mso-wrap-distance-right:9pt;mso-wrap-distance-bottom:0;mso-position-horizontal:absolute;mso-position-horizontal-relative:text;mso-position-vertical:absolute;mso-position-vertical-relative:text" o:gfxdata="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">
+                <v:imagedata r:id="rId61" o:title=""/>
+              </v:shape>
+            </w:pict>
+          </mc:Fallback>
+        </mc:AlternateContent>
+      </w:r>
+      <w:r>
+        <w:rPr>
+          <w:noProof/>
+          <w:sz w:val="2"/>
+          <w:szCs w:val="2"/>
+        </w:rPr>
+        <mc:AlternateContent>
+          <mc:Choice Requires="wpi">
+            <w:drawing>
+              <wp:anchor distT="0" distB="0" distL="114300" distR="114300" simplePos="0" relativeHeight="251730944" behindDoc="0" locked="0" layoutInCell="1" allowOverlap="1" wp14:anchorId="15B5E567" wp14:editId="057321FF">
+                <wp:simplePos x="0" y="0"/>
+                <wp:positionH relativeFrom="column">
+                  <wp:posOffset>481369</wp:posOffset>
+                </wp:positionH>
+                <wp:positionV relativeFrom="paragraph">
+                  <wp:posOffset>2740455</wp:posOffset>
+                </wp:positionV>
+                <wp:extent cx="127080" cy="680040"/>
+                <wp:effectExtent l="38100" t="38100" r="44450" b="44450"/>
+                <wp:wrapNone/>
+                <wp:docPr id="1535263344" name="Ink 93"/>
+                <wp:cNvGraphicFramePr/>
+                <a:graphic xmlns:a="http://schemas.openxmlformats.org/drawingml/2006/main">
+                  <a:graphicData uri="http://schemas.microsoft.com/office/word/2010/wordprocessingInk">
+                    <w14:contentPart bwMode="auto" r:id="rId62">
+                      <w14:nvContentPartPr>
+                        <w14:cNvContentPartPr/>
+                      </w14:nvContentPartPr>
+                      <w14:xfrm>
+                        <a:off x="0" y="0"/>
+                        <a:ext cx="127080" cy="680040"/>
+                      </w14:xfrm>
+                    </w14:contentPart>
+                  </a:graphicData>
+                </a:graphic>
+              </wp:anchor>
+            </w:drawing>
+          </mc:Choice>
+          <mc:Fallback>
+            <w:pict>
+              <v:shape w14:anchorId="4AB41AD4" id="Ink 93" o:spid="_x0000_s1026" type="#_x0000_t75" style="position:absolute;margin-left:37.4pt;margin-top:215.3pt;width:10.95pt;height:54.55pt;z-index:251730944;visibility:visible;mso-wrap-style:square;mso-wrap-distance-left:9pt;mso-wrap-distance-top:0;mso-wrap-distance-right:9pt;mso-wrap-distance-bottom:0;mso-position-horizontal:absolute;mso-position-horizontal-relative:text;mso-position-vertical:absolute;mso-position-vertical-relative:text" o:gfxdata="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">
+                <v:imagedata r:id="rId63" o:title=""/>
+              </v:shape>
+            </w:pict>
+          </mc:Fallback>
+        </mc:AlternateContent>
+      </w:r>
+      <w:r>
+        <w:rPr>
+          <w:noProof/>
+          <w:sz w:val="2"/>
+          <w:szCs w:val="2"/>
+        </w:rPr>
+        <mc:AlternateContent>
+          <mc:Choice Requires="wpi">
+            <w:drawing>
+              <wp:anchor distT="0" distB="0" distL="114300" distR="114300" simplePos="0" relativeHeight="251728896" behindDoc="0" locked="0" layoutInCell="1" allowOverlap="1" wp14:anchorId="17AD09C4" wp14:editId="6CF2082E">
+                <wp:simplePos x="0" y="0"/>
+                <wp:positionH relativeFrom="column">
+                  <wp:posOffset>356235</wp:posOffset>
+                </wp:positionH>
+                <wp:positionV relativeFrom="paragraph">
+                  <wp:posOffset>2734945</wp:posOffset>
+                </wp:positionV>
+                <wp:extent cx="156210" cy="635"/>
+                <wp:effectExtent l="38100" t="38100" r="34290" b="37465"/>
+                <wp:wrapNone/>
+                <wp:docPr id="679910143" name="Ink 91"/>
+                <wp:cNvGraphicFramePr/>
+                <a:graphic xmlns:a="http://schemas.openxmlformats.org/drawingml/2006/main">
+                  <a:graphicData uri="http://schemas.microsoft.com/office/word/2010/wordprocessingInk">
+                    <w14:contentPart bwMode="auto" r:id="rId64">
+                      <w14:nvContentPartPr>
+                        <w14:cNvContentPartPr/>
+                      </w14:nvContentPartPr>
+                      <w14:xfrm>
+                        <a:off x="0" y="0"/>
+                        <a:ext cx="156210" cy="635"/>
+                      </w14:xfrm>
+                    </w14:contentPart>
+                  </a:graphicData>
+                </a:graphic>
+                <wp14:sizeRelH relativeFrom="margin">
+                  <wp14:pctWidth>0</wp14:pctWidth>
+                </wp14:sizeRelH>
+                <wp14:sizeRelV relativeFrom="margin">
+                  <wp14:pctHeight>0</wp14:pctHeight>
+                </wp14:sizeRelV>
+              </wp:anchor>
+            </w:drawing>
+          </mc:Choice>
+          <mc:Fallback>
+            <w:pict>
+              <v:shape w14:anchorId="352A14B6" id="Ink 91" o:spid="_x0000_s1026" type="#_x0000_t75" style="position:absolute;margin-left:27.55pt;margin-top:214.5pt;width:13.25pt;height:1.75pt;z-index:251728896;visibility:visible;mso-wrap-style:square;mso-width-percent:0;mso-height-percent:0;mso-wrap-distance-left:9pt;mso-wrap-distance-top:0;mso-wrap-distance-right:9pt;mso-wrap-distance-bottom:0;mso-position-horizontal:absolute;mso-position-horizontal-relative:text;mso-position-vertical:absolute;mso-position-vertical-relative:text;mso-width-percent:0;mso-height-percent:0;mso-width-relative:margin;mso-height-relative:margin" o:gfxdata="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">
+                <v:imagedata r:id="rId65" o:title=""/>
+              </v:shape>
+            </w:pict>
+          </mc:Fallback>
+        </mc:AlternateContent>
+      </w:r>
+      <w:r>
+        <w:rPr>
+          <w:noProof/>
+          <w:sz w:val="2"/>
+          <w:szCs w:val="2"/>
+        </w:rPr>
+        <mc:AlternateContent>
+          <mc:Choice Requires="wpi">
+            <w:drawing>
+              <wp:anchor distT="0" distB="0" distL="114300" distR="114300" simplePos="0" relativeHeight="251726848" behindDoc="0" locked="0" layoutInCell="1" allowOverlap="1" wp14:anchorId="1ABCDCB4" wp14:editId="7CB98E21">
+                <wp:simplePos x="0" y="0"/>
+                <wp:positionH relativeFrom="column">
+                  <wp:posOffset>-362471</wp:posOffset>
+                </wp:positionH>
+                <wp:positionV relativeFrom="paragraph">
+                  <wp:posOffset>1995615</wp:posOffset>
+                </wp:positionV>
+                <wp:extent cx="455040" cy="1414440"/>
+                <wp:effectExtent l="38100" t="38100" r="40640" b="52705"/>
+                <wp:wrapNone/>
+                <wp:docPr id="66769434" name="Ink 89"/>
+                <wp:cNvGraphicFramePr/>
+                <a:graphic xmlns:a="http://schemas.openxmlformats.org/drawingml/2006/main">
+                  <a:graphicData uri="http://schemas.microsoft.com/office/word/2010/wordprocessingInk">
+                    <w14:contentPart bwMode="auto" r:id="rId66">
+                      <w14:nvContentPartPr>
+                        <w14:cNvContentPartPr/>
+                      </w14:nvContentPartPr>
+                      <w14:xfrm>
+                        <a:off x="0" y="0"/>
+                        <a:ext cx="455040" cy="1414440"/>
+                      </w14:xfrm>
+                    </w14:contentPart>
+                  </a:graphicData>
+                </a:graphic>
+              </wp:anchor>
+            </w:drawing>
+          </mc:Choice>
+          <mc:Fallback>
+            <w:pict>
+              <v:shape w14:anchorId="005BDE1D" id="Ink 89" o:spid="_x0000_s1026" type="#_x0000_t75" style="position:absolute;margin-left:-29.05pt;margin-top:156.65pt;width:36.85pt;height:112.35pt;z-index:251726848;visibility:visible;mso-wrap-style:square;mso-wrap-distance-left:9pt;mso-wrap-distance-top:0;mso-wrap-distance-right:9pt;mso-wrap-distance-bottom:0;mso-position-horizontal:absolute;mso-position-horizontal-relative:text;mso-position-vertical:absolute;mso-position-vertical-relative:text" o:gfxdata="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">
+                <v:imagedata r:id="rId67" o:title=""/>
+              </v:shape>
+            </w:pict>
+          </mc:Fallback>
+        </mc:AlternateContent>
+      </w:r>
+      <w:r>
+        <w:rPr>
+          <w:noProof/>
+          <w:sz w:val="2"/>
+          <w:szCs w:val="2"/>
+        </w:rPr>
+        <mc:AlternateContent>
+          <mc:Choice Requires="wpi">
+            <w:drawing>
+              <wp:anchor distT="0" distB="0" distL="114300" distR="114300" simplePos="0" relativeHeight="251725824" behindDoc="0" locked="0" layoutInCell="1" allowOverlap="1" wp14:anchorId="258D795F" wp14:editId="3774718C">
+                <wp:simplePos x="0" y="0"/>
+                <wp:positionH relativeFrom="column">
+                  <wp:posOffset>5344160</wp:posOffset>
+                </wp:positionH>
+                <wp:positionV relativeFrom="paragraph">
+                  <wp:posOffset>1708150</wp:posOffset>
+                </wp:positionV>
+                <wp:extent cx="64135" cy="120645"/>
+                <wp:effectExtent l="57150" t="57150" r="31115" b="51435"/>
+                <wp:wrapNone/>
+                <wp:docPr id="1478436800" name="Ink 88"/>
+                <wp:cNvGraphicFramePr/>
+                <a:graphic xmlns:a="http://schemas.openxmlformats.org/drawingml/2006/main">
+                  <a:graphicData uri="http://schemas.microsoft.com/office/word/2010/wordprocessingInk">
+                    <w14:contentPart bwMode="auto" r:id="rId68">
+                      <w14:nvContentPartPr>
+                        <w14:cNvContentPartPr/>
+                      </w14:nvContentPartPr>
+                      <w14:xfrm>
+                        <a:off x="0" y="0"/>
+                        <a:ext cx="64135" cy="120645"/>
+                      </w14:xfrm>
+                    </w14:contentPart>
+                  </a:graphicData>
+                </a:graphic>
+              </wp:anchor>
+            </w:drawing>
+          </mc:Choice>
+          <mc:Fallback>
+            <w:pict>
+              <v:shape w14:anchorId="52166975" id="Ink 88" o:spid="_x0000_s1026" type="#_x0000_t75" style="position:absolute;margin-left:420.1pt;margin-top:133.8pt;width:6.4pt;height:10.95pt;z-index:251725824;visibility:visible;mso-wrap-style:square;mso-wrap-distance-left:9pt;mso-wrap-distance-top:0;mso-wrap-distance-right:9pt;mso-wrap-distance-bottom:0;mso-position-horizontal:absolute;mso-position-horizontal-relative:text;mso-position-vertical:absolute;mso-position-vertical-relative:text" o:gfxdata="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">
+                <v:imagedata r:id="rId69" o:title=""/>
+              </v:shape>
+            </w:pict>
+          </mc:Fallback>
+        </mc:AlternateContent>
+      </w:r>
+      <w:r>
+        <w:rPr>
+          <w:noProof/>
+          <w:sz w:val="2"/>
+          <w:szCs w:val="2"/>
+        </w:rPr>
+        <mc:AlternateContent>
+          <mc:Choice Requires="wpi">
+            <w:drawing>
+              <wp:anchor distT="0" distB="0" distL="114300" distR="114300" simplePos="0" relativeHeight="251722752" behindDoc="0" locked="0" layoutInCell="1" allowOverlap="1" wp14:anchorId="21867E2E" wp14:editId="7AB782F2">
+                <wp:simplePos x="0" y="0"/>
+                <wp:positionH relativeFrom="column">
+                  <wp:posOffset>3112969</wp:posOffset>
+                </wp:positionH>
+                <wp:positionV relativeFrom="paragraph">
+                  <wp:posOffset>1178113</wp:posOffset>
+                </wp:positionV>
+                <wp:extent cx="2292480" cy="604800"/>
+                <wp:effectExtent l="57150" t="57150" r="50800" b="43180"/>
+                <wp:wrapNone/>
+                <wp:docPr id="1438235584" name="Ink 85"/>
+                <wp:cNvGraphicFramePr/>
+                <a:graphic xmlns:a="http://schemas.openxmlformats.org/drawingml/2006/main">
+                  <a:graphicData uri="http://schemas.microsoft.com/office/word/2010/wordprocessingInk">
+                    <w14:contentPart bwMode="auto" r:id="rId70">
+                      <w14:nvContentPartPr>
+                        <w14:cNvContentPartPr/>
+                      </w14:nvContentPartPr>
+                      <w14:xfrm>
+                        <a:off x="0" y="0"/>
+                        <a:ext cx="2292480" cy="604800"/>
+                      </w14:xfrm>
+                    </w14:contentPart>
+                  </a:graphicData>
+                </a:graphic>
+              </wp:anchor>
+            </w:drawing>
+          </mc:Choice>
+          <mc:Fallback>
+            <w:pict>
+              <v:shape w14:anchorId="268D8482" id="Ink 85" o:spid="_x0000_s1026" type="#_x0000_t75" style="position:absolute;margin-left:244.4pt;margin-top:92.05pt;width:181.9pt;height:49pt;z-index:251722752;visibility:visible;mso-wrap-style:square;mso-wrap-distance-left:9pt;mso-wrap-distance-top:0;mso-wrap-distance-right:9pt;mso-wrap-distance-bottom:0;mso-position-horizontal:absolute;mso-position-horizontal-relative:text;mso-position-vertical:absolute;mso-position-vertical-relative:text" o:gfxdata="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">
+                <v:imagedata r:id="rId71" o:title=""/>
+              </v:shape>
+            </w:pict>
+          </mc:Fallback>
+        </mc:AlternateContent>
+      </w:r>
+      <w:r>
+        <w:rPr>
+          <w:noProof/>
+          <w:sz w:val="2"/>
+          <w:szCs w:val="2"/>
+        </w:rPr>
+        <mc:AlternateContent>
+          <mc:Choice Requires="wpi">
+            <w:drawing>
+              <wp:anchor distT="0" distB="0" distL="114300" distR="114300" simplePos="0" relativeHeight="251720704" behindDoc="0" locked="0" layoutInCell="1" allowOverlap="1" wp14:anchorId="31537883" wp14:editId="26EAD8CE">
+                <wp:simplePos x="0" y="0"/>
+                <wp:positionH relativeFrom="column">
+                  <wp:posOffset>2267295</wp:posOffset>
+                </wp:positionH>
+                <wp:positionV relativeFrom="paragraph">
+                  <wp:posOffset>4846783</wp:posOffset>
+                </wp:positionV>
+                <wp:extent cx="60120" cy="63720"/>
+                <wp:effectExtent l="57150" t="57150" r="54610" b="50800"/>
+                <wp:wrapNone/>
+                <wp:docPr id="1610192936" name="Ink 81"/>
+                <wp:cNvGraphicFramePr/>
+                <a:graphic xmlns:a="http://schemas.openxmlformats.org/drawingml/2006/main">
+                  <a:graphicData uri="http://schemas.microsoft.com/office/word/2010/wordprocessingInk">
+                    <w14:contentPart bwMode="auto" r:id="rId72">
+                      <w14:nvContentPartPr>
+                        <w14:cNvContentPartPr/>
+                      </w14:nvContentPartPr>
+                      <w14:xfrm>
+                        <a:off x="0" y="0"/>
+                        <a:ext cx="60120" cy="63720"/>
+                      </w14:xfrm>
+                    </w14:contentPart>
+                  </a:graphicData>
+                </a:graphic>
+              </wp:anchor>
+            </w:drawing>
+          </mc:Choice>
+          <mc:Fallback>
+            <w:pict>
+              <v:shape w14:anchorId="10799445" id="Ink 81" o:spid="_x0000_s1026" type="#_x0000_t75" style="position:absolute;margin-left:177.85pt;margin-top:380.95pt;width:6.15pt;height:6.4pt;z-index:251720704;visibility:visible;mso-wrap-style:square;mso-wrap-distance-left:9pt;mso-wrap-distance-top:0;mso-wrap-distance-right:9pt;mso-wrap-distance-bottom:0;mso-position-horizontal:absolute;mso-position-horizontal-relative:text;mso-position-vertical:absolute;mso-position-vertical-relative:text" o:gfxdata="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">
+                <v:imagedata r:id="rId73" o:title=""/>
+              </v:shape>
+            </w:pict>
+          </mc:Fallback>
+        </mc:AlternateContent>
+      </w:r>
+      <w:r>
+        <w:rPr>
+          <w:noProof/>
+          <w:sz w:val="2"/>
+          <w:szCs w:val="2"/>
+        </w:rPr>
+        <mc:AlternateContent>
+          <mc:Choice Requires="wpi">
+            <w:drawing>
+              <wp:anchor distT="0" distB="0" distL="114300" distR="114300" simplePos="0" relativeHeight="251719680" behindDoc="0" locked="0" layoutInCell="1" allowOverlap="1" wp14:anchorId="3F5B9B1A" wp14:editId="4D4301D4">
+                <wp:simplePos x="0" y="0"/>
+                <wp:positionH relativeFrom="column">
+                  <wp:posOffset>2136975</wp:posOffset>
+                </wp:positionH>
+                <wp:positionV relativeFrom="paragraph">
+                  <wp:posOffset>3642943</wp:posOffset>
+                </wp:positionV>
+                <wp:extent cx="162720" cy="1268640"/>
+                <wp:effectExtent l="57150" t="57150" r="46990" b="46355"/>
+                <wp:wrapNone/>
+                <wp:docPr id="97288310" name="Ink 80"/>
+                <wp:cNvGraphicFramePr/>
+                <a:graphic xmlns:a="http://schemas.openxmlformats.org/drawingml/2006/main">
+                  <a:graphicData uri="http://schemas.microsoft.com/office/word/2010/wordprocessingInk">
+                    <w14:contentPart bwMode="auto" r:id="rId74">
+                      <w14:nvContentPartPr>
+                        <w14:cNvContentPartPr/>
+                      </w14:nvContentPartPr>
+                      <w14:xfrm>
+                        <a:off x="0" y="0"/>
+                        <a:ext cx="162720" cy="1268640"/>
+                      </w14:xfrm>
+                    </w14:contentPart>
+                  </a:graphicData>
+                </a:graphic>
+              </wp:anchor>
+            </w:drawing>
+          </mc:Choice>
+          <mc:Fallback>
+            <w:pict>
+              <v:shape w14:anchorId="3410977D" id="Ink 80" o:spid="_x0000_s1026" type="#_x0000_t75" style="position:absolute;margin-left:167.55pt;margin-top:286.15pt;width:14.2pt;height:101.35pt;z-index:251719680;visibility:visible;mso-wrap-style:square;mso-wrap-distance-left:9pt;mso-wrap-distance-top:0;mso-wrap-distance-right:9pt;mso-wrap-distance-bottom:0;mso-position-horizontal:absolute;mso-position-horizontal-relative:text;mso-position-vertical:absolute;mso-position-vertical-relative:text" o:gfxdata="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">
+                <v:imagedata r:id="rId75" o:title=""/>
+              </v:shape>
+            </w:pict>
+          </mc:Fallback>
+        </mc:AlternateContent>
+      </w:r>
+      <w:r>
+        <w:rPr>
+          <w:noProof/>
+          <w:sz w:val="2"/>
+          <w:szCs w:val="2"/>
+        </w:rPr>
+        <mc:AlternateContent>
+          <mc:Choice Requires="wpi">
+            <w:drawing>
+              <wp:anchor distT="0" distB="0" distL="114300" distR="114300" simplePos="0" relativeHeight="251716608" behindDoc="0" locked="0" layoutInCell="1" allowOverlap="1" wp14:anchorId="6A5A01E8" wp14:editId="6D91C86F">
+                <wp:simplePos x="0" y="0"/>
+                <wp:positionH relativeFrom="column">
+                  <wp:posOffset>2037975</wp:posOffset>
+                </wp:positionH>
+                <wp:positionV relativeFrom="paragraph">
+                  <wp:posOffset>2774570</wp:posOffset>
+                </wp:positionV>
+                <wp:extent cx="295920" cy="1080"/>
+                <wp:effectExtent l="57150" t="57150" r="46990" b="56515"/>
+                <wp:wrapNone/>
+                <wp:docPr id="269165055" name="Ink 76"/>
+                <wp:cNvGraphicFramePr/>
+                <a:graphic xmlns:a="http://schemas.openxmlformats.org/drawingml/2006/main">
+                  <a:graphicData uri="http://schemas.microsoft.com/office/word/2010/wordprocessingInk">
+                    <w14:contentPart bwMode="auto" r:id="rId76">
+                      <w14:nvContentPartPr>
+                        <w14:cNvContentPartPr/>
+                      </w14:nvContentPartPr>
+                      <w14:xfrm>
+                        <a:off x="0" y="0"/>
+                        <a:ext cx="295920" cy="1080"/>
+                      </w14:xfrm>
+                    </w14:contentPart>
+                  </a:graphicData>
+                </a:graphic>
+              </wp:anchor>
+            </w:drawing>
+          </mc:Choice>
+          <mc:Fallback>
+            <w:pict>
+              <v:shape w14:anchorId="74D5CC39" id="Ink 76" o:spid="_x0000_s1026" type="#_x0000_t75" style="position:absolute;margin-left:159.75pt;margin-top:217.9pt;width:24.7pt;height:1.2pt;z-index:251716608;visibility:visible;mso-wrap-style:square;mso-wrap-distance-left:9pt;mso-wrap-distance-top:0;mso-wrap-distance-right:9pt;mso-wrap-distance-bottom:0;mso-position-horizontal:absolute;mso-position-horizontal-relative:text;mso-position-vertical:absolute;mso-position-vertical-relative:text" o:gfxdata="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">
+                <v:imagedata r:id="rId77" o:title=""/>
+              </v:shape>
+            </w:pict>
+          </mc:Fallback>
+        </mc:AlternateContent>
+      </w:r>
+      <w:r>
+        <w:rPr>
+          <w:noProof/>
+          <w:sz w:val="2"/>
+          <w:szCs w:val="2"/>
+        </w:rPr>
+        <mc:AlternateContent>
+          <mc:Choice Requires="wpi">
+            <w:drawing>
+              <wp:anchor distT="0" distB="0" distL="114300" distR="114300" simplePos="0" relativeHeight="251714560" behindDoc="0" locked="0" layoutInCell="1" allowOverlap="1" wp14:anchorId="255ED263" wp14:editId="71628CBB">
+                <wp:simplePos x="0" y="0"/>
+                <wp:positionH relativeFrom="column">
+                  <wp:posOffset>2374215</wp:posOffset>
+                </wp:positionH>
+                <wp:positionV relativeFrom="paragraph">
+                  <wp:posOffset>2776370</wp:posOffset>
+                </wp:positionV>
+                <wp:extent cx="276480" cy="5400"/>
+                <wp:effectExtent l="57150" t="57150" r="47625" b="52070"/>
+                <wp:wrapNone/>
+                <wp:docPr id="38625035" name="Ink 74"/>
+                <wp:cNvGraphicFramePr/>
+                <a:graphic xmlns:a="http://schemas.openxmlformats.org/drawingml/2006/main">
+                  <a:graphicData uri="http://schemas.microsoft.com/office/word/2010/wordprocessingInk">
+                    <w14:contentPart bwMode="auto" r:id="rId78">
+                      <w14:nvContentPartPr>
+                        <w14:cNvContentPartPr/>
+                      </w14:nvContentPartPr>
+                      <w14:xfrm>
+                        <a:off x="0" y="0"/>
+                        <a:ext cx="276480" cy="5400"/>
+                      </w14:xfrm>
+                    </w14:contentPart>
+                  </a:graphicData>
+                </a:graphic>
+              </wp:anchor>
+            </w:drawing>
+          </mc:Choice>
+          <mc:Fallback>
+            <w:pict>
+              <v:shape w14:anchorId="059E03F3" id="Ink 74" o:spid="_x0000_s1026" type="#_x0000_t75" style="position:absolute;margin-left:186.25pt;margin-top:217.9pt;width:23.15pt;height:1.85pt;z-index:251714560;visibility:visible;mso-wrap-style:square;mso-wrap-distance-left:9pt;mso-wrap-distance-top:0;mso-wrap-distance-right:9pt;mso-wrap-distance-bottom:0;mso-position-horizontal:absolute;mso-position-horizontal-relative:text;mso-position-vertical:absolute;mso-position-vertical-relative:text" o:gfxdata="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">
+                <v:imagedata r:id="rId79" o:title=""/>
+              </v:shape>
+            </w:pict>
+          </mc:Fallback>
+        </mc:AlternateContent>
+      </w:r>
+      <w:r>
+        <w:rPr>
+          <w:noProof/>
+          <w:sz w:val="2"/>
+          <w:szCs w:val="2"/>
+        </w:rPr>
+        <mc:AlternateContent>
+          <mc:Choice Requires="wpi">
+            <w:drawing>
+              <wp:anchor distT="0" distB="0" distL="114300" distR="114300" simplePos="0" relativeHeight="251712512" behindDoc="0" locked="0" layoutInCell="1" allowOverlap="1" wp14:anchorId="6CB46721" wp14:editId="024C8AF3">
+                <wp:simplePos x="0" y="0"/>
+                <wp:positionH relativeFrom="column">
+                  <wp:posOffset>3126740</wp:posOffset>
+                </wp:positionH>
+                <wp:positionV relativeFrom="paragraph">
+                  <wp:posOffset>4839335</wp:posOffset>
+                </wp:positionV>
+                <wp:extent cx="88265" cy="81285"/>
+                <wp:effectExtent l="57150" t="57150" r="45085" b="52070"/>
+                <wp:wrapNone/>
+                <wp:docPr id="1891362254" name="Ink 71"/>
+                <wp:cNvGraphicFramePr/>
+                <a:graphic xmlns:a="http://schemas.openxmlformats.org/drawingml/2006/main">
+                  <a:graphicData uri="http://schemas.microsoft.com/office/word/2010/wordprocessingInk">
+                    <w14:contentPart bwMode="auto" r:id="rId80">
+                      <w14:nvContentPartPr>
+                        <w14:cNvContentPartPr/>
+                      </w14:nvContentPartPr>
+                      <w14:xfrm>
+                        <a:off x="0" y="0"/>
+                        <a:ext cx="88265" cy="81285"/>
+                      </w14:xfrm>
+                    </w14:contentPart>
+                  </a:graphicData>
+                </a:graphic>
+              </wp:anchor>
+            </w:drawing>
+          </mc:Choice>
+          <mc:Fallback>
+            <w:pict>
+              <v:shape w14:anchorId="663DCAA9" id="Ink 71" o:spid="_x0000_s1026" type="#_x0000_t75" style="position:absolute;margin-left:245.5pt;margin-top:380.35pt;width:8.35pt;height:7.8pt;z-index:251712512;visibility:visible;mso-wrap-style:square;mso-wrap-distance-left:9pt;mso-wrap-distance-top:0;mso-wrap-distance-right:9pt;mso-wrap-distance-bottom:0;mso-position-horizontal:absolute;mso-position-horizontal-relative:text;mso-position-vertical:absolute;mso-position-vertical-relative:text" o:gfxdata="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">
+                <v:imagedata r:id="rId81" o:title=""/>
+              </v:shape>
+            </w:pict>
+          </mc:Fallback>
+        </mc:AlternateContent>
+      </w:r>
+      <w:r>
+        <w:rPr>
+          <w:noProof/>
+          <w:sz w:val="2"/>
+          <w:szCs w:val="2"/>
+        </w:rPr>
+        <mc:AlternateContent>
+          <mc:Choice Requires="wpi">
+            <w:drawing>
+              <wp:anchor distT="0" distB="0" distL="114300" distR="114300" simplePos="0" relativeHeight="251709440" behindDoc="0" locked="0" layoutInCell="1" allowOverlap="1" wp14:anchorId="01518D4B" wp14:editId="0A2C650F">
+                <wp:simplePos x="0" y="0"/>
+                <wp:positionH relativeFrom="column">
+                  <wp:posOffset>2950215</wp:posOffset>
+                </wp:positionH>
+                <wp:positionV relativeFrom="paragraph">
+                  <wp:posOffset>4046128</wp:posOffset>
+                </wp:positionV>
+                <wp:extent cx="238680" cy="852120"/>
+                <wp:effectExtent l="57150" t="57150" r="47625" b="43815"/>
+                <wp:wrapNone/>
+                <wp:docPr id="2073773641" name="Ink 68"/>
+                <wp:cNvGraphicFramePr/>
+                <a:graphic xmlns:a="http://schemas.openxmlformats.org/drawingml/2006/main">
+                  <a:graphicData uri="http://schemas.microsoft.com/office/word/2010/wordprocessingInk">
+                    <w14:contentPart bwMode="auto" r:id="rId82">
+                      <w14:nvContentPartPr>
+                        <w14:cNvContentPartPr/>
+                      </w14:nvContentPartPr>
+                      <w14:xfrm>
+                        <a:off x="0" y="0"/>
+                        <a:ext cx="238680" cy="852120"/>
+                      </w14:xfrm>
+                    </w14:contentPart>
+                  </a:graphicData>
+                </a:graphic>
+              </wp:anchor>
+            </w:drawing>
+          </mc:Choice>
+          <mc:Fallback>
+            <w:pict>
+              <v:shape w14:anchorId="6728EE34" id="Ink 68" o:spid="_x0000_s1026" type="#_x0000_t75" style="position:absolute;margin-left:231.6pt;margin-top:317.9pt;width:20.25pt;height:68.55pt;z-index:251709440;visibility:visible;mso-wrap-style:square;mso-wrap-distance-left:9pt;mso-wrap-distance-top:0;mso-wrap-distance-right:9pt;mso-wrap-distance-bottom:0;mso-position-horizontal:absolute;mso-position-horizontal-relative:text;mso-position-vertical:absolute;mso-position-vertical-relative:text" o:gfxdata="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">
+                <v:imagedata r:id="rId83" o:title=""/>
+              </v:shape>
+            </w:pict>
+          </mc:Fallback>
+        </mc:AlternateContent>
+      </w:r>
+      <w:r>
+        <w:rPr>
+          <w:noProof/>
+          <w:sz w:val="2"/>
+          <w:szCs w:val="2"/>
+        </w:rPr>
+        <mc:AlternateContent>
+          <mc:Choice Requires="wpi">
+            <w:drawing>
+              <wp:anchor distT="0" distB="0" distL="114300" distR="114300" simplePos="0" relativeHeight="251707392" behindDoc="0" locked="0" layoutInCell="1" allowOverlap="1" wp14:anchorId="7D77E142" wp14:editId="3CB5216D">
+                <wp:simplePos x="0" y="0"/>
+                <wp:positionH relativeFrom="column">
+                  <wp:posOffset>2477135</wp:posOffset>
+                </wp:positionH>
+                <wp:positionV relativeFrom="paragraph">
+                  <wp:posOffset>4044315</wp:posOffset>
+                </wp:positionV>
+                <wp:extent cx="509270" cy="635"/>
+                <wp:effectExtent l="57150" t="57150" r="43180" b="56515"/>
+                <wp:wrapNone/>
+                <wp:docPr id="153593819" name="Ink 66"/>
+                <wp:cNvGraphicFramePr/>
+                <a:graphic xmlns:a="http://schemas.openxmlformats.org/drawingml/2006/main">
+                  <a:graphicData uri="http://schemas.microsoft.com/office/word/2010/wordprocessingInk">
+                    <w14:contentPart bwMode="auto" r:id="rId84">
+                      <w14:nvContentPartPr>
+                        <w14:cNvContentPartPr/>
+                      </w14:nvContentPartPr>
+                      <w14:xfrm>
+                        <a:off x="0" y="0"/>
+                        <a:ext cx="509270" cy="635"/>
+                      </w14:xfrm>
+                    </w14:contentPart>
+                  </a:graphicData>
+                </a:graphic>
+                <wp14:sizeRelH relativeFrom="margin">
+                  <wp14:pctWidth>0</wp14:pctWidth>
+                </wp14:sizeRelH>
+                <wp14:sizeRelV relativeFrom="margin">
+                  <wp14:pctHeight>0</wp14:pctHeight>
+                </wp14:sizeRelV>
+              </wp:anchor>
+            </w:drawing>
+          </mc:Choice>
+          <mc:Fallback>
+            <w:pict>
+              <v:shape w14:anchorId="00AD5985" id="Ink 66" o:spid="_x0000_s1026" type="#_x0000_t75" style="position:absolute;margin-left:194.35pt;margin-top:317.2pt;width:41.5pt;height:2.5pt;z-index:251707392;visibility:visible;mso-wrap-style:square;mso-width-percent:0;mso-height-percent:0;mso-wrap-distance-left:9pt;mso-wrap-distance-top:0;mso-wrap-distance-right:9pt;mso-wrap-distance-bottom:0;mso-position-horizontal:absolute;mso-position-horizontal-relative:text;mso-position-vertical:absolute;mso-position-vertical-relative:text;mso-width-percent:0;mso-height-percent:0;mso-width-relative:margin;mso-height-relative:margin" o:gfxdata="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">
+                <v:imagedata r:id="rId85" o:title=""/>
+              </v:shape>
+            </w:pict>
+          </mc:Fallback>
+        </mc:AlternateContent>
+      </w:r>
+      <w:r>
+        <w:rPr>
+          <w:noProof/>
+          <w:sz w:val="2"/>
+          <w:szCs w:val="2"/>
+        </w:rPr>
+        <mc:AlternateContent>
+          <mc:Choice Requires="wpi">
+            <w:drawing>
+              <wp:anchor distT="0" distB="0" distL="114300" distR="114300" simplePos="0" relativeHeight="251705344" behindDoc="0" locked="0" layoutInCell="1" allowOverlap="1" wp14:anchorId="7CA2560E" wp14:editId="7E4E763F">
+                <wp:simplePos x="0" y="0"/>
+                <wp:positionH relativeFrom="column">
+                  <wp:posOffset>2781935</wp:posOffset>
+                </wp:positionH>
+                <wp:positionV relativeFrom="paragraph">
+                  <wp:posOffset>3351530</wp:posOffset>
+                </wp:positionV>
+                <wp:extent cx="79375" cy="73230"/>
+                <wp:effectExtent l="57150" t="57150" r="53975" b="41275"/>
+                <wp:wrapNone/>
+                <wp:docPr id="196097794" name="Ink 64"/>
+                <wp:cNvGraphicFramePr/>
+                <a:graphic xmlns:a="http://schemas.openxmlformats.org/drawingml/2006/main">
+                  <a:graphicData uri="http://schemas.microsoft.com/office/word/2010/wordprocessingInk">
+                    <w14:contentPart bwMode="auto" r:id="rId86">
+                      <w14:nvContentPartPr>
+                        <w14:cNvContentPartPr/>
+                      </w14:nvContentPartPr>
+                      <w14:xfrm>
+                        <a:off x="0" y="0"/>
+                        <a:ext cx="79375" cy="73230"/>
+                      </w14:xfrm>
+                    </w14:contentPart>
+                  </a:graphicData>
+                </a:graphic>
+              </wp:anchor>
+            </w:drawing>
+          </mc:Choice>
+          <mc:Fallback>
+            <w:pict>
+              <v:shape w14:anchorId="1B13C1F8" id="Ink 64" o:spid="_x0000_s1026" type="#_x0000_t75" style="position:absolute;margin-left:218.35pt;margin-top:263.2pt;width:7.65pt;height:7.15pt;z-index:251705344;visibility:visible;mso-wrap-style:square;mso-wrap-distance-left:9pt;mso-wrap-distance-top:0;mso-wrap-distance-right:9pt;mso-wrap-distance-bottom:0;mso-position-horizontal:absolute;mso-position-horizontal-relative:text;mso-position-vertical:absolute;mso-position-vertical-relative:text" o:gfxdata="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">
+                <v:imagedata r:id="rId87" o:title=""/>
+              </v:shape>
+            </w:pict>
+          </mc:Fallback>
+        </mc:AlternateContent>
+      </w:r>
+      <w:r>
+        <w:rPr>
+          <w:noProof/>
+          <w:sz w:val="2"/>
+          <w:szCs w:val="2"/>
+        </w:rPr>
+        <mc:AlternateContent>
+          <mc:Choice Requires="wpi">
+            <w:drawing>
+              <wp:anchor distT="0" distB="0" distL="114300" distR="114300" simplePos="0" relativeHeight="251702272" behindDoc="0" locked="0" layoutInCell="1" allowOverlap="1" wp14:anchorId="7B0B56B8" wp14:editId="7837F4AC">
+                <wp:simplePos x="0" y="0"/>
+                <wp:positionH relativeFrom="column">
+                  <wp:posOffset>2547375</wp:posOffset>
+                </wp:positionH>
+                <wp:positionV relativeFrom="paragraph">
+                  <wp:posOffset>2783953</wp:posOffset>
+                </wp:positionV>
+                <wp:extent cx="287280" cy="628920"/>
+                <wp:effectExtent l="57150" t="57150" r="55880" b="57150"/>
+                <wp:wrapNone/>
+                <wp:docPr id="968151527" name="Ink 61"/>
+                <wp:cNvGraphicFramePr/>
+                <a:graphic xmlns:a="http://schemas.openxmlformats.org/drawingml/2006/main">
+                  <a:graphicData uri="http://schemas.microsoft.com/office/word/2010/wordprocessingInk">
+                    <w14:contentPart bwMode="auto" r:id="rId88">
+                      <w14:nvContentPartPr>
+                        <w14:cNvContentPartPr/>
+                      </w14:nvContentPartPr>
+                      <w14:xfrm>
+                        <a:off x="0" y="0"/>
+                        <a:ext cx="287280" cy="628920"/>
+                      </w14:xfrm>
+                    </w14:contentPart>
+                  </a:graphicData>
+                </a:graphic>
+              </wp:anchor>
+            </w:drawing>
+          </mc:Choice>
+          <mc:Fallback>
+            <w:pict>
+              <v:shape w14:anchorId="1DBF639F" id="Ink 61" o:spid="_x0000_s1026" type="#_x0000_t75" style="position:absolute;margin-left:199.9pt;margin-top:218.5pt;width:24pt;height:50.9pt;z-index:251702272;visibility:visible;mso-wrap-style:square;mso-wrap-distance-left:9pt;mso-wrap-distance-top:0;mso-wrap-distance-right:9pt;mso-wrap-distance-bottom:0;mso-position-horizontal:absolute;mso-position-horizontal-relative:text;mso-position-vertical:absolute;mso-position-vertical-relative:text" o:gfxdata="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">
+                <v:imagedata r:id="rId89" o:title=""/>
+              </v:shape>
+            </w:pict>
+          </mc:Fallback>
+        </mc:AlternateContent>
+      </w:r>
+      <w:r>
+        <w:rPr>
+          <w:noProof/>
+          <w:sz w:val="2"/>
+          <w:szCs w:val="2"/>
+        </w:rPr>
+        <mc:AlternateContent>
+          <mc:Choice Requires="wpi">
+            <w:drawing>
+              <wp:anchor distT="0" distB="0" distL="114300" distR="114300" simplePos="0" relativeHeight="251700224" behindDoc="0" locked="0" layoutInCell="1" allowOverlap="1" wp14:anchorId="710D6EBA" wp14:editId="2A03E42A">
+                <wp:simplePos x="0" y="0"/>
+                <wp:positionH relativeFrom="column">
+                  <wp:posOffset>1869440</wp:posOffset>
+                </wp:positionH>
+                <wp:positionV relativeFrom="paragraph">
+                  <wp:posOffset>3344545</wp:posOffset>
+                </wp:positionV>
+                <wp:extent cx="73685" cy="57150"/>
+                <wp:effectExtent l="57150" t="57150" r="2540" b="57150"/>
+                <wp:wrapNone/>
+                <wp:docPr id="104526208" name="Ink 59"/>
+                <wp:cNvGraphicFramePr/>
+                <a:graphic xmlns:a="http://schemas.openxmlformats.org/drawingml/2006/main">
+                  <a:graphicData uri="http://schemas.microsoft.com/office/word/2010/wordprocessingInk">
+                    <w14:contentPart bwMode="auto" r:id="rId90">
+                      <w14:nvContentPartPr>
+                        <w14:cNvContentPartPr/>
+                      </w14:nvContentPartPr>
+                      <w14:xfrm>
+                        <a:off x="0" y="0"/>
+                        <a:ext cx="73685" cy="57150"/>
+                      </w14:xfrm>
+                    </w14:contentPart>
+                  </a:graphicData>
+                </a:graphic>
+              </wp:anchor>
+            </w:drawing>
+          </mc:Choice>
+          <mc:Fallback>
+            <w:pict>
+              <v:shape w14:anchorId="7D8928FC" id="Ink 59" o:spid="_x0000_s1026" type="#_x0000_t75" style="position:absolute;margin-left:146.5pt;margin-top:262.65pt;width:7.2pt;height:5.9pt;z-index:251700224;visibility:visible;mso-wrap-style:square;mso-wrap-distance-left:9pt;mso-wrap-distance-top:0;mso-wrap-distance-right:9pt;mso-wrap-distance-bottom:0;mso-position-horizontal:absolute;mso-position-horizontal-relative:text;mso-position-vertical:absolute;mso-position-vertical-relative:text" o:gfxdata="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">
+                <v:imagedata r:id="rId91" o:title=""/>
+              </v:shape>
+            </w:pict>
+          </mc:Fallback>
+        </mc:AlternateContent>
+      </w:r>
+      <w:r>
+        <w:rPr>
+          <w:noProof/>
+          <w:sz w:val="2"/>
+          <w:szCs w:val="2"/>
+        </w:rPr>
+        <mc:AlternateContent>
+          <mc:Choice Requires="wpi">
+            <w:drawing>
+              <wp:anchor distT="0" distB="0" distL="114300" distR="114300" simplePos="0" relativeHeight="251697152" behindDoc="0" locked="0" layoutInCell="1" allowOverlap="1" wp14:anchorId="4F23F5A7" wp14:editId="3BB6D526">
+                <wp:simplePos x="0" y="0"/>
+                <wp:positionH relativeFrom="column">
+                  <wp:posOffset>1886415</wp:posOffset>
+                </wp:positionH>
+                <wp:positionV relativeFrom="paragraph">
+                  <wp:posOffset>2785753</wp:posOffset>
+                </wp:positionV>
+                <wp:extent cx="253080" cy="616680"/>
+                <wp:effectExtent l="57150" t="57150" r="52070" b="50165"/>
+                <wp:wrapNone/>
+                <wp:docPr id="1638840251" name="Ink 56"/>
+                <wp:cNvGraphicFramePr/>
+                <a:graphic xmlns:a="http://schemas.openxmlformats.org/drawingml/2006/main">
+                  <a:graphicData uri="http://schemas.microsoft.com/office/word/2010/wordprocessingInk">
+                    <w14:contentPart bwMode="auto" r:id="rId92">
+                      <w14:nvContentPartPr>
+                        <w14:cNvContentPartPr/>
+                      </w14:nvContentPartPr>
+                      <w14:xfrm>
+                        <a:off x="0" y="0"/>
+                        <a:ext cx="253080" cy="616680"/>
+                      </w14:xfrm>
+                    </w14:contentPart>
+                  </a:graphicData>
+                </a:graphic>
+              </wp:anchor>
+            </w:drawing>
+          </mc:Choice>
+          <mc:Fallback>
+            <w:pict>
+              <v:shape w14:anchorId="1CF0F707" id="Ink 56" o:spid="_x0000_s1026" type="#_x0000_t75" style="position:absolute;margin-left:147.85pt;margin-top:218.65pt;width:21.35pt;height:49.95pt;z-index:251697152;visibility:visible;mso-wrap-style:square;mso-wrap-distance-left:9pt;mso-wrap-distance-top:0;mso-wrap-distance-right:9pt;mso-wrap-distance-bottom:0;mso-position-horizontal:absolute;mso-position-horizontal-relative:text;mso-position-vertical:absolute;mso-position-vertical-relative:text" o:gfxdata="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">
+                <v:imagedata r:id="rId93" o:title=""/>
+              </v:shape>
+            </w:pict>
+          </mc:Fallback>
+        </mc:AlternateContent>
+      </w:r>
+      <w:r>
+        <w:rPr>
+          <w:noProof/>
+          <w:sz w:val="2"/>
+          <w:szCs w:val="2"/>
+        </w:rPr>
+        <mc:AlternateContent>
+          <mc:Choice Requires="wpi">
+            <w:drawing>
+              <wp:anchor distT="0" distB="0" distL="114300" distR="114300" simplePos="0" relativeHeight="251695104" behindDoc="0" locked="0" layoutInCell="1" allowOverlap="1" wp14:anchorId="70F80907" wp14:editId="23344AD5">
+                <wp:simplePos x="0" y="0"/>
+                <wp:positionH relativeFrom="column">
+                  <wp:posOffset>3847465</wp:posOffset>
+                </wp:positionH>
+                <wp:positionV relativeFrom="paragraph">
+                  <wp:posOffset>1718310</wp:posOffset>
+                </wp:positionV>
+                <wp:extent cx="55245" cy="62360"/>
+                <wp:effectExtent l="38100" t="38100" r="40005" b="33020"/>
+                <wp:wrapNone/>
+                <wp:docPr id="297437108" name="Ink 54"/>
+                <wp:cNvGraphicFramePr/>
+                <a:graphic xmlns:a="http://schemas.openxmlformats.org/drawingml/2006/main">
+                  <a:graphicData uri="http://schemas.microsoft.com/office/word/2010/wordprocessingInk">
+                    <w14:contentPart bwMode="auto" r:id="rId94">
+                      <w14:nvContentPartPr>
+                        <w14:cNvContentPartPr/>
+                      </w14:nvContentPartPr>
+                      <w14:xfrm>
+                        <a:off x="0" y="0"/>
+                        <a:ext cx="55245" cy="62360"/>
+                      </w14:xfrm>
+                    </w14:contentPart>
+                  </a:graphicData>
+                </a:graphic>
+              </wp:anchor>
+            </w:drawing>
+          </mc:Choice>
+          <mc:Fallback>
+            <w:pict>
+              <v:shape w14:anchorId="51867072" id="Ink 54" o:spid="_x0000_s1026" type="#_x0000_t75" style="position:absolute;margin-left:302.6pt;margin-top:134.95pt;width:5pt;height:5.6pt;z-index:251695104;visibility:visible;mso-wrap-style:square;mso-wrap-distance-left:9pt;mso-wrap-distance-top:0;mso-wrap-distance-right:9pt;mso-wrap-distance-bottom:0;mso-position-horizontal:absolute;mso-position-horizontal-relative:text;mso-position-vertical:absolute;mso-position-vertical-relative:text" o:gfxdata="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">
+                <v:imagedata r:id="rId95" o:title=""/>
+              </v:shape>
+            </w:pict>
+          </mc:Fallback>
+        </mc:AlternateContent>
+      </w:r>
+      <w:r>
+        <w:rPr>
+          <w:noProof/>
+          <w:sz w:val="2"/>
+          <w:szCs w:val="2"/>
+        </w:rPr>
+        <mc:AlternateContent>
+          <mc:Choice Requires="wpi">
+            <w:drawing>
+              <wp:anchor distT="0" distB="0" distL="114300" distR="114300" simplePos="0" relativeHeight="251692032" behindDoc="0" locked="0" layoutInCell="1" allowOverlap="1" wp14:anchorId="410458AD" wp14:editId="2A75FA20">
+                <wp:simplePos x="0" y="0"/>
+                <wp:positionH relativeFrom="column">
+                  <wp:posOffset>3094990</wp:posOffset>
+                </wp:positionH>
+                <wp:positionV relativeFrom="paragraph">
+                  <wp:posOffset>1265555</wp:posOffset>
+                </wp:positionV>
+                <wp:extent cx="803910" cy="511175"/>
+                <wp:effectExtent l="38100" t="38100" r="34290" b="41275"/>
+                <wp:wrapNone/>
+                <wp:docPr id="113690202" name="Ink 51"/>
+                <wp:cNvGraphicFramePr/>
+                <a:graphic xmlns:a="http://schemas.openxmlformats.org/drawingml/2006/main">
+                  <a:graphicData uri="http://schemas.microsoft.com/office/word/2010/wordprocessingInk">
+                    <w14:contentPart bwMode="auto" r:id="rId96">
+                      <w14:nvContentPartPr>
+                        <w14:cNvContentPartPr/>
+                      </w14:nvContentPartPr>
+                      <w14:xfrm>
+                        <a:off x="0" y="0"/>
+                        <a:ext cx="803910" cy="511175"/>
+                      </w14:xfrm>
+                    </w14:contentPart>
+                  </a:graphicData>
+                </a:graphic>
+                <wp14:sizeRelH relativeFrom="margin">
+                  <wp14:pctWidth>0</wp14:pctWidth>
+                </wp14:sizeRelH>
+                <wp14:sizeRelV relativeFrom="margin">
+                  <wp14:pctHeight>0</wp14:pctHeight>
+                </wp14:sizeRelV>
+              </wp:anchor>
+            </w:drawing>
+          </mc:Choice>
+          <mc:Fallback>
+            <w:pict>
+              <v:shape w14:anchorId="21BABBEF" id="Ink 51" o:spid="_x0000_s1026" type="#_x0000_t75" style="position:absolute;margin-left:243.35pt;margin-top:99.3pt;width:64pt;height:40.95pt;z-index:251692032;visibility:visible;mso-wrap-style:square;mso-width-percent:0;mso-height-percent:0;mso-wrap-distance-left:9pt;mso-wrap-distance-top:0;mso-wrap-distance-right:9pt;mso-wrap-distance-bottom:0;mso-position-horizontal:absolute;mso-position-horizontal-relative:text;mso-position-vertical:absolute;mso-position-vertical-relative:text;mso-width-percent:0;mso-height-percent:0;mso-width-relative:margin;mso-height-relative:margin" o:gfxdata="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">
+                <v:imagedata r:id="rId97" o:title=""/>
+              </v:shape>
+            </w:pict>
+          </mc:Fallback>
+        </mc:AlternateContent>
+      </w:r>
+      <w:r>
+        <w:rPr>
+          <w:noProof/>
+          <w:sz w:val="2"/>
+          <w:szCs w:val="2"/>
+        </w:rPr>
+        <mc:AlternateContent>
+          <mc:Choice Requires="wpi">
+            <w:drawing>
+              <wp:anchor distT="0" distB="0" distL="114300" distR="114300" simplePos="0" relativeHeight="251689984" behindDoc="0" locked="0" layoutInCell="1" allowOverlap="1" wp14:anchorId="006FCF07" wp14:editId="17F0408C">
+                <wp:simplePos x="0" y="0"/>
+                <wp:positionH relativeFrom="column">
+                  <wp:posOffset>3606800</wp:posOffset>
+                </wp:positionH>
+                <wp:positionV relativeFrom="paragraph">
+                  <wp:posOffset>2000885</wp:posOffset>
+                </wp:positionV>
+                <wp:extent cx="273685" cy="1398495"/>
+                <wp:effectExtent l="38100" t="38100" r="31115" b="30480"/>
+                <wp:wrapNone/>
+                <wp:docPr id="1660637318" name="Ink 49"/>
+                <wp:cNvGraphicFramePr/>
+                <a:graphic xmlns:a="http://schemas.openxmlformats.org/drawingml/2006/main">
+                  <a:graphicData uri="http://schemas.microsoft.com/office/word/2010/wordprocessingInk">
+                    <w14:contentPart bwMode="auto" r:id="rId98">
+                      <w14:nvContentPartPr>
+                        <w14:cNvContentPartPr/>
+                      </w14:nvContentPartPr>
+                      <w14:xfrm>
+                        <a:off x="0" y="0"/>
+                        <a:ext cx="273685" cy="1398495"/>
+                      </w14:xfrm>
+                    </w14:contentPart>
+                  </a:graphicData>
+                </a:graphic>
+              </wp:anchor>
+            </w:drawing>
+          </mc:Choice>
+          <mc:Fallback>
+            <w:pict>
+              <v:shape w14:anchorId="1C80CDA6" id="Ink 49" o:spid="_x0000_s1026" type="#_x0000_t75" style="position:absolute;margin-left:283.65pt;margin-top:157.2pt;width:22.25pt;height:110.8pt;z-index:251689984;visibility:visible;mso-wrap-style:square;mso-wrap-distance-left:9pt;mso-wrap-distance-top:0;mso-wrap-distance-right:9pt;mso-wrap-distance-bottom:0;mso-position-horizontal:absolute;mso-position-horizontal-relative:text;mso-position-vertical:absolute;mso-position-vertical-relative:text" o:gfxdata="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">
+                <v:imagedata r:id="rId99" o:title=""/>
+              </v:shape>
+            </w:pict>
+          </mc:Fallback>
+        </mc:AlternateContent>
+      </w:r>
+      <w:r>
+        <w:rPr>
+          <w:noProof/>
+          <w:sz w:val="2"/>
+          <w:szCs w:val="2"/>
+        </w:rPr>
+        <mc:AlternateContent>
+          <mc:Choice Requires="wpi">
+            <w:drawing>
+              <wp:anchor distT="0" distB="0" distL="114300" distR="114300" simplePos="0" relativeHeight="251679744" behindDoc="0" locked="0" layoutInCell="1" allowOverlap="1" wp14:anchorId="627AD121" wp14:editId="37AEAFB9">
+                <wp:simplePos x="0" y="0"/>
+                <wp:positionH relativeFrom="column">
+                  <wp:posOffset>804255</wp:posOffset>
+                </wp:positionH>
+                <wp:positionV relativeFrom="paragraph">
+                  <wp:posOffset>1825768</wp:posOffset>
+                </wp:positionV>
+                <wp:extent cx="68400" cy="16200"/>
+                <wp:effectExtent l="38100" t="38100" r="46355" b="41275"/>
+                <wp:wrapNone/>
+                <wp:docPr id="915622223" name="Ink 33"/>
+                <wp:cNvGraphicFramePr/>
+                <a:graphic xmlns:a="http://schemas.openxmlformats.org/drawingml/2006/main">
+                  <a:graphicData uri="http://schemas.microsoft.com/office/word/2010/wordprocessingInk">
+                    <w14:contentPart bwMode="auto" r:id="rId100">
+                      <w14:nvContentPartPr>
+                        <w14:cNvContentPartPr/>
+                      </w14:nvContentPartPr>
+                      <w14:xfrm>
+                        <a:off x="0" y="0"/>
+                        <a:ext cx="68400" cy="16200"/>
+                      </w14:xfrm>
+                    </w14:contentPart>
+                  </a:graphicData>
+                </a:graphic>
+              </wp:anchor>
+            </w:drawing>
+          </mc:Choice>
+          <mc:Fallback>
+            <w:pict>
+              <v:shape w14:anchorId="7B5EAC46" id="Ink 33" o:spid="_x0000_s1026" type="#_x0000_t75" style="position:absolute;margin-left:62.85pt;margin-top:143.25pt;width:6.4pt;height:2.3pt;z-index:251679744;visibility:visible;mso-wrap-style:square;mso-wrap-distance-left:9pt;mso-wrap-distance-top:0;mso-wrap-distance-right:9pt;mso-wrap-distance-bottom:0;mso-position-horizontal:absolute;mso-position-horizontal-relative:text;mso-position-vertical:absolute;mso-position-vertical-relative:text" o:gfxdata="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">
+                <v:imagedata r:id="rId101" o:title=""/>
+              </v:shape>
+            </w:pict>
+          </mc:Fallback>
+        </mc:AlternateContent>
+      </w:r>
+      <w:r>
+        <w:rPr>
+          <w:noProof/>
+          <w:sz w:val="2"/>
+          <w:szCs w:val="2"/>
+        </w:rPr>
+        <mc:AlternateContent>
+          <mc:Choice Requires="wpi">
+            <w:drawing>
+              <wp:anchor distT="0" distB="0" distL="114300" distR="114300" simplePos="0" relativeHeight="251678720" behindDoc="0" locked="0" layoutInCell="1" allowOverlap="1" wp14:anchorId="4F4881FB" wp14:editId="2B010E2C">
+                <wp:simplePos x="0" y="0"/>
+                <wp:positionH relativeFrom="column">
+                  <wp:posOffset>798135</wp:posOffset>
+                </wp:positionH>
+                <wp:positionV relativeFrom="paragraph">
+                  <wp:posOffset>1758448</wp:posOffset>
+                </wp:positionV>
+                <wp:extent cx="32760" cy="72000"/>
+                <wp:effectExtent l="38100" t="38100" r="43815" b="42545"/>
+                <wp:wrapNone/>
+                <wp:docPr id="1511801882" name="Ink 30"/>
+                <wp:cNvGraphicFramePr/>
+                <a:graphic xmlns:a="http://schemas.openxmlformats.org/drawingml/2006/main">
+                  <a:graphicData uri="http://schemas.microsoft.com/office/word/2010/wordprocessingInk">
+                    <w14:contentPart bwMode="auto" r:id="rId102">
+                      <w14:nvContentPartPr>
+                        <w14:cNvContentPartPr/>
+                      </w14:nvContentPartPr>
+                      <w14:xfrm>
+                        <a:off x="0" y="0"/>
+                        <a:ext cx="32760" cy="72000"/>
+                      </w14:xfrm>
+                    </w14:contentPart>
+                  </a:graphicData>
+                </a:graphic>
+              </wp:anchor>
+            </w:drawing>
+          </mc:Choice>
+          <mc:Fallback>
+            <w:pict>
+              <v:shape w14:anchorId="0534282D" id="Ink 30" o:spid="_x0000_s1026" type="#_x0000_t75" style="position:absolute;margin-left:62.35pt;margin-top:137.95pt;width:3.6pt;height:6.65pt;z-index:251678720;visibility:visible;mso-wrap-style:square;mso-wrap-distance-left:9pt;mso-wrap-distance-top:0;mso-wrap-distance-right:9pt;mso-wrap-distance-bottom:0;mso-position-horizontal:absolute;mso-position-horizontal-relative:text;mso-position-vertical:absolute;mso-position-vertical-relative:text" o:gfxdata="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">
+                <v:imagedata r:id="rId103" o:title=""/>
+              </v:shape>
+            </w:pict>
+          </mc:Fallback>
+        </mc:AlternateContent>
+      </w:r>
+      <w:r>
+        <w:rPr>
+          <w:noProof/>
+          <w:sz w:val="2"/>
+          <w:szCs w:val="2"/>
+        </w:rPr>
+        <mc:AlternateContent>
+          <mc:Choice Requires="wpi">
+            <w:drawing>
+              <wp:anchor distT="0" distB="0" distL="114300" distR="114300" simplePos="0" relativeHeight="251677696" behindDoc="0" locked="0" layoutInCell="1" allowOverlap="1" wp14:anchorId="04EC728B" wp14:editId="013ACAAA">
+                <wp:simplePos x="0" y="0"/>
+                <wp:positionH relativeFrom="column">
+                  <wp:posOffset>2393655</wp:posOffset>
+                </wp:positionH>
+                <wp:positionV relativeFrom="paragraph">
+                  <wp:posOffset>1705528</wp:posOffset>
+                </wp:positionV>
+                <wp:extent cx="17280" cy="52200"/>
+                <wp:effectExtent l="57150" t="38100" r="40005" b="43180"/>
+                <wp:wrapNone/>
+                <wp:docPr id="1509492103" name="Ink 29"/>
+                <wp:cNvGraphicFramePr/>
+                <a:graphic xmlns:a="http://schemas.openxmlformats.org/drawingml/2006/main">
+                  <a:graphicData uri="http://schemas.microsoft.com/office/word/2010/wordprocessingInk">
+                    <w14:contentPart bwMode="auto" r:id="rId104">
+                      <w14:nvContentPartPr>
+                        <w14:cNvContentPartPr/>
+                      </w14:nvContentPartPr>
+                      <w14:xfrm>
+                        <a:off x="0" y="0"/>
+                        <a:ext cx="17280" cy="52200"/>
+                      </w14:xfrm>
+                    </w14:contentPart>
+                  </a:graphicData>
+                </a:graphic>
+              </wp:anchor>
+            </w:drawing>
+          </mc:Choice>
+          <mc:Fallback>
+            <w:pict>
+              <v:shape w14:anchorId="22CC9E48" id="Ink 29" o:spid="_x0000_s1026" type="#_x0000_t75" style="position:absolute;margin-left:187.8pt;margin-top:133.6pt;width:2.75pt;height:5.5pt;z-index:251677696;visibility:visible;mso-wrap-style:square;mso-wrap-distance-left:9pt;mso-wrap-distance-top:0;mso-wrap-distance-right:9pt;mso-wrap-distance-bottom:0;mso-position-horizontal:absolute;mso-position-horizontal-relative:text;mso-position-vertical:absolute;mso-position-vertical-relative:text" o:gfxdata="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">
+                <v:imagedata r:id="rId105" o:title=""/>
+              </v:shape>
+            </w:pict>
+          </mc:Fallback>
+        </mc:AlternateContent>
+      </w:r>
+      <w:r>
+        <w:rPr>
+          <w:noProof/>
+          <w:sz w:val="2"/>
+          <w:szCs w:val="2"/>
+        </w:rPr>
+        <mc:AlternateContent>
+          <mc:Choice Requires="wpi">
+            <w:drawing>
+              <wp:anchor distT="0" distB="0" distL="114300" distR="114300" simplePos="0" relativeHeight="251676672" behindDoc="0" locked="0" layoutInCell="1" allowOverlap="1" wp14:anchorId="15B12751" wp14:editId="52B797EA">
+                <wp:simplePos x="0" y="0"/>
+                <wp:positionH relativeFrom="column">
+                  <wp:posOffset>2414175</wp:posOffset>
+                </wp:positionH>
+                <wp:positionV relativeFrom="paragraph">
+                  <wp:posOffset>1729565</wp:posOffset>
+                </wp:positionV>
+                <wp:extent cx="61200" cy="42480"/>
+                <wp:effectExtent l="57150" t="57150" r="53340" b="53340"/>
+                <wp:wrapNone/>
+                <wp:docPr id="1245788181" name="Ink 26"/>
+                <wp:cNvGraphicFramePr/>
+                <a:graphic xmlns:a="http://schemas.openxmlformats.org/drawingml/2006/main">
+                  <a:graphicData uri="http://schemas.microsoft.com/office/word/2010/wordprocessingInk">
+                    <w14:contentPart bwMode="auto" r:id="rId106">
+                      <w14:nvContentPartPr>
+                        <w14:cNvContentPartPr/>
+                      </w14:nvContentPartPr>
+                      <w14:xfrm>
+                        <a:off x="0" y="0"/>
+                        <a:ext cx="61200" cy="42480"/>
+                      </w14:xfrm>
+                    </w14:contentPart>
+                  </a:graphicData>
+                </a:graphic>
+              </wp:anchor>
+            </w:drawing>
+          </mc:Choice>
+          <mc:Fallback>
+            <w:pict>
+              <v:shape w14:anchorId="21730EE6" id="Ink 26" o:spid="_x0000_s1026" type="#_x0000_t75" style="position:absolute;margin-left:189.4pt;margin-top:135.5pt;width:6.2pt;height:4.8pt;z-index:251676672;visibility:visible;mso-wrap-style:square;mso-wrap-distance-left:9pt;mso-wrap-distance-top:0;mso-wrap-distance-right:9pt;mso-wrap-distance-bottom:0;mso-position-horizontal:absolute;mso-position-horizontal-relative:text;mso-position-vertical:absolute;mso-position-vertical-relative:text" o:gfxdata="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">
+                <v:imagedata r:id="rId107" o:title=""/>
+              </v:shape>
+            </w:pict>
+          </mc:Fallback>
+        </mc:AlternateContent>
+      </w:r>
+      <w:r>
+        <w:rPr>
+          <w:noProof/>
+          <w:sz w:val="2"/>
+          <w:szCs w:val="2"/>
+        </w:rPr>
+        <mc:AlternateContent>
+          <mc:Choice Requires="wpi">
+            <w:drawing>
+              <wp:anchor distT="0" distB="0" distL="114300" distR="114300" simplePos="0" relativeHeight="251675648" behindDoc="0" locked="0" layoutInCell="1" allowOverlap="1" wp14:anchorId="50998FBA" wp14:editId="7A9E9D9A">
+                <wp:simplePos x="0" y="0"/>
+                <wp:positionH relativeFrom="column">
+                  <wp:posOffset>2416335</wp:posOffset>
+                </wp:positionH>
+                <wp:positionV relativeFrom="paragraph">
+                  <wp:posOffset>1291085</wp:posOffset>
+                </wp:positionV>
+                <wp:extent cx="130320" cy="470160"/>
+                <wp:effectExtent l="57150" t="57150" r="41275" b="44450"/>
+                <wp:wrapNone/>
+                <wp:docPr id="253072878" name="Ink 25"/>
+                <wp:cNvGraphicFramePr/>
+                <a:graphic xmlns:a="http://schemas.openxmlformats.org/drawingml/2006/main">
+                  <a:graphicData uri="http://schemas.microsoft.com/office/word/2010/wordprocessingInk">
+                    <w14:contentPart bwMode="auto" r:id="rId108">
+                      <w14:nvContentPartPr>
+                        <w14:cNvContentPartPr/>
+                      </w14:nvContentPartPr>
+                      <w14:xfrm>
+                        <a:off x="0" y="0"/>
+                        <a:ext cx="130320" cy="470160"/>
+                      </w14:xfrm>
+                    </w14:contentPart>
+                  </a:graphicData>
+                </a:graphic>
+              </wp:anchor>
+            </w:drawing>
+          </mc:Choice>
+          <mc:Fallback>
+            <w:pict>
+              <v:shape w14:anchorId="69A4D14E" id="Ink 25" o:spid="_x0000_s1026" type="#_x0000_t75" style="position:absolute;margin-left:189.55pt;margin-top:100.95pt;width:11.65pt;height:38.4pt;z-index:251675648;visibility:visible;mso-wrap-style:square;mso-wrap-distance-left:9pt;mso-wrap-distance-top:0;mso-wrap-distance-right:9pt;mso-wrap-distance-bottom:0;mso-position-horizontal:absolute;mso-position-horizontal-relative:text;mso-position-vertical:absolute;mso-position-vertical-relative:text" o:gfxdata="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">
+                <v:imagedata r:id="rId109" o:title=""/>
+              </v:shape>
+            </w:pict>
+          </mc:Fallback>
+        </mc:AlternateContent>
+      </w:r>
+      <w:r>
+        <w:rPr>
+          <w:noProof/>
+          <w:sz w:val="2"/>
+          <w:szCs w:val="2"/>
+        </w:rPr>
+        <mc:AlternateContent>
+          <mc:Choice Requires="wpi">
+            <w:drawing>
+              <wp:anchor distT="0" distB="0" distL="114300" distR="114300" simplePos="0" relativeHeight="251673600" behindDoc="0" locked="0" layoutInCell="1" allowOverlap="1" wp14:anchorId="31EA2950" wp14:editId="10C07F2E">
+                <wp:simplePos x="0" y="0"/>
+                <wp:positionH relativeFrom="column">
+                  <wp:posOffset>802815</wp:posOffset>
+                </wp:positionH>
+                <wp:positionV relativeFrom="paragraph">
+                  <wp:posOffset>1223045</wp:posOffset>
+                </wp:positionV>
+                <wp:extent cx="1524600" cy="601560"/>
+                <wp:effectExtent l="38100" t="38100" r="38100" b="46355"/>
+                <wp:wrapNone/>
+                <wp:docPr id="707666875" name="Ink 23"/>
+                <wp:cNvGraphicFramePr/>
+                <a:graphic xmlns:a="http://schemas.openxmlformats.org/drawingml/2006/main">
+                  <a:graphicData uri="http://schemas.microsoft.com/office/word/2010/wordprocessingInk">
+                    <w14:contentPart bwMode="auto" r:id="rId110">
+                      <w14:nvContentPartPr>
+                        <w14:cNvContentPartPr/>
+                      </w14:nvContentPartPr>
+                      <w14:xfrm>
+                        <a:off x="0" y="0"/>
+                        <a:ext cx="1524600" cy="601560"/>
+                      </w14:xfrm>
+                    </w14:contentPart>
+                  </a:graphicData>
+                </a:graphic>
+              </wp:anchor>
+            </w:drawing>
+          </mc:Choice>
+          <mc:Fallback>
+            <w:pict>
+              <v:shape w14:anchorId="295552E1" id="Ink 23" o:spid="_x0000_s1026" type="#_x0000_t75" style="position:absolute;margin-left:62.7pt;margin-top:95.8pt;width:121.05pt;height:48.35pt;z-index:251673600;visibility:visible;mso-wrap-style:square;mso-wrap-distance-left:9pt;mso-wrap-distance-top:0;mso-wrap-distance-right:9pt;mso-wrap-distance-bottom:0;mso-position-horizontal:absolute;mso-position-horizontal-relative:text;mso-position-vertical:absolute;mso-position-vertical-relative:text" o:gfxdata="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">
+                <v:imagedata r:id="rId111" o:title=""/>
+              </v:shape>
+            </w:pict>
+          </mc:Fallback>
+        </mc:AlternateContent>
+      </w:r>
+      <w:r>
+        <w:rPr>
+          <w:noProof/>
+          <w:sz w:val="2"/>
+          <w:szCs w:val="2"/>
+        </w:rPr>
+        <mc:AlternateContent>
+          <mc:Choice Requires="wpi">
+            <w:drawing>
+              <wp:anchor distT="0" distB="0" distL="114300" distR="114300" simplePos="0" relativeHeight="251671552" behindDoc="0" locked="0" layoutInCell="1" allowOverlap="1" wp14:anchorId="38AD7F75" wp14:editId="6B09A7D6">
+                <wp:simplePos x="0" y="0"/>
+                <wp:positionH relativeFrom="column">
+                  <wp:posOffset>3305175</wp:posOffset>
+                </wp:positionH>
+                <wp:positionV relativeFrom="paragraph">
+                  <wp:posOffset>543560</wp:posOffset>
+                </wp:positionV>
+                <wp:extent cx="26035" cy="64770"/>
+                <wp:effectExtent l="38100" t="38100" r="31115" b="49530"/>
+                <wp:wrapNone/>
+                <wp:docPr id="957696270" name="Ink 20"/>
+                <wp:cNvGraphicFramePr/>
+                <a:graphic xmlns:a="http://schemas.openxmlformats.org/drawingml/2006/main">
+                  <a:graphicData uri="http://schemas.microsoft.com/office/word/2010/wordprocessingInk">
+                    <w14:contentPart bwMode="auto" r:id="rId112">
+                      <w14:nvContentPartPr>
+                        <w14:cNvContentPartPr/>
+                      </w14:nvContentPartPr>
+                      <w14:xfrm>
+                        <a:off x="0" y="0"/>
+                        <a:ext cx="26035" cy="64770"/>
+                      </w14:xfrm>
+                    </w14:contentPart>
+                  </a:graphicData>
+                </a:graphic>
+              </wp:anchor>
+            </w:drawing>
+          </mc:Choice>
+          <mc:Fallback>
+            <w:pict>
+              <v:shape w14:anchorId="04FE3005" id="Ink 20" o:spid="_x0000_s1026" type="#_x0000_t75" style="position:absolute;margin-left:259.9pt;margin-top:42.45pt;width:2.75pt;height:5.8pt;z-index:251671552;visibility:visible;mso-wrap-style:square;mso-wrap-distance-left:9pt;mso-wrap-distance-top:0;mso-wrap-distance-right:9pt;mso-wrap-distance-bottom:0;mso-position-horizontal:absolute;mso-position-horizontal-relative:text;mso-position-vertical:absolute;mso-position-vertical-relative:text" o:gfxdata="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">
+                <v:imagedata r:id="rId113" o:title=""/>
+              </v:shape>
+            </w:pict>
+          </mc:Fallback>
+        </mc:AlternateContent>
+      </w:r>
+      <w:r>
+        <w:rPr>
+          <w:noProof/>
+          <w:sz w:val="2"/>
+          <w:szCs w:val="2"/>
+        </w:rPr>
+        <mc:AlternateContent>
+          <mc:Choice Requires="wpi">
+            <w:drawing>
+              <wp:anchor distT="0" distB="0" distL="114300" distR="114300" simplePos="0" relativeHeight="251668480" behindDoc="0" locked="0" layoutInCell="1" allowOverlap="1" wp14:anchorId="4825FFF0" wp14:editId="3ECE62B6">
+                <wp:simplePos x="0" y="0"/>
+                <wp:positionH relativeFrom="column">
+                  <wp:posOffset>3083997</wp:posOffset>
+                </wp:positionH>
+                <wp:positionV relativeFrom="paragraph">
+                  <wp:posOffset>575691</wp:posOffset>
+                </wp:positionV>
+                <wp:extent cx="248760" cy="1080"/>
+                <wp:effectExtent l="38100" t="38100" r="37465" b="37465"/>
+                <wp:wrapNone/>
+                <wp:docPr id="1832051485" name="Ink 17"/>
+                <wp:cNvGraphicFramePr/>
+                <a:graphic xmlns:a="http://schemas.openxmlformats.org/drawingml/2006/main">
+                  <a:graphicData uri="http://schemas.microsoft.com/office/word/2010/wordprocessingInk">
+                    <w14:contentPart bwMode="auto" r:id="rId114">
+                      <w14:nvContentPartPr>
+                        <w14:cNvContentPartPr/>
+                      </w14:nvContentPartPr>
+                      <w14:xfrm>
+                        <a:off x="0" y="0"/>
+                        <a:ext cx="248760" cy="1080"/>
+                      </w14:xfrm>
+                    </w14:contentPart>
+                  </a:graphicData>
+                </a:graphic>
+              </wp:anchor>
+            </w:drawing>
+          </mc:Choice>
+          <mc:Fallback>
+            <w:pict>
+              <v:shape w14:anchorId="46A7DF9E" id="Ink 17" o:spid="_x0000_s1026" type="#_x0000_t75" style="position:absolute;margin-left:242.5pt;margin-top:44.85pt;width:20.3pt;height:1.15pt;z-index:251668480;visibility:visible;mso-wrap-style:square;mso-wrap-distance-left:9pt;mso-wrap-distance-top:0;mso-wrap-distance-right:9pt;mso-wrap-distance-bottom:0;mso-position-horizontal:absolute;mso-position-horizontal-relative:text;mso-position-vertical:absolute;mso-position-vertical-relative:text" o:gfxdata="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">
+                <v:imagedata r:id="rId115" o:title=""/>
+              </v:shape>
+            </w:pict>
+          </mc:Fallback>
+        </mc:AlternateContent>
+      </w:r>
+      <w:r>
+        <w:rPr>
+          <w:noProof/>
+          <w:sz w:val="2"/>
+          <w:szCs w:val="2"/>
+        </w:rPr>
+        <mc:AlternateContent>
+          <mc:Choice Requires="wpi">
+            <w:drawing>
+              <wp:anchor distT="0" distB="0" distL="114300" distR="114300" simplePos="0" relativeHeight="251666432" behindDoc="0" locked="0" layoutInCell="1" allowOverlap="1" wp14:anchorId="0E56E972" wp14:editId="6EE4CE4C">
+                <wp:simplePos x="0" y="0"/>
+                <wp:positionH relativeFrom="column">
+                  <wp:posOffset>2969877</wp:posOffset>
+                </wp:positionH>
+                <wp:positionV relativeFrom="paragraph">
+                  <wp:posOffset>527451</wp:posOffset>
+                </wp:positionV>
+                <wp:extent cx="111960" cy="111960"/>
+                <wp:effectExtent l="38100" t="38100" r="21590" b="40640"/>
+                <wp:wrapNone/>
+                <wp:docPr id="828672341" name="Ink 14"/>
+                <wp:cNvGraphicFramePr/>
+                <a:graphic xmlns:a="http://schemas.openxmlformats.org/drawingml/2006/main">
+                  <a:graphicData uri="http://schemas.microsoft.com/office/word/2010/wordprocessingInk">
+                    <w14:contentPart bwMode="auto" r:id="rId116">
+                      <w14:nvContentPartPr>
+                        <w14:cNvContentPartPr/>
+                      </w14:nvContentPartPr>
+                      <w14:xfrm>
+                        <a:off x="0" y="0"/>
+                        <a:ext cx="111960" cy="111960"/>
+                      </w14:xfrm>
+                    </w14:contentPart>
+                  </a:graphicData>
+                </a:graphic>
+              </wp:anchor>
+            </w:drawing>
+          </mc:Choice>
+          <mc:Fallback>
+            <w:pict>
+              <v:shape w14:anchorId="08247038" id="Ink 14" o:spid="_x0000_s1026" type="#_x0000_t75" style="position:absolute;margin-left:233.5pt;margin-top:41.2pt;width:9.5pt;height:9.5pt;z-index:251666432;visibility:visible;mso-wrap-style:square;mso-wrap-distance-left:9pt;mso-wrap-distance-top:0;mso-wrap-distance-right:9pt;mso-wrap-distance-bottom:0;mso-position-horizontal:absolute;mso-position-horizontal-relative:text;mso-position-vertical:absolute;mso-position-vertical-relative:text" o:gfxdata="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">
+                <v:imagedata r:id="rId117" o:title=""/>
+              </v:shape>
+            </w:pict>
+          </mc:Fallback>
+        </mc:AlternateContent>
+      </w:r>
+      <w:r>
+        <w:rPr>
+          <w:sz w:val="2"/>
+          <w:szCs w:val="2"/>
+        </w:rPr>
+        <w:drawing>
+          <wp:anchor distT="0" distB="0" distL="114300" distR="114300" simplePos="0" relativeHeight="251664384" behindDoc="1" locked="0" layoutInCell="1" allowOverlap="1" wp14:anchorId="6AE512A9" wp14:editId="2A82B20D">
+            <wp:simplePos x="0" y="0"/>
+            <wp:positionH relativeFrom="column">
+              <wp:posOffset>3368313</wp:posOffset>
+            </wp:positionH>
+            <wp:positionV relativeFrom="paragraph">
+              <wp:posOffset>324760</wp:posOffset>
+            </wp:positionV>
+            <wp:extent cx="481924" cy="839894"/>
+            <wp:effectExtent l="0" t="0" r="0" b="0"/>
+            <wp:wrapNone/>
+            <wp:docPr id="1680797205" name="Picture 1" descr="A screenshot of a phone&#10;&#10;AI-generated content may be incorrect."/>
+            <wp:cNvGraphicFramePr>
+              <a:graphicFrameLocks xmlns:a="http://schemas.openxmlformats.org/drawingml/2006/main" noChangeAspect="1"/>
+            </wp:cNvGraphicFramePr>
+            <a:graphic xmlns:a="http://schemas.openxmlformats.org/drawingml/2006/main">
+              <a:graphicData uri="http://schemas.openxmlformats.org/drawingml/2006/picture">
+                <pic:pic xmlns:pic="http://schemas.openxmlformats.org/drawingml/2006/picture">
+                  <pic:nvPicPr>
+                    <pic:cNvPr id="1680797205" name="Picture 1" descr="A screenshot of a phone&#10;&#10;AI-generated content may be incorrect."/>
+                    <pic:cNvPicPr/>
+                  </pic:nvPicPr>
+                  <pic:blipFill>
+                    <a:blip r:embed="rId118" cstate="print">
+                      <a:extLst>
+                        <a:ext uri="{28A0092B-C50C-407E-A947-70E740481C1C}">
+                          <a14:useLocalDpi xmlns:a14="http://schemas.microsoft.com/office/drawing/2010/main" val="0"/>
+                        </a:ext>
+                      </a:extLst>
+                    </a:blip>
+                    <a:stretch>
+                      <a:fillRect/>
+                    </a:stretch>
+                  </pic:blipFill>
+                  <pic:spPr>
+                    <a:xfrm>
+                      <a:off x="0" y="0"/>
+                      <a:ext cx="481924" cy="839894"/>
+                    </a:xfrm>
+                    <a:prstGeom prst="rect">
+                      <a:avLst/>
+                    </a:prstGeom>
+                  </pic:spPr>
+                </pic:pic>
+              </a:graphicData>
+            </a:graphic>
+            <wp14:sizeRelH relativeFrom="margin">
+              <wp14:pctWidth>0</wp14:pctWidth>
+            </wp14:sizeRelH>
+            <wp14:sizeRelV relativeFrom="margin">
+              <wp14:pctHeight>0</wp14:pctHeight>
+            </wp14:sizeRelV>
+          </wp:anchor>
+        </w:drawing>
+      </w:r>
+      <w:r>
+        <w:rPr>
           <w:lang w:val="en-GB"/>
         </w:rPr>
         <w:br w:type="page"/>
@@ -4459,41 +6988,13 @@
           <w:color w:val="7F7F7F" w:themeColor="text1" w:themeTint="80"/>
           <w:lang w:val="en-GB"/>
         </w:rPr>
-        <w:t>(</w:t>
-      </w:r>
-      <w:r>
-        <w:rPr>
-          <w:color w:val="7F7F7F" w:themeColor="text1" w:themeTint="80"/>
-          <w:lang w:val="en-GB"/>
-        </w:rPr>
-        <w:t>forgive the repetition</w:t>
-      </w:r>
-      <w:r>
-        <w:rPr>
-          <w:color w:val="7F7F7F" w:themeColor="text1" w:themeTint="80"/>
-          <w:lang w:val="en-GB"/>
-        </w:rPr>
-        <w:t>)</w:t>
-      </w:r>
-      <w:r>
-        <w:rPr>
-          <w:lang w:val="en-GB"/>
-        </w:rPr>
-        <w:t xml:space="preserve"> </w:t>
-      </w:r>
-      <w:proofErr w:type="gramStart"/>
-      <w:r>
-        <w:rPr>
-          <w:lang w:val="en-GB"/>
-        </w:rPr>
-        <w:t>actually will</w:t>
-      </w:r>
-      <w:proofErr w:type="gramEnd"/>
-      <w:r>
-        <w:rPr>
-          <w:lang w:val="en-GB"/>
-        </w:rPr>
-        <w:t xml:space="preserve"> show a different dashboard:</w:t>
+        <w:t>(forgive the repetition)</w:t>
+      </w:r>
+      <w:r>
+        <w:rPr>
+          <w:lang w:val="en-GB"/>
+        </w:rPr>
+        <w:t xml:space="preserve"> actually will show a different dashboard:</w:t>
       </w:r>
     </w:p>
     <w:p>
@@ -4538,15 +7039,7 @@
           <w:u w:val="single"/>
           <w:lang w:val="en-GB"/>
         </w:rPr>
-        <w:t xml:space="preserve">change </w:t>
-      </w:r>
-      <w:proofErr w:type="gramStart"/>
-      <w:r>
-        <w:rPr>
-          <w:u w:val="single"/>
-          <w:lang w:val="en-GB"/>
-        </w:rPr>
-        <w:t>password</w:t>
+        <w:t>change password</w:t>
       </w:r>
       <w:r>
         <w:rPr>
@@ -4558,14 +7051,7 @@
         <w:rPr>
           <w:lang w:val="en-GB"/>
         </w:rPr>
-        <w:t>(</w:t>
-      </w:r>
-      <w:proofErr w:type="gramEnd"/>
-      <w:r>
-        <w:rPr>
-          <w:lang w:val="en-GB"/>
-        </w:rPr>
-        <w:t>this option is available for every user il the left circle handle</w:t>
+        <w:t>(this option is available for every user il the left circle handle</w:t>
       </w:r>
       <w:r>
         <w:rPr>
@@ -4628,27 +7114,13 @@
         <w:rPr>
           <w:lang w:val="en-GB"/>
         </w:rPr>
-        <w:t xml:space="preserve">whit specific </w:t>
-      </w:r>
-      <w:proofErr w:type="gramStart"/>
-      <w:r>
-        <w:rPr>
-          <w:lang w:val="en-GB"/>
-        </w:rPr>
-        <w:t>handle</w:t>
-      </w:r>
-      <w:r>
-        <w:rPr>
-          <w:lang w:val="en-GB"/>
-        </w:rPr>
-        <w:t>(</w:t>
-      </w:r>
-      <w:proofErr w:type="gramEnd"/>
-      <w:r>
-        <w:rPr>
-          <w:lang w:val="en-GB"/>
-        </w:rPr>
-        <w:t xml:space="preserve">this option is available for every user il the left circle handle, </w:t>
+        <w:t>whit specific handle</w:t>
+      </w:r>
+      <w:r>
+        <w:rPr>
+          <w:lang w:val="en-GB"/>
+        </w:rPr>
+        <w:t xml:space="preserve">(this option is available for every user il the left circle handle, </w:t>
       </w:r>
       <w:r>
         <w:rPr>
@@ -4801,21 +7273,7 @@
         <w:rPr>
           <w:lang w:val="en-GB"/>
         </w:rPr>
-        <w:t xml:space="preserve">Is possible to go in a </w:t>
-      </w:r>
-      <w:proofErr w:type="gramStart"/>
-      <w:r>
-        <w:rPr>
-          <w:lang w:val="en-GB"/>
-        </w:rPr>
-        <w:t>screen  dedicated</w:t>
-      </w:r>
-      <w:proofErr w:type="gramEnd"/>
-      <w:r>
-        <w:rPr>
-          <w:lang w:val="en-GB"/>
-        </w:rPr>
-        <w:t xml:space="preserve"> to the menu, that show what product there are in that</w:t>
+        <w:t>Is possible to go in a screen  dedicated to the menu, that show what product there are in that</w:t>
       </w:r>
     </w:p>
     <w:p>
@@ -4944,35 +7402,7 @@
           <w:color w:val="156082" w:themeColor="accent1"/>
           <w:lang w:val="en-GB"/>
         </w:rPr>
-        <w:t xml:space="preserve">(if there are more user “kitchen” they can divide work by category, and </w:t>
-      </w:r>
-      <w:r>
-        <w:rPr>
-          <w:color w:val="156082" w:themeColor="accent1"/>
-          <w:lang w:val="en-GB"/>
-        </w:rPr>
-        <w:t>each one</w:t>
-      </w:r>
-      <w:r>
-        <w:rPr>
-          <w:color w:val="156082" w:themeColor="accent1"/>
-          <w:lang w:val="en-GB"/>
-        </w:rPr>
-        <w:t xml:space="preserve"> can see </w:t>
-      </w:r>
-      <w:r>
-        <w:rPr>
-          <w:color w:val="156082" w:themeColor="accent1"/>
-          <w:lang w:val="en-GB"/>
-        </w:rPr>
-        <w:t>their own</w:t>
-      </w:r>
-      <w:r>
-        <w:rPr>
-          <w:color w:val="156082" w:themeColor="accent1"/>
-          <w:lang w:val="en-GB"/>
-        </w:rPr>
-        <w:t>)</w:t>
+        <w:t>(if there are more user “kitchen” they can divide work by category, and each one can see their own)</w:t>
       </w:r>
     </w:p>
     <w:p>
@@ -5027,21 +7457,7 @@
         <w:rPr>
           <w:lang w:val="en-GB"/>
         </w:rPr>
-        <w:t xml:space="preserve"> a screen dedicated to </w:t>
-      </w:r>
-      <w:proofErr w:type="gramStart"/>
-      <w:r>
-        <w:rPr>
-          <w:lang w:val="en-GB"/>
-        </w:rPr>
-        <w:t>configure</w:t>
-      </w:r>
-      <w:proofErr w:type="gramEnd"/>
-      <w:r>
-        <w:rPr>
-          <w:lang w:val="en-GB"/>
-        </w:rPr>
-        <w:t xml:space="preserve"> DB</w:t>
+        <w:t xml:space="preserve"> a screen dedicated to configure DB</w:t>
       </w:r>
     </w:p>
     <w:p>
@@ -5124,15 +7540,7 @@
       </w:pPr>
       <w:bookmarkStart w:id="21" w:name="_Toc219416021"/>
       <w:r>
-        <w:t xml:space="preserve">Activity </w:t>
-      </w:r>
-      <w:proofErr w:type="spellStart"/>
-      <w:r>
-        <w:t>diagram</w:t>
-      </w:r>
-      <w:proofErr w:type="spellEnd"/>
-      <w:r>
-        <w:t>:</w:t>
+        <w:t>Activity diagram:</w:t>
       </w:r>
       <w:bookmarkEnd w:id="21"/>
     </w:p>
@@ -5151,7 +7559,7 @@
       </w:pPr>
     </w:p>
     <w:sectPr>
-      <w:footerReference w:type="default" r:id="rId14"/>
+      <w:footerReference w:type="default" r:id="rId119"/>
       <w:pgSz w:w="11906" w:h="16838"/>
       <w:pgMar w:top="1417" w:right="1134" w:bottom="1134" w:left="1134" w:header="708" w:footer="708" w:gutter="0"/>
       <w:pgNumType w:start="0"/>
@@ -7587,6 +9995,7 @@
   <w:style w:type="character" w:default="1" w:styleId="DefaultParagraphFont">
     <w:name w:val="Default Paragraph Font"/>
     <w:uiPriority w:val="1"/>
+    <w:semiHidden/>
     <w:unhideWhenUsed/>
   </w:style>
   <w:style w:type="table" w:default="1" w:styleId="TableNormal">
@@ -8112,6 +10521,1618 @@
 </w:styles>
 </file>
 
+<file path=word/ink/ink1.xml><?xml version="1.0" encoding="utf-8"?>
+<inkml:ink xmlns:inkml="http://www.w3.org/2003/InkML">
+  <inkml:definitions>
+    <inkml:context xml:id="ctx0">
+      <inkml:inkSource xml:id="inkSrc0">
+        <inkml:traceFormat>
+          <inkml:channel name="X" type="integer" min="-2.14748E9" max="2.14748E9" units="cm"/>
+          <inkml:channel name="Y" type="integer" min="-2.14748E9" max="2.14748E9" units="cm"/>
+          <inkml:channel name="F" type="integer" max="32767" units="dev"/>
+          <inkml:channel name="OA" type="integer" max="360" units="deg"/>
+          <inkml:channel name="OE" type="integer" max="90" units="deg"/>
+        </inkml:traceFormat>
+        <inkml:channelProperties>
+          <inkml:channelProperty channel="X" name="resolution" value="1000" units="1/cm"/>
+          <inkml:channelProperty channel="Y" name="resolution" value="1000" units="1/cm"/>
+          <inkml:channelProperty channel="F" name="resolution" value="0" units="1/dev"/>
+          <inkml:channelProperty channel="OA" name="resolution" value="1000" units="1/deg"/>
+          <inkml:channelProperty channel="OE" name="resolution" value="1000" units="1/deg"/>
+        </inkml:channelProperties>
+      </inkml:inkSource>
+      <inkml:timestamp xml:id="ts0" timeString="2026-01-16T12:48:14.641"/>
+    </inkml:context>
+    <inkml:brush xml:id="br0">
+      <inkml:brushProperty name="width" value="0.05" units="cm"/>
+      <inkml:brushProperty name="height" value="0.05" units="cm"/>
+      <inkml:brushProperty name="color" value="#FFC114"/>
+    </inkml:brush>
+  </inkml:definitions>
+  <inkml:trace contextRef="#ctx0" brushRef="#br0">157 259 4801 0 0,'-18'3'11105'0'0,"-1"5"-4481"0"0,-18 19-2710 0 0,26-17-4059 0 0,1 1-1 0 0,0 0 1 0 0,0 0 0 0 0,-7 13 0 0 0,13-17 154 0 0,0-1 0 0 0,1 1 0 0 0,0 0 0 0 0,-4 13 0 0 0,6-18-2 0 0,1-1 0 0 0,-1 1 0 0 0,1 0 0 0 0,-1-1-1 0 0,1 1 1 0 0,0-1 0 0 0,0 1 0 0 0,0 0 0 0 0,0-1 0 0 0,0 1 0 0 0,0 0 0 0 0,0-1 0 0 0,0 1 0 0 0,1 0-1 0 0,-1-1 1 0 0,1 1 0 0 0,-1-1 0 0 0,1 1 0 0 0,0-1 0 0 0,-1 1 0 0 0,1-1 0 0 0,0 1 0 0 0,0-1-1 0 0,0 0 1 0 0,0 1 0 0 0,0-1 0 0 0,0 0 0 0 0,2 1 0 0 0,-1-1 5 0 0,0 0 1 0 0,0-1-1 0 0,-1 0 0 0 0,1 1 1 0 0,0-1-1 0 0,0 0 1 0 0,0 0-1 0 0,0 0 0 0 0,0 0 1 0 0,0 0-1 0 0,-1 0 1 0 0,1-1-1 0 0,0 1 0 0 0,3-2 1 0 0,32-11 275 0 0,-19 6-110 0 0,0 3-103 0 0,20-7 418 0 0,-37 10-604 0 0,1 0 0 0 0,0 1 0 0 0,-1-1 0 0 0,1 0 0 0 0,-1 0 0 0 0,1 0 0 0 0,-1 0-1 0 0,0 0 1 0 0,1-1 0 0 0,-1 1 0 0 0,0 0 0 0 0,0 0 0 0 0,0-1 0 0 0,1 1 0 0 0,-2-1 0 0 0,1 1 0 0 0,1-3 0 0 0</inkml:trace>
+  <inkml:trace contextRef="#ctx0" brushRef="#br0" timeOffset="649.78">270 1 6841 0 0,'-3'-1'12265'0'0,"-3"13"-8791"0"0,-4 16-2873 0 0,-9 45 159 0 0,-8 40-256 0 0,24-97-420 0 0,1 0 0 0 0,1 0 0 0 0,0 0-1 0 0,2 0 1 0 0,1 19 0 0 0,-1-32-65 0 0,-1 0 0 0 0,1 0 0 0 0,-1 0 0 0 0,1 1 0 0 0,0-1 0 0 0,0 0 0 0 0,1 0 0 0 0,-1-1 0 0 0,1 1 1 0 0,-1 0-1 0 0,1 0 0 0 0,0-1 0 0 0,0 1 0 0 0,0-1 0 0 0,0 0 0 0 0,0 1 0 0 0,1-1 0 0 0,3 2 0 0 0,-4-2 11 0 0,0-1 0 0 0,1 0 0 0 0,-1-1-1 0 0,1 1 1 0 0,-1 0 0 0 0,1-1 0 0 0,-1 1 0 0 0,1-1 0 0 0,-1 0-1 0 0,1 0 1 0 0,0 0 0 0 0,-1 0 0 0 0,1 0 0 0 0,-1 0 0 0 0,1-1-1 0 0,-1 1 1 0 0,1-1 0 0 0,-1 0 0 0 0,1 0 0 0 0,-1 0 0 0 0,0 0-1 0 0,5-2 1 0 0,14-13-2783 0 0,-6-5-8630 0 0,-11 12 4124 0 0</inkml:trace>
+</inkml:ink>
+</file>
+
+<file path=word/ink/ink10.xml><?xml version="1.0" encoding="utf-8"?>
+<inkml:ink xmlns:inkml="http://www.w3.org/2003/InkML">
+  <inkml:definitions>
+    <inkml:context xml:id="ctx0">
+      <inkml:inkSource xml:id="inkSrc0">
+        <inkml:traceFormat>
+          <inkml:channel name="X" type="integer" min="-2.14748E9" max="2.14748E9" units="cm"/>
+          <inkml:channel name="Y" type="integer" min="-2.14748E9" max="2.14748E9" units="cm"/>
+          <inkml:channel name="F" type="integer" max="32767" units="dev"/>
+          <inkml:channel name="OA" type="integer" max="360" units="deg"/>
+          <inkml:channel name="OE" type="integer" max="90" units="deg"/>
+        </inkml:traceFormat>
+        <inkml:channelProperties>
+          <inkml:channelProperty channel="X" name="resolution" value="1000" units="1/cm"/>
+          <inkml:channelProperty channel="Y" name="resolution" value="1000" units="1/cm"/>
+          <inkml:channelProperty channel="F" name="resolution" value="0" units="1/dev"/>
+          <inkml:channelProperty channel="OA" name="resolution" value="1000" units="1/deg"/>
+          <inkml:channelProperty channel="OE" name="resolution" value="1000" units="1/deg"/>
+        </inkml:channelProperties>
+      </inkml:inkSource>
+      <inkml:timestamp xml:id="ts0" timeString="2026-01-16T12:45:48.307"/>
+    </inkml:context>
+    <inkml:brush xml:id="br0">
+      <inkml:brushProperty name="width" value="0.035" units="cm"/>
+      <inkml:brushProperty name="height" value="0.035" units="cm"/>
+      <inkml:brushProperty name="color" value="#66CC00"/>
+    </inkml:brush>
+  </inkml:definitions>
+  <inkml:trace contextRef="#ctx0" brushRef="#br0">28 67 6665 0 0,'0'-12'7420'0'0,"1"7"-6704"0"0,0 0 1 0 0,1 0-1 0 0,0 0 1 0 0,0 0 0 0 0,0 1-1 0 0,1-1 1 0 0,5-8 0 0 0,8 5 853 0 0,-8 14-441 0 0,-5 24-328 0 0,-3-25-843 0 0,0 11 102 0 0,-1 0 0 0 0,-1 0 0 0 0,0 0 0 0 0,-7 22 0 0 0,6-29-39 0 0,0 0-1 0 0,0 0 1 0 0,-1-1-1 0 0,0 0 1 0 0,-1 1-1 0 0,1-2 1 0 0,-1 1-1 0 0,-1 0 1 0 0,-7 7-1 0 0,13-14-19 0 0,0-1 0 0 0,-1 0 0 0 0,1 0 0 0 0,0 1 0 0 0,0-1 0 0 0,0 0 0 0 0,0 0 0 0 0,-1 0 0 0 0,1 1 0 0 0,0-1 0 0 0,0 0 0 0 0,0 0 0 0 0,-1 0 0 0 0,1 1 0 0 0,0-1 0 0 0,0 0 0 0 0,-1 0 0 0 0,1 0 0 0 0,0 0 0 0 0,0 0 0 0 0,-1 0-1 0 0,1 0 1 0 0,0 1 0 0 0,-1-1 0 0 0,1 0 0 0 0,0 0 0 0 0,0 0 0 0 0,-1 0 0 0 0,1 0 0 0 0,0 0 0 0 0,-1 0 0 0 0,1-1 0 0 0,0 1 0 0 0,0 0 0 0 0,-1 0 0 0 0,1 0 0 0 0,0 0 0 0 0,-1 0 0 0 0,0-13-32 0 0,1 9 39 0 0,1 1 0 0 0,-1 0-1 0 0,1-1 1 0 0,0 1 0 0 0,0 0 0 0 0,0-1 0 0 0,3-3-1 0 0,-4 7-1 0 0,1-1-1 0 0,-1 1 0 0 0,1-1 0 0 0,-1 1 1 0 0,1-1-1 0 0,-1 1 0 0 0,1-1 0 0 0,0 1 1 0 0,-1 0-1 0 0,1 0 0 0 0,0-1 0 0 0,-1 1 0 0 0,1 0 1 0 0,0 0-1 0 0,-1 0 0 0 0,1-1 0 0 0,0 1 1 0 0,-1 0-1 0 0,1 0 0 0 0,0 0 0 0 0,0 0 1 0 0,-1 0-1 0 0,1 1 0 0 0,0-1 0 0 0,-1 0 0 0 0,1 0 1 0 0,0 0-1 0 0,-1 1 0 0 0,1-1 0 0 0,0 0 1 0 0,-1 0-1 0 0,1 1 0 0 0,1 0 0 0 0,25 21 458 0 0,-7-5 45 0 0,-18-16-450 0 0,0 1 1 0 0,0-1-1 0 0,1-1 1 0 0,-1 1 0 0 0,0 0-1 0 0,0 0 1 0 0,1-1-1 0 0,-1 1 1 0 0,0-1-1 0 0,1 0 1 0 0,-1 0 0 0 0,0 0-1 0 0,1 0 1 0 0,-1 0-1 0 0,0 0 1 0 0,1-1-1 0 0,-1 1 1 0 0,0-1 0 0 0,1 1-1 0 0,-1-1 1 0 0,0 0-1 0 0,0 0 1 0 0,0 0 0 0 0,0 0-1 0 0,0-1 1 0 0,2-1-1 0 0,3 0 146 0 0,11-1 483 0 0,-14 3-632 0 0,-6 1-11 0 0,1-37-43 0 0,1 37-13 0 0,1 37-789 0 0,-2-31-1532 0 0</inkml:trace>
+</inkml:ink>
+</file>
+
+<file path=word/ink/ink11.xml><?xml version="1.0" encoding="utf-8"?>
+<inkml:ink xmlns:inkml="http://www.w3.org/2003/InkML">
+  <inkml:definitions>
+    <inkml:context xml:id="ctx0">
+      <inkml:inkSource xml:id="inkSrc0">
+        <inkml:traceFormat>
+          <inkml:channel name="X" type="integer" min="-2.14748E9" max="2.14748E9" units="cm"/>
+          <inkml:channel name="Y" type="integer" min="-2.14748E9" max="2.14748E9" units="cm"/>
+          <inkml:channel name="F" type="integer" max="32767" units="dev"/>
+          <inkml:channel name="OA" type="integer" max="360" units="deg"/>
+          <inkml:channel name="OE" type="integer" max="90" units="deg"/>
+        </inkml:traceFormat>
+        <inkml:channelProperties>
+          <inkml:channelProperty channel="X" name="resolution" value="1000" units="1/cm"/>
+          <inkml:channelProperty channel="Y" name="resolution" value="1000" units="1/cm"/>
+          <inkml:channelProperty channel="F" name="resolution" value="0" units="1/dev"/>
+          <inkml:channelProperty channel="OA" name="resolution" value="1000" units="1/deg"/>
+          <inkml:channelProperty channel="OE" name="resolution" value="1000" units="1/deg"/>
+        </inkml:channelProperties>
+      </inkml:inkSource>
+      <inkml:timestamp xml:id="ts0" timeString="2026-01-16T12:45:46.446"/>
+    </inkml:context>
+    <inkml:brush xml:id="br0">
+      <inkml:brushProperty name="width" value="0.035" units="cm"/>
+      <inkml:brushProperty name="height" value="0.035" units="cm"/>
+      <inkml:brushProperty name="color" value="#66CC00"/>
+    </inkml:brush>
+  </inkml:definitions>
+  <inkml:trace contextRef="#ctx0" brushRef="#br0">1 115 6113 0 0,'14'-2'7935'0'0,"-1"-1"-3553"0"0,-11 2-4236 0 0,1-1 0 0 0,0 1 0 0 0,-1-1 0 0 0,1 1 0 0 0,-1-1 0 0 0,1 0 0 0 0,-1 0 0 0 0,0 0 0 0 0,0 0 1 0 0,0 0-1 0 0,0-1 0 0 0,0 1 0 0 0,-1-1 0 0 0,1 1 0 0 0,-1-1 0 0 0,1 0 0 0 0,-1 1 0 0 0,0-1 0 0 0,0 0 0 0 0,0 0 0 0 0,0-3 0 0 0,1-35 1035 0 0,-3 24-796 0 0,1 17-254 0 0,-2 41 678 0 0,-3-7-630 0 0,2-11-119 0 0,-2 36 0 0 0,1-7-13 0 0,3-45-21 0 0,1-7-22 0 0,0 1 0 0 0,0-1 0 0 0,0 0-1 0 0,0 0 1 0 0,0 0 0 0 0,0 0 0 0 0,0 0 0 0 0,0 0-1 0 0,0 1 1 0 0,0-1 0 0 0,0 0 0 0 0,0 0-1 0 0,-1 0 1 0 0,1 0 0 0 0,0 0 0 0 0,0 0 0 0 0,0 0-1 0 0,0 0 1 0 0,0 1 0 0 0,0-1 0 0 0,0 0-1 0 0,0 0 1 0 0,0 0 0 0 0,0 0 0 0 0,-1 0 0 0 0,1 0-1 0 0,0 0 1 0 0,0 0 0 0 0,0 0 0 0 0,0 0-1 0 0,0 0 1 0 0,0 0 0 0 0,0 0 0 0 0,-1 0-1 0 0,1 1 1 0 0,0-1 0 0 0,0 0 0 0 0,0 0 0 0 0,0 0-1 0 0,0 0 1 0 0,0 0 0 0 0,-1 0 0 0 0,1-1-1 0 0,0 1 1 0 0,0 0 0 0 0,0 0 0 0 0,0 0 0 0 0,0 0-1 0 0,0 0 1 0 0,0 0 0 0 0,-1 0 0 0 0,1 0-1 0 0,0 0 1 0 0,0 0 0 0 0,0 0 0 0 0,0 0 0 0 0,0 0-1 0 0,0 0 1 0 0,0-1 0 0 0,-1 1 13 0 0,-1-1 0 0 0,1 0 1 0 0,0 1-1 0 0,0-1 0 0 0,0 0 1 0 0,0 1-1 0 0,-1 0 0 0 0,1-1 0 0 0,0 1 1 0 0,0 0-1 0 0,-1-1 0 0 0,1 1 0 0 0,0 0 1 0 0,-1 0-1 0 0,1 0 0 0 0,0 0 0 0 0,0 0 1 0 0,-1 1-1 0 0,1-1 0 0 0,0 0 0 0 0,-2 1 1 0 0,-7 3 193 0 0,9-1 333 0 0,65 2 205 0 0,-58-7-722 0 0,-6 2-35 0 0,1-1 0 0 0,-1 1 1 0 0,0 0-1 0 0,0 0 0 0 0,1-1 0 0 0,-1 1 1 0 0,0 0-1 0 0,0 0 0 0 0,1 0 0 0 0,-1 0 0 0 0,0-1 1 0 0,1 1-1 0 0,-1 0 0 0 0,0 0 0 0 0,0 0 0 0 0,1 0 1 0 0,-1 0-1 0 0,0 0 0 0 0,1 0 0 0 0,-1 0 0 0 0,0 0 1 0 0,1 0-1 0 0,-1 0 0 0 0,0 0 0 0 0,1 0 0 0 0,-1 0 1 0 0,0 0-1 0 0,1 0 0 0 0,-1 0 0 0 0,0 0 0 0 0,1 0 1 0 0,-1 0-1 0 0,0 1 0 0 0,1-1 0 0 0,-1 0 0 0 0,0 0 1 0 0,0 0-1 0 0,1 1 0 0 0,-1-1 0 0 0,0 0 0 0 0,0 0 1 0 0,1 1-1 0 0,-1-1 0 0 0,0 1 0 0 0,5-4-4460 0 0</inkml:trace>
+</inkml:ink>
+</file>
+
+<file path=word/ink/ink12.xml><?xml version="1.0" encoding="utf-8"?>
+<inkml:ink xmlns:inkml="http://www.w3.org/2003/InkML">
+  <inkml:definitions>
+    <inkml:context xml:id="ctx0">
+      <inkml:inkSource xml:id="inkSrc0">
+        <inkml:traceFormat>
+          <inkml:channel name="X" type="integer" min="-2.14748E9" max="2.14748E9" units="cm"/>
+          <inkml:channel name="Y" type="integer" min="-2.14748E9" max="2.14748E9" units="cm"/>
+          <inkml:channel name="F" type="integer" max="32767" units="dev"/>
+          <inkml:channel name="OA" type="integer" max="360" units="deg"/>
+          <inkml:channel name="OE" type="integer" max="90" units="deg"/>
+        </inkml:traceFormat>
+        <inkml:channelProperties>
+          <inkml:channelProperty channel="X" name="resolution" value="1000" units="1/cm"/>
+          <inkml:channelProperty channel="Y" name="resolution" value="1000" units="1/cm"/>
+          <inkml:channelProperty channel="F" name="resolution" value="0" units="1/dev"/>
+          <inkml:channelProperty channel="OA" name="resolution" value="1000" units="1/deg"/>
+          <inkml:channelProperty channel="OE" name="resolution" value="1000" units="1/deg"/>
+        </inkml:channelProperties>
+      </inkml:inkSource>
+      <inkml:timestamp xml:id="ts0" timeString="2026-01-16T12:45:32.683"/>
+    </inkml:context>
+    <inkml:brush xml:id="br0">
+      <inkml:brushProperty name="width" value="0.035" units="cm"/>
+      <inkml:brushProperty name="height" value="0.035" units="cm"/>
+      <inkml:brushProperty name="color" value="#66CC00"/>
+    </inkml:brush>
+  </inkml:definitions>
+  <inkml:trace contextRef="#ctx0" brushRef="#br0">8 0 7954 0 0,'0'0'449'0'0,"-1"10"8805"0"0,-1 8-6176 0 0,0-6-2773 0 0,1-1 1 0 0,0 1-1 0 0,1-1 0 0 0,2 19 0 0 0,-1 3-183 0 0,1 16 577 0 0,-3-59-473 0 0,0 0-3886 0 0,1 0-6990 0 0</inkml:trace>
+  <inkml:trace contextRef="#ctx0" brushRef="#br0" timeOffset="1151.1">87 8 7009 0 0,'0'0'1011'0'0,"0"42"8497"0"0,-2-14-8052 0 0,1-19-1296 0 0,0-1 0 0 0,1 0-1 0 0,0 1 1 0 0,2 11 0 0 0,-4 24 240 0 0,5-40-66 0 0,1 8 369 0 0,-2-12-427 0 0,-1-7-165 0 0,-2-1-10900 0 0</inkml:trace>
+</inkml:ink>
+</file>
+
+<file path=word/ink/ink13.xml><?xml version="1.0" encoding="utf-8"?>
+<inkml:ink xmlns:inkml="http://www.w3.org/2003/InkML">
+  <inkml:definitions>
+    <inkml:context xml:id="ctx0">
+      <inkml:inkSource xml:id="inkSrc0">
+        <inkml:traceFormat>
+          <inkml:channel name="X" type="integer" min="-2.14748E9" max="2.14748E9" units="cm"/>
+          <inkml:channel name="Y" type="integer" min="-2.14748E9" max="2.14748E9" units="cm"/>
+          <inkml:channel name="F" type="integer" max="32767" units="dev"/>
+          <inkml:channel name="OA" type="integer" max="360" units="deg"/>
+          <inkml:channel name="OE" type="integer" max="90" units="deg"/>
+        </inkml:traceFormat>
+        <inkml:channelProperties>
+          <inkml:channelProperty channel="X" name="resolution" value="1000" units="1/cm"/>
+          <inkml:channelProperty channel="Y" name="resolution" value="1000" units="1/cm"/>
+          <inkml:channelProperty channel="F" name="resolution" value="0" units="1/dev"/>
+          <inkml:channelProperty channel="OA" name="resolution" value="1000" units="1/deg"/>
+          <inkml:channelProperty channel="OE" name="resolution" value="1000" units="1/deg"/>
+        </inkml:channelProperties>
+      </inkml:inkSource>
+      <inkml:timestamp xml:id="ts0" timeString="2026-01-16T12:45:25.574"/>
+    </inkml:context>
+    <inkml:brush xml:id="br0">
+      <inkml:brushProperty name="width" value="0.035" units="cm"/>
+      <inkml:brushProperty name="height" value="0.035" units="cm"/>
+      <inkml:brushProperty name="color" value="#66CC00"/>
+    </inkml:brush>
+  </inkml:definitions>
+  <inkml:trace contextRef="#ctx0" brushRef="#br0">15 9 8378 0 0,'-1'5'7875'0'0,"-1"6"-4660"0"0,-4 19-1258 0 0,0 97-13 0 0,7-119-1719 0 0,0-13 536 0 0,0-6-1523 0 0,-3 1-3584 0 0,3-1-5596 0 0</inkml:trace>
+  <inkml:trace contextRef="#ctx0" brushRef="#br0" timeOffset="690.24">91 1 6665 0 0,'-6'12'11887'0'0,"2"17"-8810"0"0,2 28-3224 0 0,8 16 242 0 0,-2-63 286 0 0,-3-27-5154 0 0,1-6-3075 0 0,-1 18 4626 0 0,-1 0-813 0 0</inkml:trace>
+  <inkml:trace contextRef="#ctx0" brushRef="#br0" timeOffset="1483.17">174 1 7746 0 0,'0'12'8740'0'0,"1"13"-6963"0"0,-4-11-1586 0 0,2-1 1 0 0,-1 0 0 0 0,2 1-1 0 0,0-1 1 0 0,1 1 0 0 0,2 18-1 0 0,-3-20-114 0 0,0-12-56 0 0,-1 0 1 0 0,1 0-1 0 0,0 1 1 0 0,0-1-1 0 0,0 0 1 0 0,0 1-1 0 0,0-1 1 0 0,0 0-1 0 0,0 1 1 0 0,0-1 0 0 0,0 0-1 0 0,0 1 1 0 0,0-1-1 0 0,0 0 1 0 0,0 1-1 0 0,0-1 1 0 0,0 0-1 0 0,0 1 1 0 0,0-1-1 0 0,0 0 1 0 0,0 0 0 0 0,0 1-1 0 0,0-1 1 0 0,1 0-1 0 0,-1 1 1 0 0,0-1-1 0 0,0 0 1 0 0,0 0-1 0 0,0 1 1 0 0,1-1-1 0 0,-1 0 1 0 0,0 0 0 0 0,0 0-1 0 0,1 1 1 0 0,-1-1-1 0 0,1 0 1 0 0,1 0-260 0 0,-1-4-2639 0 0,-2-3-3701 0 0</inkml:trace>
+</inkml:ink>
+</file>
+
+<file path=word/ink/ink14.xml><?xml version="1.0" encoding="utf-8"?>
+<inkml:ink xmlns:inkml="http://www.w3.org/2003/InkML">
+  <inkml:definitions>
+    <inkml:context xml:id="ctx0">
+      <inkml:inkSource xml:id="inkSrc0">
+        <inkml:traceFormat>
+          <inkml:channel name="X" type="integer" min="-2.14748E9" max="2.14748E9" units="cm"/>
+          <inkml:channel name="Y" type="integer" min="-2.14748E9" max="2.14748E9" units="cm"/>
+          <inkml:channel name="F" type="integer" max="32767" units="dev"/>
+          <inkml:channel name="OA" type="integer" max="360" units="deg"/>
+          <inkml:channel name="OE" type="integer" max="90" units="deg"/>
+        </inkml:traceFormat>
+        <inkml:channelProperties>
+          <inkml:channelProperty channel="X" name="resolution" value="1000" units="1/cm"/>
+          <inkml:channelProperty channel="Y" name="resolution" value="1000" units="1/cm"/>
+          <inkml:channelProperty channel="F" name="resolution" value="0" units="1/dev"/>
+          <inkml:channelProperty channel="OA" name="resolution" value="1000" units="1/deg"/>
+          <inkml:channelProperty channel="OE" name="resolution" value="1000" units="1/deg"/>
+        </inkml:channelProperties>
+      </inkml:inkSource>
+      <inkml:timestamp xml:id="ts0" timeString="2026-01-16T12:39:32.999"/>
+    </inkml:context>
+    <inkml:brush xml:id="br0">
+      <inkml:brushProperty name="width" value="0.035" units="cm"/>
+      <inkml:brushProperty name="height" value="0.035" units="cm"/>
+      <inkml:brushProperty name="color" value="#66CC00"/>
+    </inkml:brush>
+  </inkml:definitions>
+  <inkml:trace contextRef="#ctx0" brushRef="#br0">0 21 8394 0 0,'6'-4'11132'0'0,"15"-12"-6085"0"0,-18 20-4901 0 0,0 0 0 0 0,-1 0-1 0 0,1 0 1 0 0,-1 0 0 0 0,0 1 0 0 0,0-1-1 0 0,-1 1 1 0 0,1 0 0 0 0,-1-1 0 0 0,1 8-1 0 0,6 53-58 0 0,-7-57 25 0 0,4 190 739 0 0,-5-184-705 0 0,-1 0 1 0 0,0 0-1 0 0,-5 22 0 0 0,4-54-2208 0 0,0 8-2304 0 0,2-1-3399 0 0</inkml:trace>
+  <inkml:trace contextRef="#ctx0" brushRef="#br0" timeOffset="1082.53">76 198 9170 0 0,'0'-1'666'0'0,"0"0"1"0"0,1 0-1 0 0,-1 0 0 0 0,0 0 0 0 0,1 0 1 0 0,-1 0-1 0 0,0 0 0 0 0,1 0 0 0 0,-1 0 1 0 0,1 0-1 0 0,0 1 0 0 0,-1-1 1 0 0,1 0-1 0 0,0 0 0 0 0,-1 0 0 0 0,1 1 1 0 0,2-2-1 0 0,22-11 2860 0 0,-22 12-3442 0 0,-1 0 0 0 0,1 0 0 0 0,-1 0 0 0 0,1 0 0 0 0,0 1 0 0 0,-1 0-1 0 0,1-1 1 0 0,0 1 0 0 0,-1 0 0 0 0,1 0 0 0 0,0 1 0 0 0,-1-1 0 0 0,1 0 0 0 0,0 1-1 0 0,-1 0 1 0 0,1-1 0 0 0,-1 1 0 0 0,5 2 0 0 0,-4 0-60 0 0,1-1 1 0 0,-1 0-1 0 0,1 0 0 0 0,-1-1 1 0 0,1 1-1 0 0,0-1 1 0 0,0 1-1 0 0,7 0 0 0 0,-8-2 20 0 0,0 1-1 0 0,0 0 1 0 0,1 0-1 0 0,-1 0 1 0 0,0 0-1 0 0,0 0 0 0 0,0 1 1 0 0,0-1-1 0 0,0 1 1 0 0,-1 0-1 0 0,1 0 1 0 0,0 0-1 0 0,-1 0 0 0 0,5 5 1 0 0,10 11 131 0 0,-15-16-154 0 0,0 0 0 0 0,0-1 0 0 0,0 1-1 0 0,-1 0 1 0 0,1 0 0 0 0,0 0 0 0 0,-1 0 0 0 0,0 0 0 0 0,1 0 0 0 0,-1 1 0 0 0,0-1 0 0 0,0 0 0 0 0,0 1 0 0 0,-1-1 0 0 0,1 0 0 0 0,0 1 0 0 0,-1-1 0 0 0,0 1 0 0 0,0-1 0 0 0,1 5 0 0 0,-1 8 223 0 0,0-12-187 0 0,1 0 0 0 0,-1 0-1 0 0,0 1 1 0 0,0-1 0 0 0,0 0 0 0 0,0 0-1 0 0,-1 0 1 0 0,0 0 0 0 0,1 0 0 0 0,-1 0-1 0 0,0 0 1 0 0,0 0 0 0 0,0 0 0 0 0,-1 0-1 0 0,1 0 1 0 0,-1-1 0 0 0,0 1 0 0 0,1 0-1 0 0,-1-1 1 0 0,-3 3 0 0 0,1-1 39 0 0,-1-1 0 0 0,0 1 0 0 0,0-1 1 0 0,0 0-1 0 0,0-1 0 0 0,0 1 0 0 0,0-1 0 0 0,-1 0 0 0 0,-6 1 0 0 0,-6-5 142 0 0,16 1-207 0 0,1 1 0 0 0,-1 0 0 0 0,1-1 0 0 0,-1 1 0 0 0,0 0 0 0 0,1 0 0 0 0,-1 0 0 0 0,0 0 0 0 0,1 0 0 0 0,-1 0-1 0 0,0 0 1 0 0,1 1 0 0 0,-1-1 0 0 0,0 1 0 0 0,1-1 0 0 0,-1 1 0 0 0,1 0 0 0 0,-3 1 0 0 0,2-1-15 0 0,-1 0 1 0 0,1 0-1 0 0,0 0 1 0 0,-1-1-1 0 0,1 1 1 0 0,-1 0-1 0 0,1-1 1 0 0,-1 0-1 0 0,1 1 1 0 0,-1-1-1 0 0,1 0 1 0 0,-1 0-1 0 0,1-1 1 0 0,-1 1-1 0 0,1-1 0 0 0,-1 1 1 0 0,1-1-1 0 0,-1 0 1 0 0,-2-1-1 0 0,-7-1 118 0 0,9 3-383 0 0,-15 0 144 0 0,13-4-4262 0 0</inkml:trace>
+</inkml:ink>
+</file>
+
+<file path=word/ink/ink15.xml><?xml version="1.0" encoding="utf-8"?>
+<inkml:ink xmlns:inkml="http://www.w3.org/2003/InkML">
+  <inkml:definitions>
+    <inkml:context xml:id="ctx0">
+      <inkml:inkSource xml:id="inkSrc0">
+        <inkml:traceFormat>
+          <inkml:channel name="X" type="integer" min="-2.14748E9" max="2.14748E9" units="cm"/>
+          <inkml:channel name="Y" type="integer" min="-2.14748E9" max="2.14748E9" units="cm"/>
+          <inkml:channel name="F" type="integer" max="32767" units="dev"/>
+          <inkml:channel name="OA" type="integer" max="360" units="deg"/>
+          <inkml:channel name="OE" type="integer" max="90" units="deg"/>
+        </inkml:traceFormat>
+        <inkml:channelProperties>
+          <inkml:channelProperty channel="X" name="resolution" value="1000" units="1/cm"/>
+          <inkml:channelProperty channel="Y" name="resolution" value="1000" units="1/cm"/>
+          <inkml:channelProperty channel="F" name="resolution" value="0" units="1/dev"/>
+          <inkml:channelProperty channel="OA" name="resolution" value="1000" units="1/deg"/>
+          <inkml:channelProperty channel="OE" name="resolution" value="1000" units="1/deg"/>
+        </inkml:channelProperties>
+      </inkml:inkSource>
+      <inkml:timestamp xml:id="ts0" timeString="2026-01-16T12:39:27.297"/>
+    </inkml:context>
+    <inkml:brush xml:id="br0">
+      <inkml:brushProperty name="width" value="0.035" units="cm"/>
+      <inkml:brushProperty name="height" value="0.035" units="cm"/>
+      <inkml:brushProperty name="color" value="#E71224"/>
+    </inkml:brush>
+  </inkml:definitions>
+  <inkml:trace contextRef="#ctx0" brushRef="#br0">1 110 9778 0 0,'0'-11'6400'0'0,"9"-7"-3399"0"0,14-10-17 0 0,-17 22-2523 0 0,1 0 0 0 0,0 1 0 0 0,0-1-1 0 0,0 1 1 0 0,1 1 0 0 0,0-1 0 0 0,0 1 0 0 0,0 1-1 0 0,16-6 1 0 0,-23 9-428 0 0,1 0 1 0 0,-1 0-1 0 0,0 0 0 0 0,1 1 0 0 0,-1-1 1 0 0,0 0-1 0 0,0 1 0 0 0,1-1 0 0 0,-1 1 1 0 0,0-1-1 0 0,0 1 0 0 0,0-1 1 0 0,1 1-1 0 0,-1 0 0 0 0,0 0 0 0 0,0-1 1 0 0,0 1-1 0 0,0 0 0 0 0,0 0 0 0 0,0 0 1 0 0,-1 0-1 0 0,1 0 0 0 0,0 1 0 0 0,0-1 1 0 0,-1 0-1 0 0,1 0 0 0 0,0 2 1 0 0,15 40 518 0 0,-13-35-398 0 0,4 18 88 0 0,0 0-1 0 0,-2 0 1 0 0,-1 1 0 0 0,-1 0 0 0 0,-1 28 0 0 0,-2 146-77 0 0,14-135-102 0 0,-14-62-59 0 0,0-1-1 0 0,1 1 1 0 0,-1-1 0 0 0,1 1 0 0 0,0-1 0 0 0,0 1 0 0 0,0-1-1 0 0,0 0 1 0 0,0 1 0 0 0,1-1 0 0 0,-1 0 0 0 0,1 0 0 0 0,0 0-1 0 0,3 4 1 0 0,-3-6-3 0 0,-1 1 0 0 0,1-1-1 0 0,0 1 1 0 0,0-1 0 0 0,-1 1-1 0 0,1-1 1 0 0,0 0 0 0 0,0 0-1 0 0,1 0 1 0 0,-1 0 0 0 0,0 0 0 0 0,0 0-1 0 0,0-1 1 0 0,0 1 0 0 0,1-1-1 0 0,-1 1 1 0 0,0-1 0 0 0,1 0-1 0 0,-1 0 1 0 0,0 0 0 0 0,0 0-1 0 0,5-1 1 0 0,1-1 14 0 0,1 0 1 0 0,-1 0-1 0 0,0 0 0 0 0,0-1 1 0 0,0-1-1 0 0,-1 1 0 0 0,10-6 1 0 0,-12 6-889 0 0,10-7 2756 0 0,-12 5-4193 0 0</inkml:trace>
+</inkml:ink>
+</file>
+
+<file path=word/ink/ink16.xml><?xml version="1.0" encoding="utf-8"?>
+<inkml:ink xmlns:inkml="http://www.w3.org/2003/InkML">
+  <inkml:definitions>
+    <inkml:context xml:id="ctx0">
+      <inkml:inkSource xml:id="inkSrc0">
+        <inkml:traceFormat>
+          <inkml:channel name="X" type="integer" min="-2.14748E9" max="2.14748E9" units="cm"/>
+          <inkml:channel name="Y" type="integer" min="-2.14748E9" max="2.14748E9" units="cm"/>
+          <inkml:channel name="F" type="integer" max="32767" units="dev"/>
+          <inkml:channel name="OA" type="integer" max="360" units="deg"/>
+          <inkml:channel name="OE" type="integer" max="90" units="deg"/>
+        </inkml:traceFormat>
+        <inkml:channelProperties>
+          <inkml:channelProperty channel="X" name="resolution" value="1000" units="1/cm"/>
+          <inkml:channelProperty channel="Y" name="resolution" value="1000" units="1/cm"/>
+          <inkml:channelProperty channel="F" name="resolution" value="0" units="1/dev"/>
+          <inkml:channelProperty channel="OA" name="resolution" value="1000" units="1/deg"/>
+          <inkml:channelProperty channel="OE" name="resolution" value="1000" units="1/deg"/>
+        </inkml:channelProperties>
+      </inkml:inkSource>
+      <inkml:timestamp xml:id="ts0" timeString="2026-01-16T12:39:22.125"/>
+    </inkml:context>
+    <inkml:brush xml:id="br0">
+      <inkml:brushProperty name="width" value="0.035" units="cm"/>
+      <inkml:brushProperty name="height" value="0.035" units="cm"/>
+      <inkml:brushProperty name="color" value="#E71224"/>
+    </inkml:brush>
+  </inkml:definitions>
+  <inkml:trace contextRef="#ctx0" brushRef="#br0">307 159 5545 0 0,'-2'-3'12040'0'0,"-1"-3"-7493"0"0,2 5-4343 0 0,1 0 1 0 0,-1 0-1 0 0,0 0 1 0 0,1 0-1 0 0,-1 0 1 0 0,0 0-1 0 0,0 1 1 0 0,0-1-1 0 0,0 0 0 0 0,0 0 1 0 0,0 1-1 0 0,0-1 1 0 0,0 0-1 0 0,-1 0 1 0 0,-1 0-14 0 0,1 0 0 0 0,0 0 0 0 0,0 0 1 0 0,0-1-1 0 0,0 1 0 0 0,0-1 0 0 0,0 1 1 0 0,1-1-1 0 0,-3-2 0 0 0,3 2-130 0 0,0 1-1 0 0,-1 0 1 0 0,1-1 0 0 0,0 1-1 0 0,0 0 1 0 0,-1 0-1 0 0,1 0 1 0 0,-1 0-1 0 0,1 0 1 0 0,-1 0 0 0 0,1 0-1 0 0,-1 0 1 0 0,0 1-1 0 0,1-1 1 0 0,-1 0 0 0 0,0 1-1 0 0,1 0 1 0 0,-1-1-1 0 0,0 1 1 0 0,0 0 0 0 0,1 0-1 0 0,-5 0 1 0 0,-35 1 686 0 0,35-1-645 0 0,0-1 0 0 0,1 1 0 0 0,-1 0 1 0 0,0 1-1 0 0,1-1 0 0 0,-1 1 0 0 0,1 0 0 0 0,-1 1 0 0 0,1-1 0 0 0,0 1 1 0 0,-1 0-1 0 0,-7 4 0 0 0,-16 10-2 0 0,23-13-75 0 0,0 0 0 0 0,0 0 0 0 0,1 0 0 0 0,0 1 0 0 0,-1 0 0 0 0,-5 5 0 0 0,8-5-24 0 0,0 1 1 0 0,-1-1-1 0 0,1 0 1 0 0,1 1-1 0 0,-1 0 1 0 0,1-1-1 0 0,0 1 1 0 0,0 0-1 0 0,0 0 1 0 0,1 0-1 0 0,0 1 1 0 0,0-1-1 0 0,0 0 1 0 0,0 1-1 0 0,1-1 1 0 0,0 0-1 0 0,0 1 1 0 0,0-1 0 0 0,1 0-1 0 0,1 8 1 0 0,2 0-18 0 0,-4-10 14 0 0,1 0 1 0 0,-1 1 0 0 0,1-1 0 0 0,0 0 0 0 0,1 0 0 0 0,-1 1 0 0 0,1-1 0 0 0,-1 0 0 0 0,1 0 0 0 0,0 0 0 0 0,0-1 0 0 0,0 1 0 0 0,0 0 0 0 0,3 2 0 0 0,2 0 9 0 0,-1 0 0 0 0,1 0 0 0 0,0-1 0 0 0,1 1 0 0 0,-1-2 0 0 0,1 1 0 0 0,-1-1 0 0 0,1 0 0 0 0,0-1 0 0 0,0 0 0 0 0,15 2 0 0 0,-19-3-21 0 0,0-1 1 0 0,0-1 0 0 0,0 1 0 0 0,0-1 0 0 0,0 1-1 0 0,0-1 1 0 0,0 0 0 0 0,5-2 0 0 0,-5 1 2 0 0,0 1 0 0 0,0 0 0 0 0,0 0 0 0 0,0 0 0 0 0,0 0 1 0 0,0 1-1 0 0,0-1 0 0 0,7 2 0 0 0,-8-1 15 0 0,0 0-1 0 0,-1 0 1 0 0,1-1 0 0 0,0 1 0 0 0,0-1 0 0 0,0 1-1 0 0,0-1 1 0 0,0 0 0 0 0,-1 0 0 0 0,6-2 0 0 0,16-4 258 0 0,-22 6-217 0 0,0 1 1 0 0,0 0-1 0 0,0-1 1 0 0,0 0-1 0 0,0 1 0 0 0,-1-1 1 0 0,1 0-1 0 0,0 0 1 0 0,0 0-1 0 0,-1 0 1 0 0,1 0-1 0 0,0 0 0 0 0,-1-1 1 0 0,1 1-1 0 0,-1 0 1 0 0,1-1-1 0 0,1-2 0 0 0,9-14-3327 0 0,-7 8-2148 0 0,-2 1-3617 0 0</inkml:trace>
+</inkml:ink>
+</file>
+
+<file path=word/ink/ink17.xml><?xml version="1.0" encoding="utf-8"?>
+<inkml:ink xmlns:inkml="http://www.w3.org/2003/InkML">
+  <inkml:definitions>
+    <inkml:context xml:id="ctx0">
+      <inkml:inkSource xml:id="inkSrc0">
+        <inkml:traceFormat>
+          <inkml:channel name="X" type="integer" min="-2.14748E9" max="2.14748E9" units="cm"/>
+          <inkml:channel name="Y" type="integer" min="-2.14748E9" max="2.14748E9" units="cm"/>
+          <inkml:channel name="F" type="integer" max="32767" units="dev"/>
+          <inkml:channel name="OA" type="integer" max="360" units="deg"/>
+          <inkml:channel name="OE" type="integer" max="90" units="deg"/>
+        </inkml:traceFormat>
+        <inkml:channelProperties>
+          <inkml:channelProperty channel="X" name="resolution" value="1000" units="1/cm"/>
+          <inkml:channelProperty channel="Y" name="resolution" value="1000" units="1/cm"/>
+          <inkml:channelProperty channel="F" name="resolution" value="0" units="1/dev"/>
+          <inkml:channelProperty channel="OA" name="resolution" value="1000" units="1/deg"/>
+          <inkml:channelProperty channel="OE" name="resolution" value="1000" units="1/deg"/>
+        </inkml:channelProperties>
+      </inkml:inkSource>
+      <inkml:timestamp xml:id="ts0" timeString="2026-01-16T12:38:59.943"/>
+    </inkml:context>
+    <inkml:brush xml:id="br0">
+      <inkml:brushProperty name="width" value="0.035" units="cm"/>
+      <inkml:brushProperty name="height" value="0.035" units="cm"/>
+      <inkml:brushProperty name="color" value="#66CC00"/>
+    </inkml:brush>
+  </inkml:definitions>
+  <inkml:trace contextRef="#ctx0" brushRef="#br0">2 355 7538 0 0,'0'0'973'0'0,"0"3"2657"0"0,-1 6-1160 0 0,6-58 3165 0 0,16-29-5233 0 0,-13 51 749 0 0,-3 13-975 0 0,0 0 0 0 0,1 0 0 0 0,0 0 0 0 0,1 0 1 0 0,1 1-1 0 0,0 1 0 0 0,0-1 0 0 0,14-14 0 0 0,-6 11 122 0 0,-13 11-274 0 0,1 1-1 0 0,-1 0 1 0 0,1 0-1 0 0,0 0 1 0 0,0 1-1 0 0,0-1 0 0 0,0 1 1 0 0,1 0-1 0 0,-1 0 1 0 0,1 1-1 0 0,0-1 1 0 0,0 1-1 0 0,0 0 1 0 0,0 0-1 0 0,0 1 0 0 0,0 0 1 0 0,0-1-1 0 0,9 1 1 0 0,33-3 127 0 0,-40 2-137 0 0,1 1 1 0 0,-1 0-1 0 0,1 1 0 0 0,0 0 1 0 0,0 0-1 0 0,-1 1 0 0 0,1 0 1 0 0,0 0-1 0 0,11 4 1 0 0,31 8 374 0 0,-41-11-270 0 0,0 0 1 0 0,0 0 0 0 0,0 1-1 0 0,-1 0 1 0 0,0 0 0 0 0,17 10-1 0 0,-19-9-62 0 0,1-1-1 0 0,0 0 1 0 0,0 0-1 0 0,0 0 1 0 0,8 1-1 0 0,-9-3-26 0 0,-1 1 0 0 0,0-1 0 0 0,0 1 0 0 0,0 0 0 0 0,0 0 0 0 0,0 1 0 0 0,0-1 0 0 0,0 1 0 0 0,-1 0 0 0 0,0 0 0 0 0,7 7 0 0 0,-6-6-27 0 0,0 1-1 0 0,0-1 0 0 0,0 0 0 0 0,0-1 1 0 0,1 1-1 0 0,0-1 0 0 0,-1 0 1 0 0,1-1-1 0 0,0 1 0 0 0,10 1 1 0 0,32 17 73 0 0,-18 2-35 0 0,-23-17-47 0 0,0-1 0 0 0,1 0 0 0 0,-1 0-1 0 0,13 6 1 0 0,-4-4 44 0 0,-1 2 1 0 0,17 11-1 0 0,9 6 38 0 0,-14-13-60 0 0,37 13 0 0 0,-7-3-13 0 0,-52-21-19 0 0,11 6 24 0 0,1-1 0 0 0,0-1 0 0 0,0 0 0 0 0,23 3 0 0 0,-12-6 74 0 0,-16-2-40 0 0,0 1 0 0 0,0 0 0 0 0,0 1 0 0 0,18 6 0 0 0,-5-1 7 0 0,62 11 20 0 0,-81-18-50 0 0,-1 0-1 0 0,0 1 0 0 0,0 0 0 0 0,0 0 0 0 0,10 6 0 0 0,-12-6 4 0 0,1 1-1 0 0,0-1 0 0 0,0-1 1 0 0,0 1-1 0 0,0 0 1 0 0,0-1-1 0 0,0 0 0 0 0,0 0 1 0 0,9 1-1 0 0,6 0 231 0 0,-11 0-199 0 0,-11-1-488 0 0,3-1-211 0 0,-1-1 1 0 0,0 1-1 0 0,1 0 1 0 0,-1-1-1 0 0,0 1 1 0 0,1-1-1 0 0,-1 1 1 0 0,1-1-1 0 0,-1 1 1 0 0,1-1-1 0 0,-1 1 1 0 0,1-1-1 0 0,-1 1 1 0 0,1-1-1 0 0,-1 0 1 0 0,1 1-1 0 0,0-1 1 0 0,0 0-1 0 0,-1 0 1 0 0</inkml:trace>
+  <inkml:trace contextRef="#ctx0" brushRef="#br0" timeOffset="1681">1305 513 8362 0 0,'6'-4'6442'0'0,"5"-4"-3317"0"0,2 3-1245 0 0,-10 4-1651 0 0,0 0-1 0 0,0 0 0 0 0,1 0 1 0 0,-1 0-1 0 0,0 0 1 0 0,0 0-1 0 0,1 1 0 0 0,3 0 1 0 0,7 0-30 0 0,-12 1-174 0 0,1-1 0 0 0,0 0 0 0 0,-1 0 0 0 0,1 0 0 0 0,0 0 0 0 0,-1 0 0 0 0,1 0 0 0 0,0-1 0 0 0,-1 1 0 0 0,1-1 0 0 0,-1 0 0 0 0,1 0 0 0 0,-1 1 0 0 0,1-2 0 0 0,-1 1 0 0 0,1 0 0 0 0,3-3 0 0 0,-6 3-16 0 0,1 1 0 0 0,0 0 1 0 0,0-1-1 0 0,0 1 0 0 0,0 0 0 0 0,-1-1 0 0 0,1 1 0 0 0,0 0 1 0 0,0 0-1 0 0,0 0 0 0 0,0 0 0 0 0,0 0 0 0 0,0 0 0 0 0,0 0 0 0 0,0 0 1 0 0,-1 0-1 0 0,1 1 0 0 0,0-1 0 0 0,1 0 0 0 0,2 1 271 0 0,-5-2 317 0 0,-8-30-350 0 0,1 14-44 0 0,1 1 0 0 0,0-1 0 0 0,2 0 0 0 0,0 0 0 0 0,-5-27 0 0 0,2 19 3 0 0,5 18 4 0 0,5 17-25 0 0,5 17-186 0 0,1 1 0 0 0,2-1 0 0 0,16 34 0 0 0,-21-51-1197 0 0,0-5 3633 0 0,-3-10-6212 0 0</inkml:trace>
+</inkml:ink>
+</file>
+
+<file path=word/ink/ink18.xml><?xml version="1.0" encoding="utf-8"?>
+<inkml:ink xmlns:inkml="http://www.w3.org/2003/InkML">
+  <inkml:definitions>
+    <inkml:context xml:id="ctx0">
+      <inkml:inkSource xml:id="inkSrc0">
+        <inkml:traceFormat>
+          <inkml:channel name="X" type="integer" min="-2.14748E9" max="2.14748E9" units="cm"/>
+          <inkml:channel name="Y" type="integer" min="-2.14748E9" max="2.14748E9" units="cm"/>
+          <inkml:channel name="F" type="integer" max="32767" units="dev"/>
+          <inkml:channel name="OA" type="integer" max="360" units="deg"/>
+          <inkml:channel name="OE" type="integer" max="90" units="deg"/>
+        </inkml:traceFormat>
+        <inkml:channelProperties>
+          <inkml:channelProperty channel="X" name="resolution" value="1000" units="1/cm"/>
+          <inkml:channelProperty channel="Y" name="resolution" value="1000" units="1/cm"/>
+          <inkml:channelProperty channel="F" name="resolution" value="0" units="1/dev"/>
+          <inkml:channelProperty channel="OA" name="resolution" value="1000" units="1/deg"/>
+          <inkml:channelProperty channel="OE" name="resolution" value="1000" units="1/deg"/>
+        </inkml:channelProperties>
+      </inkml:inkSource>
+      <inkml:timestamp xml:id="ts0" timeString="2026-01-16T12:38:47.718"/>
+    </inkml:context>
+    <inkml:brush xml:id="br0">
+      <inkml:brushProperty name="width" value="0.035" units="cm"/>
+      <inkml:brushProperty name="height" value="0.035" units="cm"/>
+      <inkml:brushProperty name="color" value="#66CC00"/>
+    </inkml:brush>
+  </inkml:definitions>
+  <inkml:trace contextRef="#ctx0" brushRef="#br0">1 10 7754 0 0,'2'2'5891'0'0,"4"1"-4637"0"0,52-6 2024 0 0,-42 3-2860 0 0,15-5 248 0 0,-27 4-610 0 0,-1 0 0 0 0,1 0 1 0 0,0 1-1 0 0,-1-1 0 0 0,1 1 0 0 0,0-1 0 0 0,-1 1 0 0 0,1 0 0 0 0,0 1 1 0 0,-1-1-1 0 0,1 1 0 0 0,6 1 0 0 0,-9-1-43 0 0,0-1 0 0 0,0 0 0 0 0,0 1 0 0 0,1-1 0 0 0,-1 0 0 0 0,0 0 0 0 0,0 0 0 0 0,0 0 0 0 0,1 0 0 0 0,-1 0 0 0 0,0 0 0 0 0,0 0 0 0 0,1 0 0 0 0,-1 0 0 0 0,0-1 0 0 0,0 1 0 0 0,0 0 0 0 0,0-1 0 0 0,0 1 0 0 0,2-2 0 0 0,-3 2 7 0 0,1-1-1 0 0,0 1 0 0 0,0 0 0 0 0,0-1 0 0 0,0 1 0 0 0,-1 0 0 0 0,1-1 0 0 0,0 1 0 0 0,0 0 0 0 0,0 0 0 0 0,0 0 0 0 0,0 0 0 0 0,0 0 0 0 0,0 0 0 0 0,0 0 0 0 0,0 0 0 0 0,-1 0 0 0 0,1 0 0 0 0,0 0 0 0 0,0 0 0 0 0,0 1 0 0 0,0-1 0 0 0,0 0 0 0 0,0 1 0 0 0,-1-1 1 0 0,1 1-1 0 0,0-1 0 0 0,0 1 0 0 0,-1-1 0 0 0,1 1 0 0 0,0 0 0 0 0,31 10 1057 0 0,-30-12-908 0 0,6-1 329 0 0,-8 2-492 0 0,0 0 0 0 0,0 0 0 0 0,1 0-1 0 0,-1 0 1 0 0,0 0 0 0 0,0 0 0 0 0,0 0 0 0 0,0 0 0 0 0,0 0 0 0 0,1 0-1 0 0,-1 0 1 0 0,0 0 0 0 0,0 0 0 0 0,0 0 0 0 0,0 0 0 0 0,0 1 0 0 0,0-1-1 0 0,0 0 1 0 0,1 0 0 0 0,-1 0 0 0 0,0 0 0 0 0,0 0 0 0 0,0 0 0 0 0,0 0-1 0 0,0 1 1 0 0,0-1 0 0 0,0 0 0 0 0,0 0 0 0 0,0 0 0 0 0,0 0 0 0 0,0 0-1 0 0,0 1 1 0 0,0-1 0 0 0,0 0 0 0 0,0 0 0 0 0,0 0 0 0 0,0 0-1 0 0,0 0 1 0 0,0 1 0 0 0,0-1 0 0 0,0 0 0 0 0,0 0 0 0 0,0 0 0 0 0,0 0-1 0 0,0 0 1 0 0,0 1 0 0 0,0-1 0 0 0,0 0 0 0 0,-1 0 0 0 0,1 0 0 0 0,0 0-1 0 0,0 0 1 0 0,0 0 0 0 0,0 0 0 0 0,0 1 0 0 0,0-1 0 0 0,0 0 0 0 0,-1 0-1 0 0,1 0 1 0 0</inkml:trace>
+</inkml:ink>
+</file>
+
+<file path=word/ink/ink19.xml><?xml version="1.0" encoding="utf-8"?>
+<inkml:ink xmlns:inkml="http://www.w3.org/2003/InkML">
+  <inkml:definitions>
+    <inkml:context xml:id="ctx0">
+      <inkml:inkSource xml:id="inkSrc0">
+        <inkml:traceFormat>
+          <inkml:channel name="X" type="integer" min="-2.14748E9" max="2.14748E9" units="cm"/>
+          <inkml:channel name="Y" type="integer" min="-2.14748E9" max="2.14748E9" units="cm"/>
+          <inkml:channel name="F" type="integer" max="32767" units="dev"/>
+          <inkml:channel name="OA" type="integer" max="360" units="deg"/>
+          <inkml:channel name="OE" type="integer" max="90" units="deg"/>
+        </inkml:traceFormat>
+        <inkml:channelProperties>
+          <inkml:channelProperty channel="X" name="resolution" value="1000" units="1/cm"/>
+          <inkml:channelProperty channel="Y" name="resolution" value="1000" units="1/cm"/>
+          <inkml:channelProperty channel="F" name="resolution" value="0" units="1/dev"/>
+          <inkml:channelProperty channel="OA" name="resolution" value="1000" units="1/deg"/>
+          <inkml:channelProperty channel="OE" name="resolution" value="1000" units="1/deg"/>
+        </inkml:channelProperties>
+      </inkml:inkSource>
+      <inkml:timestamp xml:id="ts0" timeString="2026-01-16T12:38:43.641"/>
+    </inkml:context>
+    <inkml:brush xml:id="br0">
+      <inkml:brushProperty name="width" value="0.035" units="cm"/>
+      <inkml:brushProperty name="height" value="0.035" units="cm"/>
+      <inkml:brushProperty name="color" value="#66CC00"/>
+    </inkml:brush>
+  </inkml:definitions>
+  <inkml:trace contextRef="#ctx0" brushRef="#br0">74 144 6041 0 0,'1'14'7681'0'0,"3"-19"-3678"0"0,7-13-3324 0 0,10-13-510 0 0,-17 25-154 0 0,1-1-1 0 0,-1 1 0 0 0,1 0 0 0 0,0 0 1 0 0,0 0-1 0 0,10-7 0 0 0,4-10 74 0 0,-15 17-20 0 0,-5 10 138 0 0,-37 50 60 0 0,32-43-243 0 0,0 0-1 0 0,-1 0 1 0 0,0-1-1 0 0,-12 14 0 0 0,15-20-16 0 0,-7 4 218 0 0,2-24 185 0 0,-2-14-77 0 0,6 17-248 0 0,1 1 0 0 0,-2-1 0 0 0,0 1 0 0 0,-11-18 0 0 0,12 20-65 0 0,5 8-10 0 0,-1 0 1 0 0,0-1 0 0 0,0 1 0 0 0,0 0-1 0 0,0 0 1 0 0,0 0 0 0 0,-1 0 0 0 0,1 0-1 0 0,-1 0 1 0 0,-2-2 0 0 0,4 4-17 0 0,4 26 48 0 0,-2-12-49 0 0,1 0-1 0 0,1-1 1 0 0,0 1-1 0 0,1 0 1 0 0,0-1-1 0 0,1 0 0 0 0,1 0 1 0 0,8 12-1 0 0,-10-13-921 0 0,-6-2-5815 0 0</inkml:trace>
+</inkml:ink>
+</file>
+
+<file path=word/ink/ink2.xml><?xml version="1.0" encoding="utf-8"?>
+<inkml:ink xmlns:inkml="http://www.w3.org/2003/InkML">
+  <inkml:definitions>
+    <inkml:context xml:id="ctx0">
+      <inkml:inkSource xml:id="inkSrc0">
+        <inkml:traceFormat>
+          <inkml:channel name="X" type="integer" min="-2.14748E9" max="2.14748E9" units="cm"/>
+          <inkml:channel name="Y" type="integer" min="-2.14748E9" max="2.14748E9" units="cm"/>
+          <inkml:channel name="F" type="integer" max="32767" units="dev"/>
+          <inkml:channel name="OA" type="integer" max="360" units="deg"/>
+          <inkml:channel name="OE" type="integer" max="90" units="deg"/>
+        </inkml:traceFormat>
+        <inkml:channelProperties>
+          <inkml:channelProperty channel="X" name="resolution" value="1000" units="1/cm"/>
+          <inkml:channelProperty channel="Y" name="resolution" value="1000" units="1/cm"/>
+          <inkml:channelProperty channel="F" name="resolution" value="0" units="1/dev"/>
+          <inkml:channelProperty channel="OA" name="resolution" value="1000" units="1/deg"/>
+          <inkml:channelProperty channel="OE" name="resolution" value="1000" units="1/deg"/>
+        </inkml:channelProperties>
+      </inkml:inkSource>
+      <inkml:timestamp xml:id="ts0" timeString="2026-01-16T12:48:06.905"/>
+    </inkml:context>
+    <inkml:brush xml:id="br0">
+      <inkml:brushProperty name="width" value="0.025" units="cm"/>
+      <inkml:brushProperty name="height" value="0.025" units="cm"/>
+      <inkml:brushProperty name="color" value="#5B2D90"/>
+    </inkml:brush>
+  </inkml:definitions>
+  <inkml:trace contextRef="#ctx0" brushRef="#br0">24 123 3625 0 0,'-5'12'12876'0'0,"2"16"-9321"0"0,1 30-2731 0 0,4 34-254 0 0,-8-97-4455 0 0,0-8-840 0 0,5 6 376 0 0,0 4-789 0 0</inkml:trace>
+  <inkml:trace contextRef="#ctx0" brushRef="#br0" timeOffset="343.95">8 0 9754 0 0,'-1'1'371'0'0,"0"0"0"0"0,1 0 0 0 0,-1 0 0 0 0,0-1 0 0 0,1 1 0 0 0,-1 0 0 0 0,1 0 0 0 0,-1 0 0 0 0,1 0 0 0 0,0 0 0 0 0,-1 1 0 0 0,1-1 0 0 0,0 0 0 0 0,0 0 0 0 0,0 0 0 0 0,-1 0 0 0 0,1 0 0 0 0,1 0 0 0 0,-1 2 0 0 0,5 2-628 0 0,7-10-6211 0 0</inkml:trace>
+</inkml:ink>
+</file>
+
+<file path=word/ink/ink20.xml><?xml version="1.0" encoding="utf-8"?>
+<inkml:ink xmlns:inkml="http://www.w3.org/2003/InkML">
+  <inkml:definitions>
+    <inkml:context xml:id="ctx0">
+      <inkml:inkSource xml:id="inkSrc0">
+        <inkml:traceFormat>
+          <inkml:channel name="X" type="integer" min="-2.14748E9" max="2.14748E9" units="cm"/>
+          <inkml:channel name="Y" type="integer" min="-2.14748E9" max="2.14748E9" units="cm"/>
+          <inkml:channel name="F" type="integer" max="32767" units="dev"/>
+        </inkml:traceFormat>
+        <inkml:channelProperties>
+          <inkml:channelProperty channel="X" name="resolution" value="1000" units="1/cm"/>
+          <inkml:channelProperty channel="Y" name="resolution" value="1000" units="1/cm"/>
+          <inkml:channelProperty channel="F" name="resolution" value="0" units="1/dev"/>
+        </inkml:channelProperties>
+      </inkml:inkSource>
+      <inkml:timestamp xml:id="ts0" timeString="2026-01-16T12:38:40.831"/>
+    </inkml:context>
+    <inkml:brush xml:id="br0">
+      <inkml:brushProperty name="width" value="0.035" units="cm"/>
+      <inkml:brushProperty name="height" value="0.035" units="cm"/>
+      <inkml:brushProperty name="color" value="#66CC00"/>
+    </inkml:brush>
+  </inkml:definitions>
+  <inkml:trace contextRef="#ctx0" brushRef="#br0">430 0 22634,'-429'3257'0</inkml:trace>
+</inkml:ink>
+</file>
+
+<file path=word/ink/ink21.xml><?xml version="1.0" encoding="utf-8"?>
+<inkml:ink xmlns:inkml="http://www.w3.org/2003/InkML">
+  <inkml:definitions>
+    <inkml:context xml:id="ctx0">
+      <inkml:inkSource xml:id="inkSrc0">
+        <inkml:traceFormat>
+          <inkml:channel name="X" type="integer" min="-2.14748E9" max="2.14748E9" units="cm"/>
+          <inkml:channel name="Y" type="integer" min="-2.14748E9" max="2.14748E9" units="cm"/>
+          <inkml:channel name="F" type="integer" max="32767" units="dev"/>
+        </inkml:traceFormat>
+        <inkml:channelProperties>
+          <inkml:channelProperty channel="X" name="resolution" value="1000" units="1/cm"/>
+          <inkml:channelProperty channel="Y" name="resolution" value="1000" units="1/cm"/>
+          <inkml:channelProperty channel="F" name="resolution" value="0" units="1/dev"/>
+        </inkml:channelProperties>
+      </inkml:inkSource>
+      <inkml:timestamp xml:id="ts0" timeString="2026-01-16T12:33:40.202"/>
+    </inkml:context>
+    <inkml:brush xml:id="br0">
+      <inkml:brushProperty name="width" value="0.035" units="cm"/>
+      <inkml:brushProperty name="height" value="0.035" units="cm"/>
+      <inkml:brushProperty name="color" value="#E71224"/>
+    </inkml:brush>
+  </inkml:definitions>
+  <inkml:trace contextRef="#ctx0" brushRef="#br0">0 0 22837,'921'35'0</inkml:trace>
+</inkml:ink>
+</file>
+
+<file path=word/ink/ink22.xml><?xml version="1.0" encoding="utf-8"?>
+<inkml:ink xmlns:inkml="http://www.w3.org/2003/InkML">
+  <inkml:definitions>
+    <inkml:context xml:id="ctx0">
+      <inkml:inkSource xml:id="inkSrc0">
+        <inkml:traceFormat>
+          <inkml:channel name="X" type="integer" min="-2.14748E9" max="2.14748E9" units="cm"/>
+          <inkml:channel name="Y" type="integer" min="-2.14748E9" max="2.14748E9" units="cm"/>
+          <inkml:channel name="F" type="integer" max="32767" units="dev"/>
+          <inkml:channel name="OA" type="integer" max="360" units="deg"/>
+          <inkml:channel name="OE" type="integer" max="90" units="deg"/>
+        </inkml:traceFormat>
+        <inkml:channelProperties>
+          <inkml:channelProperty channel="X" name="resolution" value="1000" units="1/cm"/>
+          <inkml:channelProperty channel="Y" name="resolution" value="1000" units="1/cm"/>
+          <inkml:channelProperty channel="F" name="resolution" value="0" units="1/dev"/>
+          <inkml:channelProperty channel="OA" name="resolution" value="1000" units="1/deg"/>
+          <inkml:channelProperty channel="OE" name="resolution" value="1000" units="1/deg"/>
+        </inkml:channelProperties>
+      </inkml:inkSource>
+      <inkml:timestamp xml:id="ts0" timeString="2026-01-16T12:33:24.012"/>
+    </inkml:context>
+    <inkml:brush xml:id="br0">
+      <inkml:brushProperty name="width" value="0.035" units="cm"/>
+      <inkml:brushProperty name="height" value="0.035" units="cm"/>
+      <inkml:brushProperty name="color" value="#E71224"/>
+    </inkml:brush>
+  </inkml:definitions>
+  <inkml:trace contextRef="#ctx0" brushRef="#br0">39 123 5593 0 0,'1'24'2836'0'0,"1"-14"-2505"0"0,0-18 1387 0 0,-3 2-637 0 0,-1 1 0 0 0,1-1-1 0 0,-1 1 1 0 0,0-1-1 0 0,-5-9 1 0 0,4 9-1037 0 0,0-1 1 0 0,0 1-1 0 0,1 0 1 0 0,0-1-1 0 0,0 0 0 0 0,0 0 1 0 0,1 0-1 0 0,0 1 0 0 0,0-1 1 0 0,1 0-1 0 0,0-9 0 0 0,0 16-40 0 0,1-1-1 0 0,-1 0 1 0 0,0 1-1 0 0,0-1 1 0 0,1 0-1 0 0,-1 0 1 0 0,0 1-1 0 0,0-1 0 0 0,0 0 1 0 0,0 1-1 0 0,0-1 1 0 0,0 0-1 0 0,0 0 1 0 0,0 1-1 0 0,-1-1 1 0 0,1 0-1 0 0,0 1 0 0 0,0-1 1 0 0,0 0-1 0 0,-1 1 1 0 0,1-1-1 0 0,0 0 1 0 0,-1 0-1 0 0,0 2 0 0 0,1-1 0 0 0,-1 0 0 0 0,0 1 1 0 0,1 0-1 0 0,-1-1 0 0 0,1 1 0 0 0,0-1 0 0 0,-1 1 0 0 0,1-1 0 0 0,-1 1 0 0 0,1 0 0 0 0,0-1 1 0 0,-1 1-1 0 0,1 0 0 0 0,0 0 0 0 0,0-1 0 0 0,0 1 0 0 0,0 0 0 0 0,0-1 0 0 0,-1 1 0 0 0,1 0 1 0 0,0 0-1 0 0,1 0 0 0 0,-2 5-109 0 0,1 1 0 0 0,0-1 0 0 0,1 0 1 0 0,-1 0-1 0 0,1 0 0 0 0,3 8 0 0 0,1 26-780 0 0</inkml:trace>
+  <inkml:trace contextRef="#ctx0" brushRef="#br0" timeOffset="786.82">41 144 7130 0 0,'0'0'1010'0'0,"6"-3"5393"0"0,17-11-4708 0 0,62-84-355 0 0,-82 95-1883 0 0,-5 7 846 0 0,-16 20 732 0 0,-3 4-2578 0 0,4-4-5758 0 0</inkml:trace>
+</inkml:ink>
+</file>
+
+<file path=word/ink/ink23.xml><?xml version="1.0" encoding="utf-8"?>
+<inkml:ink xmlns:inkml="http://www.w3.org/2003/InkML">
+  <inkml:definitions>
+    <inkml:context xml:id="ctx0">
+      <inkml:inkSource xml:id="inkSrc0">
+        <inkml:traceFormat>
+          <inkml:channel name="X" type="integer" min="-2.14748E9" max="2.14748E9" units="cm"/>
+          <inkml:channel name="Y" type="integer" min="-2.14748E9" max="2.14748E9" units="cm"/>
+          <inkml:channel name="F" type="integer" max="32767" units="dev"/>
+        </inkml:traceFormat>
+        <inkml:channelProperties>
+          <inkml:channelProperty channel="X" name="resolution" value="1000" units="1/cm"/>
+          <inkml:channelProperty channel="Y" name="resolution" value="1000" units="1/cm"/>
+          <inkml:channelProperty channel="F" name="resolution" value="0" units="1/dev"/>
+        </inkml:channelProperties>
+      </inkml:inkSource>
+      <inkml:timestamp xml:id="ts0" timeString="2026-01-16T12:33:22.249"/>
+    </inkml:context>
+    <inkml:brush xml:id="br0">
+      <inkml:brushProperty name="width" value="0.035" units="cm"/>
+      <inkml:brushProperty name="height" value="0.035" units="cm"/>
+      <inkml:brushProperty name="color" value="#E71224"/>
+    </inkml:brush>
+  </inkml:definitions>
+  <inkml:trace contextRef="#ctx0" brushRef="#br0">227 1 20514,'-226'997'0</inkml:trace>
+</inkml:ink>
+</file>
+
+<file path=word/ink/ink24.xml><?xml version="1.0" encoding="utf-8"?>
+<inkml:ink xmlns:inkml="http://www.w3.org/2003/InkML">
+  <inkml:definitions>
+    <inkml:context xml:id="ctx0">
+      <inkml:inkSource xml:id="inkSrc0">
+        <inkml:traceFormat>
+          <inkml:channel name="X" type="integer" min="-2.14748E9" max="2.14748E9" units="cm"/>
+          <inkml:channel name="Y" type="integer" min="-2.14748E9" max="2.14748E9" units="cm"/>
+          <inkml:channel name="F" type="integer" max="32767" units="dev"/>
+          <inkml:channel name="OA" type="integer" max="360" units="deg"/>
+          <inkml:channel name="OE" type="integer" max="90" units="deg"/>
+        </inkml:traceFormat>
+        <inkml:channelProperties>
+          <inkml:channelProperty channel="X" name="resolution" value="1000" units="1/cm"/>
+          <inkml:channelProperty channel="Y" name="resolution" value="1000" units="1/cm"/>
+          <inkml:channelProperty channel="F" name="resolution" value="0" units="1/dev"/>
+          <inkml:channelProperty channel="OA" name="resolution" value="1000" units="1/deg"/>
+          <inkml:channelProperty channel="OE" name="resolution" value="1000" units="1/deg"/>
+        </inkml:channelProperties>
+      </inkml:inkSource>
+      <inkml:timestamp xml:id="ts0" timeString="2026-01-16T12:33:15.664"/>
+    </inkml:context>
+    <inkml:brush xml:id="br0">
+      <inkml:brushProperty name="width" value="0.035" units="cm"/>
+      <inkml:brushProperty name="height" value="0.035" units="cm"/>
+      <inkml:brushProperty name="color" value="#E71224"/>
+    </inkml:brush>
+  </inkml:definitions>
+  <inkml:trace contextRef="#ctx0" brushRef="#br0">92 139 7578 0 0,'0'0'135'0'0,"-1"0"0"0"0,1 1 0 0 0,0-1 1 0 0,0 0-1 0 0,-1 0 0 0 0,1 0 0 0 0,0 0 1 0 0,0 0-1 0 0,0 0 0 0 0,-1 0 1 0 0,1 0-1 0 0,0 1 0 0 0,0-1 0 0 0,0 0 1 0 0,-1 0-1 0 0,1 0 0 0 0,0 0 0 0 0,0 1 1 0 0,0-1-1 0 0,0 0 0 0 0,0 0 0 0 0,-1 0 1 0 0,1 1-1 0 0,0-1 0 0 0,0 0 1 0 0,0 0-1 0 0,0 1 0 0 0,0-1 0 0 0,0 0 1 0 0,0 0-1 0 0,0 0 0 0 0,0 1 0 0 0,0-1 1 0 0,0 0-1 0 0,0 0 0 0 0,0 1 0 0 0,0-1 1 0 0,0 0-1 0 0,0 1 0 0 0,2-1 1950 0 0,2-10-706 0 0,3-12 488 0 0,16-35 0 0 0,-9 24-1418 0 0,-5 17-397 0 0,-4 8 57 0 0,-9 11 129 0 0,3-2-266 0 0,1-1 28 0 0,-4 9 21 0 0,0 0 0 0 0,-1 0 1 0 0,-1-1-1 0 0,0 0 1 0 0,0 0-1 0 0,-12 12 0 0 0,16-17-211 0 0,0-1-1 0 0,0 1 1 0 0,0 0-1 0 0,1 0 1 0 0,-1 0-1 0 0,1 0 1 0 0,-1 0-1 0 0,0 7 1 0 0,-2 14-8713 0 0</inkml:trace>
+  <inkml:trace contextRef="#ctx0" brushRef="#br0" timeOffset="836.14">1 8 4881 0 0,'0'-1'119'0'0,"0"1"0"0"0,0 0 0 0 0,0 0 0 0 0,0-1 0 0 0,0 1 0 0 0,0 0 0 0 0,0 0 0 0 0,1-1-1 0 0,-1 1 1 0 0,0 0 0 0 0,0 0 0 0 0,0 0 0 0 0,0-1 0 0 0,1 1 0 0 0,-1 0 0 0 0,0 0 0 0 0,0 0 0 0 0,0 0 0 0 0,1-1 0 0 0,-1 1 0 0 0,0 0 0 0 0,0 0 0 0 0,1 0 0 0 0,-1 0 0 0 0,0 0-1 0 0,0 0 1 0 0,1 0 0 0 0,-1 0 0 0 0,0 0 0 0 0,0 0 0 0 0,1 0 0 0 0,-1 0 0 0 0,0 0 0 0 0,0 0 0 0 0,1 0 0 0 0,-1 0 0 0 0,0 0 0 0 0,0 0 0 0 0,1 0 0 0 0,-1 0 0 0 0,0 0-1 0 0,0 0 1 0 0,1 0 0 0 0,-1 0 0 0 0,0 1 0 0 0,0-1 0 0 0,1 0 0 0 0,-1 0 0 0 0,0 0 0 0 0,0 0 0 0 0,0 1 0 0 0,0-1 0 0 0,1 0 0 0 0,-1 0 0 0 0,0 0 0 0 0,0 1 0 0 0,0-1-1 0 0,14 12 1140 0 0,-4 11-476 0 0,-7-16-833 0 0,0 0 1 0 0,0 0-1 0 0,1-1 1 0 0,0 1-1 0 0,0-1 1 0 0,1 0-1 0 0,0 0 1 0 0,0 0-1 0 0,7 7 1 0 0,-5-7-4643 0 0</inkml:trace>
+</inkml:ink>
+</file>
+
+<file path=word/ink/ink25.xml><?xml version="1.0" encoding="utf-8"?>
+<inkml:ink xmlns:inkml="http://www.w3.org/2003/InkML">
+  <inkml:definitions>
+    <inkml:context xml:id="ctx0">
+      <inkml:inkSource xml:id="inkSrc0">
+        <inkml:traceFormat>
+          <inkml:channel name="X" type="integer" min="-2.14748E9" max="2.14748E9" units="cm"/>
+          <inkml:channel name="Y" type="integer" min="-2.14748E9" max="2.14748E9" units="cm"/>
+          <inkml:channel name="F" type="integer" max="32767" units="dev"/>
+        </inkml:traceFormat>
+        <inkml:channelProperties>
+          <inkml:channelProperty channel="X" name="resolution" value="1000" units="1/cm"/>
+          <inkml:channelProperty channel="Y" name="resolution" value="1000" units="1/cm"/>
+          <inkml:channelProperty channel="F" name="resolution" value="0" units="1/dev"/>
+        </inkml:channelProperties>
+      </inkml:inkSource>
+      <inkml:timestamp xml:id="ts0" timeString="2026-01-16T12:33:05.745"/>
+    </inkml:context>
+    <inkml:brush xml:id="br0">
+      <inkml:brushProperty name="width" value="0.035" units="cm"/>
+      <inkml:brushProperty name="height" value="0.035" units="cm"/>
+      <inkml:brushProperty name="color" value="#E71224"/>
+    </inkml:brush>
+  </inkml:definitions>
+  <inkml:trace contextRef="#ctx0" brushRef="#br0">0 1 16851,'353'1888'0</inkml:trace>
+</inkml:ink>
+</file>
+
+<file path=word/ink/ink26.xml><?xml version="1.0" encoding="utf-8"?>
+<inkml:ink xmlns:inkml="http://www.w3.org/2003/InkML">
+  <inkml:definitions>
+    <inkml:context xml:id="ctx0">
+      <inkml:inkSource xml:id="inkSrc0">
+        <inkml:traceFormat>
+          <inkml:channel name="X" type="integer" min="-2.14748E9" max="2.14748E9" units="cm"/>
+          <inkml:channel name="Y" type="integer" min="-2.14748E9" max="2.14748E9" units="cm"/>
+          <inkml:channel name="F" type="integer" max="32767" units="dev"/>
+        </inkml:traceFormat>
+        <inkml:channelProperties>
+          <inkml:channelProperty channel="X" name="resolution" value="1000" units="1/cm"/>
+          <inkml:channelProperty channel="Y" name="resolution" value="1000" units="1/cm"/>
+          <inkml:channelProperty channel="F" name="resolution" value="0" units="1/dev"/>
+        </inkml:channelProperties>
+      </inkml:inkSource>
+      <inkml:timestamp xml:id="ts0" timeString="2026-01-16T12:33:02.814"/>
+    </inkml:context>
+    <inkml:brush xml:id="br0">
+      <inkml:brushProperty name="width" value="0.035" units="cm"/>
+      <inkml:brushProperty name="height" value="0.035" units="cm"/>
+      <inkml:brushProperty name="color" value="#E71224"/>
+    </inkml:brush>
+  </inkml:definitions>
+  <inkml:trace contextRef="#ctx0" brushRef="#br0">0 8 22867,'434'0'0</inkml:trace>
+</inkml:ink>
+</file>
+
+<file path=word/ink/ink27.xml><?xml version="1.0" encoding="utf-8"?>
+<inkml:ink xmlns:inkml="http://www.w3.org/2003/InkML">
+  <inkml:definitions>
+    <inkml:context xml:id="ctx0">
+      <inkml:inkSource xml:id="inkSrc0">
+        <inkml:traceFormat>
+          <inkml:channel name="X" type="integer" min="-2.14748E9" max="2.14748E9" units="cm"/>
+          <inkml:channel name="Y" type="integer" min="-2.14748E9" max="2.14748E9" units="cm"/>
+          <inkml:channel name="F" type="integer" max="32767" units="dev"/>
+          <inkml:channel name="OA" type="integer" max="360" units="deg"/>
+          <inkml:channel name="OE" type="integer" max="90" units="deg"/>
+        </inkml:traceFormat>
+        <inkml:channelProperties>
+          <inkml:channelProperty channel="X" name="resolution" value="1000" units="1/cm"/>
+          <inkml:channelProperty channel="Y" name="resolution" value="1000" units="1/cm"/>
+          <inkml:channelProperty channel="F" name="resolution" value="0" units="1/dev"/>
+          <inkml:channelProperty channel="OA" name="resolution" value="1000" units="1/deg"/>
+          <inkml:channelProperty channel="OE" name="resolution" value="1000" units="1/deg"/>
+        </inkml:channelProperties>
+      </inkml:inkSource>
+      <inkml:timestamp xml:id="ts0" timeString="2026-01-16T12:32:56.447"/>
+    </inkml:context>
+    <inkml:brush xml:id="br0">
+      <inkml:brushProperty name="width" value="0.035" units="cm"/>
+      <inkml:brushProperty name="height" value="0.035" units="cm"/>
+      <inkml:brushProperty name="color" value="#E71224"/>
+    </inkml:brush>
+  </inkml:definitions>
+  <inkml:trace contextRef="#ctx0" brushRef="#br0">1263 0 6169 0 0,'-24'6'8506'0'0,"-2"1"-3740"0"0,20-5-4600 0 0,0 0 0 0 0,0 1 0 0 0,0-1 0 0 0,0 1 0 0 0,1 1 0 0 0,0-1 0 0 0,-1 1 0 0 0,1 0 0 0 0,0 0 0 0 0,1 1 0 0 0,-6 5 0 0 0,-19 16 287 0 0,12-13-166 0 0,1 2 0 0 0,-21 24 0 0 0,-15 13 122 0 0,29-29-231 0 0,2 2 0 0 0,0 0 0 0 0,1 1 0 0 0,2 1 0 0 0,-21 40 0 0 0,1-4 199 0 0,-23 47 376 0 0,-10 14 137 0 0,-5 12-1006 0 0,62-109 331 0 0,-5 16-4 0 0,2 0 0 0 0,-20 75 0 0 0,-1 5 127 0 0,-15 32-330 0 0,-45 113-10 0 0,80-219 153 0 0,-18 74 0 0 0,25-82-119 0 0,-53 219-189 0 0,51-195-22 0 0,-16 80 398 0 0,-26 186-57 0 0,48-284-511 0 0,-12 46-1 0 0,13-62 369 0 0,1 0-1 0 0,0 33 1 0 0,-3 22 48 0 0,-19 242-47 0 0,23-242-248 0 0,0-23 94 0 0,-4 121 161 0 0,8-141-44 0 0,-1 8 7 0 0,9 72 0 0 0,-5-71 59 0 0,-3-48-49 0 0,-4 13 52 0 0,4-17-64 0 0,0 0-1 0 0,0 1 1 0 0,0-1-1 0 0,0 0 1 0 0,0 0-1 0 0,0 0 0 0 0,0 0 1 0 0,0 0-1 0 0,0 1 1 0 0,0-1-1 0 0,0 0 1 0 0,0 0-1 0 0,0 0 1 0 0,0 0-1 0 0,0 0 0 0 0,0 1 1 0 0,0-1-1 0 0,0 0 1 0 0,0 0-1 0 0,0 0 1 0 0,-1 0-1 0 0,1 0 1 0 0,0 0-1 0 0,0 0 0 0 0,0 1 1 0 0,0-1-1 0 0,0 0 1 0 0,0 0-1 0 0,0 0 1 0 0,-1 0-1 0 0,1 0 1 0 0,0 0-1 0 0,0 0 0 0 0,0 0 1 0 0,0 0-1 0 0,0 0 1 0 0,-1 0-1 0 0,1 0 1 0 0,0 0-1 0 0,0 0 1 0 0,0 0-1 0 0,0 0 0 0 0,0 0 1 0 0,-1 0-1 0 0,1 0 1 0 0,0 0-1 0 0,0 0 1 0 0,0 0-1 0 0,0 0 0 0 0,0 0 1 0 0,-1 0-1 0 0,1 0 1 0 0,0 0-1 0 0,0 0 1 0 0,0 0-1 0 0,0-1 1 0 0,0 1-1 0 0,0 0 0 0 0,-1 0 1 0 0,1 0-1 0 0,0 0 1 0 0,0 0-1 0 0,0 0 1 0 0,0-1-1 0 0,-9-3-1051 0 0</inkml:trace>
+</inkml:ink>
+</file>
+
+<file path=word/ink/ink28.xml><?xml version="1.0" encoding="utf-8"?>
+<inkml:ink xmlns:inkml="http://www.w3.org/2003/InkML">
+  <inkml:definitions>
+    <inkml:context xml:id="ctx0">
+      <inkml:inkSource xml:id="inkSrc0">
+        <inkml:traceFormat>
+          <inkml:channel name="X" type="integer" min="-2.14748E9" max="2.14748E9" units="cm"/>
+          <inkml:channel name="Y" type="integer" min="-2.14748E9" max="2.14748E9" units="cm"/>
+          <inkml:channel name="F" type="integer" max="32767" units="dev"/>
+          <inkml:channel name="OA" type="integer" max="360" units="deg"/>
+          <inkml:channel name="OE" type="integer" max="90" units="deg"/>
+        </inkml:traceFormat>
+        <inkml:channelProperties>
+          <inkml:channelProperty channel="X" name="resolution" value="1000" units="1/cm"/>
+          <inkml:channelProperty channel="Y" name="resolution" value="1000" units="1/cm"/>
+          <inkml:channelProperty channel="F" name="resolution" value="0" units="1/dev"/>
+          <inkml:channelProperty channel="OA" name="resolution" value="1000" units="1/deg"/>
+          <inkml:channelProperty channel="OE" name="resolution" value="1000" units="1/deg"/>
+        </inkml:channelProperties>
+      </inkml:inkSource>
+      <inkml:timestamp xml:id="ts0" timeString="2026-01-16T12:31:54.826"/>
+    </inkml:context>
+    <inkml:brush xml:id="br0">
+      <inkml:brushProperty name="width" value="0.05" units="cm"/>
+      <inkml:brushProperty name="height" value="0.05" units="cm"/>
+      <inkml:brushProperty name="color" value="#FFC114"/>
+    </inkml:brush>
+  </inkml:definitions>
+  <inkml:trace contextRef="#ctx0" brushRef="#br0">169 189 7314 0 0,'10'17'9016'0'0,"-10"-20"-8772"0"0,0 0 0 0 0,0 0 0 0 0,0 0 0 0 0,0 0 0 0 0,-1 0 0 0 0,1 0-1 0 0,-1 0 1 0 0,0 0 0 0 0,0 0 0 0 0,0 0 0 0 0,-1 0 0 0 0,1 1 0 0 0,-1-1 0 0 0,1 1 0 0 0,-3-4-1 0 0,-8-18 124 0 0,6-23-180 0 0,6 41-95 0 0,-1 0-1 0 0,1 1 1 0 0,-1-1 0 0 0,0 1-1 0 0,0-1 1 0 0,0 0 0 0 0,-1 1-1 0 0,0 0 1 0 0,0-1 0 0 0,-1 1-1 0 0,-2-5 1 0 0,-5-2 349 0 0,7 10 47 0 0,4 6 115 0 0,11 18-461 0 0,-8-16-138 0 0,0 1-1 0 0,-1 0 1 0 0,0 1 0 0 0,0-1 0 0 0,4 15-1 0 0,-5-8-495 0 0,1 1-1 0 0,-1 25 1 0 0</inkml:trace>
+  <inkml:trace contextRef="#ctx0" brushRef="#br0" timeOffset="938">143 240 4833 0 0,'-4'4'6621'0'0,"-12"11"-547"0"0,-12 5-4186 0 0,17-12-1561 0 0,0 0 1 0 0,-1-1-1 0 0,-17 9 1 0 0,17-9-206 0 0,-5 2-27 0 0,14-9 78 0 0,8-5 168 0 0,-2 2-319 0 0,1 1 0 0 0,-1-1 1 0 0,1 1-1 0 0,-1 0 1 0 0,1 1-1 0 0,0-1 1 0 0,5-1-1 0 0,-5 1-33 0 0,1 1 0 0 0,-1-1-1 0 0,1 0 1 0 0,-1 0 0 0 0,0-1-1 0 0,0 1 1 0 0,6-6 0 0 0,9-9-35 0 0,-14 13-126 0 0,0 0 0 0 0,0-1 1 0 0,0 0-1 0 0,6-9 1 0 0,-7 13-2339 0 0</inkml:trace>
+</inkml:ink>
+</file>
+
+<file path=word/ink/ink29.xml><?xml version="1.0" encoding="utf-8"?>
+<inkml:ink xmlns:inkml="http://www.w3.org/2003/InkML">
+  <inkml:definitions>
+    <inkml:context xml:id="ctx0">
+      <inkml:inkSource xml:id="inkSrc0">
+        <inkml:traceFormat>
+          <inkml:channel name="X" type="integer" min="-2.14748E9" max="2.14748E9" units="cm"/>
+          <inkml:channel name="Y" type="integer" min="-2.14748E9" max="2.14748E9" units="cm"/>
+          <inkml:channel name="F" type="integer" max="32767" units="dev"/>
+        </inkml:traceFormat>
+        <inkml:channelProperties>
+          <inkml:channelProperty channel="X" name="resolution" value="1000" units="1/cm"/>
+          <inkml:channelProperty channel="Y" name="resolution" value="1000" units="1/cm"/>
+          <inkml:channelProperty channel="F" name="resolution" value="0" units="1/dev"/>
+        </inkml:channelProperties>
+      </inkml:inkSource>
+      <inkml:timestamp xml:id="ts0" timeString="2026-01-16T12:31:52.961"/>
+    </inkml:context>
+    <inkml:brush xml:id="br0">
+      <inkml:brushProperty name="width" value="0.05" units="cm"/>
+      <inkml:brushProperty name="height" value="0.05" units="cm"/>
+      <inkml:brushProperty name="color" value="#FFC114"/>
+    </inkml:brush>
+  </inkml:definitions>
+  <inkml:trace contextRef="#ctx0" brushRef="#br0">0 0 25524,'6367'1679'0</inkml:trace>
+</inkml:ink>
+</file>
+
+<file path=word/ink/ink3.xml><?xml version="1.0" encoding="utf-8"?>
+<inkml:ink xmlns:inkml="http://www.w3.org/2003/InkML">
+  <inkml:definitions>
+    <inkml:context xml:id="ctx0">
+      <inkml:inkSource xml:id="inkSrc0">
+        <inkml:traceFormat>
+          <inkml:channel name="X" type="integer" min="-2.14748E9" max="2.14748E9" units="cm"/>
+          <inkml:channel name="Y" type="integer" min="-2.14748E9" max="2.14748E9" units="cm"/>
+          <inkml:channel name="F" type="integer" max="32767" units="dev"/>
+          <inkml:channel name="OA" type="integer" max="360" units="deg"/>
+          <inkml:channel name="OE" type="integer" max="90" units="deg"/>
+        </inkml:traceFormat>
+        <inkml:channelProperties>
+          <inkml:channelProperty channel="X" name="resolution" value="1000" units="1/cm"/>
+          <inkml:channelProperty channel="Y" name="resolution" value="1000" units="1/cm"/>
+          <inkml:channelProperty channel="F" name="resolution" value="0" units="1/dev"/>
+          <inkml:channelProperty channel="OA" name="resolution" value="1000" units="1/deg"/>
+          <inkml:channelProperty channel="OE" name="resolution" value="1000" units="1/deg"/>
+        </inkml:channelProperties>
+      </inkml:inkSource>
+      <inkml:timestamp xml:id="ts0" timeString="2026-01-16T12:48:01.304"/>
+    </inkml:context>
+    <inkml:brush xml:id="br0">
+      <inkml:brushProperty name="width" value="0.025" units="cm"/>
+      <inkml:brushProperty name="height" value="0.025" units="cm"/>
+      <inkml:brushProperty name="color" value="#5B2D90"/>
+    </inkml:brush>
+  </inkml:definitions>
+  <inkml:trace contextRef="#ctx0" brushRef="#br0">173 15 8362 0 0,'-5'-6'9025'0'0,"4"6"-8873"0"0,1-1 0 0 0,0 1-1 0 0,0-1 1 0 0,-1 1 0 0 0,1-1 0 0 0,0 1 0 0 0,-1-1-1 0 0,1 1 1 0 0,-1 0 0 0 0,1-1 0 0 0,-1 1 0 0 0,1-1-1 0 0,0 1 1 0 0,-1 0 0 0 0,1-1 0 0 0,-1 1-1 0 0,0 0 1 0 0,1 0 0 0 0,-1-1 0 0 0,1 1 0 0 0,-1 0-1 0 0,1 0 1 0 0,-1 0 0 0 0,0 0 0 0 0,1 0-1 0 0,-1 0 1 0 0,1 0 0 0 0,-1 0 0 0 0,1 0 0 0 0,-1 0-1 0 0,0 0 1 0 0,1 0 0 0 0,-1 0 0 0 0,0 1 0 0 0,-17 4 1734 0 0,11-3-1576 0 0,-1 0 0 0 0,1 1 0 0 0,0-1 1 0 0,1 1-1 0 0,-1 1 0 0 0,0-1 0 0 0,1 1 0 0 0,0 0 1 0 0,0 1-1 0 0,-7 5 0 0 0,6-3-212 0 0,1 0-1 0 0,-1 0 1 0 0,1 1 0 0 0,-10 15 0 0 0,14-19-45 0 0,0-1 0 0 0,1 1 1 0 0,0-1-1 0 0,0 1 0 0 0,0 0 1 0 0,0 0-1 0 0,1 0 0 0 0,-1-1 0 0 0,1 1 1 0 0,0 0-1 0 0,0 0 0 0 0,1 0 1 0 0,-1 0-1 0 0,1 0 0 0 0,1 5 1 0 0,-2-8-24 0 0,1 1 0 0 0,-1 0 0 0 0,1-1 0 0 0,-1 1 0 0 0,1 0 0 0 0,0-1 1 0 0,-1 1-1 0 0,1-1 0 0 0,0 1 0 0 0,0-1 0 0 0,0 0 0 0 0,0 1 0 0 0,1-1 1 0 0,-1 0-1 0 0,0 0 0 0 0,0 0 0 0 0,1 0 0 0 0,-1 0 0 0 0,1 0 0 0 0,-1 0 1 0 0,1 0-1 0 0,-1-1 0 0 0,3 2 0 0 0,2-1 13 0 0,0 0 1 0 0,0 0-1 0 0,-1-1 0 0 0,1 0 1 0 0,10 0-1 0 0,2-1 119 0 0,46-3 208 0 0,-42-4-291 0 0,-21 7-72 0 0,1 0 0 0 0,0 0-1 0 0,-1 0 1 0 0,1 0 0 0 0,0 0-1 0 0,0 1 1 0 0,-1-1 0 0 0,1 1 0 0 0,0-1-1 0 0,0 1 1 0 0,0 0 0 0 0,0 0-1 0 0,1 0 1 0 0,5 5-147 0 0,-14-15-7654 0 0,6 9 6513 0 0</inkml:trace>
+</inkml:ink>
+</file>
+
+<file path=word/ink/ink30.xml><?xml version="1.0" encoding="utf-8"?>
+<inkml:ink xmlns:inkml="http://www.w3.org/2003/InkML">
+  <inkml:definitions>
+    <inkml:context xml:id="ctx0">
+      <inkml:inkSource xml:id="inkSrc0">
+        <inkml:traceFormat>
+          <inkml:channel name="X" type="integer" min="-2.14748E9" max="2.14748E9" units="cm"/>
+          <inkml:channel name="Y" type="integer" min="-2.14748E9" max="2.14748E9" units="cm"/>
+          <inkml:channel name="F" type="integer" max="32767" units="dev"/>
+          <inkml:channel name="OA" type="integer" max="360" units="deg"/>
+          <inkml:channel name="OE" type="integer" max="90" units="deg"/>
+        </inkml:traceFormat>
+        <inkml:channelProperties>
+          <inkml:channelProperty channel="X" name="resolution" value="1000" units="1/cm"/>
+          <inkml:channelProperty channel="Y" name="resolution" value="1000" units="1/cm"/>
+          <inkml:channelProperty channel="F" name="resolution" value="0" units="1/dev"/>
+          <inkml:channelProperty channel="OA" name="resolution" value="1000" units="1/deg"/>
+          <inkml:channelProperty channel="OE" name="resolution" value="1000" units="1/deg"/>
+        </inkml:channelProperties>
+      </inkml:inkSource>
+      <inkml:timestamp xml:id="ts0" timeString="2026-01-16T12:28:19.654"/>
+    </inkml:context>
+    <inkml:brush xml:id="br0">
+      <inkml:brushProperty name="width" value="0.05" units="cm"/>
+      <inkml:brushProperty name="height" value="0.05" units="cm"/>
+      <inkml:brushProperty name="color" value="#66CC00"/>
+    </inkml:brush>
+  </inkml:definitions>
+  <inkml:trace contextRef="#ctx0" brushRef="#br0">69 173 6649 0 0,'6'-16'7101'0'0,"6"-4"-5069"0"0,5-10-1793 0 0,-17 29-226 0 0,3-6 217 0 0,0 0 0 0 0,-1-1 1 0 0,0 1-1 0 0,0-1 0 0 0,0-10 1 0 0,1 1 70 0 0,-1 31-49 0 0,-3-9-237 0 0,1 0-1 0 0,-1 0 1 0 0,0-1-1 0 0,-1 1 1 0 0,1 0-1 0 0,-5 7 1 0 0,4-7-19 0 0,1-1 1 0 0,-1 0-1 0 0,0 1 1 0 0,1-1 0 0 0,0 1-1 0 0,-1 8 1 0 0,-1 5-72 0 0,2-17 74 0 0,1 0-1 0 0,-1 0 1 0 0,1 0 0 0 0,0 0 0 0 0,-1 0 0 0 0,1 0 0 0 0,0 1-1 0 0,0-1 1 0 0,0 0 0 0 0,0 0 0 0 0,0 0 0 0 0,0 0 0 0 0,0 0-1 0 0,0 0 1 0 0,0 1 0 0 0,1 0 0 0 0,-2-9-19 0 0,1 7 20 0 0,0-1 1 0 0,0 1-1 0 0,0 0 0 0 0,0 0 0 0 0,0 0 0 0 0,0 0 0 0 0,0 0 1 0 0,0-1-1 0 0,0 1 0 0 0,0 0 0 0 0,0 0 0 0 0,0 0 0 0 0,0 0 1 0 0,0 0-1 0 0,0 0 0 0 0,0 0 0 0 0,0-1 0 0 0,-1 1 0 0 0,1 0 1 0 0,0 0-1 0 0,0 0 0 0 0,0 0 0 0 0,0 0 0 0 0,0 0 1 0 0,0 0-1 0 0,0 0 0 0 0,-1 0 0 0 0,1 0 0 0 0,0 0 0 0 0,0 0 1 0 0,0 0-1 0 0,0 0 0 0 0,0-1 0 0 0,0 1 0 0 0,-1 0 0 0 0,1 0 1 0 0,0 0-1 0 0,0 0 0 0 0,0 0 0 0 0,0 1 0 0 0,0-1 0 0 0,0 0 1 0 0,-1 0-1 0 0,1 0 0 0 0,0 0 0 0 0,0 0 0 0 0,0 0 1 0 0,0 0-1 0 0,0 0 0 0 0,0 0 0 0 0,-1 0 0 0 0,1 0 0 0 0,0 0 1 0 0,0 0-1 0 0,0 0 0 0 0,0 0 0 0 0,0 1 0 0 0,0-1 0 0 0,0 0 1 0 0,0 0-1 0 0,0 0 0 0 0,0 0 0 0 0,-1 0 0 0 0,1 0 0 0 0,0 1 1 0 0,0-1-1 0 0,0-1 14 0 0,-1 1 1 0 0,1-1-1 0 0,-1 1 1 0 0,1-1-1 0 0,-1 1 0 0 0,1 0 1 0 0,-1-1-1 0 0,0 1 1 0 0,1-1-1 0 0,-1 1 1 0 0,0 0-1 0 0,1 0 0 0 0,-1-1 1 0 0,0 1-1 0 0,0 0 1 0 0,1 0-1 0 0,-1 0 1 0 0,0 0-1 0 0,1 0 0 0 0,-1 0 1 0 0,0 0-1 0 0,-1 0 1 0 0,-13-4 270 0 0,-16-43 1061 0 0,21 18-1147 0 0,9 25-163 0 0,0 1 1 0 0,0-1-1 0 0,0 1 1 0 0,0 0-1 0 0,-1 0 0 0 0,1 0 1 0 0,-1-1-1 0 0,-3-3 1 0 0,30 43 141 0 0,-19-26-169 0 0,-1-2 0 0 0,1 1-1 0 0,11 12 1 0 0,-6 1-55 0 0,-10-20 47 0 0,-1 0-1 0 0,0-1 1 0 0,1 1-1 0 0,-1-1 1 0 0,1 1-1 0 0,-1-1 1 0 0,1 1-1 0 0,0-1 1 0 0,0 1 0 0 0,0-1-1 0 0,0 0 1 0 0,0 1-1 0 0,0-1 1 0 0,0 0-1 0 0,0 0 1 0 0,0 1-1 0 0,0-1 1 0 0,1 0-1 0 0,-1-1 1 0 0,0 1-1 0 0,1 0 1 0 0,-1 0-1 0 0,4 1 1 0 0,-5-8 83 0 0,1 1 0 0 0,0 0 1 0 0,0-1-1 0 0,0 1 0 0 0,1 0 1 0 0,0 0-1 0 0,4-8 1 0 0,1-3 54 0 0,26-55 312 0 0,-26 56-203 0 0,-6 13-244 0 0,0 0 1 0 0,0 0-1 0 0,0 0 0 0 0,0 0 1 0 0,0 0-1 0 0,0 0 0 0 0,-1-1 0 0 0,1 1 1 0 0,0-3-1 0 0,-1 5 24 0 0,0 0 0 0 0,0 1-1 0 0,0-1 1 0 0,0 0 0 0 0,0 1 0 0 0,0-1 0 0 0,0 0-1 0 0,0 1 1 0 0,0-1 0 0 0,0 0 0 0 0,0 1 0 0 0,0-1-1 0 0,0 1 1 0 0,0-1 0 0 0,0 0 0 0 0,-1 1 0 0 0,1-1-1 0 0,0 0 1 0 0,0 0 0 0 0,0 1 0 0 0,-1-1-1 0 0,1 0 1 0 0,0 1 0 0 0,0-1 0 0 0,0 0 0 0 0,-1 0-1 0 0,1 0 1 0 0,0 1 0 0 0,-1-1 0 0 0,1 0 0 0 0,0 0-1 0 0,-1 0 1 0 0,1 1 0 0 0,-1-1 0 0 0,1 0-28 0 0,0 0 0 0 0,-1 0-1 0 0,1 0 1 0 0,0 1 0 0 0,-1-1 0 0 0,1 0 0 0 0,0 0 0 0 0,-1 0 0 0 0,1 1 0 0 0,0-1 0 0 0,-1 0 0 0 0,1 1 0 0 0,0-1-1 0 0,0 0 1 0 0,0 1 0 0 0,-1-1 0 0 0,1 0 0 0 0,0 1 0 0 0,0-1 0 0 0,0 0 0 0 0,0 1 0 0 0,-1-1 0 0 0,1 0 0 0 0,0 1 0 0 0,0-1-1 0 0,0 1 1 0 0,0-1 0 0 0,0 0 0 0 0,0 1 0 0 0,0-1 0 0 0,0 1 0 0 0,0-1 0 0 0,0 0 0 0 0,1 1 0 0 0,-1-1 9 0 0,0 1-24 0 0</inkml:trace>
+</inkml:ink>
+</file>
+
+<file path=word/ink/ink31.xml><?xml version="1.0" encoding="utf-8"?>
+<inkml:ink xmlns:inkml="http://www.w3.org/2003/InkML">
+  <inkml:definitions>
+    <inkml:context xml:id="ctx0">
+      <inkml:inkSource xml:id="inkSrc0">
+        <inkml:traceFormat>
+          <inkml:channel name="X" type="integer" min="-2.14748E9" max="2.14748E9" units="cm"/>
+          <inkml:channel name="Y" type="integer" min="-2.14748E9" max="2.14748E9" units="cm"/>
+          <inkml:channel name="F" type="integer" max="32767" units="dev"/>
+        </inkml:traceFormat>
+        <inkml:channelProperties>
+          <inkml:channelProperty channel="X" name="resolution" value="1000" units="1/cm"/>
+          <inkml:channelProperty channel="Y" name="resolution" value="1000" units="1/cm"/>
+          <inkml:channelProperty channel="F" name="resolution" value="0" units="1/dev"/>
+        </inkml:channelProperties>
+      </inkml:inkSource>
+      <inkml:timestamp xml:id="ts0" timeString="2026-01-16T12:28:16.563"/>
+    </inkml:context>
+    <inkml:brush xml:id="br0">
+      <inkml:brushProperty name="width" value="0.05" units="cm"/>
+      <inkml:brushProperty name="height" value="0.05" units="cm"/>
+      <inkml:brushProperty name="color" value="#66CC00"/>
+    </inkml:brush>
+  </inkml:definitions>
+  <inkml:trace contextRef="#ctx0" brushRef="#br0">0 1 24337,'451'3523'0</inkml:trace>
+</inkml:ink>
+</file>
+
+<file path=word/ink/ink32.xml><?xml version="1.0" encoding="utf-8"?>
+<inkml:ink xmlns:inkml="http://www.w3.org/2003/InkML">
+  <inkml:definitions>
+    <inkml:context xml:id="ctx0">
+      <inkml:inkSource xml:id="inkSrc0">
+        <inkml:traceFormat>
+          <inkml:channel name="X" type="integer" min="-2.14748E9" max="2.14748E9" units="cm"/>
+          <inkml:channel name="Y" type="integer" min="-2.14748E9" max="2.14748E9" units="cm"/>
+          <inkml:channel name="F" type="integer" max="32767" units="dev"/>
+        </inkml:traceFormat>
+        <inkml:channelProperties>
+          <inkml:channelProperty channel="X" name="resolution" value="1000" units="1/cm"/>
+          <inkml:channelProperty channel="Y" name="resolution" value="1000" units="1/cm"/>
+          <inkml:channelProperty channel="F" name="resolution" value="0" units="1/dev"/>
+        </inkml:channelProperties>
+      </inkml:inkSource>
+      <inkml:timestamp xml:id="ts0" timeString="2026-01-16T12:28:01.450"/>
+    </inkml:context>
+    <inkml:brush xml:id="br0">
+      <inkml:brushProperty name="width" value="0.05" units="cm"/>
+      <inkml:brushProperty name="height" value="0.05" units="cm"/>
+      <inkml:brushProperty name="color" value="#66CC00"/>
+    </inkml:brush>
+  </inkml:definitions>
+  <inkml:trace contextRef="#ctx0" brushRef="#br0">0 3 30029,'821'-3'0</inkml:trace>
+</inkml:ink>
+</file>
+
+<file path=word/ink/ink33.xml><?xml version="1.0" encoding="utf-8"?>
+<inkml:ink xmlns:inkml="http://www.w3.org/2003/InkML">
+  <inkml:definitions>
+    <inkml:context xml:id="ctx0">
+      <inkml:inkSource xml:id="inkSrc0">
+        <inkml:traceFormat>
+          <inkml:channel name="X" type="integer" min="-2.14748E9" max="2.14748E9" units="cm"/>
+          <inkml:channel name="Y" type="integer" min="-2.14748E9" max="2.14748E9" units="cm"/>
+          <inkml:channel name="F" type="integer" max="32767" units="dev"/>
+        </inkml:traceFormat>
+        <inkml:channelProperties>
+          <inkml:channelProperty channel="X" name="resolution" value="1000" units="1/cm"/>
+          <inkml:channelProperty channel="Y" name="resolution" value="1000" units="1/cm"/>
+          <inkml:channelProperty channel="F" name="resolution" value="0" units="1/dev"/>
+        </inkml:channelProperties>
+      </inkml:inkSource>
+      <inkml:timestamp xml:id="ts0" timeString="2026-01-16T12:27:58.922"/>
+    </inkml:context>
+    <inkml:brush xml:id="br0">
+      <inkml:brushProperty name="width" value="0.05" units="cm"/>
+      <inkml:brushProperty name="height" value="0.05" units="cm"/>
+      <inkml:brushProperty name="color" value="#66CC00"/>
+    </inkml:brush>
+  </inkml:definitions>
+  <inkml:trace contextRef="#ctx0" brushRef="#br0">0 0 29448,'768'14'0</inkml:trace>
+</inkml:ink>
+</file>
+
+<file path=word/ink/ink34.xml><?xml version="1.0" encoding="utf-8"?>
+<inkml:ink xmlns:inkml="http://www.w3.org/2003/InkML">
+  <inkml:definitions>
+    <inkml:context xml:id="ctx0">
+      <inkml:inkSource xml:id="inkSrc0">
+        <inkml:traceFormat>
+          <inkml:channel name="X" type="integer" min="-2.14748E9" max="2.14748E9" units="cm"/>
+          <inkml:channel name="Y" type="integer" min="-2.14748E9" max="2.14748E9" units="cm"/>
+          <inkml:channel name="F" type="integer" max="32767" units="dev"/>
+          <inkml:channel name="OA" type="integer" max="360" units="deg"/>
+          <inkml:channel name="OE" type="integer" max="90" units="deg"/>
+        </inkml:traceFormat>
+        <inkml:channelProperties>
+          <inkml:channelProperty channel="X" name="resolution" value="1000" units="1/cm"/>
+          <inkml:channelProperty channel="Y" name="resolution" value="1000" units="1/cm"/>
+          <inkml:channelProperty channel="F" name="resolution" value="0" units="1/dev"/>
+          <inkml:channelProperty channel="OA" name="resolution" value="1000" units="1/deg"/>
+          <inkml:channelProperty channel="OE" name="resolution" value="1000" units="1/deg"/>
+        </inkml:channelProperties>
+      </inkml:inkSource>
+      <inkml:timestamp xml:id="ts0" timeString="2026-01-16T12:27:42.374"/>
+    </inkml:context>
+    <inkml:brush xml:id="br0">
+      <inkml:brushProperty name="width" value="0.05" units="cm"/>
+      <inkml:brushProperty name="height" value="0.05" units="cm"/>
+      <inkml:brushProperty name="color" value="#66CC00"/>
+    </inkml:brush>
+  </inkml:definitions>
+  <inkml:trace contextRef="#ctx0" brushRef="#br0">171 176 8026 0 0,'3'10'8344'0'0,"3"-17"-5356"0"0,8-21-2861 0 0,-13 25 703 0 0,9-20-626 0 0,-1 0 0 0 0,-2 0 1 0 0,6-24-1 0 0,-12 40-39 0 0,7-13 9 0 0,-6 15 25 0 0,-4 14 106 0 0,-16 36-16 0 0,-19 20-384 0 0,35-62-1688 0 0</inkml:trace>
+  <inkml:trace contextRef="#ctx0" brushRef="#br0" timeOffset="930.16">156 153 7570 0 0,'-4'2'10124'0'0,"-11"-20"-7264"0"0,-29-3-687 0 0,35 17-2052 0 0,0 0 1 0 0,1 0-1 0 0,-15-9 1 0 0,13 5-92 0 0,9 6 42 0 0,-1 1 0 0 0,1 0 0 0 0,0 0 0 0 0,-1 0 0 0 0,0 0 1 0 0,1 0-1 0 0,-1 0 0 0 0,1 0 0 0 0,-1 0 0 0 0,0 1 0 0 0,0-1 0 0 0,0 0 0 0 0,1 1 0 0 0,-1 0 0 0 0,0-1 0 0 0,0 1 0 0 0,-3 0 0 0 0,41 48-163 0 0,-10-30 66 0 0,-21-16 20 0 0,-1 1 1 0 0,0 0-1 0 0,0 0 1 0 0,0 0-1 0 0,0 1 1 0 0,0-1 0 0 0,0 1-1 0 0,-1 0 1 0 0,0 0-1 0 0,0 0 1 0 0,0 0-1 0 0,0 1 1 0 0,-1-1 0 0 0,4 10-1 0 0,8 6 475 0 0,-6-14-1461 0 0,-8-6 845 0 0,0 0 0 0 0,0 0 0 0 0,1 0-1 0 0,-1 0 1 0 0,0 0 0 0 0,0 0-1 0 0,0 0 1 0 0,1-1 0 0 0,-1 1 0 0 0,0 0-1 0 0,0 0 1 0 0,1-1-439 0 0,-1 1 439 0 0,0 0-1 0 0,0 0 1 0 0,0 0 0 0 0,0-1 0 0 0,0 1-1 0 0,0 0 1 0 0,1 0 0 0 0,-1-1-1 0 0,0 1 1 0 0,0 0 0 0 0,0 0 0 0 0,0 0-1 0 0,0-1 1 0 0,0 1 0 0 0,0 0-1 0 0,0 0 1 0 0,0-1 0 0 0,0 1 0 0 0,0 0-1 0 0,0 0 1 0 0,0 0 0 0 0,-1-1-1 0 0,1 1 1 0 0</inkml:trace>
+</inkml:ink>
+</file>
+
+<file path=word/ink/ink35.xml><?xml version="1.0" encoding="utf-8"?>
+<inkml:ink xmlns:inkml="http://www.w3.org/2003/InkML">
+  <inkml:definitions>
+    <inkml:context xml:id="ctx0">
+      <inkml:inkSource xml:id="inkSrc0">
+        <inkml:traceFormat>
+          <inkml:channel name="X" type="integer" min="-2.14748E9" max="2.14748E9" units="cm"/>
+          <inkml:channel name="Y" type="integer" min="-2.14748E9" max="2.14748E9" units="cm"/>
+          <inkml:channel name="F" type="integer" max="32767" units="dev"/>
+        </inkml:traceFormat>
+        <inkml:channelProperties>
+          <inkml:channelProperty channel="X" name="resolution" value="1000" units="1/cm"/>
+          <inkml:channelProperty channel="Y" name="resolution" value="1000" units="1/cm"/>
+          <inkml:channelProperty channel="F" name="resolution" value="0" units="1/dev"/>
+        </inkml:channelProperties>
+      </inkml:inkSource>
+      <inkml:timestamp xml:id="ts0" timeString="2026-01-16T12:27:40.595"/>
+    </inkml:context>
+    <inkml:brush xml:id="br0">
+      <inkml:brushProperty name="width" value="0.05" units="cm"/>
+      <inkml:brushProperty name="height" value="0.05" units="cm"/>
+      <inkml:brushProperty name="color" value="#66CC00"/>
+    </inkml:brush>
+  </inkml:definitions>
+  <inkml:trace contextRef="#ctx0" brushRef="#br0">0 1 26642,'662'2365'0</inkml:trace>
+</inkml:ink>
+</file>
+
+<file path=word/ink/ink36.xml><?xml version="1.0" encoding="utf-8"?>
+<inkml:ink xmlns:inkml="http://www.w3.org/2003/InkML">
+  <inkml:definitions>
+    <inkml:context xml:id="ctx0">
+      <inkml:inkSource xml:id="inkSrc0">
+        <inkml:traceFormat>
+          <inkml:channel name="X" type="integer" min="-2.14748E9" max="2.14748E9" units="cm"/>
+          <inkml:channel name="Y" type="integer" min="-2.14748E9" max="2.14748E9" units="cm"/>
+          <inkml:channel name="F" type="integer" max="32767" units="dev"/>
+        </inkml:traceFormat>
+        <inkml:channelProperties>
+          <inkml:channelProperty channel="X" name="resolution" value="1000" units="1/cm"/>
+          <inkml:channelProperty channel="Y" name="resolution" value="1000" units="1/cm"/>
+          <inkml:channelProperty channel="F" name="resolution" value="0" units="1/dev"/>
+        </inkml:channelProperties>
+      </inkml:inkSource>
+      <inkml:timestamp xml:id="ts0" timeString="2026-01-16T12:27:36.982"/>
+    </inkml:context>
+    <inkml:brush xml:id="br0">
+      <inkml:brushProperty name="width" value="0.05" units="cm"/>
+      <inkml:brushProperty name="height" value="0.05" units="cm"/>
+      <inkml:brushProperty name="color" value="#66CC00"/>
+    </inkml:brush>
+  </inkml:definitions>
+  <inkml:trace contextRef="#ctx0" brushRef="#br0">0 0 25231,'1414'0'0</inkml:trace>
+</inkml:ink>
+</file>
+
+<file path=word/ink/ink37.xml><?xml version="1.0" encoding="utf-8"?>
+<inkml:ink xmlns:inkml="http://www.w3.org/2003/InkML">
+  <inkml:definitions>
+    <inkml:context xml:id="ctx0">
+      <inkml:inkSource xml:id="inkSrc0">
+        <inkml:traceFormat>
+          <inkml:channel name="X" type="integer" min="-2.14748E9" max="2.14748E9" units="cm"/>
+          <inkml:channel name="Y" type="integer" min="-2.14748E9" max="2.14748E9" units="cm"/>
+          <inkml:channel name="F" type="integer" max="32767" units="dev"/>
+          <inkml:channel name="OA" type="integer" max="360" units="deg"/>
+          <inkml:channel name="OE" type="integer" max="90" units="deg"/>
+        </inkml:traceFormat>
+        <inkml:channelProperties>
+          <inkml:channelProperty channel="X" name="resolution" value="1000" units="1/cm"/>
+          <inkml:channelProperty channel="Y" name="resolution" value="1000" units="1/cm"/>
+          <inkml:channelProperty channel="F" name="resolution" value="0" units="1/dev"/>
+          <inkml:channelProperty channel="OA" name="resolution" value="1000" units="1/deg"/>
+          <inkml:channelProperty channel="OE" name="resolution" value="1000" units="1/deg"/>
+        </inkml:channelProperties>
+      </inkml:inkSource>
+      <inkml:timestamp xml:id="ts0" timeString="2026-01-16T12:27:26.842"/>
+    </inkml:context>
+    <inkml:brush xml:id="br0">
+      <inkml:brushProperty name="width" value="0.05" units="cm"/>
+      <inkml:brushProperty name="height" value="0.05" units="cm"/>
+      <inkml:brushProperty name="color" value="#66CC00"/>
+    </inkml:brush>
+  </inkml:definitions>
+  <inkml:trace contextRef="#ctx0" brushRef="#br0">173 189 3969 0 0,'-7'3'10471'0'0,"19"-33"-7393"0"0,-12 29-3034 0 0,2-22 317 0 0,2 0 0 0 0,0 1 0 0 0,12-38 1 0 0,0 27-4 0 0,-17 45 63 0 0,0 3-511 0 0,-5-5-7171 0 0</inkml:trace>
+  <inkml:trace contextRef="#ctx0" brushRef="#br0" timeOffset="745.08">178 185 8162 0 0,'-2'3'4389'0'0,"-17"9"-150"0"0,17-11-4137 0 0,0-1 0 0 0,0 1 0 0 0,0-1 0 0 0,0 0-1 0 0,0 0 1 0 0,0 0 0 0 0,-1 0 0 0 0,1 0 0 0 0,0 0 0 0 0,0 0 0 0 0,0-1-1 0 0,0 1 1 0 0,0-1 0 0 0,0 0 0 0 0,0 1 0 0 0,0-1 0 0 0,0 0-1 0 0,0 0 1 0 0,-2-2 0 0 0,-36-28 232 0 0,17 12-64 0 0,10 8-88 0 0,-8-4 558 0 0,20 14-717 0 0,1 1 0 0 0,-1 0 0 0 0,1 0 0 0 0,-1 0-1 0 0,1 0 1 0 0,-1 0 0 0 0,0 0 0 0 0,1 0 0 0 0,-1 0-1 0 0,1 0 1 0 0,-1 0 0 0 0,1 0 0 0 0,-1 1 0 0 0,1-1 0 0 0,-1 0-1 0 0,1 0 1 0 0,-1 0 0 0 0,1 1 0 0 0,-1-1 0 0 0,1 0-1 0 0,-1 1 1 0 0,1-1 0 0 0,0 0 0 0 0,-1 1 0 0 0,1-1-1 0 0,0 0 1 0 0,-1 1 0 0 0,1-1 0 0 0,0 1 0 0 0,-1-1-1 0 0,1 1 1 0 0,0-1 0 0 0,0 1 0 0 0,-1-1 0 0 0,1 1 0 0 0,0-1-1 0 0,0 1 1 0 0,0-1 0 0 0,0 1 0 0 0,0 0 0 0 0,2 6-253 0 0</inkml:trace>
+</inkml:ink>
+</file>
+
+<file path=word/ink/ink38.xml><?xml version="1.0" encoding="utf-8"?>
+<inkml:ink xmlns:inkml="http://www.w3.org/2003/InkML">
+  <inkml:definitions>
+    <inkml:context xml:id="ctx0">
+      <inkml:inkSource xml:id="inkSrc0">
+        <inkml:traceFormat>
+          <inkml:channel name="X" type="integer" min="-2.14748E9" max="2.14748E9" units="cm"/>
+          <inkml:channel name="Y" type="integer" min="-2.14748E9" max="2.14748E9" units="cm"/>
+          <inkml:channel name="F" type="integer" max="32767" units="dev"/>
+        </inkml:traceFormat>
+        <inkml:channelProperties>
+          <inkml:channelProperty channel="X" name="resolution" value="1000" units="1/cm"/>
+          <inkml:channelProperty channel="Y" name="resolution" value="1000" units="1/cm"/>
+          <inkml:channelProperty channel="F" name="resolution" value="0" units="1/dev"/>
+        </inkml:channelProperties>
+      </inkml:inkSource>
+      <inkml:timestamp xml:id="ts0" timeString="2026-01-16T12:27:25.542"/>
+    </inkml:context>
+    <inkml:brush xml:id="br0">
+      <inkml:brushProperty name="width" value="0.05" units="cm"/>
+      <inkml:brushProperty name="height" value="0.05" units="cm"/>
+      <inkml:brushProperty name="color" value="#66CC00"/>
+    </inkml:brush>
+  </inkml:definitions>
+  <inkml:trace contextRef="#ctx0" brushRef="#br0">0 0 25125,'797'1747'0</inkml:trace>
+</inkml:ink>
+</file>
+
+<file path=word/ink/ink39.xml><?xml version="1.0" encoding="utf-8"?>
+<inkml:ink xmlns:inkml="http://www.w3.org/2003/InkML">
+  <inkml:definitions>
+    <inkml:context xml:id="ctx0">
+      <inkml:inkSource xml:id="inkSrc0">
+        <inkml:traceFormat>
+          <inkml:channel name="X" type="integer" min="-2.14748E9" max="2.14748E9" units="cm"/>
+          <inkml:channel name="Y" type="integer" min="-2.14748E9" max="2.14748E9" units="cm"/>
+          <inkml:channel name="F" type="integer" max="32767" units="dev"/>
+          <inkml:channel name="OA" type="integer" max="360" units="deg"/>
+          <inkml:channel name="OE" type="integer" max="90" units="deg"/>
+        </inkml:traceFormat>
+        <inkml:channelProperties>
+          <inkml:channelProperty channel="X" name="resolution" value="1000" units="1/cm"/>
+          <inkml:channelProperty channel="Y" name="resolution" value="1000" units="1/cm"/>
+          <inkml:channelProperty channel="F" name="resolution" value="0" units="1/dev"/>
+          <inkml:channelProperty channel="OA" name="resolution" value="1000" units="1/deg"/>
+          <inkml:channelProperty channel="OE" name="resolution" value="1000" units="1/deg"/>
+        </inkml:channelProperties>
+      </inkml:inkSource>
+      <inkml:timestamp xml:id="ts0" timeString="2026-01-16T12:27:21.553"/>
+    </inkml:context>
+    <inkml:brush xml:id="br0">
+      <inkml:brushProperty name="width" value="0.05" units="cm"/>
+      <inkml:brushProperty name="height" value="0.05" units="cm"/>
+      <inkml:brushProperty name="color" value="#66CC00"/>
+    </inkml:brush>
+  </inkml:definitions>
+  <inkml:trace contextRef="#ctx0" brushRef="#br0">31 158 7114 0 0,'-1'-5'9843'0'0,"-5"-7"-9428"0"0,1 0 0 0 0,1-1 0 0 0,0 0 1 0 0,1 0-1 0 0,0 0 0 0 0,1 0 0 0 0,0 0 0 0 0,1-1 0 0 0,2-21 1 0 0,-1 33-134 0 0,1 4-25 0 0,-2 10 146 0 0,1 0-650 0 0,-1-1 0 0 0,2 1-1 0 0,0 0 1 0 0,0-1-1 0 0,5 23 1 0 0,1-29-2565 0 0,1-6-3318 0 0</inkml:trace>
+  <inkml:trace contextRef="#ctx0" brushRef="#br0" timeOffset="728.75">58 139 7017 0 0,'-2'6'7837'0'0,"5"-5"-6812"0"0,5-7-561 0 0,0-2 86 0 0,0 2 0 0 0,1-1-1 0 0,0 1 1 0 0,1 1-1 0 0,10-6 1 0 0,-10 7-482 0 0,-1-2 0 0 0,1 1 0 0 0,-1-1 0 0 0,0-1 0 0 0,8-7 1 0 0,-8 8-151 0 0,-8 12-53 0 0,-3 4-2048 0 0,-1-1-4039 0 0</inkml:trace>
+</inkml:ink>
+</file>
+
+<file path=word/ink/ink4.xml><?xml version="1.0" encoding="utf-8"?>
+<inkml:ink xmlns:inkml="http://www.w3.org/2003/InkML">
+  <inkml:definitions>
+    <inkml:context xml:id="ctx0">
+      <inkml:inkSource xml:id="inkSrc0">
+        <inkml:traceFormat>
+          <inkml:channel name="X" type="integer" min="-2.14748E9" max="2.14748E9" units="cm"/>
+          <inkml:channel name="Y" type="integer" min="-2.14748E9" max="2.14748E9" units="cm"/>
+          <inkml:channel name="F" type="integer" max="32767" units="dev"/>
+          <inkml:channel name="OA" type="integer" max="360" units="deg"/>
+          <inkml:channel name="OE" type="integer" max="90" units="deg"/>
+        </inkml:traceFormat>
+        <inkml:channelProperties>
+          <inkml:channelProperty channel="X" name="resolution" value="1000" units="1/cm"/>
+          <inkml:channelProperty channel="Y" name="resolution" value="1000" units="1/cm"/>
+          <inkml:channelProperty channel="F" name="resolution" value="0" units="1/dev"/>
+          <inkml:channelProperty channel="OA" name="resolution" value="1000" units="1/deg"/>
+          <inkml:channelProperty channel="OE" name="resolution" value="1000" units="1/deg"/>
+        </inkml:channelProperties>
+      </inkml:inkSource>
+      <inkml:timestamp xml:id="ts0" timeString="2026-01-16T12:47:48.884"/>
+    </inkml:context>
+    <inkml:brush xml:id="br0">
+      <inkml:brushProperty name="width" value="0.025" units="cm"/>
+      <inkml:brushProperty name="height" value="0.025" units="cm"/>
+      <inkml:brushProperty name="color" value="#E71224"/>
+    </inkml:brush>
+  </inkml:definitions>
+  <inkml:trace contextRef="#ctx0" brushRef="#br0">1 102 5977 0 0,'7'-1'6070'0'0,"5"-7"-3583"0"0,-7 2-1727 0 0,-1-1 1 0 0,1 0 0 0 0,-1 0-1 0 0,-1 0 1 0 0,1 0 0 0 0,-1 0-1 0 0,-1-1 1 0 0,1 0 0 0 0,2-13-1 0 0,-4 16-687 0 0,0 3 1068 0 0,0 10-569 0 0,-2 25-407 0 0,0 1-84 0 0,-3 97 80 0 0,4-130-119 0 0,0 0 0 0 0,0 0-1 0 0,0-1 1 0 0,0 1 0 0 0,-1 0 0 0 0,1 0-1 0 0,0-1 1 0 0,-1 1 0 0 0,1 0-1 0 0,0-1 1 0 0,-1 1 0 0 0,1 0 0 0 0,-1-1-1 0 0,1 1 1 0 0,-1 0 0 0 0,0-1-1 0 0,1 1 1 0 0,-1-1 0 0 0,1 1 0 0 0,-1-1-1 0 0,0 1 1 0 0,0-1 0 0 0,1 0-1 0 0,-1 1 1 0 0,0-1 0 0 0,0 1 0 0 0,-9 4 158 0 0,9-4-201 0 0,-12 9 942 0 0,32-14-287 0 0,-17 4-692 0 0,12-3 79 0 0,-11 3-29 0 0,0-1 0 0 0,0 1-1 0 0,0-1 1 0 0,1 1 0 0 0,-1-1-1 0 0,0 0 1 0 0,0-1 0 0 0,-1 1-1 0 0,1 0 1 0 0,4-3 0 0 0,-6 5 330 0 0</inkml:trace>
+</inkml:ink>
+</file>
+
+<file path=word/ink/ink40.xml><?xml version="1.0" encoding="utf-8"?>
+<inkml:ink xmlns:inkml="http://www.w3.org/2003/InkML">
+  <inkml:definitions>
+    <inkml:context xml:id="ctx0">
+      <inkml:inkSource xml:id="inkSrc0">
+        <inkml:traceFormat>
+          <inkml:channel name="X" type="integer" min="-2.14748E9" max="2.14748E9" units="cm"/>
+          <inkml:channel name="Y" type="integer" min="-2.14748E9" max="2.14748E9" units="cm"/>
+          <inkml:channel name="F" type="integer" max="32767" units="dev"/>
+        </inkml:traceFormat>
+        <inkml:channelProperties>
+          <inkml:channelProperty channel="X" name="resolution" value="1000" units="1/cm"/>
+          <inkml:channelProperty channel="Y" name="resolution" value="1000" units="1/cm"/>
+          <inkml:channelProperty channel="F" name="resolution" value="0" units="1/dev"/>
+        </inkml:channelProperties>
+      </inkml:inkSource>
+      <inkml:timestamp xml:id="ts0" timeString="2026-01-16T12:27:19.913"/>
+    </inkml:context>
+    <inkml:brush xml:id="br0">
+      <inkml:brushProperty name="width" value="0.05" units="cm"/>
+      <inkml:brushProperty name="height" value="0.05" units="cm"/>
+      <inkml:brushProperty name="color" value="#66CC00"/>
+    </inkml:brush>
+  </inkml:definitions>
+  <inkml:trace contextRef="#ctx0" brushRef="#br0">703 0 19880,'-703'1712'0</inkml:trace>
+</inkml:ink>
+</file>
+
+<file path=word/ink/ink41.xml><?xml version="1.0" encoding="utf-8"?>
+<inkml:ink xmlns:inkml="http://www.w3.org/2003/InkML">
+  <inkml:definitions>
+    <inkml:context xml:id="ctx0">
+      <inkml:inkSource xml:id="inkSrc0">
+        <inkml:traceFormat>
+          <inkml:channel name="X" type="integer" min="-2.14748E9" max="2.14748E9" units="cm"/>
+          <inkml:channel name="Y" type="integer" min="-2.14748E9" max="2.14748E9" units="cm"/>
+          <inkml:channel name="F" type="integer" max="32767" units="dev"/>
+          <inkml:channel name="OA" type="integer" max="360" units="deg"/>
+          <inkml:channel name="OE" type="integer" max="90" units="deg"/>
+        </inkml:traceFormat>
+        <inkml:channelProperties>
+          <inkml:channelProperty channel="X" name="resolution" value="1000" units="1/cm"/>
+          <inkml:channelProperty channel="Y" name="resolution" value="1000" units="1/cm"/>
+          <inkml:channelProperty channel="F" name="resolution" value="0" units="1/dev"/>
+          <inkml:channelProperty channel="OA" name="resolution" value="1000" units="1/deg"/>
+          <inkml:channelProperty channel="OE" name="resolution" value="1000" units="1/deg"/>
+        </inkml:channelProperties>
+      </inkml:inkSource>
+      <inkml:timestamp xml:id="ts0" timeString="2026-01-16T12:19:39.017"/>
+    </inkml:context>
+    <inkml:brush xml:id="br0">
+      <inkml:brushProperty name="width" value="0.025" units="cm"/>
+      <inkml:brushProperty name="height" value="0.025" units="cm"/>
+      <inkml:brushProperty name="color" value="#5B2D90"/>
+    </inkml:brush>
+  </inkml:definitions>
+  <inkml:trace contextRef="#ctx0" brushRef="#br0">144 135 5433 0 0,'0'2'6121'0'0,"6"-35"12"0"0,-4-22-5614 0 0,-2 51-229 0 0,0-5-294 0 0,-1 6 86 0 0,1-1 0 0 0,0 1 0 0 0,0-1 0 0 0,0 1 0 0 0,0-1 0 0 0,1 1 0 0 0,-1 0-1 0 0,3-6 1 0 0,-5 13-41 0 0,0 0 1 0 0,1 1-1 0 0,-1-1 0 0 0,1 0 0 0 0,0 0 0 0 0,1 1 0 0 0,-1-1 0 0 0,1 0 0 0 0,0 1 0 0 0,0-1 0 0 0,1 6 0 0 0,-3 23 153 0 0,1-28-1149 0 0,1-3-53 0 0,0 1-1 0 0,0-1 1 0 0,0 0-1 0 0,-1 0 0 0 0,1 1 1 0 0,-1-1-1 0 0,0 0 0 0 0,0 0 1 0 0,-1 3-1 0 0</inkml:trace>
+  <inkml:trace contextRef="#ctx0" brushRef="#br0" timeOffset="1046.33">128 164 2761 0 0,'-8'5'13665'0'0,"-14"-3"-7940"0"0,-35-3-5182 0 0,35 1 881 0 0,12 1-1057 0 0,1 0 1 0 0,15-5-364 0 0,3 1-174 0 0,0 0 1 0 0,1 1-1 0 0,-1 0 0 0 0,1 1 0 0 0,-1 0 0 0 0,1 0 0 0 0,13 2 0 0 0,-19 0-3934 0 0</inkml:trace>
+</inkml:ink>
+</file>
+
+<file path=word/ink/ink42.xml><?xml version="1.0" encoding="utf-8"?>
+<inkml:ink xmlns:inkml="http://www.w3.org/2003/InkML">
+  <inkml:definitions>
+    <inkml:context xml:id="ctx0">
+      <inkml:inkSource xml:id="inkSrc0">
+        <inkml:traceFormat>
+          <inkml:channel name="X" type="integer" min="-2.14748E9" max="2.14748E9" units="cm"/>
+          <inkml:channel name="Y" type="integer" min="-2.14748E9" max="2.14748E9" units="cm"/>
+          <inkml:channel name="F" type="integer" max="32767" units="dev"/>
+        </inkml:traceFormat>
+        <inkml:channelProperties>
+          <inkml:channelProperty channel="X" name="resolution" value="1000" units="1/cm"/>
+          <inkml:channelProperty channel="Y" name="resolution" value="1000" units="1/cm"/>
+          <inkml:channelProperty channel="F" name="resolution" value="0" units="1/dev"/>
+        </inkml:channelProperties>
+      </inkml:inkSource>
+      <inkml:timestamp xml:id="ts0" timeString="2026-01-16T12:19:36.864"/>
+    </inkml:context>
+    <inkml:brush xml:id="br0">
+      <inkml:brushProperty name="width" value="0.025" units="cm"/>
+      <inkml:brushProperty name="height" value="0.025" units="cm"/>
+      <inkml:brushProperty name="color" value="#5B2D90"/>
+    </inkml:brush>
+  </inkml:definitions>
+  <inkml:trace contextRef="#ctx0" brushRef="#br0">1 1 22304,'2232'1419'0</inkml:trace>
+</inkml:ink>
+</file>
+
+<file path=word/ink/ink43.xml><?xml version="1.0" encoding="utf-8"?>
+<inkml:ink xmlns:inkml="http://www.w3.org/2003/InkML">
+  <inkml:definitions>
+    <inkml:context xml:id="ctx0">
+      <inkml:inkSource xml:id="inkSrc0">
+        <inkml:traceFormat>
+          <inkml:channel name="X" type="integer" min="-2.14748E9" max="2.14748E9" units="cm"/>
+          <inkml:channel name="Y" type="integer" min="-2.14748E9" max="2.14748E9" units="cm"/>
+          <inkml:channel name="F" type="integer" max="32767" units="dev"/>
+          <inkml:channel name="OA" type="integer" max="360" units="deg"/>
+          <inkml:channel name="OE" type="integer" max="90" units="deg"/>
+        </inkml:traceFormat>
+        <inkml:channelProperties>
+          <inkml:channelProperty channel="X" name="resolution" value="1000" units="1/cm"/>
+          <inkml:channelProperty channel="Y" name="resolution" value="1000" units="1/cm"/>
+          <inkml:channelProperty channel="F" name="resolution" value="0" units="1/dev"/>
+          <inkml:channelProperty channel="OA" name="resolution" value="1000" units="1/deg"/>
+          <inkml:channelProperty channel="OE" name="resolution" value="1000" units="1/deg"/>
+        </inkml:channelProperties>
+      </inkml:inkSource>
+      <inkml:timestamp xml:id="ts0" timeString="2026-01-16T12:19:25.881"/>
+    </inkml:context>
+    <inkml:brush xml:id="br0">
+      <inkml:brushProperty name="width" value="0.025" units="cm"/>
+      <inkml:brushProperty name="height" value="0.025" units="cm"/>
+      <inkml:brushProperty name="color" value="#5B2D90"/>
+    </inkml:brush>
+  </inkml:definitions>
+  <inkml:trace contextRef="#ctx0" brushRef="#br0">360 0 9194 0 0,'-24'11'11120'0'0,"8"1"-7582"0"0,11-8-3457 0 0,-9 7 206 0 0,2 1 0 0 0,-1 1 1 0 0,2 0-1 0 0,0 1 0 0 0,-16 26 0 0 0,-1-1 476 0 0,8-9-592 0 0,1 2 0 0 0,1 0 0 0 0,2 0 0 0 0,1 2 0 0 0,1 0 0 0 0,-8 37 1 0 0,7-21-163 0 0,3 1 0 0 0,-6 63 1 0 0,-1 107 68 0 0,15-159-88 0 0,-1 21 22 0 0,3 1 1 0 0,5 0 0 0 0,16 109-1 0 0,-7-117-98 0 0,41 210-73 0 0,-34-179 149 0 0,2 15-195 0 0,26 80 239 0 0,10 42 14 0 0,-22-130-23 0 0,27 107 52 0 0,-54-189-21 0 0,16 40 0 0 0,-1-6 6 0 0,-8-3-32 0 0,-11-42-14 0 0,1 0-1 0 0,13 33 1 0 0,-8-25-68 0 0,0 0 0 0 0,6 38 0 0 0,-10-39 70 0 0,1 0-1 0 0,21 51 1 0 0,35 83 81 0 0,-55-142-120 0 0,12 69 57 0 0,4-17-15 0 0,-18-66-54 0 0,-6-6 31 0 0,1 1 1 0 0,-1-1-1 0 0,0 0 1 0 0,1 0-1 0 0,-1 0 1 0 0,0 1-1 0 0,1-1 1 0 0,-1 0-1 0 0,0 1 1 0 0,1-1-1 0 0,-1 0 1 0 0,0 0-1 0 0,0 1 1 0 0,1-1-1 0 0,-1 1 1 0 0,0-1-1 0 0,0 0 1 0 0,0 1-1 0 0,0-1 0 0 0,1 0 1 0 0,-1 1-1 0 0,0-1 1 0 0,0 1-1 0 0,0-1 1 0 0,0 0-1 0 0,0 1 1 0 0,0-1-1 0 0,0 1 1 0 0,0 0-1 0 0,0 1-11 0 0,0-1 0 0 0,0 1 0 0 0,1 0 0 0 0,-1 0-1 0 0,1 0 1 0 0,-1 0 0 0 0,1 0 0 0 0,-1-1 0 0 0,1 1 0 0 0,0 0-1 0 0,0-1 1 0 0,0 1 0 0 0,0 0 0 0 0,0-1 0 0 0,3 3 0 0 0,-3-2 23 0 0,1 1 0 0 0,0 0 0 0 0,-1-1 1 0 0,1 1-1 0 0,-1 0 0 0 0,0 0 1 0 0,0 0-1 0 0,0 0 0 0 0,0 0 0 0 0,0 0 1 0 0,-1 5-1 0 0,1-4-5 0 0,0 0 0 0 0,0 0 0 0 0,0 0-1 0 0,0 0 1 0 0,1 0 0 0 0,3 7 0 0 0,0 15 36 0 0,-5-24-36 0 0,0 0 0 0 0,0 0 0 0 0,1 0-1 0 0,-1 1 1 0 0,0-1 0 0 0,1 0 0 0 0,-1 0 0 0 0,1 0 0 0 0,0 0-1 0 0,0 0 1 0 0,-1 0 0 0 0,4 3 0 0 0,-3-4 3 0 0,0 1 1 0 0,0-1-1 0 0,0 0 1 0 0,-1 1-1 0 0,1-1 1 0 0,0 0-1 0 0,0 1 1 0 0,-1-1-1 0 0,1 1 1 0 0,-1-1-1 0 0,1 1 1 0 0,-1-1-1 0 0,0 1 1 0 0,1-1-1 0 0,-1 1 0 0 0,0 1 1 0 0,0-3-16 0 0,1 0 0 0 0,-1 0 0 0 0,1 0 0 0 0,-1 0-1 0 0,1 0 1 0 0,-1-1 0 0 0,1 1 0 0 0,-1 0 0 0 0,0 0 0 0 0,1-1 0 0 0,-1 1 0 0 0,1 0-1 0 0,-1-1 1 0 0,0 1 0 0 0,1 0 0 0 0,-1-1 0 0 0,0 1 0 0 0,1 0 0 0 0,-1-1 0 0 0,0 1 0 0 0,0-1-1 0 0,1 1 1 0 0,-1-1 0 0 0,0 1 0 0 0,0 0 0 0 0,0-1 0 0 0,0 1 0 0 0,0-1 0 0 0,1 0 0 0 0,-4-25-4166 0 0,1 2-4442 0 0,0 13 211 0 0</inkml:trace>
+  <inkml:trace contextRef="#ctx0" brushRef="#br0" timeOffset="1360.32">700 3871 3593 0 0,'2'10'10745'0'0,"2"-25"-7486"0"0,2-8-2261 0 0,2-5-599 0 0,17-41-1 0 0,-23 59-407 0 0,-2 8 23 0 0,0 1-1 0 0,1 0 1 0 0,-1-1-1 0 0,0 1 1 0 0,0-1-1 0 0,1 1 1 0 0,-1 0-1 0 0,0 0 1 0 0,1-1-1 0 0,0 1 1 0 0,-1 0-1 0 0,1 0 1 0 0,0-1-1 0 0,-1 1 1 0 0,1 0-1 0 0,0 0 1 0 0,0 0-1 0 0,0 0 1 0 0,0 0-1 0 0,1-1 1 0 0,-5 16-957 0 0</inkml:trace>
+  <inkml:trace contextRef="#ctx0" brushRef="#br0" timeOffset="2347.55">663 3867 6545 0 0,'-4'4'5822'0'0,"5"6"-3200"0"0,-2-7-2163 0 0,-3-11 1675 0 0,-33-11 1099 0 0,4 4-2284 0 0,28 14-879 0 0,1-1 0 0 0,-1 0 1 0 0,1 0-1 0 0,-1 0 0 0 0,1-1 1 0 0,0 1-1 0 0,0-1 0 0 0,-5-5 1 0 0,8 7-49 0 0,0 0 0 0 0,0 0 0 0 0,-1 0 1 0 0,1 0-1 0 0,0 0 0 0 0,0 0 0 0 0,-1 1 1 0 0,1-1-1 0 0,0 0 0 0 0,-1 1 0 0 0,1-1 1 0 0,0 1-1 0 0,-1 0 0 0 0,1-1 0 0 0,-1 1 0 0 0,1 0 1 0 0,-1 0-1 0 0,1 0 0 0 0,-1 0 0 0 0,1 0 1 0 0,-1 0-1 0 0,1 0 0 0 0,0 0 0 0 0,-1 1 0 0 0,1-1 1 0 0,-3 1-1 0 0,59 31-2303 0 0,-45-26 70 0 0,6 1-6225 0 0,-12-7 2816 0 0</inkml:trace>
+</inkml:ink>
+</file>
+
+<file path=word/ink/ink44.xml><?xml version="1.0" encoding="utf-8"?>
+<inkml:ink xmlns:inkml="http://www.w3.org/2003/InkML">
+  <inkml:definitions>
+    <inkml:context xml:id="ctx0">
+      <inkml:inkSource xml:id="inkSrc0">
+        <inkml:traceFormat>
+          <inkml:channel name="X" type="integer" min="-2.14748E9" max="2.14748E9" units="cm"/>
+          <inkml:channel name="Y" type="integer" min="-2.14748E9" max="2.14748E9" units="cm"/>
+          <inkml:channel name="F" type="integer" max="32767" units="dev"/>
+          <inkml:channel name="OA" type="integer" max="360" units="deg"/>
+          <inkml:channel name="OE" type="integer" max="90" units="deg"/>
+        </inkml:traceFormat>
+        <inkml:channelProperties>
+          <inkml:channelProperty channel="X" name="resolution" value="1000" units="1/cm"/>
+          <inkml:channelProperty channel="Y" name="resolution" value="1000" units="1/cm"/>
+          <inkml:channelProperty channel="F" name="resolution" value="0" units="1/dev"/>
+          <inkml:channelProperty channel="OA" name="resolution" value="1000" units="1/deg"/>
+          <inkml:channelProperty channel="OE" name="resolution" value="1000" units="1/deg"/>
+        </inkml:channelProperties>
+      </inkml:inkSource>
+      <inkml:timestamp xml:id="ts0" timeString="2026-01-16T12:18:38.895"/>
+    </inkml:context>
+    <inkml:brush xml:id="br0">
+      <inkml:brushProperty name="width" value="0.035" units="cm"/>
+      <inkml:brushProperty name="height" value="0.035" units="cm"/>
+      <inkml:brushProperty name="color" value="#E71224"/>
+    </inkml:brush>
+  </inkml:definitions>
+  <inkml:trace contextRef="#ctx0" brushRef="#br0">0 1 8098 0 0,'2'0'876'0'0,"0"0"1"0"0,-1 0-1 0 0,1-1 1 0 0,0 1-1 0 0,0 0 1 0 0,-1 0-1 0 0,1 1 1 0 0,0-1-1 0 0,0 0 1 0 0,-1 1-1 0 0,1-1 1 0 0,1 1-1 0 0,37 12 1782 0 0,-26-7-2564 0 0,-1-1-1 0 0,1-1 0 0 0,26 6 1 0 0,-2-7-2512 0 0,-31-3-1648 0 0</inkml:trace>
+</inkml:ink>
+</file>
+
+<file path=word/ink/ink45.xml><?xml version="1.0" encoding="utf-8"?>
+<inkml:ink xmlns:inkml="http://www.w3.org/2003/InkML">
+  <inkml:definitions>
+    <inkml:context xml:id="ctx0">
+      <inkml:inkSource xml:id="inkSrc0">
+        <inkml:traceFormat>
+          <inkml:channel name="X" type="integer" min="-2.14748E9" max="2.14748E9" units="cm"/>
+          <inkml:channel name="Y" type="integer" min="-2.14748E9" max="2.14748E9" units="cm"/>
+          <inkml:channel name="F" type="integer" max="32767" units="dev"/>
+          <inkml:channel name="OA" type="integer" max="360" units="deg"/>
+          <inkml:channel name="OE" type="integer" max="90" units="deg"/>
+        </inkml:traceFormat>
+        <inkml:channelProperties>
+          <inkml:channelProperty channel="X" name="resolution" value="1000" units="1/cm"/>
+          <inkml:channelProperty channel="Y" name="resolution" value="1000" units="1/cm"/>
+          <inkml:channelProperty channel="F" name="resolution" value="0" units="1/dev"/>
+          <inkml:channelProperty channel="OA" name="resolution" value="1000" units="1/deg"/>
+          <inkml:channelProperty channel="OE" name="resolution" value="1000" units="1/deg"/>
+        </inkml:channelProperties>
+      </inkml:inkSource>
+      <inkml:timestamp xml:id="ts0" timeString="2026-01-16T12:18:32.531"/>
+    </inkml:context>
+    <inkml:brush xml:id="br0">
+      <inkml:brushProperty name="width" value="0.035" units="cm"/>
+      <inkml:brushProperty name="height" value="0.035" units="cm"/>
+      <inkml:brushProperty name="color" value="#E71224"/>
+    </inkml:brush>
+  </inkml:definitions>
+  <inkml:trace contextRef="#ctx0" brushRef="#br0">1 200 7930 0 0,'9'-12'6340'0'0,"9"-10"-4661"0"0,-12 12-1256 0 0,-1 0 0 0 0,0 0 1 0 0,0 0-1 0 0,-1-1 0 0 0,5-21 1 0 0,10-23-370 0 0,-17 53-575 0 0,4-13 715 0 0,-4 5-8717 0 0</inkml:trace>
+</inkml:ink>
+</file>
+
+<file path=word/ink/ink46.xml><?xml version="1.0" encoding="utf-8"?>
+<inkml:ink xmlns:inkml="http://www.w3.org/2003/InkML">
+  <inkml:definitions>
+    <inkml:context xml:id="ctx0">
+      <inkml:inkSource xml:id="inkSrc0">
+        <inkml:traceFormat>
+          <inkml:channel name="X" type="integer" min="-2.14748E9" max="2.14748E9" units="cm"/>
+          <inkml:channel name="Y" type="integer" min="-2.14748E9" max="2.14748E9" units="cm"/>
+          <inkml:channel name="F" type="integer" max="32767" units="dev"/>
+          <inkml:channel name="OA" type="integer" max="360" units="deg"/>
+          <inkml:channel name="OE" type="integer" max="90" units="deg"/>
+        </inkml:traceFormat>
+        <inkml:channelProperties>
+          <inkml:channelProperty channel="X" name="resolution" value="1000" units="1/cm"/>
+          <inkml:channelProperty channel="Y" name="resolution" value="1000" units="1/cm"/>
+          <inkml:channelProperty channel="F" name="resolution" value="0" units="1/dev"/>
+          <inkml:channelProperty channel="OA" name="resolution" value="1000" units="1/deg"/>
+          <inkml:channelProperty channel="OE" name="resolution" value="1000" units="1/deg"/>
+        </inkml:channelProperties>
+      </inkml:inkSource>
+      <inkml:timestamp xml:id="ts0" timeString="2026-01-16T12:18:30.229"/>
+    </inkml:context>
+    <inkml:brush xml:id="br0">
+      <inkml:brushProperty name="width" value="0.05" units="cm"/>
+      <inkml:brushProperty name="height" value="0.05" units="cm"/>
+      <inkml:brushProperty name="color" value="#66CC00"/>
+    </inkml:brush>
+  </inkml:definitions>
+  <inkml:trace contextRef="#ctx0" brushRef="#br0">48 144 6793 0 0,'-2'-2'441'0'0,"0"-1"0"0"0,1 1 0 0 0,-1-1 0 0 0,1 1 0 0 0,0-1 0 0 0,0 0-1 0 0,0 0 1 0 0,0 1 0 0 0,0-1 0 0 0,0-3 0 0 0,0 1-291 0 0,0 1 0 0 0,0 0 0 0 0,-1-1-1 0 0,1 1 1 0 0,-1 0 0 0 0,-2-5 0 0 0,1 5-135 0 0,1-1-1 0 0,0 0 1 0 0,0 0 0 0 0,1 0-1 0 0,-1 0 1 0 0,1 0 0 0 0,-1-7-1 0 0,-4-18-4965 0 0</inkml:trace>
+</inkml:ink>
+</file>
+
+<file path=word/ink/ink47.xml><?xml version="1.0" encoding="utf-8"?>
+<inkml:ink xmlns:inkml="http://www.w3.org/2003/InkML">
+  <inkml:definitions>
+    <inkml:context xml:id="ctx0">
+      <inkml:inkSource xml:id="inkSrc0">
+        <inkml:traceFormat>
+          <inkml:channel name="X" type="integer" min="-2.14748E9" max="2.14748E9" units="cm"/>
+          <inkml:channel name="Y" type="integer" min="-2.14748E9" max="2.14748E9" units="cm"/>
+          <inkml:channel name="F" type="integer" max="32767" units="dev"/>
+          <inkml:channel name="OA" type="integer" max="360" units="deg"/>
+          <inkml:channel name="OE" type="integer" max="90" units="deg"/>
+        </inkml:traceFormat>
+        <inkml:channelProperties>
+          <inkml:channelProperty channel="X" name="resolution" value="1000" units="1/cm"/>
+          <inkml:channelProperty channel="Y" name="resolution" value="1000" units="1/cm"/>
+          <inkml:channelProperty channel="F" name="resolution" value="0" units="1/dev"/>
+          <inkml:channelProperty channel="OA" name="resolution" value="1000" units="1/deg"/>
+          <inkml:channelProperty channel="OE" name="resolution" value="1000" units="1/deg"/>
+        </inkml:channelProperties>
+      </inkml:inkSource>
+      <inkml:timestamp xml:id="ts0" timeString="2026-01-16T12:18:23.848"/>
+    </inkml:context>
+    <inkml:brush xml:id="br0">
+      <inkml:brushProperty name="width" value="0.05" units="cm"/>
+      <inkml:brushProperty name="height" value="0.05" units="cm"/>
+      <inkml:brushProperty name="color" value="#66CC00"/>
+    </inkml:brush>
+  </inkml:definitions>
+  <inkml:trace contextRef="#ctx0" brushRef="#br0">1 117 6105 0 0,'4'-4'6547'0'0,"14"-5"-3325"0"0,-5 4-2460 0 0,28-25 147 0 0,-22 16-1202 0 0,41-23-1 0 0,-46 19-7539 0 0</inkml:trace>
+</inkml:ink>
+</file>
+
+<file path=word/ink/ink48.xml><?xml version="1.0" encoding="utf-8"?>
+<inkml:ink xmlns:inkml="http://www.w3.org/2003/InkML">
+  <inkml:definitions>
+    <inkml:context xml:id="ctx0">
+      <inkml:inkSource xml:id="inkSrc0">
+        <inkml:traceFormat>
+          <inkml:channel name="X" type="integer" min="-2.14748E9" max="2.14748E9" units="cm"/>
+          <inkml:channel name="Y" type="integer" min="-2.14748E9" max="2.14748E9" units="cm"/>
+          <inkml:channel name="F" type="integer" max="32767" units="dev"/>
+        </inkml:traceFormat>
+        <inkml:channelProperties>
+          <inkml:channelProperty channel="X" name="resolution" value="1000" units="1/cm"/>
+          <inkml:channelProperty channel="Y" name="resolution" value="1000" units="1/cm"/>
+          <inkml:channelProperty channel="F" name="resolution" value="0" units="1/dev"/>
+        </inkml:channelProperties>
+      </inkml:inkSource>
+      <inkml:timestamp xml:id="ts0" timeString="2026-01-16T12:18:20.134"/>
+    </inkml:context>
+    <inkml:brush xml:id="br0">
+      <inkml:brushProperty name="width" value="0.05" units="cm"/>
+      <inkml:brushProperty name="height" value="0.05" units="cm"/>
+      <inkml:brushProperty name="color" value="#66CC00"/>
+    </inkml:brush>
+  </inkml:definitions>
+  <inkml:trace contextRef="#ctx0" brushRef="#br0">361 1 23000,'-361'1304'0</inkml:trace>
+</inkml:ink>
+</file>
+
+<file path=word/ink/ink49.xml><?xml version="1.0" encoding="utf-8"?>
+<inkml:ink xmlns:inkml="http://www.w3.org/2003/InkML">
+  <inkml:definitions>
+    <inkml:context xml:id="ctx0">
+      <inkml:inkSource xml:id="inkSrc0">
+        <inkml:traceFormat>
+          <inkml:channel name="X" type="integer" min="-2.14748E9" max="2.14748E9" units="cm"/>
+          <inkml:channel name="Y" type="integer" min="-2.14748E9" max="2.14748E9" units="cm"/>
+          <inkml:channel name="F" type="integer" max="32767" units="dev"/>
+        </inkml:traceFormat>
+        <inkml:channelProperties>
+          <inkml:channelProperty channel="X" name="resolution" value="1000" units="1/cm"/>
+          <inkml:channelProperty channel="Y" name="resolution" value="1000" units="1/cm"/>
+          <inkml:channelProperty channel="F" name="resolution" value="0" units="1/dev"/>
+        </inkml:channelProperties>
+      </inkml:inkSource>
+      <inkml:timestamp xml:id="ts0" timeString="2026-01-16T12:18:16.529"/>
+    </inkml:context>
+    <inkml:brush xml:id="br0">
+      <inkml:brushProperty name="width" value="0.035" units="cm"/>
+      <inkml:brushProperty name="height" value="0.035" units="cm"/>
+      <inkml:brushProperty name="color" value="#E71224"/>
+    </inkml:brush>
+  </inkml:definitions>
+  <inkml:trace contextRef="#ctx0" brushRef="#br0">4234 1 21852,'-4233'1670'0</inkml:trace>
+</inkml:ink>
+</file>
+
+<file path=word/ink/ink5.xml><?xml version="1.0" encoding="utf-8"?>
+<inkml:ink xmlns:inkml="http://www.w3.org/2003/InkML">
+  <inkml:definitions>
+    <inkml:context xml:id="ctx0">
+      <inkml:inkSource xml:id="inkSrc0">
+        <inkml:traceFormat>
+          <inkml:channel name="X" type="integer" min="-2.14748E9" max="2.14748E9" units="cm"/>
+          <inkml:channel name="Y" type="integer" min="-2.14748E9" max="2.14748E9" units="cm"/>
+          <inkml:channel name="F" type="integer" max="32767" units="dev"/>
+          <inkml:channel name="OA" type="integer" max="360" units="deg"/>
+          <inkml:channel name="OE" type="integer" max="90" units="deg"/>
+        </inkml:traceFormat>
+        <inkml:channelProperties>
+          <inkml:channelProperty channel="X" name="resolution" value="1000" units="1/cm"/>
+          <inkml:channelProperty channel="Y" name="resolution" value="1000" units="1/cm"/>
+          <inkml:channelProperty channel="F" name="resolution" value="0" units="1/dev"/>
+          <inkml:channelProperty channel="OA" name="resolution" value="1000" units="1/deg"/>
+          <inkml:channelProperty channel="OE" name="resolution" value="1000" units="1/deg"/>
+        </inkml:channelProperties>
+      </inkml:inkSource>
+      <inkml:timestamp xml:id="ts0" timeString="2026-01-16T12:47:41.925"/>
+    </inkml:context>
+    <inkml:brush xml:id="br0">
+      <inkml:brushProperty name="width" value="0.025" units="cm"/>
+      <inkml:brushProperty name="height" value="0.025" units="cm"/>
+      <inkml:brushProperty name="color" value="#E71224"/>
+    </inkml:brush>
+  </inkml:definitions>
+  <inkml:trace contextRef="#ctx0" brushRef="#br0">3 64 7754 0 0,'0'0'303'0'0,"0"-1"0"0"0,0 1 1 0 0,-1-1-1 0 0,1 1 0 0 0,0-1 0 0 0,0 1 1 0 0,-1 0-1 0 0,1-1 0 0 0,0 1 1 0 0,0-1-1 0 0,0 1 0 0 0,0-1 0 0 0,0 1 1 0 0,0-1-1 0 0,0 1 0 0 0,0-1 1 0 0,0 1-1 0 0,0-1 0 0 0,0 1 0 0 0,0-1 1 0 0,0 1-1 0 0,0-1 0 0 0,0 1 1 0 0,1-1-1 0 0,-1 1 0 0 0,0 0 1 0 0,0-1-1 0 0,0 1 0 0 0,1-1 0 0 0,-1 1 1 0 0,0 0-1 0 0,1-1 0 0 0,-1 1 1 0 0,1-1-1 0 0,3 1 3332 0 0,-5 13-2350 0 0,0-8-1162 0 0,0 1 0 0 0,1-1 0 0 0,0 0 0 0 0,0 1 0 0 0,0-1 0 0 0,1 0 0 0 0,1 6 0 0 0,1 18 99 0 0,0 1 161 0 0,-3-30-349 0 0,0 0-1 0 0,1 1 1 0 0,-1-1 0 0 0,0 0-1 0 0,1 1 1 0 0,-1-1-1 0 0,0 0 1 0 0,1 0-1 0 0,-1 1 1 0 0,0-1-1 0 0,1 0 1 0 0,-1 0 0 0 0,1 0-1 0 0,-1 1 1 0 0,1-1-1 0 0,-1 0 1 0 0,0 0-1 0 0,1 0 1 0 0,-1 0-1 0 0,1 0 1 0 0,-1 0 0 0 0,1 0-1 0 0,-1 0 1 0 0,1 0-1 0 0,-1 0 1 0 0,1 0-1 0 0,-1 0 1 0 0,0-1 0 0 0,1 1-1 0 0,-1 0 1 0 0,1 0-1 0 0,-1 0 1 0 0,0 0-1 0 0,1-1 1 0 0,-1 1-1 0 0,1 0 1 0 0,-1-1 0 0 0,0 1-1 0 0,1 0 1 0 0,-1-1-1 0 0,0 1 1 0 0,1 0-1 0 0,-1-1 1 0 0,4-4-16 0 0,0 1-1 0 0,0-1 1 0 0,-1 0-1 0 0,1 0 1 0 0,-1 0-1 0 0,0 0 1 0 0,-1-1-1 0 0,1 1 1 0 0,-1-1-1 0 0,1-6 1 0 0,18-33-11 0 0,-2 16 45 0 0,0 1-117 0 0,-19 26-1063 0 0,-1 5 2378 0 0,-5 3 125 0 0,3-2-3267 0 0</inkml:trace>
+</inkml:ink>
+</file>
+
+<file path=word/ink/ink50.xml><?xml version="1.0" encoding="utf-8"?>
+<inkml:ink xmlns:inkml="http://www.w3.org/2003/InkML">
+  <inkml:definitions>
+    <inkml:context xml:id="ctx0">
+      <inkml:inkSource xml:id="inkSrc0">
+        <inkml:traceFormat>
+          <inkml:channel name="X" type="integer" min="-2.14748E9" max="2.14748E9" units="cm"/>
+          <inkml:channel name="Y" type="integer" min="-2.14748E9" max="2.14748E9" units="cm"/>
+          <inkml:channel name="F" type="integer" max="32767" units="dev"/>
+          <inkml:channel name="OA" type="integer" max="360" units="deg"/>
+          <inkml:channel name="OE" type="integer" max="90" units="deg"/>
+        </inkml:traceFormat>
+        <inkml:channelProperties>
+          <inkml:channelProperty channel="X" name="resolution" value="1000" units="1/cm"/>
+          <inkml:channelProperty channel="Y" name="resolution" value="1000" units="1/cm"/>
+          <inkml:channelProperty channel="F" name="resolution" value="0" units="1/dev"/>
+          <inkml:channelProperty channel="OA" name="resolution" value="1000" units="1/deg"/>
+          <inkml:channelProperty channel="OE" name="resolution" value="1000" units="1/deg"/>
+        </inkml:channelProperties>
+      </inkml:inkSource>
+      <inkml:timestamp xml:id="ts0" timeString="2026-01-16T12:15:50.863"/>
+    </inkml:context>
+    <inkml:brush xml:id="br0">
+      <inkml:brushProperty name="width" value="0.025" units="cm"/>
+      <inkml:brushProperty name="height" value="0.025" units="cm"/>
+      <inkml:brushProperty name="color" value="#33CCFF"/>
+    </inkml:brush>
+  </inkml:definitions>
+  <inkml:trace contextRef="#ctx0" brushRef="#br0">1 180 5025 0 0,'0'0'3115'0'0,"5"-8"3689"0"0,8-14-6018 0 0,-8 14-265 0 0,15-15-130 0 0,-2 1-1660 0 0,-8 6-4358 0 0</inkml:trace>
+  <inkml:trace contextRef="#ctx0" brushRef="#br0" timeOffset="937.55">5 0 6945 0 0,'0'0'2446'0'0,"8"5"4623"0"0,-4-1-5417 0 0,-1 4-1760 0 0,-1 0 1 0 0,1 0-1 0 0,1 0 1 0 0,-1-1-1 0 0,1 1 1 0 0,1-1-1 0 0,-1 0 1 0 0,1 0-1 0 0,8 8 1 0 0,-7-13-6305 0 0</inkml:trace>
+</inkml:ink>
+</file>
+
+<file path=word/ink/ink51.xml><?xml version="1.0" encoding="utf-8"?>
+<inkml:ink xmlns:inkml="http://www.w3.org/2003/InkML">
+  <inkml:definitions>
+    <inkml:context xml:id="ctx0">
+      <inkml:inkSource xml:id="inkSrc0">
+        <inkml:traceFormat>
+          <inkml:channel name="X" type="integer" min="-2.14748E9" max="2.14748E9" units="cm"/>
+          <inkml:channel name="Y" type="integer" min="-2.14748E9" max="2.14748E9" units="cm"/>
+          <inkml:channel name="F" type="integer" max="32767" units="dev"/>
+        </inkml:traceFormat>
+        <inkml:channelProperties>
+          <inkml:channelProperty channel="X" name="resolution" value="1000" units="1/cm"/>
+          <inkml:channelProperty channel="Y" name="resolution" value="1000" units="1/cm"/>
+          <inkml:channelProperty channel="F" name="resolution" value="0" units="1/dev"/>
+        </inkml:channelProperties>
+      </inkml:inkSource>
+      <inkml:timestamp xml:id="ts0" timeString="2026-01-16T12:15:45.476"/>
+    </inkml:context>
+    <inkml:brush xml:id="br0">
+      <inkml:brushProperty name="width" value="0.025" units="cm"/>
+      <inkml:brushProperty name="height" value="0.025" units="cm"/>
+      <inkml:brushProperty name="color" value="#33CCFF"/>
+    </inkml:brush>
+  </inkml:definitions>
+  <inkml:trace contextRef="#ctx0" brushRef="#br0">0 1 20927,'690'1'0</inkml:trace>
+</inkml:ink>
+</file>
+
+<file path=word/ink/ink52.xml><?xml version="1.0" encoding="utf-8"?>
+<inkml:ink xmlns:inkml="http://www.w3.org/2003/InkML">
+  <inkml:definitions>
+    <inkml:context xml:id="ctx0">
+      <inkml:inkSource xml:id="inkSrc0">
+        <inkml:traceFormat>
+          <inkml:channel name="X" type="integer" min="-2.14748E9" max="2.14748E9" units="cm"/>
+          <inkml:channel name="Y" type="integer" min="-2.14748E9" max="2.14748E9" units="cm"/>
+          <inkml:channel name="F" type="integer" max="32767" units="dev"/>
+        </inkml:traceFormat>
+        <inkml:channelProperties>
+          <inkml:channelProperty channel="X" name="resolution" value="1000" units="1/cm"/>
+          <inkml:channelProperty channel="Y" name="resolution" value="1000" units="1/cm"/>
+          <inkml:channelProperty channel="F" name="resolution" value="0" units="1/dev"/>
+        </inkml:channelProperties>
+      </inkml:inkSource>
+      <inkml:timestamp xml:id="ts0" timeString="2026-01-16T12:15:36.526"/>
+    </inkml:context>
+    <inkml:brush xml:id="br0">
+      <inkml:brushProperty name="width" value="0.025" units="cm"/>
+      <inkml:brushProperty name="height" value="0.025" units="cm"/>
+      <inkml:brushProperty name="color" value="#33CCFF"/>
+    </inkml:brush>
+  </inkml:definitions>
+  <inkml:trace contextRef="#ctx0" brushRef="#br0">311 155 20341,'0'6'0,"-1"0"0,1 1 0,-1-1 0,0 0 0,0 0 0,-1-1 0,0 1 0,0 0 0,0 0 0,0-1 0,-1 1 0,0-1 0,0 0 0,0 0 0,-1 0 0,1 0 0,-1 0 0,0 0 0,0-1 0,-1 0 0,1 0 0,-1 0 0,0 0 0,0-1 0,0 1 0,0-1 0,-1-1 0,1 1 0,-1 0 0,1-1 0,-1 0 0,0 0 0,0-1 0,0 0 0,0 0 0,0 0 0,0 0 0,0-1 0,0 0 0,0 0 0,0 0 0,0-1 0,0 0 0,0 0 0,0 0 0,0 0 0,0-1 0,0 0 0,1 0 0,-1-1 0,0 0 0,1 1 0,0-1 0,0-1 0,0 1 0,0-1 0,0 0 0,1 0 0,-1 0 0,1 0 0,0-1 0,0 0 0,0 0 0,1 0 0,0 0 0,0 0 0,0 0 0,0-1 0,1 1 0,-1-1 0,1 0 0,1 0 0,-1 1 0,1-1 0,0 0 0,0 0 0,0-1 0,1 1 0,0 0 0,0 0 0,0 0 0,1 0 0,0 0 0,0 0 0,0 0 0,1 0 0,-1 0 0,1 1 0,1-1 0,-1 0 0,1 1 0,0 0 0,0-1 0,0 1 0,0 0 0,1 0 0,0 1 0,0-1 0,0 1 0,1-1 0,-1 1 0,1 1 0,0-1 0,0 0 0,0 1 0,0 0 0,0 0 0,1 0 0,0 1 0,-1 0 0,1 0 0,0 0 0,0 1 0,0-1 0,0 1 0,0 0 0,0 1 0,0-1 0,0 1 0,0 0 0,0 1 0,0-1 0,0 1 0,0 0 0,0 1 0,0-1 0,0 1 0,0 0 0,-1 0 0,1 0 0,-1 1 0,1 0 0,-1 0 0,0 0 0,0 1 0,0 0 0,0-1 0,-1 1 0,1 1 0,-1-1 0,0 1 0,0-1 0,-1 1 0,1 0 0,-1 0 0,0 1 0,0-1 0,0 0 0,-1 1 0,0 0 0,0-1 0,0 1 0,0 0 0,-1 0 0,0 0 0,0 0 0,-1 0 0,1 0 0,-1 0 0</inkml:trace>
+</inkml:ink>
+</file>
+
+<file path=word/ink/ink6.xml><?xml version="1.0" encoding="utf-8"?>
+<inkml:ink xmlns:inkml="http://www.w3.org/2003/InkML">
+  <inkml:definitions>
+    <inkml:context xml:id="ctx0">
+      <inkml:inkSource xml:id="inkSrc0">
+        <inkml:traceFormat>
+          <inkml:channel name="X" type="integer" min="-2.14748E9" max="2.14748E9" units="cm"/>
+          <inkml:channel name="Y" type="integer" min="-2.14748E9" max="2.14748E9" units="cm"/>
+          <inkml:channel name="F" type="integer" max="32767" units="dev"/>
+          <inkml:channel name="OA" type="integer" max="360" units="deg"/>
+          <inkml:channel name="OE" type="integer" max="90" units="deg"/>
+        </inkml:traceFormat>
+        <inkml:channelProperties>
+          <inkml:channelProperty channel="X" name="resolution" value="1000" units="1/cm"/>
+          <inkml:channelProperty channel="Y" name="resolution" value="1000" units="1/cm"/>
+          <inkml:channelProperty channel="F" name="resolution" value="0" units="1/dev"/>
+          <inkml:channelProperty channel="OA" name="resolution" value="1000" units="1/deg"/>
+          <inkml:channelProperty channel="OE" name="resolution" value="1000" units="1/deg"/>
+        </inkml:channelProperties>
+      </inkml:inkSource>
+      <inkml:timestamp xml:id="ts0" timeString="2026-01-16T12:47:33.718"/>
+    </inkml:context>
+    <inkml:brush xml:id="br0">
+      <inkml:brushProperty name="width" value="0.025" units="cm"/>
+      <inkml:brushProperty name="height" value="0.025" units="cm"/>
+      <inkml:brushProperty name="color" value="#E71224"/>
+    </inkml:brush>
+  </inkml:definitions>
+  <inkml:trace contextRef="#ctx0" brushRef="#br0">16 125 5217 0 0,'2'-19'5080'0'0,"-2"9"3054"0"0,-4 25-2631 0 0,-1 42-5098 0 0,-4 8-297 0 0,11-148-16 0 0,-1 79-97 0 0,0 0 11 0 0,-1 0 0 0 0,1 0 0 0 0,-1 0 0 0 0,0 0 1 0 0,0 0-1 0 0,0 0 0 0 0,0 0 0 0 0,0 0 0 0 0,-1 0 0 0 0,-2-7 0 0 0,4 28 228 0 0,-1-14-5213 0 0</inkml:trace>
+  <inkml:trace contextRef="#ctx0" brushRef="#br0" timeOffset="375.39">10 1 5777 0 0,'0'2'3977'0'0,"0"3"2822"0"0,0-3-5320 0 0,2-2-4622 0 0,2-5-3918 0 0</inkml:trace>
+</inkml:ink>
+</file>
+
+<file path=word/ink/ink7.xml><?xml version="1.0" encoding="utf-8"?>
+<inkml:ink xmlns:inkml="http://www.w3.org/2003/InkML">
+  <inkml:definitions>
+    <inkml:context xml:id="ctx0">
+      <inkml:inkSource xml:id="inkSrc0">
+        <inkml:traceFormat>
+          <inkml:channel name="X" type="integer" min="-2.14748E9" max="2.14748E9" units="cm"/>
+          <inkml:channel name="Y" type="integer" min="-2.14748E9" max="2.14748E9" units="cm"/>
+          <inkml:channel name="F" type="integer" max="32767" units="dev"/>
+          <inkml:channel name="OA" type="integer" max="360" units="deg"/>
+          <inkml:channel name="OE" type="integer" max="90" units="deg"/>
+        </inkml:traceFormat>
+        <inkml:channelProperties>
+          <inkml:channelProperty channel="X" name="resolution" value="1000" units="1/cm"/>
+          <inkml:channelProperty channel="Y" name="resolution" value="1000" units="1/cm"/>
+          <inkml:channelProperty channel="F" name="resolution" value="0" units="1/dev"/>
+          <inkml:channelProperty channel="OA" name="resolution" value="1000" units="1/deg"/>
+          <inkml:channelProperty channel="OE" name="resolution" value="1000" units="1/deg"/>
+        </inkml:channelProperties>
+      </inkml:inkSource>
+      <inkml:timestamp xml:id="ts0" timeString="2026-01-16T12:47:12.407"/>
+    </inkml:context>
+    <inkml:brush xml:id="br0">
+      <inkml:brushProperty name="width" value="0.025" units="cm"/>
+      <inkml:brushProperty name="height" value="0.025" units="cm"/>
+      <inkml:brushProperty name="color" value="#E71224"/>
+    </inkml:brush>
+  </inkml:definitions>
+  <inkml:trace contextRef="#ctx0" brushRef="#br0">14 239 5185 0 0,'-1'-1'708'0'0,"0"1"0"0"0,1-1 1 0 0,-1 0-1 0 0,1 0 0 0 0,-1 0 0 0 0,1 0 0 0 0,-1 0 1 0 0,1 0-1 0 0,-1-1 0 0 0,1 1 0 0 0,0 0 0 0 0,0 0 1 0 0,-1 0-1 0 0,1 0 0 0 0,0 0 0 0 0,0-2 0 0 0,0 1 1226 0 0,0 6-181 0 0,5 48 48 0 0,-9 22-1515 0 0,4-70-278 0 0,-1 1 7 0 0,1-1 0 0 0,0 1 0 0 0,1-1 1 0 0,-1 1-1 0 0,1-1 0 0 0,0 1 0 0 0,3 7 1 0 0,1-2 22 0 0,-3-9-9 0 0,-1-7-11 0 0,-12-79 93 0 0,21 45-202 0 0,-7-28 14 0 0,-6 56 96 0 0,-3 18 35 0 0,5-4-47 0 0,0-1 0 0 0,0 2-1 0 0,1-1 1 0 0,-1 0 0 0 0,0 0 0 0 0,1 0-1 0 0,0 0 1 0 0,-1 0 0 0 0,1 0 0 0 0,0 0 0 0 0,0 5-1 0 0,1-5 3 0 0,-1 1 0 0 0,0-1-1 0 0,0 0 1 0 0,0 1-1 0 0,-1-1 1 0 0,1 1 0 0 0,-1-1-1 0 0,1 1 1 0 0,-2 2-1 0 0,1-3 0 0 0,1 0-1 0 0,-1 1 1 0 0,0-1-1 0 0,1 0 1 0 0,0 0-1 0 0,0 1 1 0 0,-1-1-1 0 0,1 0 1 0 0,1 1-1 0 0,-1-1 1 0 0,0 3-1 0 0,1-2 1 0 0,-1 1-1 0 0,1-1 1 0 0,-1 1 0 0 0,0-1-1 0 0,0 1 1 0 0,-1-1-1 0 0,0 6 1 0 0,0-5-8 0 0,1 0 1 0 0,-1 1-1 0 0,1-1 1 0 0,0 0-1 0 0,0 0 1 0 0,1 7-1 0 0,0-5-285 0 0,5 16-90 0 0,1-16-4407 0 0,-6-15-5658 0 0,-1 6 5693 0 0</inkml:trace>
+  <inkml:trace contextRef="#ctx0" brushRef="#br0" timeOffset="544.13">16 1 5641 0 0,'0'0'88'0'0,"0"-1"-1"0"0,0 1 1 0 0,0 0-1 0 0,1 0 0 0 0,-1 0 1 0 0,0 0-1 0 0,0 0 1 0 0,0 0-1 0 0,0 0 1 0 0,0 0-1 0 0,1 0 1 0 0,-1 0-1 0 0,0 0 1 0 0,0 0-1 0 0,0 0 1 0 0,0 0-1 0 0,0 0 0 0 0,0 0 1 0 0,1 0-1 0 0,-1 0 1 0 0,0 0-1 0 0,0 0 1 0 0,0 0-1 0 0,0 0 1 0 0,0 0-1 0 0,0 0 1 0 0,1 1-1 0 0,-1-1 0 0 0,0 0 1 0 0,0 0-1 0 0,0 0 1 0 0,0 0-1 0 0,0 0 1 0 0,0 0-1 0 0,0 0 1 0 0,0 0-1 0 0,0 1 1 0 0,0-1-1 0 0,1 0 0 0 0,-1 0 1 0 0,0 0-1 0 0,0 0 1 0 0,0 0-1 0 0,0 0 1 0 0,0 1-1 0 0,0-1 1 0 0,0 0-1 0 0,0 0 1 0 0,0 0-1 0 0,0 0 0 0 0,0 0 1 0 0,0 0-1 0 0,0 1 1 0 0,0-1-1 0 0,0 0 1 0 0,0 0-1 0 0,0 0 1 0 0,0 0-1 0 0,0 0 1 0 0,0 0-1 0 0,-1 1 0 0 0,1-1 1 0 0,0 0-1 0 0,0 0-159 0 0,-2-4-4989 0 0</inkml:trace>
+</inkml:ink>
+</file>
+
+<file path=word/ink/ink8.xml><?xml version="1.0" encoding="utf-8"?>
+<inkml:ink xmlns:inkml="http://www.w3.org/2003/InkML">
+  <inkml:definitions>
+    <inkml:context xml:id="ctx0">
+      <inkml:inkSource xml:id="inkSrc0">
+        <inkml:traceFormat>
+          <inkml:channel name="X" type="integer" min="-2.14748E9" max="2.14748E9" units="cm"/>
+          <inkml:channel name="Y" type="integer" min="-2.14748E9" max="2.14748E9" units="cm"/>
+          <inkml:channel name="F" type="integer" max="32767" units="dev"/>
+          <inkml:channel name="OA" type="integer" max="360" units="deg"/>
+          <inkml:channel name="OE" type="integer" max="90" units="deg"/>
+        </inkml:traceFormat>
+        <inkml:channelProperties>
+          <inkml:channelProperty channel="X" name="resolution" value="1000" units="1/cm"/>
+          <inkml:channelProperty channel="Y" name="resolution" value="1000" units="1/cm"/>
+          <inkml:channelProperty channel="F" name="resolution" value="0" units="1/dev"/>
+          <inkml:channelProperty channel="OA" name="resolution" value="1000" units="1/deg"/>
+          <inkml:channelProperty channel="OE" name="resolution" value="1000" units="1/deg"/>
+        </inkml:channelProperties>
+      </inkml:inkSource>
+      <inkml:timestamp xml:id="ts0" timeString="2026-01-16T12:46:33.384"/>
+    </inkml:context>
+    <inkml:brush xml:id="br0">
+      <inkml:brushProperty name="width" value="0.025" units="cm"/>
+      <inkml:brushProperty name="height" value="0.025" units="cm"/>
+      <inkml:brushProperty name="color" value="#E71224"/>
+    </inkml:brush>
+  </inkml:definitions>
+  <inkml:trace contextRef="#ctx0" brushRef="#br0">85 171 5185 0 0,'-1'6'2116'0'0,"1"-8"-613"0"0,0 2-1439 0 0,-1 0 1 0 0,1-1 0 0 0,0 1-1 0 0,0 0 1 0 0,0-1-1 0 0,0 1 1 0 0,1 0 0 0 0,-1 0-1 0 0,0-1 1 0 0,0 1 0 0 0,0 0-1 0 0,0-1 1 0 0,0 1-1 0 0,0 0 1 0 0,0 0 0 0 0,0-1-1 0 0,1 1 1 0 0,-1 0-1 0 0,0 0 1 0 0,0-1 0 0 0,0 1-1 0 0,1 0 1 0 0,-1 0-1 0 0,0 0 1 0 0,0-1 0 0 0,0 1-1 0 0,1 0 1 0 0,-1 0-1 0 0,0 0 1 0 0,0 0 0 0 0,1 0-1 0 0,-1 0 1 0 0,0-1-1 0 0,1 1 1 0 0,12-26 5510 0 0,3-9-4171 0 0,8-17 486 0 0,-18 45-1961 0 0,-2 0 1 0 0,1 0 0 0 0,-1 0 0 0 0,0 0-1 0 0,3-8 1 0 0,-8 12-3090 0 0</inkml:trace>
+  <inkml:trace contextRef="#ctx0" brushRef="#br0" timeOffset="1103.59">67 159 2825 0 0,'4'14'6532'0'0,"1"-10"-4692"0"0,-3-16 282 0 0,-3 10-1813 0 0,1 0 0 0 0,-1 0 1 0 0,0 0-1 0 0,0 0 0 0 0,0 0 1 0 0,0 0-1 0 0,0 0 0 0 0,-1 0 1 0 0,1 0-1 0 0,0 1 0 0 0,-3-3 0 0 0,-14-22 14 0 0,-9-43 1241 0 0,21 55-1525 0 0,-4-7 250 0 0,8 22-144 0 0,4 15-65 0 0,0-10-348 0 0,1 0 1 0 0,-1 0 0 0 0,1-1 0 0 0,0 1 0 0 0,0-1 0 0 0,6 8-1 0 0,-6-9-669 0 0,0 0-1 0 0,0 0 1 0 0,-1 0-1 0 0,1 1 0 0 0,-1-1 1 0 0,0 1-1 0 0,0-1 0 0 0,-1 1 1 0 0,1 0-1 0 0,1 9 1 0 0,-3-12-3164 0 0</inkml:trace>
+</inkml:ink>
+</file>
+
+<file path=word/ink/ink9.xml><?xml version="1.0" encoding="utf-8"?>
+<inkml:ink xmlns:inkml="http://www.w3.org/2003/InkML">
+  <inkml:definitions>
+    <inkml:context xml:id="ctx0">
+      <inkml:inkSource xml:id="inkSrc0">
+        <inkml:traceFormat>
+          <inkml:channel name="X" type="integer" min="-2.14748E9" max="2.14748E9" units="cm"/>
+          <inkml:channel name="Y" type="integer" min="-2.14748E9" max="2.14748E9" units="cm"/>
+          <inkml:channel name="F" type="integer" max="32767" units="dev"/>
+          <inkml:channel name="OA" type="integer" max="360" units="deg"/>
+          <inkml:channel name="OE" type="integer" max="90" units="deg"/>
+        </inkml:traceFormat>
+        <inkml:channelProperties>
+          <inkml:channelProperty channel="X" name="resolution" value="1000" units="1/cm"/>
+          <inkml:channelProperty channel="Y" name="resolution" value="1000" units="1/cm"/>
+          <inkml:channelProperty channel="F" name="resolution" value="0" units="1/dev"/>
+          <inkml:channelProperty channel="OA" name="resolution" value="1000" units="1/deg"/>
+          <inkml:channelProperty channel="OE" name="resolution" value="1000" units="1/deg"/>
+        </inkml:channelProperties>
+      </inkml:inkSource>
+      <inkml:timestamp xml:id="ts0" timeString="2026-01-16T12:46:00.234"/>
+    </inkml:context>
+    <inkml:brush xml:id="br0">
+      <inkml:brushProperty name="width" value="0.035" units="cm"/>
+      <inkml:brushProperty name="height" value="0.035" units="cm"/>
+      <inkml:brushProperty name="color" value="#66CC00"/>
+    </inkml:brush>
+  </inkml:definitions>
+  <inkml:trace contextRef="#ctx0" brushRef="#br0">1 133 4617 0 0,'7'1'8510'0'0,"9"1"-4672"0"0,-13-3-3674 0 0,-1 0 1 0 0,1-1-1 0 0,0 1 1 0 0,0-1-1 0 0,0 1 1 0 0,-1-1-1 0 0,1 0 0 0 0,-1 0 1 0 0,0 0-1 0 0,1-1 1 0 0,-1 1-1 0 0,0 0 1 0 0,0-1-1 0 0,0 0 1 0 0,-1 1-1 0 0,1-1 0 0 0,-1 0 1 0 0,1 0-1 0 0,-1 0 1 0 0,1-4-1 0 0,1-2 21 0 0,0 0 0 0 0,-1 0 0 0 0,0 0 0 0 0,0 0-1 0 0,0-18 1 0 0,-2 27-172 0 0,0 0 0 0 0,1-1-1 0 0,-1 1 1 0 0,0-1 0 0 0,0 1-1 0 0,0 0 1 0 0,0-1 0 0 0,0 1-1 0 0,0-1 1 0 0,0 1 0 0 0,0 0-1 0 0,0-1 1 0 0,0 1 0 0 0,0-1-1 0 0,0 1 1 0 0,0 0 0 0 0,0-1-1 0 0,0 1 1 0 0,0-1 0 0 0,-1 1-1 0 0,1 0 1 0 0,0-1 0 0 0,0 1-1 0 0,0 0 1 0 0,-1-1 0 0 0,1 1-1 0 0,0 0 1 0 0,0-1 0 0 0,-1 1-1 0 0,1 0 1 0 0,0 0 0 0 0,-1-1-1 0 0,1 1 1 0 0,0 0 0 0 0,-1 0 0 0 0,1 0-1 0 0,0-1 1 0 0,-1 1 0 0 0,1 0-1 0 0,0 0 1 0 0,-1 0 0 0 0,1 0-1 0 0,-1 0 1 0 0,1 0 0 0 0,0 0-1 0 0,-1 0 1 0 0,1 0 0 0 0,-1 0-1 0 0,1 0 1 0 0,0 0 0 0 0,-1 0-1 0 0,1 0 1 0 0,-1 0 0 0 0,0 1-7 0 0,0-1 0 0 0,1 1 0 0 0,-1 0 0 0 0,1-1 0 0 0,-1 1 0 0 0,0 0 0 0 0,1 0 0 0 0,0-1 0 0 0,-1 1 0 0 0,1 0 0 0 0,-1 0 0 0 0,1 0 0 0 0,0 0 1 0 0,-1 0-1 0 0,1-1 0 0 0,0 1 0 0 0,0 0 0 0 0,0 0 0 0 0,0 0 0 0 0,0 0 0 0 0,0 0 0 0 0,0 0 0 0 0,0 0 0 0 0,0 0 0 0 0,0 0 0 0 0,1 1 0 0 0,4 12 112 0 0,0 14 229 0 0,-11 107-149 0 0,5-130-171 0 0,1-1 0 0 0,0 0-1 0 0,0 1 1 0 0,0-1 0 0 0,0 0-1 0 0,1 1 1 0 0,0-1 0 0 0,2 8-1 0 0,-5-12 74 0 0,-1 1 0 0 0,1 0 0 0 0,-1 0 0 0 0,1-1 0 0 0,0 2 0 0 0,0-1 0 0 0,0 0 0 0 0,-1 0 1 0 0,1 1-1 0 0,0-1 0 0 0,0 1 0 0 0,1-1 0 0 0,-1 1 0 0 0,-2 2 0 0 0,4-4-92 0 0,0 1 0 0 0,0-1 0 0 0,0 0 0 0 0,0 0 1 0 0,-1 1-1 0 0,1-1 0 0 0,0 0 0 0 0,0 1 0 0 0,0-1 1 0 0,0 0-1 0 0,0 0 0 0 0,0 1 0 0 0,0-1 0 0 0,0 0 1 0 0,0 1-1 0 0,0-1 0 0 0,0 0 0 0 0,0 1 0 0 0,0-1 1 0 0,0 0-1 0 0,0 1 0 0 0,1-1 0 0 0,-1 0 0 0 0,0 0 1 0 0,0 1-1 0 0,0-1 0 0 0,0 0 0 0 0,0 0 1 0 0,1 1-1 0 0,-1-1 0 0 0,0 0 0 0 0,0 0 0 0 0,1 1 1 0 0,-1-1-1 0 0,0 0 0 0 0,0 0 0 0 0,1 0 0 0 0,-1 1 1 0 0,18 2 476 0 0,16-6 30 0 0,-21 0-401 0 0,0 0 6 0 0,-13 3-114 0 0,-1 0 1 0 0,1 0-1 0 0,0 0 1 0 0,0-1 0 0 0,0 1-1 0 0,0 0 1 0 0,0 0-1 0 0,0 0 1 0 0,0 0 0 0 0,0 0-1 0 0,0 0 1 0 0,0 0-1 0 0,0 0 1 0 0,0 0 0 0 0,0 0-1 0 0,0 0 1 0 0,0 0-1 0 0,0 0 1 0 0,0 0 0 0 0,0 0-1 0 0,0 0 1 0 0,0-1-1 0 0,0 1 1 0 0,-10 1 84 0 0,8-1-87 0 0,1 0 1 0 0,0 1-1 0 0,-1-1 0 0 0,1 0 1 0 0,-1 0-1 0 0,1-1 0 0 0,0 1 1 0 0,-1 0-1 0 0,1 0 0 0 0,-1-1 1 0 0,1 1-1 0 0,0-1 1 0 0,-1 1-1 0 0,1-1 0 0 0,0 1 1 0 0,0-1-1 0 0,-2-1 0 0 0,-9-3 37 0 0,4 0-4040 0 0,4-6-7465 0 0</inkml:trace>
+</inkml:ink>
+</file>
+
 <file path=word/theme/theme1.xml><?xml version="1.0" encoding="utf-8"?>
 <a:theme xmlns:a="http://schemas.openxmlformats.org/drawingml/2006/main" name="Tema di Office">
   <a:themeElements>

</xml_diff>

<commit_message>
refactoring e addionta bean (non in uso solo scritti)
</commit_message>
<xml_diff>
--- a/documentation.docx
+++ b/documentation.docx
@@ -1018,7 +1018,7 @@
               </mc:Choice>
               <mc:Fallback>
                 <w:pict>
-                  <v:group w14:anchorId="1638223D" id="Gruppo 2" o:spid="_x0000_s1026" style="position:absolute;margin-left:131.25pt;margin-top:197.85pt;width:468.75pt;height:531.15pt;z-index:-251656192;mso-position-horizontal-relative:page;mso-position-vertical-relative:page" coordsize="43291,44910" o:gfxdata="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">
+                  <v:group w14:anchorId="04604F2E" id="Gruppo 2" o:spid="_x0000_s1026" style="position:absolute;margin-left:131.25pt;margin-top:197.85pt;width:468.75pt;height:531.15pt;z-index:-251656192;mso-position-horizontal-relative:page;mso-position-vertical-relative:page" coordsize="43291,44910" o:gfxdata="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">
                     <o:lock v:ext="edit" aspectratio="t"/>
                     <v:shape id="Figura a mano libera 64" o:spid="_x0000_s1027" style="position:absolute;left:15017;width:28274;height:28352;visibility:visible;mso-wrap-style:square;v-text-anchor:top" coordsize="1781,1786" o:gfxdata="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" path="m4,1786l,1782,1776,r5,5l4,1786xe" filled="f" stroked="f">
                       <v:path arrowok="t" o:connecttype="custom" o:connectlocs="6350,2835275;0,2828925;2819400,0;2827338,7938;6350,2835275" o:connectangles="0,0,0,0,0"/>
@@ -1047,11 +1047,6 @@
         </w:p>
       </w:sdtContent>
     </w:sdt>
-    <w:p>
-      <w:pPr>
-        <w:pStyle w:val="Heading2"/>
-      </w:pPr>
-    </w:p>
     <w:sdt>
       <w:sdtPr>
         <w:rPr>
@@ -1105,7 +1100,7 @@
             </w:rPr>
             <w:fldChar w:fldCharType="separate"/>
           </w:r>
-          <w:hyperlink w:anchor="_Toc221377436" w:history="1">
+          <w:hyperlink w:anchor="_Toc221461373" w:history="1">
             <w:r>
               <w:rPr>
                 <w:rStyle w:val="Hyperlink"/>
@@ -1132,7 +1127,7 @@
                 <w:noProof/>
                 <w:webHidden/>
               </w:rPr>
-              <w:instrText xml:space="preserve"> PAGEREF _Toc221377436 \h </w:instrText>
+              <w:instrText xml:space="preserve"> PAGEREF _Toc221461373 \h </w:instrText>
             </w:r>
             <w:r>
               <w:rPr>
@@ -1175,7 +1170,7 @@
               <w:lang w:val="it-IT" w:eastAsia="it-IT"/>
             </w:rPr>
           </w:pPr>
-          <w:hyperlink w:anchor="_Toc221377437" w:history="1">
+          <w:hyperlink w:anchor="_Toc221461374" w:history="1">
             <w:r>
               <w:rPr>
                 <w:rStyle w:val="Hyperlink"/>
@@ -1202,7 +1197,7 @@
                 <w:noProof/>
                 <w:webHidden/>
               </w:rPr>
-              <w:instrText xml:space="preserve"> PAGEREF _Toc221377437 \h </w:instrText>
+              <w:instrText xml:space="preserve"> PAGEREF _Toc221461374 \h </w:instrText>
             </w:r>
             <w:r>
               <w:rPr>
@@ -1245,7 +1240,7 @@
               <w:lang w:val="it-IT" w:eastAsia="it-IT"/>
             </w:rPr>
           </w:pPr>
-          <w:hyperlink w:anchor="_Toc221377438" w:history="1">
+          <w:hyperlink w:anchor="_Toc221461375" w:history="1">
             <w:r>
               <w:rPr>
                 <w:rStyle w:val="Hyperlink"/>
@@ -1272,7 +1267,7 @@
                 <w:noProof/>
                 <w:webHidden/>
               </w:rPr>
-              <w:instrText xml:space="preserve"> PAGEREF _Toc221377438 \h </w:instrText>
+              <w:instrText xml:space="preserve"> PAGEREF _Toc221461375 \h </w:instrText>
             </w:r>
             <w:r>
               <w:rPr>
@@ -1315,7 +1310,7 @@
               <w:lang w:val="it-IT" w:eastAsia="it-IT"/>
             </w:rPr>
           </w:pPr>
-          <w:hyperlink w:anchor="_Toc221377439" w:history="1">
+          <w:hyperlink w:anchor="_Toc221461376" w:history="1">
             <w:r>
               <w:rPr>
                 <w:rStyle w:val="Hyperlink"/>
@@ -1342,7 +1337,7 @@
                 <w:noProof/>
                 <w:webHidden/>
               </w:rPr>
-              <w:instrText xml:space="preserve"> PAGEREF _Toc221377439 \h </w:instrText>
+              <w:instrText xml:space="preserve"> PAGEREF _Toc221461376 \h </w:instrText>
             </w:r>
             <w:r>
               <w:rPr>
@@ -1385,7 +1380,7 @@
               <w:lang w:val="it-IT" w:eastAsia="it-IT"/>
             </w:rPr>
           </w:pPr>
-          <w:hyperlink w:anchor="_Toc221377440" w:history="1">
+          <w:hyperlink w:anchor="_Toc221461377" w:history="1">
             <w:r>
               <w:rPr>
                 <w:rStyle w:val="Hyperlink"/>
@@ -1412,7 +1407,7 @@
                 <w:noProof/>
                 <w:webHidden/>
               </w:rPr>
-              <w:instrText xml:space="preserve"> PAGEREF _Toc221377440 \h </w:instrText>
+              <w:instrText xml:space="preserve"> PAGEREF _Toc221461377 \h </w:instrText>
             </w:r>
             <w:r>
               <w:rPr>
@@ -1455,7 +1450,7 @@
               <w:lang w:val="it-IT" w:eastAsia="it-IT"/>
             </w:rPr>
           </w:pPr>
-          <w:hyperlink w:anchor="_Toc221377441" w:history="1">
+          <w:hyperlink w:anchor="_Toc221461378" w:history="1">
             <w:r>
               <w:rPr>
                 <w:rStyle w:val="Hyperlink"/>
@@ -1482,7 +1477,7 @@
                 <w:noProof/>
                 <w:webHidden/>
               </w:rPr>
-              <w:instrText xml:space="preserve"> PAGEREF _Toc221377441 \h </w:instrText>
+              <w:instrText xml:space="preserve"> PAGEREF _Toc221461378 \h </w:instrText>
             </w:r>
             <w:r>
               <w:rPr>
@@ -1525,13 +1520,13 @@
               <w:lang w:val="it-IT" w:eastAsia="it-IT"/>
             </w:rPr>
           </w:pPr>
-          <w:hyperlink w:anchor="_Toc221377442" w:history="1">
+          <w:hyperlink w:anchor="_Toc221461379" w:history="1">
             <w:r>
               <w:rPr>
                 <w:rStyle w:val="Hyperlink"/>
                 <w:noProof/>
               </w:rPr>
-              <w:t>FUNTIONAL REQUIREMENTS:</w:t>
+              <w:t>FUNCTIONAL REQUIREMENTS:</w:t>
             </w:r>
             <w:r>
               <w:rPr>
@@ -1552,7 +1547,7 @@
                 <w:noProof/>
                 <w:webHidden/>
               </w:rPr>
-              <w:instrText xml:space="preserve"> PAGEREF _Toc221377442 \h </w:instrText>
+              <w:instrText xml:space="preserve"> PAGEREF _Toc221461379 \h </w:instrText>
             </w:r>
             <w:r>
               <w:rPr>
@@ -1595,7 +1590,7 @@
               <w:lang w:val="it-IT" w:eastAsia="it-IT"/>
             </w:rPr>
           </w:pPr>
-          <w:hyperlink w:anchor="_Toc221377443" w:history="1">
+          <w:hyperlink w:anchor="_Toc221461380" w:history="1">
             <w:r>
               <w:rPr>
                 <w:rStyle w:val="Hyperlink"/>
@@ -1622,7 +1617,7 @@
                 <w:noProof/>
                 <w:webHidden/>
               </w:rPr>
-              <w:instrText xml:space="preserve"> PAGEREF _Toc221377443 \h </w:instrText>
+              <w:instrText xml:space="preserve"> PAGEREF _Toc221461380 \h </w:instrText>
             </w:r>
             <w:r>
               <w:rPr>
@@ -1665,7 +1660,7 @@
               <w:lang w:val="it-IT" w:eastAsia="it-IT"/>
             </w:rPr>
           </w:pPr>
-          <w:hyperlink w:anchor="_Toc221377444" w:history="1">
+          <w:hyperlink w:anchor="_Toc221461381" w:history="1">
             <w:r>
               <w:rPr>
                 <w:rStyle w:val="Hyperlink"/>
@@ -1692,7 +1687,7 @@
                 <w:noProof/>
                 <w:webHidden/>
               </w:rPr>
-              <w:instrText xml:space="preserve"> PAGEREF _Toc221377444 \h </w:instrText>
+              <w:instrText xml:space="preserve"> PAGEREF _Toc221461381 \h </w:instrText>
             </w:r>
             <w:r>
               <w:rPr>
@@ -1735,7 +1730,14 @@
               <w:lang w:val="it-IT" w:eastAsia="it-IT"/>
             </w:rPr>
           </w:pPr>
-          <w:hyperlink w:anchor="_Toc221377445" w:history="1">
+          <w:hyperlink w:anchor="_Toc221461382" w:history="1">
+            <w:r>
+              <w:rPr>
+                <w:rStyle w:val="Hyperlink"/>
+                <w:noProof/>
+              </w:rPr>
+              <w:t>INTERNAL STEP:</w:t>
+            </w:r>
             <w:r>
               <w:rPr>
                 <w:noProof/>
@@ -1755,7 +1757,7 @@
                 <w:noProof/>
                 <w:webHidden/>
               </w:rPr>
-              <w:instrText xml:space="preserve"> PAGEREF _Toc221377445 \h </w:instrText>
+              <w:instrText xml:space="preserve"> PAGEREF _Toc221461382 \h </w:instrText>
             </w:r>
             <w:r>
               <w:rPr>
@@ -1775,7 +1777,147 @@
                 <w:noProof/>
                 <w:webHidden/>
               </w:rPr>
-              <w:t>5</w:t>
+              <w:t>6</w:t>
+            </w:r>
+            <w:r>
+              <w:rPr>
+                <w:noProof/>
+                <w:webHidden/>
+              </w:rPr>
+              <w:fldChar w:fldCharType="end"/>
+            </w:r>
+          </w:hyperlink>
+        </w:p>
+        <w:p>
+          <w:pPr>
+            <w:pStyle w:val="TOC2"/>
+            <w:tabs>
+              <w:tab w:val="right" w:leader="dot" w:pos="9628"/>
+            </w:tabs>
+            <w:rPr>
+              <w:rFonts w:eastAsiaTheme="minorEastAsia"/>
+              <w:noProof/>
+              <w:lang w:val="it-IT" w:eastAsia="it-IT"/>
+            </w:rPr>
+          </w:pPr>
+          <w:hyperlink w:anchor="_Toc221461383" w:history="1">
+            <w:r>
+              <w:rPr>
+                <w:rStyle w:val="Hyperlink"/>
+                <w:noProof/>
+              </w:rPr>
+              <w:t>STORYBOARD AND PROTOTYPE:</w:t>
+            </w:r>
+            <w:r>
+              <w:rPr>
+                <w:noProof/>
+                <w:webHidden/>
+              </w:rPr>
+              <w:tab/>
+            </w:r>
+            <w:r>
+              <w:rPr>
+                <w:noProof/>
+                <w:webHidden/>
+              </w:rPr>
+              <w:fldChar w:fldCharType="begin"/>
+            </w:r>
+            <w:r>
+              <w:rPr>
+                <w:noProof/>
+                <w:webHidden/>
+              </w:rPr>
+              <w:instrText xml:space="preserve"> PAGEREF _Toc221461383 \h </w:instrText>
+            </w:r>
+            <w:r>
+              <w:rPr>
+                <w:noProof/>
+                <w:webHidden/>
+              </w:rPr>
+            </w:r>
+            <w:r>
+              <w:rPr>
+                <w:noProof/>
+                <w:webHidden/>
+              </w:rPr>
+              <w:fldChar w:fldCharType="separate"/>
+            </w:r>
+            <w:r>
+              <w:rPr>
+                <w:noProof/>
+                <w:webHidden/>
+              </w:rPr>
+              <w:t>8</w:t>
+            </w:r>
+            <w:r>
+              <w:rPr>
+                <w:noProof/>
+                <w:webHidden/>
+              </w:rPr>
+              <w:fldChar w:fldCharType="end"/>
+            </w:r>
+          </w:hyperlink>
+        </w:p>
+        <w:p>
+          <w:pPr>
+            <w:pStyle w:val="TOC2"/>
+            <w:tabs>
+              <w:tab w:val="right" w:leader="dot" w:pos="9628"/>
+            </w:tabs>
+            <w:rPr>
+              <w:rFonts w:eastAsiaTheme="minorEastAsia"/>
+              <w:noProof/>
+              <w:lang w:val="it-IT" w:eastAsia="it-IT"/>
+            </w:rPr>
+          </w:pPr>
+          <w:hyperlink w:anchor="_Toc221461384" w:history="1">
+            <w:r>
+              <w:rPr>
+                <w:rStyle w:val="Hyperlink"/>
+                <w:noProof/>
+              </w:rPr>
+              <w:t>Design:</w:t>
+            </w:r>
+            <w:r>
+              <w:rPr>
+                <w:noProof/>
+                <w:webHidden/>
+              </w:rPr>
+              <w:tab/>
+            </w:r>
+            <w:r>
+              <w:rPr>
+                <w:noProof/>
+                <w:webHidden/>
+              </w:rPr>
+              <w:fldChar w:fldCharType="begin"/>
+            </w:r>
+            <w:r>
+              <w:rPr>
+                <w:noProof/>
+                <w:webHidden/>
+              </w:rPr>
+              <w:instrText xml:space="preserve"> PAGEREF _Toc221461384 \h </w:instrText>
+            </w:r>
+            <w:r>
+              <w:rPr>
+                <w:noProof/>
+                <w:webHidden/>
+              </w:rPr>
+            </w:r>
+            <w:r>
+              <w:rPr>
+                <w:noProof/>
+                <w:webHidden/>
+              </w:rPr>
+              <w:fldChar w:fldCharType="separate"/>
+            </w:r>
+            <w:r>
+              <w:rPr>
+                <w:noProof/>
+                <w:webHidden/>
+              </w:rPr>
+              <w:t>10</w:t>
             </w:r>
             <w:r>
               <w:rPr>
@@ -1798,13 +1940,13 @@
               <w:lang w:val="it-IT" w:eastAsia="it-IT"/>
             </w:rPr>
           </w:pPr>
-          <w:hyperlink w:anchor="_Toc221377446" w:history="1">
+          <w:hyperlink w:anchor="_Toc221461385" w:history="1">
             <w:r>
               <w:rPr>
                 <w:rStyle w:val="Hyperlink"/>
                 <w:noProof/>
               </w:rPr>
-              <w:t>INTERNAL STEP:</w:t>
+              <w:t>Class diagram:</w:t>
             </w:r>
             <w:r>
               <w:rPr>
@@ -1825,7 +1967,7 @@
                 <w:noProof/>
                 <w:webHidden/>
               </w:rPr>
-              <w:instrText xml:space="preserve"> PAGEREF _Toc221377446 \h </w:instrText>
+              <w:instrText xml:space="preserve"> PAGEREF _Toc221461385 \h </w:instrText>
             </w:r>
             <w:r>
               <w:rPr>
@@ -1845,7 +1987,287 @@
                 <w:noProof/>
                 <w:webHidden/>
               </w:rPr>
-              <w:t>6</w:t>
+              <w:t>10</w:t>
+            </w:r>
+            <w:r>
+              <w:rPr>
+                <w:noProof/>
+                <w:webHidden/>
+              </w:rPr>
+              <w:fldChar w:fldCharType="end"/>
+            </w:r>
+          </w:hyperlink>
+        </w:p>
+        <w:p>
+          <w:pPr>
+            <w:pStyle w:val="TOC3"/>
+            <w:tabs>
+              <w:tab w:val="right" w:leader="dot" w:pos="9628"/>
+            </w:tabs>
+            <w:rPr>
+              <w:rFonts w:eastAsiaTheme="minorEastAsia"/>
+              <w:noProof/>
+              <w:lang w:val="it-IT" w:eastAsia="it-IT"/>
+            </w:rPr>
+          </w:pPr>
+          <w:hyperlink w:anchor="_Toc221461386" w:history="1">
+            <w:r>
+              <w:rPr>
+                <w:rStyle w:val="Hyperlink"/>
+                <w:noProof/>
+              </w:rPr>
+              <w:t>Design patterns:</w:t>
+            </w:r>
+            <w:r>
+              <w:rPr>
+                <w:noProof/>
+                <w:webHidden/>
+              </w:rPr>
+              <w:tab/>
+            </w:r>
+            <w:r>
+              <w:rPr>
+                <w:noProof/>
+                <w:webHidden/>
+              </w:rPr>
+              <w:fldChar w:fldCharType="begin"/>
+            </w:r>
+            <w:r>
+              <w:rPr>
+                <w:noProof/>
+                <w:webHidden/>
+              </w:rPr>
+              <w:instrText xml:space="preserve"> PAGEREF _Toc221461386 \h </w:instrText>
+            </w:r>
+            <w:r>
+              <w:rPr>
+                <w:noProof/>
+                <w:webHidden/>
+              </w:rPr>
+            </w:r>
+            <w:r>
+              <w:rPr>
+                <w:noProof/>
+                <w:webHidden/>
+              </w:rPr>
+              <w:fldChar w:fldCharType="separate"/>
+            </w:r>
+            <w:r>
+              <w:rPr>
+                <w:noProof/>
+                <w:webHidden/>
+              </w:rPr>
+              <w:t>19</w:t>
+            </w:r>
+            <w:r>
+              <w:rPr>
+                <w:noProof/>
+                <w:webHidden/>
+              </w:rPr>
+              <w:fldChar w:fldCharType="end"/>
+            </w:r>
+          </w:hyperlink>
+        </w:p>
+        <w:p>
+          <w:pPr>
+            <w:pStyle w:val="TOC3"/>
+            <w:tabs>
+              <w:tab w:val="right" w:leader="dot" w:pos="9628"/>
+            </w:tabs>
+            <w:rPr>
+              <w:rFonts w:eastAsiaTheme="minorEastAsia"/>
+              <w:noProof/>
+              <w:lang w:val="it-IT" w:eastAsia="it-IT"/>
+            </w:rPr>
+          </w:pPr>
+          <w:hyperlink w:anchor="_Toc221461387" w:history="1">
+            <w:r>
+              <w:rPr>
+                <w:rStyle w:val="Hyperlink"/>
+                <w:noProof/>
+              </w:rPr>
+              <w:t>Activity diagram:</w:t>
+            </w:r>
+            <w:r>
+              <w:rPr>
+                <w:noProof/>
+                <w:webHidden/>
+              </w:rPr>
+              <w:tab/>
+            </w:r>
+            <w:r>
+              <w:rPr>
+                <w:noProof/>
+                <w:webHidden/>
+              </w:rPr>
+              <w:fldChar w:fldCharType="begin"/>
+            </w:r>
+            <w:r>
+              <w:rPr>
+                <w:noProof/>
+                <w:webHidden/>
+              </w:rPr>
+              <w:instrText xml:space="preserve"> PAGEREF _Toc221461387 \h </w:instrText>
+            </w:r>
+            <w:r>
+              <w:rPr>
+                <w:noProof/>
+                <w:webHidden/>
+              </w:rPr>
+            </w:r>
+            <w:r>
+              <w:rPr>
+                <w:noProof/>
+                <w:webHidden/>
+              </w:rPr>
+              <w:fldChar w:fldCharType="separate"/>
+            </w:r>
+            <w:r>
+              <w:rPr>
+                <w:noProof/>
+                <w:webHidden/>
+              </w:rPr>
+              <w:t>21</w:t>
+            </w:r>
+            <w:r>
+              <w:rPr>
+                <w:noProof/>
+                <w:webHidden/>
+              </w:rPr>
+              <w:fldChar w:fldCharType="end"/>
+            </w:r>
+          </w:hyperlink>
+        </w:p>
+        <w:p>
+          <w:pPr>
+            <w:pStyle w:val="TOC3"/>
+            <w:tabs>
+              <w:tab w:val="right" w:leader="dot" w:pos="9628"/>
+            </w:tabs>
+            <w:rPr>
+              <w:rFonts w:eastAsiaTheme="minorEastAsia"/>
+              <w:noProof/>
+              <w:lang w:val="it-IT" w:eastAsia="it-IT"/>
+            </w:rPr>
+          </w:pPr>
+          <w:hyperlink w:anchor="_Toc221461388" w:history="1">
+            <w:r>
+              <w:rPr>
+                <w:rStyle w:val="Hyperlink"/>
+                <w:noProof/>
+              </w:rPr>
+              <w:t>Sequence diagram:</w:t>
+            </w:r>
+            <w:r>
+              <w:rPr>
+                <w:noProof/>
+                <w:webHidden/>
+              </w:rPr>
+              <w:tab/>
+            </w:r>
+            <w:r>
+              <w:rPr>
+                <w:noProof/>
+                <w:webHidden/>
+              </w:rPr>
+              <w:fldChar w:fldCharType="begin"/>
+            </w:r>
+            <w:r>
+              <w:rPr>
+                <w:noProof/>
+                <w:webHidden/>
+              </w:rPr>
+              <w:instrText xml:space="preserve"> PAGEREF _Toc221461388 \h </w:instrText>
+            </w:r>
+            <w:r>
+              <w:rPr>
+                <w:noProof/>
+                <w:webHidden/>
+              </w:rPr>
+            </w:r>
+            <w:r>
+              <w:rPr>
+                <w:noProof/>
+                <w:webHidden/>
+              </w:rPr>
+              <w:fldChar w:fldCharType="separate"/>
+            </w:r>
+            <w:r>
+              <w:rPr>
+                <w:noProof/>
+                <w:webHidden/>
+              </w:rPr>
+              <w:t>24</w:t>
+            </w:r>
+            <w:r>
+              <w:rPr>
+                <w:noProof/>
+                <w:webHidden/>
+              </w:rPr>
+              <w:fldChar w:fldCharType="end"/>
+            </w:r>
+          </w:hyperlink>
+        </w:p>
+        <w:p>
+          <w:pPr>
+            <w:pStyle w:val="TOC3"/>
+            <w:tabs>
+              <w:tab w:val="right" w:leader="dot" w:pos="9628"/>
+            </w:tabs>
+            <w:rPr>
+              <w:rFonts w:eastAsiaTheme="minorEastAsia"/>
+              <w:noProof/>
+              <w:lang w:val="it-IT" w:eastAsia="it-IT"/>
+            </w:rPr>
+          </w:pPr>
+          <w:hyperlink w:anchor="_Toc221461389" w:history="1">
+            <w:r>
+              <w:rPr>
+                <w:rStyle w:val="Hyperlink"/>
+                <w:noProof/>
+              </w:rPr>
+              <w:t>State diagram:</w:t>
+            </w:r>
+            <w:r>
+              <w:rPr>
+                <w:noProof/>
+                <w:webHidden/>
+              </w:rPr>
+              <w:tab/>
+            </w:r>
+            <w:r>
+              <w:rPr>
+                <w:noProof/>
+                <w:webHidden/>
+              </w:rPr>
+              <w:fldChar w:fldCharType="begin"/>
+            </w:r>
+            <w:r>
+              <w:rPr>
+                <w:noProof/>
+                <w:webHidden/>
+              </w:rPr>
+              <w:instrText xml:space="preserve"> PAGEREF _Toc221461389 \h </w:instrText>
+            </w:r>
+            <w:r>
+              <w:rPr>
+                <w:noProof/>
+                <w:webHidden/>
+              </w:rPr>
+            </w:r>
+            <w:r>
+              <w:rPr>
+                <w:noProof/>
+                <w:webHidden/>
+              </w:rPr>
+              <w:fldChar w:fldCharType="separate"/>
+            </w:r>
+            <w:r>
+              <w:rPr>
+                <w:noProof/>
+                <w:webHidden/>
+              </w:rPr>
+              <w:t>25</w:t>
             </w:r>
             <w:r>
               <w:rPr>
@@ -1868,13 +2290,13 @@
               <w:lang w:val="it-IT" w:eastAsia="it-IT"/>
             </w:rPr>
           </w:pPr>
-          <w:hyperlink w:anchor="_Toc221377447" w:history="1">
+          <w:hyperlink w:anchor="_Toc221461390" w:history="1">
             <w:r>
               <w:rPr>
                 <w:rStyle w:val="Hyperlink"/>
                 <w:noProof/>
               </w:rPr>
-              <w:t>STORYBOARD AND PROTOTYPE:</w:t>
+              <w:t>TESTING:</w:t>
             </w:r>
             <w:r>
               <w:rPr>
@@ -1895,7 +2317,7 @@
                 <w:noProof/>
                 <w:webHidden/>
               </w:rPr>
-              <w:instrText xml:space="preserve"> PAGEREF _Toc221377447 \h </w:instrText>
+              <w:instrText xml:space="preserve"> PAGEREF _Toc221461390 \h </w:instrText>
             </w:r>
             <w:r>
               <w:rPr>
@@ -1915,7 +2337,7 @@
                 <w:noProof/>
                 <w:webHidden/>
               </w:rPr>
-              <w:t>8</w:t>
+              <w:t>26</w:t>
             </w:r>
             <w:r>
               <w:rPr>
@@ -1938,13 +2360,13 @@
               <w:lang w:val="it-IT" w:eastAsia="it-IT"/>
             </w:rPr>
           </w:pPr>
-          <w:hyperlink w:anchor="_Toc221377448" w:history="1">
+          <w:hyperlink w:anchor="_Toc221461391" w:history="1">
             <w:r>
               <w:rPr>
                 <w:rStyle w:val="Hyperlink"/>
                 <w:noProof/>
               </w:rPr>
-              <w:t>Design:</w:t>
+              <w:t>EXCEPTIONS:</w:t>
             </w:r>
             <w:r>
               <w:rPr>
@@ -1965,7 +2387,7 @@
                 <w:noProof/>
                 <w:webHidden/>
               </w:rPr>
-              <w:instrText xml:space="preserve"> PAGEREF _Toc221377448 \h </w:instrText>
+              <w:instrText xml:space="preserve"> PAGEREF _Toc221461391 \h </w:instrText>
             </w:r>
             <w:r>
               <w:rPr>
@@ -1985,7 +2407,77 @@
                 <w:noProof/>
                 <w:webHidden/>
               </w:rPr>
-              <w:t>10</w:t>
+              <w:t>27</w:t>
+            </w:r>
+            <w:r>
+              <w:rPr>
+                <w:noProof/>
+                <w:webHidden/>
+              </w:rPr>
+              <w:fldChar w:fldCharType="end"/>
+            </w:r>
+          </w:hyperlink>
+        </w:p>
+        <w:p>
+          <w:pPr>
+            <w:pStyle w:val="TOC2"/>
+            <w:tabs>
+              <w:tab w:val="right" w:leader="dot" w:pos="9628"/>
+            </w:tabs>
+            <w:rPr>
+              <w:rFonts w:eastAsiaTheme="minorEastAsia"/>
+              <w:noProof/>
+              <w:lang w:val="it-IT" w:eastAsia="it-IT"/>
+            </w:rPr>
+          </w:pPr>
+          <w:hyperlink w:anchor="_Toc221461392" w:history="1">
+            <w:r>
+              <w:rPr>
+                <w:rStyle w:val="Hyperlink"/>
+                <w:noProof/>
+              </w:rPr>
+              <w:t>DATA BASES:</w:t>
+            </w:r>
+            <w:r>
+              <w:rPr>
+                <w:noProof/>
+                <w:webHidden/>
+              </w:rPr>
+              <w:tab/>
+            </w:r>
+            <w:r>
+              <w:rPr>
+                <w:noProof/>
+                <w:webHidden/>
+              </w:rPr>
+              <w:fldChar w:fldCharType="begin"/>
+            </w:r>
+            <w:r>
+              <w:rPr>
+                <w:noProof/>
+                <w:webHidden/>
+              </w:rPr>
+              <w:instrText xml:space="preserve"> PAGEREF _Toc221461392 \h </w:instrText>
+            </w:r>
+            <w:r>
+              <w:rPr>
+                <w:noProof/>
+                <w:webHidden/>
+              </w:rPr>
+            </w:r>
+            <w:r>
+              <w:rPr>
+                <w:noProof/>
+                <w:webHidden/>
+              </w:rPr>
+              <w:fldChar w:fldCharType="separate"/>
+            </w:r>
+            <w:r>
+              <w:rPr>
+                <w:noProof/>
+                <w:webHidden/>
+              </w:rPr>
+              <w:t>28</w:t>
             </w:r>
             <w:r>
               <w:rPr>
@@ -2008,13 +2500,13 @@
               <w:lang w:val="it-IT" w:eastAsia="it-IT"/>
             </w:rPr>
           </w:pPr>
-          <w:hyperlink w:anchor="_Toc221377449" w:history="1">
+          <w:hyperlink w:anchor="_Toc221461393" w:history="1">
             <w:r>
               <w:rPr>
                 <w:rStyle w:val="Hyperlink"/>
                 <w:noProof/>
               </w:rPr>
-              <w:t>Class diagram:</w:t>
+              <w:t>RELATIONAL DATABASE (POSTGRESQL)</w:t>
             </w:r>
             <w:r>
               <w:rPr>
@@ -2035,7 +2527,7 @@
                 <w:noProof/>
                 <w:webHidden/>
               </w:rPr>
-              <w:instrText xml:space="preserve"> PAGEREF _Toc221377449 \h </w:instrText>
+              <w:instrText xml:space="preserve"> PAGEREF _Toc221461393 \h </w:instrText>
             </w:r>
             <w:r>
               <w:rPr>
@@ -2055,7 +2547,7 @@
                 <w:noProof/>
                 <w:webHidden/>
               </w:rPr>
-              <w:t>10</w:t>
+              <w:t>28</w:t>
             </w:r>
             <w:r>
               <w:rPr>
@@ -2078,13 +2570,13 @@
               <w:lang w:val="it-IT" w:eastAsia="it-IT"/>
             </w:rPr>
           </w:pPr>
-          <w:hyperlink w:anchor="_Toc221377450" w:history="1">
+          <w:hyperlink w:anchor="_Toc221461394" w:history="1">
             <w:r>
               <w:rPr>
                 <w:rStyle w:val="Hyperlink"/>
                 <w:noProof/>
               </w:rPr>
-              <w:t>Design patterns:</w:t>
+              <w:t>DATA ACCESS OBJECT (DAO) LAYER</w:t>
             </w:r>
             <w:r>
               <w:rPr>
@@ -2105,7 +2597,7 @@
                 <w:noProof/>
                 <w:webHidden/>
               </w:rPr>
-              <w:instrText xml:space="preserve"> PAGEREF _Toc221377450 \h </w:instrText>
+              <w:instrText xml:space="preserve"> PAGEREF _Toc221461394 \h </w:instrText>
             </w:r>
             <w:r>
               <w:rPr>
@@ -2125,7 +2617,7 @@
                 <w:noProof/>
                 <w:webHidden/>
               </w:rPr>
-              <w:t>19</w:t>
+              <w:t>29</w:t>
             </w:r>
             <w:r>
               <w:rPr>
@@ -2148,13 +2640,13 @@
               <w:lang w:val="it-IT" w:eastAsia="it-IT"/>
             </w:rPr>
           </w:pPr>
-          <w:hyperlink w:anchor="_Toc221377451" w:history="1">
+          <w:hyperlink w:anchor="_Toc221461395" w:history="1">
             <w:r>
               <w:rPr>
                 <w:rStyle w:val="Hyperlink"/>
                 <w:noProof/>
               </w:rPr>
-              <w:t>Activity diagram:</w:t>
+              <w:t>DOCKER-BASED DEVELOPMENT ENVIRONMENT</w:t>
             </w:r>
             <w:r>
               <w:rPr>
@@ -2175,7 +2667,7 @@
                 <w:noProof/>
                 <w:webHidden/>
               </w:rPr>
-              <w:instrText xml:space="preserve"> PAGEREF _Toc221377451 \h </w:instrText>
+              <w:instrText xml:space="preserve"> PAGEREF _Toc221461395 \h </w:instrText>
             </w:r>
             <w:r>
               <w:rPr>
@@ -2195,7 +2687,7 @@
                 <w:noProof/>
                 <w:webHidden/>
               </w:rPr>
-              <w:t>21</w:t>
+              <w:t>29</w:t>
             </w:r>
             <w:r>
               <w:rPr>
@@ -2218,13 +2710,13 @@
               <w:lang w:val="it-IT" w:eastAsia="it-IT"/>
             </w:rPr>
           </w:pPr>
-          <w:hyperlink w:anchor="_Toc221377452" w:history="1">
+          <w:hyperlink w:anchor="_Toc221461396" w:history="1">
             <w:r>
               <w:rPr>
                 <w:rStyle w:val="Hyperlink"/>
                 <w:noProof/>
               </w:rPr>
-              <w:t>Sequence diagram:</w:t>
+              <w:t>FILE SYSTEM–BASED DAO IMPLEMENTATION</w:t>
             </w:r>
             <w:r>
               <w:rPr>
@@ -2245,7 +2737,7 @@
                 <w:noProof/>
                 <w:webHidden/>
               </w:rPr>
-              <w:instrText xml:space="preserve"> PAGEREF _Toc221377452 \h </w:instrText>
+              <w:instrText xml:space="preserve"> PAGEREF _Toc221461396 \h </w:instrText>
             </w:r>
             <w:r>
               <w:rPr>
@@ -2265,77 +2757,7 @@
                 <w:noProof/>
                 <w:webHidden/>
               </w:rPr>
-              <w:t>24</w:t>
-            </w:r>
-            <w:r>
-              <w:rPr>
-                <w:noProof/>
-                <w:webHidden/>
-              </w:rPr>
-              <w:fldChar w:fldCharType="end"/>
-            </w:r>
-          </w:hyperlink>
-        </w:p>
-        <w:p>
-          <w:pPr>
-            <w:pStyle w:val="TOC3"/>
-            <w:tabs>
-              <w:tab w:val="right" w:leader="dot" w:pos="9628"/>
-            </w:tabs>
-            <w:rPr>
-              <w:rFonts w:eastAsiaTheme="minorEastAsia"/>
-              <w:noProof/>
-              <w:lang w:val="it-IT" w:eastAsia="it-IT"/>
-            </w:rPr>
-          </w:pPr>
-          <w:hyperlink w:anchor="_Toc221377453" w:history="1">
-            <w:r>
-              <w:rPr>
-                <w:rStyle w:val="Hyperlink"/>
-                <w:noProof/>
-              </w:rPr>
-              <w:t>State diagram:</w:t>
-            </w:r>
-            <w:r>
-              <w:rPr>
-                <w:noProof/>
-                <w:webHidden/>
-              </w:rPr>
-              <w:tab/>
-            </w:r>
-            <w:r>
-              <w:rPr>
-                <w:noProof/>
-                <w:webHidden/>
-              </w:rPr>
-              <w:fldChar w:fldCharType="begin"/>
-            </w:r>
-            <w:r>
-              <w:rPr>
-                <w:noProof/>
-                <w:webHidden/>
-              </w:rPr>
-              <w:instrText xml:space="preserve"> PAGEREF _Toc221377453 \h </w:instrText>
-            </w:r>
-            <w:r>
-              <w:rPr>
-                <w:noProof/>
-                <w:webHidden/>
-              </w:rPr>
-            </w:r>
-            <w:r>
-              <w:rPr>
-                <w:noProof/>
-                <w:webHidden/>
-              </w:rPr>
-              <w:fldChar w:fldCharType="separate"/>
-            </w:r>
-            <w:r>
-              <w:rPr>
-                <w:noProof/>
-                <w:webHidden/>
-              </w:rPr>
-              <w:t>25</w:t>
+              <w:t>29</w:t>
             </w:r>
             <w:r>
               <w:rPr>
@@ -2358,13 +2780,13 @@
               <w:lang w:val="it-IT" w:eastAsia="it-IT"/>
             </w:rPr>
           </w:pPr>
-          <w:hyperlink w:anchor="_Toc221377454" w:history="1">
+          <w:hyperlink w:anchor="_Toc221461397" w:history="1">
             <w:r>
               <w:rPr>
                 <w:rStyle w:val="Hyperlink"/>
                 <w:noProof/>
               </w:rPr>
-              <w:t>TESTING:</w:t>
+              <w:t>SONAR CLOUD</w:t>
             </w:r>
             <w:r>
               <w:rPr>
@@ -2385,7 +2807,7 @@
                 <w:noProof/>
                 <w:webHidden/>
               </w:rPr>
-              <w:instrText xml:space="preserve"> PAGEREF _Toc221377454 \h </w:instrText>
+              <w:instrText xml:space="preserve"> PAGEREF _Toc221461397 \h </w:instrText>
             </w:r>
             <w:r>
               <w:rPr>
@@ -2405,7 +2827,7 @@
                 <w:noProof/>
                 <w:webHidden/>
               </w:rPr>
-              <w:t>26</w:t>
+              <w:t>31</w:t>
             </w:r>
             <w:r>
               <w:rPr>
@@ -2428,13 +2850,13 @@
               <w:lang w:val="it-IT" w:eastAsia="it-IT"/>
             </w:rPr>
           </w:pPr>
-          <w:hyperlink w:anchor="_Toc221377455" w:history="1">
+          <w:hyperlink w:anchor="_Toc221461398" w:history="1">
             <w:r>
               <w:rPr>
                 <w:rStyle w:val="Hyperlink"/>
                 <w:noProof/>
               </w:rPr>
-              <w:t>EXCEPTIONS:</w:t>
+              <w:t>DEMOSTRATION</w:t>
             </w:r>
             <w:r>
               <w:rPr>
@@ -2455,7 +2877,7 @@
                 <w:noProof/>
                 <w:webHidden/>
               </w:rPr>
-              <w:instrText xml:space="preserve"> PAGEREF _Toc221377455 \h </w:instrText>
+              <w:instrText xml:space="preserve"> PAGEREF _Toc221461398 \h </w:instrText>
             </w:r>
             <w:r>
               <w:rPr>
@@ -2475,7 +2897,7 @@
                 <w:noProof/>
                 <w:webHidden/>
               </w:rPr>
-              <w:t>27</w:t>
+              <w:t>31</w:t>
             </w:r>
             <w:r>
               <w:rPr>
@@ -2498,13 +2920,13 @@
               <w:lang w:val="it-IT" w:eastAsia="it-IT"/>
             </w:rPr>
           </w:pPr>
-          <w:hyperlink w:anchor="_Toc221377456" w:history="1">
+          <w:hyperlink w:anchor="_Toc221461399" w:history="1">
             <w:r>
               <w:rPr>
                 <w:rStyle w:val="Hyperlink"/>
                 <w:noProof/>
               </w:rPr>
-              <w:t>DATA BASES:</w:t>
+              <w:t>DOWNLOAD SOURCE CODE</w:t>
             </w:r>
             <w:r>
               <w:rPr>
@@ -2525,497 +2947,7 @@
                 <w:noProof/>
                 <w:webHidden/>
               </w:rPr>
-              <w:instrText xml:space="preserve"> PAGEREF _Toc221377456 \h </w:instrText>
-            </w:r>
-            <w:r>
-              <w:rPr>
-                <w:noProof/>
-                <w:webHidden/>
-              </w:rPr>
-            </w:r>
-            <w:r>
-              <w:rPr>
-                <w:noProof/>
-                <w:webHidden/>
-              </w:rPr>
-              <w:fldChar w:fldCharType="separate"/>
-            </w:r>
-            <w:r>
-              <w:rPr>
-                <w:noProof/>
-                <w:webHidden/>
-              </w:rPr>
-              <w:t>28</w:t>
-            </w:r>
-            <w:r>
-              <w:rPr>
-                <w:noProof/>
-                <w:webHidden/>
-              </w:rPr>
-              <w:fldChar w:fldCharType="end"/>
-            </w:r>
-          </w:hyperlink>
-        </w:p>
-        <w:p>
-          <w:pPr>
-            <w:pStyle w:val="TOC3"/>
-            <w:tabs>
-              <w:tab w:val="right" w:leader="dot" w:pos="9628"/>
-            </w:tabs>
-            <w:rPr>
-              <w:rFonts w:eastAsiaTheme="minorEastAsia"/>
-              <w:noProof/>
-              <w:lang w:val="it-IT" w:eastAsia="it-IT"/>
-            </w:rPr>
-          </w:pPr>
-          <w:hyperlink w:anchor="_Toc221377457" w:history="1">
-            <w:r>
-              <w:rPr>
-                <w:rStyle w:val="Hyperlink"/>
-                <w:noProof/>
-              </w:rPr>
-              <w:t>RELATIONAL DATABASE (POSTGRESQL)</w:t>
-            </w:r>
-            <w:r>
-              <w:rPr>
-                <w:noProof/>
-                <w:webHidden/>
-              </w:rPr>
-              <w:tab/>
-            </w:r>
-            <w:r>
-              <w:rPr>
-                <w:noProof/>
-                <w:webHidden/>
-              </w:rPr>
-              <w:fldChar w:fldCharType="begin"/>
-            </w:r>
-            <w:r>
-              <w:rPr>
-                <w:noProof/>
-                <w:webHidden/>
-              </w:rPr>
-              <w:instrText xml:space="preserve"> PAGEREF _Toc221377457 \h </w:instrText>
-            </w:r>
-            <w:r>
-              <w:rPr>
-                <w:noProof/>
-                <w:webHidden/>
-              </w:rPr>
-            </w:r>
-            <w:r>
-              <w:rPr>
-                <w:noProof/>
-                <w:webHidden/>
-              </w:rPr>
-              <w:fldChar w:fldCharType="separate"/>
-            </w:r>
-            <w:r>
-              <w:rPr>
-                <w:noProof/>
-                <w:webHidden/>
-              </w:rPr>
-              <w:t>28</w:t>
-            </w:r>
-            <w:r>
-              <w:rPr>
-                <w:noProof/>
-                <w:webHidden/>
-              </w:rPr>
-              <w:fldChar w:fldCharType="end"/>
-            </w:r>
-          </w:hyperlink>
-        </w:p>
-        <w:p>
-          <w:pPr>
-            <w:pStyle w:val="TOC3"/>
-            <w:tabs>
-              <w:tab w:val="right" w:leader="dot" w:pos="9628"/>
-            </w:tabs>
-            <w:rPr>
-              <w:rFonts w:eastAsiaTheme="minorEastAsia"/>
-              <w:noProof/>
-              <w:lang w:val="it-IT" w:eastAsia="it-IT"/>
-            </w:rPr>
-          </w:pPr>
-          <w:hyperlink w:anchor="_Toc221377458" w:history="1">
-            <w:r>
-              <w:rPr>
-                <w:rStyle w:val="Hyperlink"/>
-                <w:noProof/>
-              </w:rPr>
-              <w:t>DATA ACCESS OBJECT (DAO) LAYER</w:t>
-            </w:r>
-            <w:r>
-              <w:rPr>
-                <w:noProof/>
-                <w:webHidden/>
-              </w:rPr>
-              <w:tab/>
-            </w:r>
-            <w:r>
-              <w:rPr>
-                <w:noProof/>
-                <w:webHidden/>
-              </w:rPr>
-              <w:fldChar w:fldCharType="begin"/>
-            </w:r>
-            <w:r>
-              <w:rPr>
-                <w:noProof/>
-                <w:webHidden/>
-              </w:rPr>
-              <w:instrText xml:space="preserve"> PAGEREF _Toc221377458 \h </w:instrText>
-            </w:r>
-            <w:r>
-              <w:rPr>
-                <w:noProof/>
-                <w:webHidden/>
-              </w:rPr>
-            </w:r>
-            <w:r>
-              <w:rPr>
-                <w:noProof/>
-                <w:webHidden/>
-              </w:rPr>
-              <w:fldChar w:fldCharType="separate"/>
-            </w:r>
-            <w:r>
-              <w:rPr>
-                <w:noProof/>
-                <w:webHidden/>
-              </w:rPr>
-              <w:t>29</w:t>
-            </w:r>
-            <w:r>
-              <w:rPr>
-                <w:noProof/>
-                <w:webHidden/>
-              </w:rPr>
-              <w:fldChar w:fldCharType="end"/>
-            </w:r>
-          </w:hyperlink>
-        </w:p>
-        <w:p>
-          <w:pPr>
-            <w:pStyle w:val="TOC3"/>
-            <w:tabs>
-              <w:tab w:val="right" w:leader="dot" w:pos="9628"/>
-            </w:tabs>
-            <w:rPr>
-              <w:rFonts w:eastAsiaTheme="minorEastAsia"/>
-              <w:noProof/>
-              <w:lang w:val="it-IT" w:eastAsia="it-IT"/>
-            </w:rPr>
-          </w:pPr>
-          <w:hyperlink w:anchor="_Toc221377459" w:history="1">
-            <w:r>
-              <w:rPr>
-                <w:rStyle w:val="Hyperlink"/>
-                <w:noProof/>
-              </w:rPr>
-              <w:t>DOCKER-BASED DEVELOPMENT ENVIRONMENT</w:t>
-            </w:r>
-            <w:r>
-              <w:rPr>
-                <w:noProof/>
-                <w:webHidden/>
-              </w:rPr>
-              <w:tab/>
-            </w:r>
-            <w:r>
-              <w:rPr>
-                <w:noProof/>
-                <w:webHidden/>
-              </w:rPr>
-              <w:fldChar w:fldCharType="begin"/>
-            </w:r>
-            <w:r>
-              <w:rPr>
-                <w:noProof/>
-                <w:webHidden/>
-              </w:rPr>
-              <w:instrText xml:space="preserve"> PAGEREF _Toc221377459 \h </w:instrText>
-            </w:r>
-            <w:r>
-              <w:rPr>
-                <w:noProof/>
-                <w:webHidden/>
-              </w:rPr>
-            </w:r>
-            <w:r>
-              <w:rPr>
-                <w:noProof/>
-                <w:webHidden/>
-              </w:rPr>
-              <w:fldChar w:fldCharType="separate"/>
-            </w:r>
-            <w:r>
-              <w:rPr>
-                <w:noProof/>
-                <w:webHidden/>
-              </w:rPr>
-              <w:t>29</w:t>
-            </w:r>
-            <w:r>
-              <w:rPr>
-                <w:noProof/>
-                <w:webHidden/>
-              </w:rPr>
-              <w:fldChar w:fldCharType="end"/>
-            </w:r>
-          </w:hyperlink>
-        </w:p>
-        <w:p>
-          <w:pPr>
-            <w:pStyle w:val="TOC3"/>
-            <w:tabs>
-              <w:tab w:val="right" w:leader="dot" w:pos="9628"/>
-            </w:tabs>
-            <w:rPr>
-              <w:rFonts w:eastAsiaTheme="minorEastAsia"/>
-              <w:noProof/>
-              <w:lang w:val="it-IT" w:eastAsia="it-IT"/>
-            </w:rPr>
-          </w:pPr>
-          <w:hyperlink w:anchor="_Toc221377460" w:history="1">
-            <w:r>
-              <w:rPr>
-                <w:rStyle w:val="Hyperlink"/>
-                <w:noProof/>
-              </w:rPr>
-              <w:t>FILE SYSTEM–BASED DAO IMPLEMENTATION</w:t>
-            </w:r>
-            <w:r>
-              <w:rPr>
-                <w:noProof/>
-                <w:webHidden/>
-              </w:rPr>
-              <w:tab/>
-            </w:r>
-            <w:r>
-              <w:rPr>
-                <w:noProof/>
-                <w:webHidden/>
-              </w:rPr>
-              <w:fldChar w:fldCharType="begin"/>
-            </w:r>
-            <w:r>
-              <w:rPr>
-                <w:noProof/>
-                <w:webHidden/>
-              </w:rPr>
-              <w:instrText xml:space="preserve"> PAGEREF _Toc221377460 \h </w:instrText>
-            </w:r>
-            <w:r>
-              <w:rPr>
-                <w:noProof/>
-                <w:webHidden/>
-              </w:rPr>
-            </w:r>
-            <w:r>
-              <w:rPr>
-                <w:noProof/>
-                <w:webHidden/>
-              </w:rPr>
-              <w:fldChar w:fldCharType="separate"/>
-            </w:r>
-            <w:r>
-              <w:rPr>
-                <w:noProof/>
-                <w:webHidden/>
-              </w:rPr>
-              <w:t>29</w:t>
-            </w:r>
-            <w:r>
-              <w:rPr>
-                <w:noProof/>
-                <w:webHidden/>
-              </w:rPr>
-              <w:fldChar w:fldCharType="end"/>
-            </w:r>
-          </w:hyperlink>
-        </w:p>
-        <w:p>
-          <w:pPr>
-            <w:pStyle w:val="TOC2"/>
-            <w:tabs>
-              <w:tab w:val="right" w:leader="dot" w:pos="9628"/>
-            </w:tabs>
-            <w:rPr>
-              <w:rFonts w:eastAsiaTheme="minorEastAsia"/>
-              <w:noProof/>
-              <w:lang w:val="it-IT" w:eastAsia="it-IT"/>
-            </w:rPr>
-          </w:pPr>
-          <w:hyperlink w:anchor="_Toc221377461" w:history="1">
-            <w:r>
-              <w:rPr>
-                <w:rStyle w:val="Hyperlink"/>
-                <w:noProof/>
-              </w:rPr>
-              <w:t>SONAR CLOUD</w:t>
-            </w:r>
-            <w:r>
-              <w:rPr>
-                <w:noProof/>
-                <w:webHidden/>
-              </w:rPr>
-              <w:tab/>
-            </w:r>
-            <w:r>
-              <w:rPr>
-                <w:noProof/>
-                <w:webHidden/>
-              </w:rPr>
-              <w:fldChar w:fldCharType="begin"/>
-            </w:r>
-            <w:r>
-              <w:rPr>
-                <w:noProof/>
-                <w:webHidden/>
-              </w:rPr>
-              <w:instrText xml:space="preserve"> PAGEREF _Toc221377461 \h </w:instrText>
-            </w:r>
-            <w:r>
-              <w:rPr>
-                <w:noProof/>
-                <w:webHidden/>
-              </w:rPr>
-            </w:r>
-            <w:r>
-              <w:rPr>
-                <w:noProof/>
-                <w:webHidden/>
-              </w:rPr>
-              <w:fldChar w:fldCharType="separate"/>
-            </w:r>
-            <w:r>
-              <w:rPr>
-                <w:noProof/>
-                <w:webHidden/>
-              </w:rPr>
-              <w:t>31</w:t>
-            </w:r>
-            <w:r>
-              <w:rPr>
-                <w:noProof/>
-                <w:webHidden/>
-              </w:rPr>
-              <w:fldChar w:fldCharType="end"/>
-            </w:r>
-          </w:hyperlink>
-        </w:p>
-        <w:p>
-          <w:pPr>
-            <w:pStyle w:val="TOC2"/>
-            <w:tabs>
-              <w:tab w:val="right" w:leader="dot" w:pos="9628"/>
-            </w:tabs>
-            <w:rPr>
-              <w:rFonts w:eastAsiaTheme="minorEastAsia"/>
-              <w:noProof/>
-              <w:lang w:val="it-IT" w:eastAsia="it-IT"/>
-            </w:rPr>
-          </w:pPr>
-          <w:hyperlink w:anchor="_Toc221377462" w:history="1">
-            <w:r>
-              <w:rPr>
-                <w:rStyle w:val="Hyperlink"/>
-                <w:noProof/>
-              </w:rPr>
-              <w:t>DEMOSTRATION</w:t>
-            </w:r>
-            <w:r>
-              <w:rPr>
-                <w:noProof/>
-                <w:webHidden/>
-              </w:rPr>
-              <w:tab/>
-            </w:r>
-            <w:r>
-              <w:rPr>
-                <w:noProof/>
-                <w:webHidden/>
-              </w:rPr>
-              <w:fldChar w:fldCharType="begin"/>
-            </w:r>
-            <w:r>
-              <w:rPr>
-                <w:noProof/>
-                <w:webHidden/>
-              </w:rPr>
-              <w:instrText xml:space="preserve"> PAGEREF _Toc221377462 \h </w:instrText>
-            </w:r>
-            <w:r>
-              <w:rPr>
-                <w:noProof/>
-                <w:webHidden/>
-              </w:rPr>
-            </w:r>
-            <w:r>
-              <w:rPr>
-                <w:noProof/>
-                <w:webHidden/>
-              </w:rPr>
-              <w:fldChar w:fldCharType="separate"/>
-            </w:r>
-            <w:r>
-              <w:rPr>
-                <w:noProof/>
-                <w:webHidden/>
-              </w:rPr>
-              <w:t>31</w:t>
-            </w:r>
-            <w:r>
-              <w:rPr>
-                <w:noProof/>
-                <w:webHidden/>
-              </w:rPr>
-              <w:fldChar w:fldCharType="end"/>
-            </w:r>
-          </w:hyperlink>
-        </w:p>
-        <w:p>
-          <w:pPr>
-            <w:pStyle w:val="TOC2"/>
-            <w:tabs>
-              <w:tab w:val="right" w:leader="dot" w:pos="9628"/>
-            </w:tabs>
-            <w:rPr>
-              <w:rFonts w:eastAsiaTheme="minorEastAsia"/>
-              <w:noProof/>
-              <w:lang w:val="it-IT" w:eastAsia="it-IT"/>
-            </w:rPr>
-          </w:pPr>
-          <w:hyperlink w:anchor="_Toc221377463" w:history="1">
-            <w:r>
-              <w:rPr>
-                <w:rStyle w:val="Hyperlink"/>
-                <w:noProof/>
-              </w:rPr>
-              <w:t>DOWNLOAD SOURCE CODE</w:t>
-            </w:r>
-            <w:r>
-              <w:rPr>
-                <w:noProof/>
-                <w:webHidden/>
-              </w:rPr>
-              <w:tab/>
-            </w:r>
-            <w:r>
-              <w:rPr>
-                <w:noProof/>
-                <w:webHidden/>
-              </w:rPr>
-              <w:fldChar w:fldCharType="begin"/>
-            </w:r>
-            <w:r>
-              <w:rPr>
-                <w:noProof/>
-                <w:webHidden/>
-              </w:rPr>
-              <w:instrText xml:space="preserve"> PAGEREF _Toc221377463 \h </w:instrText>
+              <w:instrText xml:space="preserve"> PAGEREF _Toc221461399 \h </w:instrText>
             </w:r>
             <w:r>
               <w:rPr>
@@ -3057,13 +2989,9 @@
       <w:pPr>
         <w:pStyle w:val="Heading2"/>
       </w:pPr>
-    </w:p>
-    <w:p>
-      <w:pPr>
-        <w:pStyle w:val="Heading2"/>
-      </w:pPr>
-      <w:bookmarkStart w:id="0" w:name="_Toc221377436"/>
-      <w:r>
+      <w:bookmarkStart w:id="0" w:name="_Toc221461373"/>
+      <w:r>
+        <w:lastRenderedPageBreak/>
         <w:t>INTRODUCTION</w:t>
       </w:r>
       <w:bookmarkEnd w:id="0"/>
@@ -3072,7 +3000,7 @@
       <w:pPr>
         <w:pStyle w:val="Heading3"/>
       </w:pPr>
-      <w:bookmarkStart w:id="1" w:name="_Toc221377437"/>
+      <w:bookmarkStart w:id="1" w:name="_Toc221461374"/>
       <w:r>
         <w:t>AIM OF DOCUMENT</w:t>
       </w:r>
@@ -3080,31 +3008,22 @@
     </w:p>
     <w:p>
       <w:r>
-        <w:t>the scope of this document is to show objectively the fundamental requirements and specific ones of the system</w:t>
-      </w:r>
-      <w:r>
-        <w:t>:</w:t>
+        <w:t>This document describes the requirements and architecture of the Restaurant Manager system</w:t>
+      </w:r>
+      <w:r>
+        <w:t>;</w:t>
       </w:r>
       <w:r>
         <w:t xml:space="preserve"> </w:t>
       </w:r>
       <w:r>
-        <w:t xml:space="preserve"> Restaurant Manager;</w:t>
-      </w:r>
-      <w:r>
-        <w:t xml:space="preserve"> </w:t>
-      </w:r>
-      <w:r>
-        <w:t>s</w:t>
-      </w:r>
-      <w:r>
-        <w:t>o, we will be doing a review of all the important internal and external aspects of the system with the help of some illustration</w:t>
-      </w:r>
-      <w:r>
-        <w:t>.</w:t>
-      </w:r>
-      <w:r>
-        <w:t xml:space="preserve"> </w:t>
+        <w:t xml:space="preserve">This </w:t>
+      </w:r>
+      <w:r>
+        <w:t>paper</w:t>
+      </w:r>
+      <w:r>
+        <w:t xml:space="preserve"> presents a review of the main internal and external aspects of the system, supported by illustrative diagrams.</w:t>
       </w:r>
     </w:p>
     <w:p/>
@@ -3113,7 +3032,7 @@
       <w:pPr>
         <w:pStyle w:val="Heading3"/>
       </w:pPr>
-      <w:bookmarkStart w:id="2" w:name="_Toc221377438"/>
+      <w:bookmarkStart w:id="2" w:name="_Toc221461375"/>
       <w:r>
         <w:t>OVERVIEW</w:t>
       </w:r>
@@ -3133,13 +3052,10 @@
         <w:t xml:space="preserve"> the instruments to manage a small activity, </w:t>
       </w:r>
       <w:r>
-        <w:t>which</w:t>
-      </w:r>
-      <w:r>
-        <w:t xml:space="preserve"> work in the restaurant </w:t>
-      </w:r>
-      <w:r>
-        <w:t>world.</w:t>
+        <w:t>operating in the restaurant domain</w:t>
+      </w:r>
+      <w:r>
+        <w:t>.</w:t>
       </w:r>
     </w:p>
     <w:p>
@@ -3156,18 +3072,22 @@
         <w:t>synchronize</w:t>
       </w:r>
       <w:r>
-        <w:t xml:space="preserve"> in real time the order between the "the hall", the kitchen and the cash desk, but also the management, in fact the system also keep track </w:t>
-      </w:r>
-      <w:r>
-        <w:t xml:space="preserve">of orders, what they contain and, how it cost </w:t>
-      </w:r>
-      <w:proofErr w:type="gramStart"/>
-      <w:r>
-        <w:t>at the moment</w:t>
-      </w:r>
-      <w:proofErr w:type="gramEnd"/>
-      <w:r>
-        <w:t xml:space="preserve"> of order</w:t>
+        <w:t xml:space="preserve"> in real time the order</w:t>
+      </w:r>
+      <w:r>
+        <w:t>,</w:t>
+      </w:r>
+      <w:r>
+        <w:t xml:space="preserve"> between the "the hall", the kitchen and the cash desk, but also the management, in fact the system also keep</w:t>
+      </w:r>
+      <w:r>
+        <w:t>s</w:t>
+      </w:r>
+      <w:r>
+        <w:t xml:space="preserve"> track </w:t>
+      </w:r>
+      <w:r>
+        <w:t>of orders, what they contain and, how it cost at the moment of order</w:t>
       </w:r>
       <w:r>
         <w:t>.</w:t>
@@ -3182,7 +3102,7 @@
       <w:pPr>
         <w:pStyle w:val="Heading3"/>
       </w:pPr>
-      <w:bookmarkStart w:id="3" w:name="_Toc221377439"/>
+      <w:bookmarkStart w:id="3" w:name="_Toc221461376"/>
       <w:r>
         <w:t>HARDWARE AND SOFTWARE REQUIREMENTS</w:t>
       </w:r>
@@ -3297,7 +3217,7 @@
       <w:pPr>
         <w:pStyle w:val="Heading3"/>
       </w:pPr>
-      <w:bookmarkStart w:id="4" w:name="_Toc221377440"/>
+      <w:bookmarkStart w:id="4" w:name="_Toc221461377"/>
       <w:r>
         <w:t>RELATED SYSTEMS, PROS AND CONS</w:t>
       </w:r>
@@ -3326,10 +3246,11 @@
       </w:r>
       <w:r>
         <w:br/>
+        <w:t xml:space="preserve">However, as a drawback, it is a closed and proprietary system, not easily customizable, </w:t>
       </w:r>
       <w:r>
         <w:lastRenderedPageBreak/>
-        <w:t>However, as a drawback, it is a closed and proprietary system, not easily customizable, and strongly dependent on a stable internet connection. Moreover, its complexity can be excessive for small restaurants and requires a non-negligible learning curve.</w:t>
+        <w:t>and strongly dependent on a stable internet connection. Moreover, its complexity can be excessive for small restaurants and requires a non-negligible learning curve.</w:t>
       </w:r>
     </w:p>
     <w:p>
@@ -3364,114 +3285,227 @@
       <w:pPr>
         <w:pStyle w:val="Heading2"/>
       </w:pPr>
-      <w:bookmarkStart w:id="5" w:name="_Toc221377441"/>
-      <w:r>
-        <w:t>USER STORY:</w:t>
+      <w:bookmarkStart w:id="5" w:name="_Toc221461378"/>
+      <w:r>
+        <w:t>USER STOR</w:t>
+      </w:r>
+      <w:r>
+        <w:t>IES</w:t>
+      </w:r>
+      <w:r>
+        <w:t>:</w:t>
       </w:r>
       <w:bookmarkEnd w:id="5"/>
     </w:p>
     <w:p>
       <w:pPr>
+        <w:ind w:left="1276" w:hanging="567"/>
+      </w:pPr>
+      <w:r>
+        <w:rPr>
+          <w:color w:val="E97132" w:themeColor="accent2"/>
+        </w:rPr>
+        <w:t xml:space="preserve">US-1: </w:t>
+      </w:r>
+      <w:r>
+        <w:t xml:space="preserve">As a restaurant manager, I want to </w:t>
+      </w:r>
+      <w:r>
+        <w:t>keep track of all customer orders and their status</w:t>
+      </w:r>
+      <w:r>
+        <w:t xml:space="preserve">, so that I can improve service and </w:t>
+      </w:r>
+      <w:r>
+        <w:t>accuracy.</w:t>
+      </w:r>
+    </w:p>
+    <w:p>
+      <w:pPr>
         <w:pStyle w:val="ListParagraph"/>
-        <w:numPr>
-          <w:ilvl w:val="0"/>
-          <w:numId w:val="5"/>
-        </w:numPr>
-      </w:pPr>
-      <w:r>
-        <w:t xml:space="preserve">As a restaurant manager, I want to keep track of all customer orders, so that I can improve service and </w:t>
-      </w:r>
-      <w:r>
-        <w:t>accuracy.</w:t>
+        <w:ind w:left="1276" w:hanging="567"/>
+      </w:pPr>
+      <w:r>
+        <w:rPr>
+          <w:color w:val="E97132" w:themeColor="accent2"/>
+        </w:rPr>
+        <w:t>US-</w:t>
+      </w:r>
+      <w:r>
+        <w:rPr>
+          <w:color w:val="E97132" w:themeColor="accent2"/>
+        </w:rPr>
+        <w:t>2</w:t>
+      </w:r>
+      <w:r>
+        <w:rPr>
+          <w:color w:val="E97132" w:themeColor="accent2"/>
+        </w:rPr>
+        <w:t>:</w:t>
+      </w:r>
+      <w:r>
+        <w:rPr>
+          <w:color w:val="E97132" w:themeColor="accent2"/>
+        </w:rPr>
+        <w:t xml:space="preserve"> </w:t>
+      </w:r>
+      <w:r>
+        <w:t xml:space="preserve">As a waiter, I want to </w:t>
+      </w:r>
+      <w:r>
+        <w:t>send orders to the kitchen in real time</w:t>
+      </w:r>
+      <w:r>
+        <w:t xml:space="preserve">, so that customers receive their food </w:t>
+      </w:r>
+      <w:r>
+        <w:t>faster.</w:t>
+      </w:r>
+    </w:p>
+    <w:p>
+      <w:pPr>
+        <w:ind w:left="1276" w:hanging="567"/>
+      </w:pPr>
+      <w:r>
+        <w:rPr>
+          <w:color w:val="E97132" w:themeColor="accent2"/>
+        </w:rPr>
+        <w:t>US-</w:t>
+      </w:r>
+      <w:r>
+        <w:rPr>
+          <w:color w:val="E97132" w:themeColor="accent2"/>
+        </w:rPr>
+        <w:t>3</w:t>
+      </w:r>
+      <w:r>
+        <w:rPr>
+          <w:color w:val="E97132" w:themeColor="accent2"/>
+        </w:rPr>
+        <w:t>:</w:t>
+      </w:r>
+      <w:r>
+        <w:rPr>
+          <w:color w:val="E97132" w:themeColor="accent2"/>
+        </w:rPr>
+        <w:t xml:space="preserve"> </w:t>
+      </w:r>
+      <w:r>
+        <w:t xml:space="preserve">As a cashier, I want to see everything a table has ordered, so that I can prepare the bill </w:t>
+      </w:r>
+      <w:r>
+        <w:t>efficiently.</w:t>
       </w:r>
     </w:p>
     <w:p>
       <w:pPr>
         <w:pStyle w:val="ListParagraph"/>
-        <w:numPr>
-          <w:ilvl w:val="0"/>
-          <w:numId w:val="5"/>
-        </w:numPr>
-      </w:pPr>
-      <w:r>
-        <w:t xml:space="preserve">As a waiter, I want to send orders </w:t>
-      </w:r>
-      <w:r>
-        <w:t>at</w:t>
-      </w:r>
-      <w:r>
-        <w:t xml:space="preserve"> the kitchen quickly, so that customers receive their food </w:t>
-      </w:r>
-      <w:r>
-        <w:t>faster.</w:t>
-      </w:r>
-    </w:p>
-    <w:p>
-      <w:pPr>
-        <w:pStyle w:val="ListParagraph"/>
-        <w:numPr>
-          <w:ilvl w:val="0"/>
-          <w:numId w:val="5"/>
-        </w:numPr>
-      </w:pPr>
-      <w:r>
-        <w:t xml:space="preserve">As a cashier, I want to see everything a table has ordered, so that I can prepare the bill </w:t>
-      </w:r>
-      <w:r>
-        <w:t>efficiently.</w:t>
-      </w:r>
-    </w:p>
-    <w:p>
-      <w:pPr>
-        <w:pStyle w:val="ListParagraph"/>
-        <w:numPr>
-          <w:ilvl w:val="0"/>
-          <w:numId w:val="5"/>
-        </w:numPr>
-      </w:pPr>
+        <w:ind w:left="1276" w:hanging="567"/>
+      </w:pPr>
+      <w:r>
+        <w:rPr>
+          <w:color w:val="E97132" w:themeColor="accent2"/>
+        </w:rPr>
+        <w:t>US-</w:t>
+      </w:r>
+      <w:r>
+        <w:rPr>
+          <w:color w:val="E97132" w:themeColor="accent2"/>
+        </w:rPr>
+        <w:t>4</w:t>
+      </w:r>
+      <w:r>
+        <w:rPr>
+          <w:color w:val="E97132" w:themeColor="accent2"/>
+        </w:rPr>
+        <w:t>:</w:t>
+      </w:r>
+      <w:r>
+        <w:rPr>
+          <w:color w:val="E97132" w:themeColor="accent2"/>
+        </w:rPr>
+        <w:t xml:space="preserve"> </w:t>
+      </w:r>
       <w:r>
         <w:t>As a cashier, I want to see the total bill, so that I can charge the customer correctly.</w:t>
       </w:r>
     </w:p>
     <w:p>
       <w:pPr>
-        <w:pStyle w:val="ListParagraph"/>
-        <w:numPr>
-          <w:ilvl w:val="0"/>
-          <w:numId w:val="5"/>
-        </w:numPr>
-      </w:pPr>
+        <w:ind w:left="1276" w:hanging="567"/>
+      </w:pPr>
+      <w:r>
+        <w:rPr>
+          <w:color w:val="E97132" w:themeColor="accent2"/>
+        </w:rPr>
+        <w:t>US-</w:t>
+      </w:r>
+      <w:r>
+        <w:rPr>
+          <w:color w:val="E97132" w:themeColor="accent2"/>
+        </w:rPr>
+        <w:t>5</w:t>
+      </w:r>
+      <w:r>
+        <w:rPr>
+          <w:color w:val="E97132" w:themeColor="accent2"/>
+        </w:rPr>
+        <w:t>:</w:t>
+      </w:r>
+      <w:r>
+        <w:rPr>
+          <w:color w:val="E97132" w:themeColor="accent2"/>
+        </w:rPr>
+        <w:t xml:space="preserve"> </w:t>
+      </w:r>
       <w:r>
         <w:t xml:space="preserve">As a waiter, I want to be able to </w:t>
       </w:r>
       <w:r>
-        <w:t>custom</w:t>
-      </w:r>
-      <w:r>
+        <w:t>customize an order</w:t>
+      </w:r>
+      <w:r>
+        <w:t>, so that the customer can have a customized item.</w:t>
+      </w:r>
+    </w:p>
+    <w:p>
+      <w:pPr>
+        <w:ind w:left="1276" w:hanging="567"/>
+      </w:pPr>
+      <w:r>
+        <w:rPr>
+          <w:color w:val="E97132" w:themeColor="accent2"/>
+        </w:rPr>
+        <w:t>US-</w:t>
+      </w:r>
+      <w:r>
+        <w:rPr>
+          <w:color w:val="E97132" w:themeColor="accent2"/>
+        </w:rPr>
+        <w:t>6</w:t>
+      </w:r>
+      <w:r>
+        <w:rPr>
+          <w:color w:val="E97132" w:themeColor="accent2"/>
+        </w:rPr>
+        <w:t>:</w:t>
+      </w:r>
+      <w:r>
+        <w:rPr>
+          <w:color w:val="E97132" w:themeColor="accent2"/>
+        </w:rPr>
         <w:t xml:space="preserve"> </w:t>
       </w:r>
       <w:r>
-        <w:t xml:space="preserve">an </w:t>
-      </w:r>
-      <w:r>
-        <w:t>order</w:t>
-      </w:r>
-      <w:r>
-        <w:t>, so that the customer can have a customized item.</w:t>
-      </w:r>
-    </w:p>
-    <w:p>
-      <w:pPr>
-        <w:pStyle w:val="ListParagraph"/>
-        <w:numPr>
-          <w:ilvl w:val="0"/>
-          <w:numId w:val="5"/>
-        </w:numPr>
-      </w:pPr>
-      <w:r>
         <w:t>As a waiter, I want to be able to delete</w:t>
       </w:r>
       <w:r>
+        <w:t xml:space="preserve"> </w:t>
+      </w:r>
+      <w:r>
+        <w:t>an order</w:t>
+      </w:r>
+      <w:r>
         <w:t xml:space="preserve">, </w:t>
       </w:r>
       <w:r>
@@ -3486,13 +3520,22 @@
       <w:pPr>
         <w:pStyle w:val="Heading2"/>
       </w:pPr>
-      <w:bookmarkStart w:id="6" w:name="_Toc221377442"/>
-      <w:r>
-        <w:t>FUNTIONAL REQUIREMENTS:</w:t>
+      <w:bookmarkStart w:id="6" w:name="_Toc221461379"/>
+      <w:r>
+        <w:t>FUN</w:t>
+      </w:r>
+      <w:r>
+        <w:t>C</w:t>
+      </w:r>
+      <w:r>
+        <w:t>TIONAL REQUIREMENTS:</w:t>
       </w:r>
       <w:bookmarkEnd w:id="6"/>
     </w:p>
     <w:p>
+      <w:pPr>
+        <w:ind w:left="1701" w:hanging="993"/>
+      </w:pPr>
       <w:r>
         <w:rPr>
           <w:color w:val="E97132" w:themeColor="accent2"/>
@@ -3503,10 +3546,13 @@
         <w:t xml:space="preserve">: </w:t>
       </w:r>
       <w:r>
-        <w:t>The system must keep track of all orders that are placed (and their status).</w:t>
-      </w:r>
-    </w:p>
-    <w:p>
+        <w:t>The system shall persist all placed orders and their associated status throughout their lifecycle.</w:t>
+      </w:r>
+    </w:p>
+    <w:p>
+      <w:pPr>
+        <w:ind w:left="1701" w:hanging="993"/>
+      </w:pPr>
       <w:r>
         <w:rPr>
           <w:color w:val="E97132" w:themeColor="accent2"/>
@@ -3514,25 +3560,19 @@
         <w:t>F_Req2</w:t>
       </w:r>
       <w:r>
-        <w:t xml:space="preserve">: </w:t>
-      </w:r>
-      <w:r>
-        <w:t>The system must provide a real-time communication channel for the propagation of order-related events (creation</w:t>
-      </w:r>
-      <w:r>
-        <w:t xml:space="preserve"> and</w:t>
-      </w:r>
-      <w:r>
-        <w:t xml:space="preserve"> status change) from the </w:t>
-      </w:r>
-      <w:r>
-        <w:t>waiter</w:t>
-      </w:r>
-      <w:r>
-        <w:t xml:space="preserve"> generating the event to all affected subscribed clients (kitchen, cash register, dashboard manager)</w:t>
-      </w:r>
-    </w:p>
-    <w:p>
+        <w:t>:</w:t>
+      </w:r>
+      <w:r>
+        <w:t xml:space="preserve"> </w:t>
+      </w:r>
+      <w:r>
+        <w:t>The system shall notify all subscribed client components of order creation and status updates.</w:t>
+      </w:r>
+    </w:p>
+    <w:p>
+      <w:pPr>
+        <w:ind w:left="1701" w:hanging="993"/>
+      </w:pPr>
       <w:r>
         <w:rPr>
           <w:color w:val="E97132" w:themeColor="accent2"/>
@@ -3544,10 +3584,13 @@
         <w:t xml:space="preserve">: </w:t>
       </w:r>
       <w:r>
-        <w:t>The system must allow authorized users to view all orders (active and historical) associated with a specific table, with the possibility of filtering by status and time range.</w:t>
-      </w:r>
-    </w:p>
-    <w:p>
+        <w:t>The system shall allow authorized users to retrieve active and historical orders associated with a specific table, with optional filtering by status and time range.</w:t>
+      </w:r>
+    </w:p>
+    <w:p>
+      <w:pPr>
+        <w:ind w:left="1701" w:hanging="993"/>
+      </w:pPr>
       <w:r>
         <w:rPr>
           <w:color w:val="E97132" w:themeColor="accent2"/>
@@ -3561,10 +3604,13 @@
         <w:t xml:space="preserve"> </w:t>
       </w:r>
       <w:r>
-        <w:t>The system must offer the possibility to calculate and display the total bill.</w:t>
-      </w:r>
-    </w:p>
-    <w:p>
+        <w:t>The system shall compute and display the total bill for a table based on the prices of the associated order items at the time of ordering.</w:t>
+      </w:r>
+    </w:p>
+    <w:p>
+      <w:pPr>
+        <w:ind w:left="1701" w:hanging="992"/>
+      </w:pPr>
       <w:r>
         <w:rPr>
           <w:color w:val="E97132" w:themeColor="accent2"/>
@@ -3575,10 +3621,13 @@
         <w:t xml:space="preserve">: </w:t>
       </w:r>
       <w:r>
-        <w:t>The system must offer the possibility add some customization at the order and add some notes.</w:t>
-      </w:r>
-    </w:p>
-    <w:p>
+        <w:t>The system shall allow authorized users to add predefined customizations and free-text notes to individual order items.</w:t>
+      </w:r>
+    </w:p>
+    <w:p>
+      <w:pPr>
+        <w:ind w:left="1701" w:hanging="992"/>
+      </w:pPr>
       <w:r>
         <w:rPr>
           <w:color w:val="E97132" w:themeColor="accent2"/>
@@ -3589,7 +3638,7 @@
         <w:t xml:space="preserve">: </w:t>
       </w:r>
       <w:r>
-        <w:t xml:space="preserve">The system must offer the possibility to delete some order. </w:t>
+        <w:t>The system shall allow authorized users to delete an order or order item before billing confirmation.</w:t>
       </w:r>
     </w:p>
     <w:p>
@@ -3606,7 +3655,7 @@
       <w:pPr>
         <w:pStyle w:val="Heading2"/>
       </w:pPr>
-      <w:bookmarkStart w:id="7" w:name="_Toc221377443"/>
+      <w:bookmarkStart w:id="7" w:name="_Toc221461380"/>
       <w:r>
         <w:t>USE CASES</w:t>
       </w:r>
@@ -3616,7 +3665,7 @@
       <w:pPr>
         <w:pStyle w:val="Heading3"/>
       </w:pPr>
-      <w:bookmarkStart w:id="8" w:name="_Toc221377444"/>
+      <w:bookmarkStart w:id="8" w:name="_Toc221461381"/>
       <w:r>
         <w:t>OVERVIEW DIAGRAM</w:t>
       </w:r>
@@ -3627,9 +3676,13 @@
     </w:p>
     <w:p>
       <w:pPr>
-        <w:pStyle w:val="Heading3"/>
-      </w:pPr>
-      <w:bookmarkStart w:id="9" w:name="_Toc221377445"/>
+        <w:rPr>
+          <w:rFonts w:eastAsiaTheme="majorEastAsia" w:cstheme="majorBidi"/>
+          <w:color w:val="0F4761" w:themeColor="accent1" w:themeShade="BF"/>
+          <w:sz w:val="28"/>
+          <w:szCs w:val="28"/>
+        </w:rPr>
+      </w:pPr>
       <w:r>
         <w:drawing>
           <wp:anchor distT="0" distB="0" distL="114300" distR="114300" simplePos="0" relativeHeight="251798528" behindDoc="1" locked="0" layoutInCell="1" allowOverlap="1" wp14:anchorId="660E661E" wp14:editId="51256F90">
@@ -3687,31 +3740,15 @@
           </wp:anchor>
         </w:drawing>
       </w:r>
-      <w:bookmarkEnd w:id="9"/>
+      <w:r>
+        <w:br w:type="page"/>
+      </w:r>
     </w:p>
     <w:p>
       <w:pPr>
         <w:pStyle w:val="Heading3"/>
       </w:pPr>
-    </w:p>
-    <w:p>
-      <w:pPr>
-        <w:rPr>
-          <w:rFonts w:eastAsiaTheme="majorEastAsia" w:cstheme="majorBidi"/>
-          <w:color w:val="0F4761" w:themeColor="accent1" w:themeShade="BF"/>
-          <w:sz w:val="28"/>
-          <w:szCs w:val="28"/>
-        </w:rPr>
-      </w:pPr>
-      <w:r>
-        <w:br w:type="page"/>
-      </w:r>
-    </w:p>
-    <w:p>
-      <w:pPr>
-        <w:pStyle w:val="Heading3"/>
-      </w:pPr>
-      <w:bookmarkStart w:id="10" w:name="_Toc221377446"/>
+      <w:bookmarkStart w:id="9" w:name="_Toc221461382"/>
       <w:r>
         <w:lastRenderedPageBreak/>
         <w:t>INTERNAL STEP</w:t>
@@ -3719,7 +3756,7 @@
       <w:r>
         <w:t>:</w:t>
       </w:r>
-      <w:bookmarkEnd w:id="10"/>
+      <w:bookmarkEnd w:id="9"/>
     </w:p>
     <w:p>
       <w:pPr>
@@ -4478,7 +4515,7 @@
       <w:pPr>
         <w:pStyle w:val="Heading2"/>
       </w:pPr>
-      <w:bookmarkStart w:id="11" w:name="_Toc221377447"/>
+      <w:bookmarkStart w:id="10" w:name="_Toc221461383"/>
       <w:r>
         <w:rPr>
           <w:noProof/>
@@ -4556,7 +4593,7 @@
       <w:r>
         <w:t>:</w:t>
       </w:r>
-      <w:bookmarkEnd w:id="11"/>
+      <w:bookmarkEnd w:id="10"/>
     </w:p>
     <w:p>
       <w:pPr>
@@ -4605,7 +4642,7 @@
           </mc:Choice>
           <mc:Fallback>
             <w:pict>
-              <v:shapetype w14:anchorId="1B82C74C" id="_x0000_t75" coordsize="21600,21600" o:spt="75" o:preferrelative="t" path="m@4@5l@4@11@9@11@9@5xe" filled="f" stroked="f">
+              <v:shapetype w14:anchorId="4484A07D" id="_x0000_t75" coordsize="21600,21600" o:spt="75" o:preferrelative="t" path="m@4@5l@4@11@9@11@9@5xe" filled="f" stroked="f">
                 <v:stroke joinstyle="miter"/>
                 <v:formulas>
                   <v:f eqn="if lineDrawn pixelLineWidth 0"/>
@@ -4669,7 +4706,7 @@
           </mc:Choice>
           <mc:Fallback>
             <w:pict>
-              <v:shape w14:anchorId="6F4894D0" id="Ink 173" o:spid="_x0000_s1026" type="#_x0000_t75" style="position:absolute;margin-left:283.45pt;margin-top:220.9pt;width:1.25pt;height:9.55pt;z-index:251789312;visibility:visible;mso-wrap-style:square;mso-wrap-distance-left:9pt;mso-wrap-distance-top:0;mso-wrap-distance-right:9pt;mso-wrap-distance-bottom:0;mso-position-horizontal:absolute;mso-position-horizontal-relative:text;mso-position-vertical:absolute;mso-position-vertical-relative:text" o:gfxdata="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">
+              <v:shape w14:anchorId="0D2662D4" id="Ink 173" o:spid="_x0000_s1026" type="#_x0000_t75" style="position:absolute;margin-left:283.45pt;margin-top:220.9pt;width:1.25pt;height:9.55pt;z-index:251789312;visibility:visible;mso-wrap-style:square;mso-wrap-distance-left:9pt;mso-wrap-distance-top:0;mso-wrap-distance-right:9pt;mso-wrap-distance-bottom:0;mso-position-horizontal:absolute;mso-position-horizontal-relative:text;mso-position-vertical:absolute;mso-position-vertical-relative:text" o:gfxdata="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">
                 <v:imagedata r:id="rId14" o:title=""/>
               </v:shape>
             </w:pict>
@@ -4714,7 +4751,7 @@
           </mc:Choice>
           <mc:Fallback>
             <w:pict>
-              <v:shape w14:anchorId="509F979A" id="Ink 168" o:spid="_x0000_s1026" type="#_x0000_t75" style="position:absolute;margin-left:285.8pt;margin-top:113.4pt;width:6.8pt;height:6.45pt;z-index:251786240;visibility:visible;mso-wrap-style:square;mso-wrap-distance-left:9pt;mso-wrap-distance-top:0;mso-wrap-distance-right:9pt;mso-wrap-distance-bottom:0;mso-position-horizontal:absolute;mso-position-horizontal-relative:text;mso-position-vertical:absolute;mso-position-vertical-relative:text" o:gfxdata="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">
+              <v:shape w14:anchorId="32607CC6" id="Ink 168" o:spid="_x0000_s1026" type="#_x0000_t75" style="position:absolute;margin-left:285.8pt;margin-top:113.4pt;width:6.8pt;height:6.45pt;z-index:251786240;visibility:visible;mso-wrap-style:square;mso-wrap-distance-left:9pt;mso-wrap-distance-top:0;mso-wrap-distance-right:9pt;mso-wrap-distance-bottom:0;mso-position-horizontal:absolute;mso-position-horizontal-relative:text;mso-position-vertical:absolute;mso-position-vertical-relative:text" o:gfxdata="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">
                 <v:imagedata r:id="rId16" o:title=""/>
               </v:shape>
             </w:pict>
@@ -4759,7 +4796,7 @@
           </mc:Choice>
           <mc:Fallback>
             <w:pict>
-              <v:shape w14:anchorId="006CA7C7" id="Ink 167" o:spid="_x0000_s1026" type="#_x0000_t75" style="position:absolute;margin-left:47.25pt;margin-top:367.55pt;width:3.3pt;height:7.5pt;z-index:251785216;visibility:visible;mso-wrap-style:square;mso-wrap-distance-left:9pt;mso-wrap-distance-top:0;mso-wrap-distance-right:9pt;mso-wrap-distance-bottom:0;mso-position-horizontal:absolute;mso-position-horizontal-relative:text;mso-position-vertical:absolute;mso-position-vertical-relative:text" o:gfxdata="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">
+              <v:shape w14:anchorId="3BC2C6F8" id="Ink 167" o:spid="_x0000_s1026" type="#_x0000_t75" style="position:absolute;margin-left:47.25pt;margin-top:367.55pt;width:3.3pt;height:7.5pt;z-index:251785216;visibility:visible;mso-wrap-style:square;mso-wrap-distance-left:9pt;mso-wrap-distance-top:0;mso-wrap-distance-right:9pt;mso-wrap-distance-bottom:0;mso-position-horizontal:absolute;mso-position-horizontal-relative:text;mso-position-vertical:absolute;mso-position-vertical-relative:text" o:gfxdata="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">
                 <v:imagedata r:id="rId18" o:title=""/>
               </v:shape>
             </w:pict>
@@ -4804,7 +4841,7 @@
           </mc:Choice>
           <mc:Fallback>
             <w:pict>
-              <v:shape w14:anchorId="00975EEC" id="Ink 163" o:spid="_x0000_s1026" type="#_x0000_t75" style="position:absolute;margin-left:49.2pt;margin-top:241.15pt;width:4.3pt;height:5.6pt;z-index:251784192;visibility:visible;mso-wrap-style:square;mso-wrap-distance-left:9pt;mso-wrap-distance-top:0;mso-wrap-distance-right:9pt;mso-wrap-distance-bottom:0;mso-position-horizontal:absolute;mso-position-horizontal-relative:text;mso-position-vertical:absolute;mso-position-vertical-relative:text" o:gfxdata="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">
+              <v:shape w14:anchorId="5CAE85B0" id="Ink 163" o:spid="_x0000_s1026" type="#_x0000_t75" style="position:absolute;margin-left:49.2pt;margin-top:241.15pt;width:4.3pt;height:5.6pt;z-index:251784192;visibility:visible;mso-wrap-style:square;mso-wrap-distance-left:9pt;mso-wrap-distance-top:0;mso-wrap-distance-right:9pt;mso-wrap-distance-bottom:0;mso-position-horizontal:absolute;mso-position-horizontal-relative:text;mso-position-vertical:absolute;mso-position-vertical-relative:text" o:gfxdata="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">
                 <v:imagedata r:id="rId20" o:title=""/>
               </v:shape>
             </w:pict>
@@ -4852,7 +4889,7 @@
           </mc:Choice>
           <mc:Fallback>
             <w:pict>
-              <v:shape w14:anchorId="69CC53B6" id="Ink 161" o:spid="_x0000_s1026" type="#_x0000_t75" style="position:absolute;margin-left:46.5pt;margin-top:240.4pt;width:1.25pt;height:7.3pt;z-index:251783168;visibility:visible;mso-wrap-style:square;mso-width-percent:0;mso-wrap-distance-left:9pt;mso-wrap-distance-top:0;mso-wrap-distance-right:9pt;mso-wrap-distance-bottom:0;mso-position-horizontal:absolute;mso-position-horizontal-relative:text;mso-position-vertical:absolute;mso-position-vertical-relative:text;mso-width-percent:0;mso-width-relative:margin" o:gfxdata="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">
+              <v:shape w14:anchorId="5FF7D26A" id="Ink 161" o:spid="_x0000_s1026" type="#_x0000_t75" style="position:absolute;margin-left:46.5pt;margin-top:240.4pt;width:1.25pt;height:7.3pt;z-index:251783168;visibility:visible;mso-wrap-style:square;mso-width-percent:0;mso-wrap-distance-left:9pt;mso-wrap-distance-top:0;mso-wrap-distance-right:9pt;mso-wrap-distance-bottom:0;mso-position-horizontal:absolute;mso-position-horizontal-relative:text;mso-position-vertical:absolute;mso-position-vertical-relative:text;mso-width-percent:0;mso-width-relative:margin" o:gfxdata="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">
                 <v:imagedata r:id="rId22" o:title=""/>
               </v:shape>
             </w:pict>
@@ -4897,7 +4934,7 @@
           </mc:Choice>
           <mc:Fallback>
             <w:pict>
-              <v:shape w14:anchorId="01A925A2" id="Ink 154" o:spid="_x0000_s1026" type="#_x0000_t75" style="position:absolute;margin-left:-28.7pt;margin-top:202.6pt;width:1.3pt;height:12.25pt;z-index:251779072;visibility:visible;mso-wrap-style:square;mso-wrap-distance-left:9pt;mso-wrap-distance-top:0;mso-wrap-distance-right:9pt;mso-wrap-distance-bottom:0;mso-position-horizontal:absolute;mso-position-horizontal-relative:text;mso-position-vertical:absolute;mso-position-vertical-relative:text" o:gfxdata="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">
+              <v:shape w14:anchorId="11D5EBCE" id="Ink 154" o:spid="_x0000_s1026" type="#_x0000_t75" style="position:absolute;margin-left:-28.7pt;margin-top:202.6pt;width:1.3pt;height:12.25pt;z-index:251779072;visibility:visible;mso-wrap-style:square;mso-wrap-distance-left:9pt;mso-wrap-distance-top:0;mso-wrap-distance-right:9pt;mso-wrap-distance-bottom:0;mso-position-horizontal:absolute;mso-position-horizontal-relative:text;mso-position-vertical:absolute;mso-position-vertical-relative:text" o:gfxdata="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">
                 <v:imagedata r:id="rId24" o:title=""/>
               </v:shape>
             </w:pict>
@@ -4942,7 +4979,7 @@
           </mc:Choice>
           <mc:Fallback>
             <w:pict>
-              <v:shape w14:anchorId="3F755489" id="Ink 146" o:spid="_x0000_s1026" type="#_x0000_t75" style="position:absolute;margin-left:-31.2pt;margin-top:263.9pt;width:5.6pt;height:5.7pt;z-index:251776000;visibility:visible;mso-wrap-style:square;mso-wrap-distance-left:9pt;mso-wrap-distance-top:0;mso-wrap-distance-right:9pt;mso-wrap-distance-bottom:0;mso-position-horizontal:absolute;mso-position-horizontal-relative:text;mso-position-vertical:absolute;mso-position-vertical-relative:text" o:gfxdata="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">
+              <v:shape w14:anchorId="6CA91DB9" id="Ink 146" o:spid="_x0000_s1026" type="#_x0000_t75" style="position:absolute;margin-left:-31.2pt;margin-top:263.9pt;width:5.6pt;height:5.7pt;z-index:251776000;visibility:visible;mso-wrap-style:square;mso-wrap-distance-left:9pt;mso-wrap-distance-top:0;mso-wrap-distance-right:9pt;mso-wrap-distance-bottom:0;mso-position-horizontal:absolute;mso-position-horizontal-relative:text;mso-position-vertical:absolute;mso-position-vertical-relative:text" o:gfxdata="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">
                 <v:imagedata r:id="rId26" o:title=""/>
               </v:shape>
             </w:pict>
@@ -4987,7 +5024,7 @@
           </mc:Choice>
           <mc:Fallback>
             <w:pict>
-              <v:shape w14:anchorId="747E7746" id="Ink 143" o:spid="_x0000_s1026" type="#_x0000_t75" style="position:absolute;margin-left:237.4pt;margin-top:365.65pt;width:4.45pt;height:9pt;z-index:251772928;visibility:visible;mso-wrap-style:square;mso-wrap-distance-left:9pt;mso-wrap-distance-top:0;mso-wrap-distance-right:9pt;mso-wrap-distance-bottom:0;mso-position-horizontal:absolute;mso-position-horizontal-relative:text;mso-position-vertical:absolute;mso-position-vertical-relative:text" o:gfxdata="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">
+              <v:shape w14:anchorId="1950B896" id="Ink 143" o:spid="_x0000_s1026" type="#_x0000_t75" style="position:absolute;margin-left:237.4pt;margin-top:365.65pt;width:4.45pt;height:9pt;z-index:251772928;visibility:visible;mso-wrap-style:square;mso-wrap-distance-left:9pt;mso-wrap-distance-top:0;mso-wrap-distance-right:9pt;mso-wrap-distance-bottom:0;mso-position-horizontal:absolute;mso-position-horizontal-relative:text;mso-position-vertical:absolute;mso-position-vertical-relative:text" o:gfxdata="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">
                 <v:imagedata r:id="rId28" o:title=""/>
               </v:shape>
             </w:pict>
@@ -5032,7 +5069,7 @@
           </mc:Choice>
           <mc:Fallback>
             <w:pict>
-              <v:shape w14:anchorId="7EC4A116" id="Ink 142" o:spid="_x0000_s1026" type="#_x0000_t75" style="position:absolute;margin-left:96.4pt;margin-top:347.9pt;width:5.85pt;height:7.75pt;z-index:251771904;visibility:visible;mso-wrap-style:square;mso-wrap-distance-left:9pt;mso-wrap-distance-top:0;mso-wrap-distance-right:9pt;mso-wrap-distance-bottom:0;mso-position-horizontal:absolute;mso-position-horizontal-relative:text;mso-position-vertical:absolute;mso-position-vertical-relative:text" o:gfxdata="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">
+              <v:shape w14:anchorId="30180D4D" id="Ink 142" o:spid="_x0000_s1026" type="#_x0000_t75" style="position:absolute;margin-left:96.4pt;margin-top:347.9pt;width:5.85pt;height:7.75pt;z-index:251771904;visibility:visible;mso-wrap-style:square;mso-wrap-distance-left:9pt;mso-wrap-distance-top:0;mso-wrap-distance-right:9pt;mso-wrap-distance-bottom:0;mso-position-horizontal:absolute;mso-position-horizontal-relative:text;mso-position-vertical:absolute;mso-position-vertical-relative:text" o:gfxdata="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">
                 <v:imagedata r:id="rId30" o:title=""/>
               </v:shape>
             </w:pict>
@@ -5077,7 +5114,7 @@
           </mc:Choice>
           <mc:Fallback>
             <w:pict>
-              <v:shape w14:anchorId="2E454E7D" id="Ink 141" o:spid="_x0000_s1026" type="#_x0000_t75" style="position:absolute;margin-left:178.25pt;margin-top:347pt;width:3.65pt;height:7.45pt;z-index:251770880;visibility:visible;mso-wrap-style:square;mso-wrap-distance-left:9pt;mso-wrap-distance-top:0;mso-wrap-distance-right:9pt;mso-wrap-distance-bottom:0;mso-position-horizontal:absolute;mso-position-horizontal-relative:text;mso-position-vertical:absolute;mso-position-vertical-relative:text" o:gfxdata="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">
+              <v:shape w14:anchorId="233E1C96" id="Ink 141" o:spid="_x0000_s1026" type="#_x0000_t75" style="position:absolute;margin-left:178.25pt;margin-top:347pt;width:3.65pt;height:7.45pt;z-index:251770880;visibility:visible;mso-wrap-style:square;mso-wrap-distance-left:9pt;mso-wrap-distance-top:0;mso-wrap-distance-right:9pt;mso-wrap-distance-bottom:0;mso-position-horizontal:absolute;mso-position-horizontal-relative:text;mso-position-vertical:absolute;mso-position-vertical-relative:text" o:gfxdata="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">
                 <v:imagedata r:id="rId32" o:title=""/>
               </v:shape>
             </w:pict>
@@ -5122,7 +5159,7 @@
           </mc:Choice>
           <mc:Fallback>
             <w:pict>
-              <v:shape w14:anchorId="2823092A" id="Ink 140" o:spid="_x0000_s1026" type="#_x0000_t75" style="position:absolute;margin-left:159.1pt;margin-top:250.9pt;width:3.65pt;height:6.45pt;z-index:251769856;visibility:visible;mso-wrap-style:square;mso-wrap-distance-left:9pt;mso-wrap-distance-top:0;mso-wrap-distance-right:9pt;mso-wrap-distance-bottom:0;mso-position-horizontal:absolute;mso-position-horizontal-relative:text;mso-position-vertical:absolute;mso-position-vertical-relative:text" o:gfxdata="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">
+              <v:shape w14:anchorId="7E221923" id="Ink 140" o:spid="_x0000_s1026" type="#_x0000_t75" style="position:absolute;margin-left:159.1pt;margin-top:250.9pt;width:3.65pt;height:6.45pt;z-index:251769856;visibility:visible;mso-wrap-style:square;mso-wrap-distance-left:9pt;mso-wrap-distance-top:0;mso-wrap-distance-right:9pt;mso-wrap-distance-bottom:0;mso-position-horizontal:absolute;mso-position-horizontal-relative:text;mso-position-vertical:absolute;mso-position-vertical-relative:text" o:gfxdata="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">
                 <v:imagedata r:id="rId34" o:title=""/>
               </v:shape>
             </w:pict>
@@ -5167,7 +5204,7 @@
           </mc:Choice>
           <mc:Fallback>
             <w:pict>
-              <v:shape w14:anchorId="0C2A5373" id="Ink 137" o:spid="_x0000_s1026" type="#_x0000_t75" style="position:absolute;margin-left:220.85pt;margin-top:245.95pt;width:6pt;height:6.35pt;z-index:251766784;visibility:visible;mso-wrap-style:square;mso-wrap-distance-left:9pt;mso-wrap-distance-top:0;mso-wrap-distance-right:9pt;mso-wrap-distance-bottom:0;mso-position-horizontal:absolute;mso-position-horizontal-relative:text;mso-position-vertical:absolute;mso-position-vertical-relative:text" o:gfxdata="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">
+              <v:shape w14:anchorId="2E152BBB" id="Ink 137" o:spid="_x0000_s1026" type="#_x0000_t75" style="position:absolute;margin-left:220.85pt;margin-top:245.95pt;width:6pt;height:6.35pt;z-index:251766784;visibility:visible;mso-wrap-style:square;mso-wrap-distance-left:9pt;mso-wrap-distance-top:0;mso-wrap-distance-right:9pt;mso-wrap-distance-bottom:0;mso-position-horizontal:absolute;mso-position-horizontal-relative:text;mso-position-vertical:absolute;mso-position-vertical-relative:text" o:gfxdata="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">
                 <v:imagedata r:id="rId36" o:title=""/>
               </v:shape>
             </w:pict>
@@ -5212,7 +5249,7 @@
           </mc:Choice>
           <mc:Fallback>
             <w:pict>
-              <v:shape w14:anchorId="7964DBC3" id="Ink 124" o:spid="_x0000_s1026" type="#_x0000_t75" style="position:absolute;margin-left:199.4pt;margin-top:113pt;width:9.4pt;height:12.4pt;z-index:251756544;visibility:visible;mso-wrap-style:square;mso-wrap-distance-left:9pt;mso-wrap-distance-top:0;mso-wrap-distance-right:9pt;mso-wrap-distance-bottom:0;mso-position-horizontal:absolute;mso-position-horizontal-relative:text;mso-position-vertical:absolute;mso-position-vertical-relative:text" o:gfxdata="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">
+              <v:shape w14:anchorId="092882C7" id="Ink 124" o:spid="_x0000_s1026" type="#_x0000_t75" style="position:absolute;margin-left:199.4pt;margin-top:113pt;width:9.4pt;height:12.4pt;z-index:251756544;visibility:visible;mso-wrap-style:square;mso-wrap-distance-left:9pt;mso-wrap-distance-top:0;mso-wrap-distance-right:9pt;mso-wrap-distance-bottom:0;mso-position-horizontal:absolute;mso-position-horizontal-relative:text;mso-position-vertical:absolute;mso-position-vertical-relative:text" o:gfxdata="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">
                 <v:imagedata r:id="rId38" o:title=""/>
               </v:shape>
             </w:pict>
@@ -5257,7 +5294,7 @@
           </mc:Choice>
           <mc:Fallback>
             <w:pict>
-              <v:shape w14:anchorId="13921727" id="Ink 121" o:spid="_x0000_s1026" type="#_x0000_t75" style="position:absolute;margin-left:102.75pt;margin-top:103.15pt;width:11.75pt;height:18pt;z-index:251753472;visibility:visible;mso-wrap-style:square;mso-wrap-distance-left:9pt;mso-wrap-distance-top:0;mso-wrap-distance-right:9pt;mso-wrap-distance-bottom:0;mso-position-horizontal:absolute;mso-position-horizontal-relative:text;mso-position-vertical:absolute;mso-position-vertical-relative:text" o:gfxdata="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">
+              <v:shape w14:anchorId="565877E1" id="Ink 121" o:spid="_x0000_s1026" type="#_x0000_t75" style="position:absolute;margin-left:102.75pt;margin-top:103.15pt;width:11.75pt;height:18pt;z-index:251753472;visibility:visible;mso-wrap-style:square;mso-wrap-distance-left:9pt;mso-wrap-distance-top:0;mso-wrap-distance-right:9pt;mso-wrap-distance-bottom:0;mso-position-horizontal:absolute;mso-position-horizontal-relative:text;mso-position-vertical:absolute;mso-position-vertical-relative:text" o:gfxdata="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">
                 <v:imagedata r:id="rId40" o:title=""/>
               </v:shape>
             </w:pict>
@@ -5308,7 +5345,7 @@
           </mc:Choice>
           <mc:Fallback>
             <w:pict>
-              <v:shape w14:anchorId="14C02343" id="Ink 120" o:spid="_x0000_s1026" type="#_x0000_t75" style="position:absolute;margin-left:99.5pt;margin-top:111.7pt;width:10.45pt;height:8.95pt;z-index:251752448;visibility:visible;mso-wrap-style:square;mso-width-percent:0;mso-height-percent:0;mso-wrap-distance-left:9pt;mso-wrap-distance-top:0;mso-wrap-distance-right:9pt;mso-wrap-distance-bottom:0;mso-position-horizontal:absolute;mso-position-horizontal-relative:text;mso-position-vertical:absolute;mso-position-vertical-relative:text;mso-width-percent:0;mso-height-percent:0;mso-width-relative:margin;mso-height-relative:margin" o:gfxdata="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">
+              <v:shape w14:anchorId="65E79A34" id="Ink 120" o:spid="_x0000_s1026" type="#_x0000_t75" style="position:absolute;margin-left:99.5pt;margin-top:111.7pt;width:10.45pt;height:8.95pt;z-index:251752448;visibility:visible;mso-wrap-style:square;mso-width-percent:0;mso-height-percent:0;mso-wrap-distance-left:9pt;mso-wrap-distance-top:0;mso-wrap-distance-right:9pt;mso-wrap-distance-bottom:0;mso-position-horizontal:absolute;mso-position-horizontal-relative:text;mso-position-vertical:absolute;mso-position-vertical-relative:text;mso-width-percent:0;mso-height-percent:0;mso-width-relative:margin;mso-height-relative:margin" o:gfxdata="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">
                 <v:imagedata r:id="rId42" o:title=""/>
               </v:shape>
             </w:pict>
@@ -5353,7 +5390,7 @@
           </mc:Choice>
           <mc:Fallback>
             <w:pict>
-              <v:shape w14:anchorId="3D88C069" id="Ink 115" o:spid="_x0000_s1026" type="#_x0000_t75" style="position:absolute;margin-left:113.7pt;margin-top:382.15pt;width:43.15pt;height:15.55pt;z-index:251748352;visibility:visible;mso-wrap-style:square;mso-wrap-distance-left:9pt;mso-wrap-distance-top:0;mso-wrap-distance-right:9pt;mso-wrap-distance-bottom:0;mso-position-horizontal:absolute;mso-position-horizontal-relative:text;mso-position-vertical:absolute;mso-position-vertical-relative:text" o:gfxdata="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">
+              <v:shape w14:anchorId="1BD008EC" id="Ink 115" o:spid="_x0000_s1026" type="#_x0000_t75" style="position:absolute;margin-left:113.7pt;margin-top:382.15pt;width:43.15pt;height:15.55pt;z-index:251748352;visibility:visible;mso-wrap-style:square;mso-wrap-distance-left:9pt;mso-wrap-distance-top:0;mso-wrap-distance-right:9pt;mso-wrap-distance-bottom:0;mso-position-horizontal:absolute;mso-position-horizontal-relative:text;mso-position-vertical:absolute;mso-position-vertical-relative:text" o:gfxdata="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">
                 <v:imagedata r:id="rId44" o:title=""/>
               </v:shape>
             </w:pict>
@@ -5398,7 +5435,7 @@
           </mc:Choice>
           <mc:Fallback>
             <w:pict>
-              <v:shape w14:anchorId="13C469E7" id="Ink 110" o:spid="_x0000_s1026" type="#_x0000_t75" style="position:absolute;margin-left:108.25pt;margin-top:393.35pt;width:8.55pt;height:1.6pt;z-index:251745280;visibility:visible;mso-wrap-style:square;mso-wrap-distance-left:9pt;mso-wrap-distance-top:0;mso-wrap-distance-right:9pt;mso-wrap-distance-bottom:0;mso-position-horizontal:absolute;mso-position-horizontal-relative:text;mso-position-vertical:absolute;mso-position-vertical-relative:text" o:gfxdata="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">
+              <v:shape w14:anchorId="322CCCD4" id="Ink 110" o:spid="_x0000_s1026" type="#_x0000_t75" style="position:absolute;margin-left:108.25pt;margin-top:393.35pt;width:8.55pt;height:1.6pt;z-index:251745280;visibility:visible;mso-wrap-style:square;mso-wrap-distance-left:9pt;mso-wrap-distance-top:0;mso-wrap-distance-right:9pt;mso-wrap-distance-bottom:0;mso-position-horizontal:absolute;mso-position-horizontal-relative:text;mso-position-vertical:absolute;mso-position-vertical-relative:text" o:gfxdata="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">
                 <v:imagedata r:id="rId46" o:title=""/>
               </v:shape>
             </w:pict>
@@ -5443,7 +5480,7 @@
           </mc:Choice>
           <mc:Fallback>
             <w:pict>
-              <v:shape w14:anchorId="120DF64B" id="Ink 109" o:spid="_x0000_s1026" type="#_x0000_t75" style="position:absolute;margin-left:98.15pt;margin-top:384.75pt;width:6.05pt;height:6.1pt;z-index:251744256;visibility:visible;mso-wrap-style:square;mso-wrap-distance-left:9pt;mso-wrap-distance-top:0;mso-wrap-distance-right:9pt;mso-wrap-distance-bottom:0;mso-position-horizontal:absolute;mso-position-horizontal-relative:text;mso-position-vertical:absolute;mso-position-vertical-relative:text" o:gfxdata="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">
+              <v:shape w14:anchorId="29656613" id="Ink 109" o:spid="_x0000_s1026" type="#_x0000_t75" style="position:absolute;margin-left:98.15pt;margin-top:384.75pt;width:6.05pt;height:6.1pt;z-index:251744256;visibility:visible;mso-wrap-style:square;mso-wrap-distance-left:9pt;mso-wrap-distance-top:0;mso-wrap-distance-right:9pt;mso-wrap-distance-bottom:0;mso-position-horizontal:absolute;mso-position-horizontal-relative:text;mso-position-vertical:absolute;mso-position-vertical-relative:text" o:gfxdata="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">
                 <v:imagedata r:id="rId48" o:title=""/>
               </v:shape>
             </w:pict>
@@ -5488,7 +5525,7 @@
           </mc:Choice>
           <mc:Fallback>
             <w:pict>
-              <v:shape w14:anchorId="5709AD70" id="Ink 108" o:spid="_x0000_s1026" type="#_x0000_t75" style="position:absolute;margin-left:100.25pt;margin-top:297.7pt;width:13.2pt;height:93.3pt;z-index:251743232;visibility:visible;mso-wrap-style:square;mso-wrap-distance-left:9pt;mso-wrap-distance-top:0;mso-wrap-distance-right:9pt;mso-wrap-distance-bottom:0;mso-position-horizontal:absolute;mso-position-horizontal-relative:text;mso-position-vertical:absolute;mso-position-vertical-relative:text" o:gfxdata="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">
+              <v:shape w14:anchorId="2DEBC135" id="Ink 108" o:spid="_x0000_s1026" type="#_x0000_t75" style="position:absolute;margin-left:100.25pt;margin-top:297.7pt;width:13.2pt;height:93.3pt;z-index:251743232;visibility:visible;mso-wrap-style:square;mso-wrap-distance-left:9pt;mso-wrap-distance-top:0;mso-wrap-distance-right:9pt;mso-wrap-distance-bottom:0;mso-position-horizontal:absolute;mso-position-horizontal-relative:text;mso-position-vertical:absolute;mso-position-vertical-relative:text" o:gfxdata="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">
                 <v:imagedata r:id="rId50" o:title=""/>
               </v:shape>
             </w:pict>
@@ -5533,7 +5570,7 @@
           </mc:Choice>
           <mc:Fallback>
             <w:pict>
-              <v:shape w14:anchorId="6B78E2E8" id="Ink 106" o:spid="_x0000_s1026" type="#_x0000_t75" style="position:absolute;margin-left:36.8pt;margin-top:359.2pt;width:27.15pt;height:2pt;z-index:251741184;visibility:visible;mso-wrap-style:square;mso-wrap-distance-left:9pt;mso-wrap-distance-top:0;mso-wrap-distance-right:9pt;mso-wrap-distance-bottom:0;mso-position-horizontal:absolute;mso-position-horizontal-relative:text;mso-position-vertical:absolute;mso-position-vertical-relative:text" o:gfxdata="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">
+              <v:shape w14:anchorId="2615D37D" id="Ink 106" o:spid="_x0000_s1026" type="#_x0000_t75" style="position:absolute;margin-left:36.8pt;margin-top:359.2pt;width:27.15pt;height:2pt;z-index:251741184;visibility:visible;mso-wrap-style:square;mso-wrap-distance-left:9pt;mso-wrap-distance-top:0;mso-wrap-distance-right:9pt;mso-wrap-distance-bottom:0;mso-position-horizontal:absolute;mso-position-horizontal-relative:text;mso-position-vertical:absolute;mso-position-vertical-relative:text" o:gfxdata="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">
                 <v:imagedata r:id="rId52" o:title=""/>
               </v:shape>
             </w:pict>
@@ -5578,7 +5615,7 @@
           </mc:Choice>
           <mc:Fallback>
             <w:pict>
-              <v:shape w14:anchorId="7391FFC8" id="Ink 102" o:spid="_x0000_s1026" type="#_x0000_t75" style="position:absolute;margin-left:39.45pt;margin-top:384.05pt;width:5.5pt;height:5.4pt;z-index:251739136;visibility:visible;mso-wrap-style:square;mso-wrap-distance-left:9pt;mso-wrap-distance-top:0;mso-wrap-distance-right:9pt;mso-wrap-distance-bottom:0;mso-position-horizontal:absolute;mso-position-horizontal-relative:text;mso-position-vertical:absolute;mso-position-vertical-relative:text" o:gfxdata="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">
+              <v:shape w14:anchorId="09DB674E" id="Ink 102" o:spid="_x0000_s1026" type="#_x0000_t75" style="position:absolute;margin-left:39.45pt;margin-top:384.05pt;width:5.5pt;height:5.4pt;z-index:251739136;visibility:visible;mso-wrap-style:square;mso-wrap-distance-left:9pt;mso-wrap-distance-top:0;mso-wrap-distance-right:9pt;mso-wrap-distance-bottom:0;mso-position-horizontal:absolute;mso-position-horizontal-relative:text;mso-position-vertical:absolute;mso-position-vertical-relative:text" o:gfxdata="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">
                 <v:imagedata r:id="rId54" o:title=""/>
               </v:shape>
             </w:pict>
@@ -5623,7 +5660,7 @@
           </mc:Choice>
           <mc:Fallback>
             <w:pict>
-              <v:shape w14:anchorId="6C1BBE79" id="Ink 99" o:spid="_x0000_s1026" type="#_x0000_t75" style="position:absolute;margin-left:40.95pt;margin-top:359.45pt;width:7.45pt;height:29.3pt;z-index:251736064;visibility:visible;mso-wrap-style:square;mso-wrap-distance-left:9pt;mso-wrap-distance-top:0;mso-wrap-distance-right:9pt;mso-wrap-distance-bottom:0;mso-position-horizontal:absolute;mso-position-horizontal-relative:text;mso-position-vertical:absolute;mso-position-vertical-relative:text" o:gfxdata="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">
+              <v:shape w14:anchorId="306EC469" id="Ink 99" o:spid="_x0000_s1026" type="#_x0000_t75" style="position:absolute;margin-left:40.95pt;margin-top:359.45pt;width:7.45pt;height:29.3pt;z-index:251736064;visibility:visible;mso-wrap-style:square;mso-wrap-distance-left:9pt;mso-wrap-distance-top:0;mso-wrap-distance-right:9pt;mso-wrap-distance-bottom:0;mso-position-horizontal:absolute;mso-position-horizontal-relative:text;mso-position-vertical:absolute;mso-position-vertical-relative:text" o:gfxdata="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">
                 <v:imagedata r:id="rId56" o:title=""/>
               </v:shape>
             </w:pict>
@@ -5668,7 +5705,7 @@
           </mc:Choice>
           <mc:Fallback>
             <w:pict>
-              <v:shape w14:anchorId="3EE7EA87" id="Ink 97" o:spid="_x0000_s1026" type="#_x0000_t75" style="position:absolute;margin-left:44.6pt;margin-top:264.85pt;width:5.2pt;height:5.1pt;z-index:251734016;visibility:visible;mso-wrap-style:square;mso-wrap-distance-left:9pt;mso-wrap-distance-top:0;mso-wrap-distance-right:9pt;mso-wrap-distance-bottom:0;mso-position-horizontal:absolute;mso-position-horizontal-relative:text;mso-position-vertical:absolute;mso-position-vertical-relative:text" o:gfxdata="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">
+              <v:shape w14:anchorId="520FE676" id="Ink 97" o:spid="_x0000_s1026" type="#_x0000_t75" style="position:absolute;margin-left:44.6pt;margin-top:264.85pt;width:5.2pt;height:5.1pt;z-index:251734016;visibility:visible;mso-wrap-style:square;mso-wrap-distance-left:9pt;mso-wrap-distance-top:0;mso-wrap-distance-right:9pt;mso-wrap-distance-bottom:0;mso-position-horizontal:absolute;mso-position-horizontal-relative:text;mso-position-vertical:absolute;mso-position-vertical-relative:text" o:gfxdata="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">
                 <v:imagedata r:id="rId58" o:title=""/>
               </v:shape>
             </w:pict>
@@ -5713,7 +5750,7 @@
           </mc:Choice>
           <mc:Fallback>
             <w:pict>
-              <v:shape w14:anchorId="274E8370" id="Ink 93" o:spid="_x0000_s1026" type="#_x0000_t75" style="position:absolute;margin-left:37.4pt;margin-top:215.3pt;width:10.95pt;height:54.55pt;z-index:251730944;visibility:visible;mso-wrap-style:square;mso-wrap-distance-left:9pt;mso-wrap-distance-top:0;mso-wrap-distance-right:9pt;mso-wrap-distance-bottom:0;mso-position-horizontal:absolute;mso-position-horizontal-relative:text;mso-position-vertical:absolute;mso-position-vertical-relative:text" o:gfxdata="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">
+              <v:shape w14:anchorId="3FA66877" id="Ink 93" o:spid="_x0000_s1026" type="#_x0000_t75" style="position:absolute;margin-left:37.4pt;margin-top:215.3pt;width:10.95pt;height:54.55pt;z-index:251730944;visibility:visible;mso-wrap-style:square;mso-wrap-distance-left:9pt;mso-wrap-distance-top:0;mso-wrap-distance-right:9pt;mso-wrap-distance-bottom:0;mso-position-horizontal:absolute;mso-position-horizontal-relative:text;mso-position-vertical:absolute;mso-position-vertical-relative:text" o:gfxdata="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">
                 <v:imagedata r:id="rId60" o:title=""/>
               </v:shape>
             </w:pict>
@@ -5764,7 +5801,7 @@
           </mc:Choice>
           <mc:Fallback>
             <w:pict>
-              <v:shape w14:anchorId="23AC5BDD" id="Ink 91" o:spid="_x0000_s1026" type="#_x0000_t75" style="position:absolute;margin-left:27.55pt;margin-top:214.5pt;width:13.25pt;height:1.75pt;z-index:251728896;visibility:visible;mso-wrap-style:square;mso-width-percent:0;mso-height-percent:0;mso-wrap-distance-left:9pt;mso-wrap-distance-top:0;mso-wrap-distance-right:9pt;mso-wrap-distance-bottom:0;mso-position-horizontal:absolute;mso-position-horizontal-relative:text;mso-position-vertical:absolute;mso-position-vertical-relative:text;mso-width-percent:0;mso-height-percent:0;mso-width-relative:margin;mso-height-relative:margin" o:gfxdata="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">
+              <v:shape w14:anchorId="18C384F5" id="Ink 91" o:spid="_x0000_s1026" type="#_x0000_t75" style="position:absolute;margin-left:27.55pt;margin-top:214.5pt;width:13.25pt;height:1.75pt;z-index:251728896;visibility:visible;mso-wrap-style:square;mso-width-percent:0;mso-height-percent:0;mso-wrap-distance-left:9pt;mso-wrap-distance-top:0;mso-wrap-distance-right:9pt;mso-wrap-distance-bottom:0;mso-position-horizontal:absolute;mso-position-horizontal-relative:text;mso-position-vertical:absolute;mso-position-vertical-relative:text;mso-width-percent:0;mso-height-percent:0;mso-width-relative:margin;mso-height-relative:margin" o:gfxdata="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">
                 <v:imagedata r:id="rId62" o:title=""/>
               </v:shape>
             </w:pict>
@@ -5809,7 +5846,7 @@
           </mc:Choice>
           <mc:Fallback>
             <w:pict>
-              <v:shape w14:anchorId="02C4224A" id="Ink 89" o:spid="_x0000_s1026" type="#_x0000_t75" style="position:absolute;margin-left:-29.05pt;margin-top:156.65pt;width:36.85pt;height:112.35pt;z-index:251726848;visibility:visible;mso-wrap-style:square;mso-wrap-distance-left:9pt;mso-wrap-distance-top:0;mso-wrap-distance-right:9pt;mso-wrap-distance-bottom:0;mso-position-horizontal:absolute;mso-position-horizontal-relative:text;mso-position-vertical:absolute;mso-position-vertical-relative:text" o:gfxdata="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">
+              <v:shape w14:anchorId="2510DDC7" id="Ink 89" o:spid="_x0000_s1026" type="#_x0000_t75" style="position:absolute;margin-left:-29.05pt;margin-top:156.65pt;width:36.85pt;height:112.35pt;z-index:251726848;visibility:visible;mso-wrap-style:square;mso-wrap-distance-left:9pt;mso-wrap-distance-top:0;mso-wrap-distance-right:9pt;mso-wrap-distance-bottom:0;mso-position-horizontal:absolute;mso-position-horizontal-relative:text;mso-position-vertical:absolute;mso-position-vertical-relative:text" o:gfxdata="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">
                 <v:imagedata r:id="rId64" o:title=""/>
               </v:shape>
             </w:pict>
@@ -5854,7 +5891,7 @@
           </mc:Choice>
           <mc:Fallback>
             <w:pict>
-              <v:shape w14:anchorId="08D31924" id="Ink 88" o:spid="_x0000_s1026" type="#_x0000_t75" style="position:absolute;margin-left:420.1pt;margin-top:133.8pt;width:6.4pt;height:10.95pt;z-index:251725824;visibility:visible;mso-wrap-style:square;mso-wrap-distance-left:9pt;mso-wrap-distance-top:0;mso-wrap-distance-right:9pt;mso-wrap-distance-bottom:0;mso-position-horizontal:absolute;mso-position-horizontal-relative:text;mso-position-vertical:absolute;mso-position-vertical-relative:text" o:gfxdata="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">
+              <v:shape w14:anchorId="79880DFC" id="Ink 88" o:spid="_x0000_s1026" type="#_x0000_t75" style="position:absolute;margin-left:420.1pt;margin-top:133.8pt;width:6.4pt;height:10.95pt;z-index:251725824;visibility:visible;mso-wrap-style:square;mso-wrap-distance-left:9pt;mso-wrap-distance-top:0;mso-wrap-distance-right:9pt;mso-wrap-distance-bottom:0;mso-position-horizontal:absolute;mso-position-horizontal-relative:text;mso-position-vertical:absolute;mso-position-vertical-relative:text" o:gfxdata="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">
                 <v:imagedata r:id="rId66" o:title=""/>
               </v:shape>
             </w:pict>
@@ -5899,7 +5936,7 @@
           </mc:Choice>
           <mc:Fallback>
             <w:pict>
-              <v:shape w14:anchorId="1464001D" id="Ink 85" o:spid="_x0000_s1026" type="#_x0000_t75" style="position:absolute;margin-left:244.4pt;margin-top:92.05pt;width:181.9pt;height:49pt;z-index:251722752;visibility:visible;mso-wrap-style:square;mso-wrap-distance-left:9pt;mso-wrap-distance-top:0;mso-wrap-distance-right:9pt;mso-wrap-distance-bottom:0;mso-position-horizontal:absolute;mso-position-horizontal-relative:text;mso-position-vertical:absolute;mso-position-vertical-relative:text" o:gfxdata="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">
+              <v:shape w14:anchorId="42335215" id="Ink 85" o:spid="_x0000_s1026" type="#_x0000_t75" style="position:absolute;margin-left:244.4pt;margin-top:92.05pt;width:181.9pt;height:49pt;z-index:251722752;visibility:visible;mso-wrap-style:square;mso-wrap-distance-left:9pt;mso-wrap-distance-top:0;mso-wrap-distance-right:9pt;mso-wrap-distance-bottom:0;mso-position-horizontal:absolute;mso-position-horizontal-relative:text;mso-position-vertical:absolute;mso-position-vertical-relative:text" o:gfxdata="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">
                 <v:imagedata r:id="rId68" o:title=""/>
               </v:shape>
             </w:pict>
@@ -5944,7 +5981,7 @@
           </mc:Choice>
           <mc:Fallback>
             <w:pict>
-              <v:shape w14:anchorId="44A2AEBA" id="Ink 81" o:spid="_x0000_s1026" type="#_x0000_t75" style="position:absolute;margin-left:177.85pt;margin-top:380.95pt;width:6.15pt;height:6.4pt;z-index:251720704;visibility:visible;mso-wrap-style:square;mso-wrap-distance-left:9pt;mso-wrap-distance-top:0;mso-wrap-distance-right:9pt;mso-wrap-distance-bottom:0;mso-position-horizontal:absolute;mso-position-horizontal-relative:text;mso-position-vertical:absolute;mso-position-vertical-relative:text" o:gfxdata="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">
+              <v:shape w14:anchorId="317FC594" id="Ink 81" o:spid="_x0000_s1026" type="#_x0000_t75" style="position:absolute;margin-left:177.85pt;margin-top:380.95pt;width:6.15pt;height:6.4pt;z-index:251720704;visibility:visible;mso-wrap-style:square;mso-wrap-distance-left:9pt;mso-wrap-distance-top:0;mso-wrap-distance-right:9pt;mso-wrap-distance-bottom:0;mso-position-horizontal:absolute;mso-position-horizontal-relative:text;mso-position-vertical:absolute;mso-position-vertical-relative:text" o:gfxdata="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">
                 <v:imagedata r:id="rId70" o:title=""/>
               </v:shape>
             </w:pict>
@@ -5989,7 +6026,7 @@
           </mc:Choice>
           <mc:Fallback>
             <w:pict>
-              <v:shape w14:anchorId="7B7FF2BD" id="Ink 80" o:spid="_x0000_s1026" type="#_x0000_t75" style="position:absolute;margin-left:167.55pt;margin-top:286.15pt;width:14.2pt;height:101.35pt;z-index:251719680;visibility:visible;mso-wrap-style:square;mso-wrap-distance-left:9pt;mso-wrap-distance-top:0;mso-wrap-distance-right:9pt;mso-wrap-distance-bottom:0;mso-position-horizontal:absolute;mso-position-horizontal-relative:text;mso-position-vertical:absolute;mso-position-vertical-relative:text" o:gfxdata="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">
+              <v:shape w14:anchorId="64A70AF4" id="Ink 80" o:spid="_x0000_s1026" type="#_x0000_t75" style="position:absolute;margin-left:167.55pt;margin-top:286.15pt;width:14.2pt;height:101.35pt;z-index:251719680;visibility:visible;mso-wrap-style:square;mso-wrap-distance-left:9pt;mso-wrap-distance-top:0;mso-wrap-distance-right:9pt;mso-wrap-distance-bottom:0;mso-position-horizontal:absolute;mso-position-horizontal-relative:text;mso-position-vertical:absolute;mso-position-vertical-relative:text" o:gfxdata="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">
                 <v:imagedata r:id="rId72" o:title=""/>
               </v:shape>
             </w:pict>
@@ -6034,7 +6071,7 @@
           </mc:Choice>
           <mc:Fallback>
             <w:pict>
-              <v:shape w14:anchorId="683484BB" id="Ink 76" o:spid="_x0000_s1026" type="#_x0000_t75" style="position:absolute;margin-left:159.75pt;margin-top:217.9pt;width:24.7pt;height:1.2pt;z-index:251716608;visibility:visible;mso-wrap-style:square;mso-wrap-distance-left:9pt;mso-wrap-distance-top:0;mso-wrap-distance-right:9pt;mso-wrap-distance-bottom:0;mso-position-horizontal:absolute;mso-position-horizontal-relative:text;mso-position-vertical:absolute;mso-position-vertical-relative:text" o:gfxdata="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">
+              <v:shape w14:anchorId="2C0DA55A" id="Ink 76" o:spid="_x0000_s1026" type="#_x0000_t75" style="position:absolute;margin-left:159.75pt;margin-top:217.9pt;width:24.7pt;height:1.2pt;z-index:251716608;visibility:visible;mso-wrap-style:square;mso-wrap-distance-left:9pt;mso-wrap-distance-top:0;mso-wrap-distance-right:9pt;mso-wrap-distance-bottom:0;mso-position-horizontal:absolute;mso-position-horizontal-relative:text;mso-position-vertical:absolute;mso-position-vertical-relative:text" o:gfxdata="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">
                 <v:imagedata r:id="rId74" o:title=""/>
               </v:shape>
             </w:pict>
@@ -6079,7 +6116,7 @@
           </mc:Choice>
           <mc:Fallback>
             <w:pict>
-              <v:shape w14:anchorId="45B90415" id="Ink 74" o:spid="_x0000_s1026" type="#_x0000_t75" style="position:absolute;margin-left:186.25pt;margin-top:217.9pt;width:23.15pt;height:1.85pt;z-index:251714560;visibility:visible;mso-wrap-style:square;mso-wrap-distance-left:9pt;mso-wrap-distance-top:0;mso-wrap-distance-right:9pt;mso-wrap-distance-bottom:0;mso-position-horizontal:absolute;mso-position-horizontal-relative:text;mso-position-vertical:absolute;mso-position-vertical-relative:text" o:gfxdata="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">
+              <v:shape w14:anchorId="07723421" id="Ink 74" o:spid="_x0000_s1026" type="#_x0000_t75" style="position:absolute;margin-left:186.25pt;margin-top:217.9pt;width:23.15pt;height:1.85pt;z-index:251714560;visibility:visible;mso-wrap-style:square;mso-wrap-distance-left:9pt;mso-wrap-distance-top:0;mso-wrap-distance-right:9pt;mso-wrap-distance-bottom:0;mso-position-horizontal:absolute;mso-position-horizontal-relative:text;mso-position-vertical:absolute;mso-position-vertical-relative:text" o:gfxdata="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">
                 <v:imagedata r:id="rId76" o:title=""/>
               </v:shape>
             </w:pict>
@@ -6124,7 +6161,7 @@
           </mc:Choice>
           <mc:Fallback>
             <w:pict>
-              <v:shape w14:anchorId="284948AC" id="Ink 71" o:spid="_x0000_s1026" type="#_x0000_t75" style="position:absolute;margin-left:245.5pt;margin-top:380.35pt;width:8.35pt;height:7.8pt;z-index:251712512;visibility:visible;mso-wrap-style:square;mso-wrap-distance-left:9pt;mso-wrap-distance-top:0;mso-wrap-distance-right:9pt;mso-wrap-distance-bottom:0;mso-position-horizontal:absolute;mso-position-horizontal-relative:text;mso-position-vertical:absolute;mso-position-vertical-relative:text" o:gfxdata="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">
+              <v:shape w14:anchorId="24825CA9" id="Ink 71" o:spid="_x0000_s1026" type="#_x0000_t75" style="position:absolute;margin-left:245.5pt;margin-top:380.35pt;width:8.35pt;height:7.8pt;z-index:251712512;visibility:visible;mso-wrap-style:square;mso-wrap-distance-left:9pt;mso-wrap-distance-top:0;mso-wrap-distance-right:9pt;mso-wrap-distance-bottom:0;mso-position-horizontal:absolute;mso-position-horizontal-relative:text;mso-position-vertical:absolute;mso-position-vertical-relative:text" o:gfxdata="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">
                 <v:imagedata r:id="rId78" o:title=""/>
               </v:shape>
             </w:pict>
@@ -6169,7 +6206,7 @@
           </mc:Choice>
           <mc:Fallback>
             <w:pict>
-              <v:shape w14:anchorId="5DBC5DCE" id="Ink 68" o:spid="_x0000_s1026" type="#_x0000_t75" style="position:absolute;margin-left:231.6pt;margin-top:317.9pt;width:20.25pt;height:68.55pt;z-index:251709440;visibility:visible;mso-wrap-style:square;mso-wrap-distance-left:9pt;mso-wrap-distance-top:0;mso-wrap-distance-right:9pt;mso-wrap-distance-bottom:0;mso-position-horizontal:absolute;mso-position-horizontal-relative:text;mso-position-vertical:absolute;mso-position-vertical-relative:text" o:gfxdata="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">
+              <v:shape w14:anchorId="2259961B" id="Ink 68" o:spid="_x0000_s1026" type="#_x0000_t75" style="position:absolute;margin-left:231.6pt;margin-top:317.9pt;width:20.25pt;height:68.55pt;z-index:251709440;visibility:visible;mso-wrap-style:square;mso-wrap-distance-left:9pt;mso-wrap-distance-top:0;mso-wrap-distance-right:9pt;mso-wrap-distance-bottom:0;mso-position-horizontal:absolute;mso-position-horizontal-relative:text;mso-position-vertical:absolute;mso-position-vertical-relative:text" o:gfxdata="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">
                 <v:imagedata r:id="rId80" o:title=""/>
               </v:shape>
             </w:pict>
@@ -6220,7 +6257,7 @@
           </mc:Choice>
           <mc:Fallback>
             <w:pict>
-              <v:shape w14:anchorId="1BA0298F" id="Ink 66" o:spid="_x0000_s1026" type="#_x0000_t75" style="position:absolute;margin-left:194.35pt;margin-top:317.2pt;width:41.5pt;height:2.5pt;z-index:251707392;visibility:visible;mso-wrap-style:square;mso-width-percent:0;mso-height-percent:0;mso-wrap-distance-left:9pt;mso-wrap-distance-top:0;mso-wrap-distance-right:9pt;mso-wrap-distance-bottom:0;mso-position-horizontal:absolute;mso-position-horizontal-relative:text;mso-position-vertical:absolute;mso-position-vertical-relative:text;mso-width-percent:0;mso-height-percent:0;mso-width-relative:margin;mso-height-relative:margin" o:gfxdata="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">
+              <v:shape w14:anchorId="0A4BEBBE" id="Ink 66" o:spid="_x0000_s1026" type="#_x0000_t75" style="position:absolute;margin-left:194.35pt;margin-top:317.2pt;width:41.5pt;height:2.5pt;z-index:251707392;visibility:visible;mso-wrap-style:square;mso-width-percent:0;mso-height-percent:0;mso-wrap-distance-left:9pt;mso-wrap-distance-top:0;mso-wrap-distance-right:9pt;mso-wrap-distance-bottom:0;mso-position-horizontal:absolute;mso-position-horizontal-relative:text;mso-position-vertical:absolute;mso-position-vertical-relative:text;mso-width-percent:0;mso-height-percent:0;mso-width-relative:margin;mso-height-relative:margin" o:gfxdata="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">
                 <v:imagedata r:id="rId82" o:title=""/>
               </v:shape>
             </w:pict>
@@ -6265,7 +6302,7 @@
           </mc:Choice>
           <mc:Fallback>
             <w:pict>
-              <v:shape w14:anchorId="1EC4A3C7" id="Ink 64" o:spid="_x0000_s1026" type="#_x0000_t75" style="position:absolute;margin-left:218.35pt;margin-top:263.2pt;width:7.65pt;height:7.15pt;z-index:251705344;visibility:visible;mso-wrap-style:square;mso-wrap-distance-left:9pt;mso-wrap-distance-top:0;mso-wrap-distance-right:9pt;mso-wrap-distance-bottom:0;mso-position-horizontal:absolute;mso-position-horizontal-relative:text;mso-position-vertical:absolute;mso-position-vertical-relative:text" o:gfxdata="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">
+              <v:shape w14:anchorId="3C6AD3DB" id="Ink 64" o:spid="_x0000_s1026" type="#_x0000_t75" style="position:absolute;margin-left:218.35pt;margin-top:263.2pt;width:7.65pt;height:7.15pt;z-index:251705344;visibility:visible;mso-wrap-style:square;mso-wrap-distance-left:9pt;mso-wrap-distance-top:0;mso-wrap-distance-right:9pt;mso-wrap-distance-bottom:0;mso-position-horizontal:absolute;mso-position-horizontal-relative:text;mso-position-vertical:absolute;mso-position-vertical-relative:text" o:gfxdata="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">
                 <v:imagedata r:id="rId84" o:title=""/>
               </v:shape>
             </w:pict>
@@ -6310,7 +6347,7 @@
           </mc:Choice>
           <mc:Fallback>
             <w:pict>
-              <v:shape w14:anchorId="1DE1EFAF" id="Ink 61" o:spid="_x0000_s1026" type="#_x0000_t75" style="position:absolute;margin-left:199.9pt;margin-top:218.5pt;width:24pt;height:50.9pt;z-index:251702272;visibility:visible;mso-wrap-style:square;mso-wrap-distance-left:9pt;mso-wrap-distance-top:0;mso-wrap-distance-right:9pt;mso-wrap-distance-bottom:0;mso-position-horizontal:absolute;mso-position-horizontal-relative:text;mso-position-vertical:absolute;mso-position-vertical-relative:text" o:gfxdata="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">
+              <v:shape w14:anchorId="3E7F36D7" id="Ink 61" o:spid="_x0000_s1026" type="#_x0000_t75" style="position:absolute;margin-left:199.9pt;margin-top:218.5pt;width:24pt;height:50.9pt;z-index:251702272;visibility:visible;mso-wrap-style:square;mso-wrap-distance-left:9pt;mso-wrap-distance-top:0;mso-wrap-distance-right:9pt;mso-wrap-distance-bottom:0;mso-position-horizontal:absolute;mso-position-horizontal-relative:text;mso-position-vertical:absolute;mso-position-vertical-relative:text" o:gfxdata="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">
                 <v:imagedata r:id="rId86" o:title=""/>
               </v:shape>
             </w:pict>
@@ -6355,7 +6392,7 @@
           </mc:Choice>
           <mc:Fallback>
             <w:pict>
-              <v:shape w14:anchorId="57500427" id="Ink 59" o:spid="_x0000_s1026" type="#_x0000_t75" style="position:absolute;margin-left:146.5pt;margin-top:262.65pt;width:7.2pt;height:5.9pt;z-index:251700224;visibility:visible;mso-wrap-style:square;mso-wrap-distance-left:9pt;mso-wrap-distance-top:0;mso-wrap-distance-right:9pt;mso-wrap-distance-bottom:0;mso-position-horizontal:absolute;mso-position-horizontal-relative:text;mso-position-vertical:absolute;mso-position-vertical-relative:text" o:gfxdata="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">
+              <v:shape w14:anchorId="50BD7190" id="Ink 59" o:spid="_x0000_s1026" type="#_x0000_t75" style="position:absolute;margin-left:146.5pt;margin-top:262.65pt;width:7.2pt;height:5.9pt;z-index:251700224;visibility:visible;mso-wrap-style:square;mso-wrap-distance-left:9pt;mso-wrap-distance-top:0;mso-wrap-distance-right:9pt;mso-wrap-distance-bottom:0;mso-position-horizontal:absolute;mso-position-horizontal-relative:text;mso-position-vertical:absolute;mso-position-vertical-relative:text" o:gfxdata="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">
                 <v:imagedata r:id="rId88" o:title=""/>
               </v:shape>
             </w:pict>
@@ -6400,7 +6437,7 @@
           </mc:Choice>
           <mc:Fallback>
             <w:pict>
-              <v:shape w14:anchorId="09C1588A" id="Ink 56" o:spid="_x0000_s1026" type="#_x0000_t75" style="position:absolute;margin-left:147.85pt;margin-top:218.65pt;width:21.35pt;height:49.95pt;z-index:251697152;visibility:visible;mso-wrap-style:square;mso-wrap-distance-left:9pt;mso-wrap-distance-top:0;mso-wrap-distance-right:9pt;mso-wrap-distance-bottom:0;mso-position-horizontal:absolute;mso-position-horizontal-relative:text;mso-position-vertical:absolute;mso-position-vertical-relative:text" o:gfxdata="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">
+              <v:shape w14:anchorId="09A48057" id="Ink 56" o:spid="_x0000_s1026" type="#_x0000_t75" style="position:absolute;margin-left:147.85pt;margin-top:218.65pt;width:21.35pt;height:49.95pt;z-index:251697152;visibility:visible;mso-wrap-style:square;mso-wrap-distance-left:9pt;mso-wrap-distance-top:0;mso-wrap-distance-right:9pt;mso-wrap-distance-bottom:0;mso-position-horizontal:absolute;mso-position-horizontal-relative:text;mso-position-vertical:absolute;mso-position-vertical-relative:text" o:gfxdata="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">
                 <v:imagedata r:id="rId90" o:title=""/>
               </v:shape>
             </w:pict>
@@ -6445,7 +6482,7 @@
           </mc:Choice>
           <mc:Fallback>
             <w:pict>
-              <v:shape w14:anchorId="512BDDED" id="Ink 54" o:spid="_x0000_s1026" type="#_x0000_t75" style="position:absolute;margin-left:302.6pt;margin-top:134.95pt;width:5pt;height:5.6pt;z-index:251695104;visibility:visible;mso-wrap-style:square;mso-wrap-distance-left:9pt;mso-wrap-distance-top:0;mso-wrap-distance-right:9pt;mso-wrap-distance-bottom:0;mso-position-horizontal:absolute;mso-position-horizontal-relative:text;mso-position-vertical:absolute;mso-position-vertical-relative:text" o:gfxdata="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">
+              <v:shape w14:anchorId="4A6B6745" id="Ink 54" o:spid="_x0000_s1026" type="#_x0000_t75" style="position:absolute;margin-left:302.6pt;margin-top:134.95pt;width:5pt;height:5.6pt;z-index:251695104;visibility:visible;mso-wrap-style:square;mso-wrap-distance-left:9pt;mso-wrap-distance-top:0;mso-wrap-distance-right:9pt;mso-wrap-distance-bottom:0;mso-position-horizontal:absolute;mso-position-horizontal-relative:text;mso-position-vertical:absolute;mso-position-vertical-relative:text" o:gfxdata="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">
                 <v:imagedata r:id="rId92" o:title=""/>
               </v:shape>
             </w:pict>
@@ -6496,7 +6533,7 @@
           </mc:Choice>
           <mc:Fallback>
             <w:pict>
-              <v:shape w14:anchorId="4251E79E" id="Ink 51" o:spid="_x0000_s1026" type="#_x0000_t75" style="position:absolute;margin-left:243.35pt;margin-top:99.3pt;width:64pt;height:40.95pt;z-index:251692032;visibility:visible;mso-wrap-style:square;mso-width-percent:0;mso-height-percent:0;mso-wrap-distance-left:9pt;mso-wrap-distance-top:0;mso-wrap-distance-right:9pt;mso-wrap-distance-bottom:0;mso-position-horizontal:absolute;mso-position-horizontal-relative:text;mso-position-vertical:absolute;mso-position-vertical-relative:text;mso-width-percent:0;mso-height-percent:0;mso-width-relative:margin;mso-height-relative:margin" o:gfxdata="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">
+              <v:shape w14:anchorId="3BE47258" id="Ink 51" o:spid="_x0000_s1026" type="#_x0000_t75" style="position:absolute;margin-left:243.35pt;margin-top:99.3pt;width:64pt;height:40.95pt;z-index:251692032;visibility:visible;mso-wrap-style:square;mso-width-percent:0;mso-height-percent:0;mso-wrap-distance-left:9pt;mso-wrap-distance-top:0;mso-wrap-distance-right:9pt;mso-wrap-distance-bottom:0;mso-position-horizontal:absolute;mso-position-horizontal-relative:text;mso-position-vertical:absolute;mso-position-vertical-relative:text;mso-width-percent:0;mso-height-percent:0;mso-width-relative:margin;mso-height-relative:margin" o:gfxdata="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">
                 <v:imagedata r:id="rId94" o:title=""/>
               </v:shape>
             </w:pict>
@@ -6541,7 +6578,7 @@
           </mc:Choice>
           <mc:Fallback>
             <w:pict>
-              <v:shape w14:anchorId="43122789" id="Ink 49" o:spid="_x0000_s1026" type="#_x0000_t75" style="position:absolute;margin-left:283.65pt;margin-top:157.2pt;width:22.25pt;height:110.8pt;z-index:251689984;visibility:visible;mso-wrap-style:square;mso-wrap-distance-left:9pt;mso-wrap-distance-top:0;mso-wrap-distance-right:9pt;mso-wrap-distance-bottom:0;mso-position-horizontal:absolute;mso-position-horizontal-relative:text;mso-position-vertical:absolute;mso-position-vertical-relative:text" o:gfxdata="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">
+              <v:shape w14:anchorId="739EA40A" id="Ink 49" o:spid="_x0000_s1026" type="#_x0000_t75" style="position:absolute;margin-left:283.65pt;margin-top:157.2pt;width:22.25pt;height:110.8pt;z-index:251689984;visibility:visible;mso-wrap-style:square;mso-wrap-distance-left:9pt;mso-wrap-distance-top:0;mso-wrap-distance-right:9pt;mso-wrap-distance-bottom:0;mso-position-horizontal:absolute;mso-position-horizontal-relative:text;mso-position-vertical:absolute;mso-position-vertical-relative:text" o:gfxdata="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">
                 <v:imagedata r:id="rId96" o:title=""/>
               </v:shape>
             </w:pict>
@@ -6586,7 +6623,7 @@
           </mc:Choice>
           <mc:Fallback>
             <w:pict>
-              <v:shape w14:anchorId="54FE601B" id="Ink 33" o:spid="_x0000_s1026" type="#_x0000_t75" style="position:absolute;margin-left:62.85pt;margin-top:143.25pt;width:6.4pt;height:2.3pt;z-index:251679744;visibility:visible;mso-wrap-style:square;mso-wrap-distance-left:9pt;mso-wrap-distance-top:0;mso-wrap-distance-right:9pt;mso-wrap-distance-bottom:0;mso-position-horizontal:absolute;mso-position-horizontal-relative:text;mso-position-vertical:absolute;mso-position-vertical-relative:text" o:gfxdata="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">
+              <v:shape w14:anchorId="7A3D6B7E" id="Ink 33" o:spid="_x0000_s1026" type="#_x0000_t75" style="position:absolute;margin-left:62.85pt;margin-top:143.25pt;width:6.4pt;height:2.3pt;z-index:251679744;visibility:visible;mso-wrap-style:square;mso-wrap-distance-left:9pt;mso-wrap-distance-top:0;mso-wrap-distance-right:9pt;mso-wrap-distance-bottom:0;mso-position-horizontal:absolute;mso-position-horizontal-relative:text;mso-position-vertical:absolute;mso-position-vertical-relative:text" o:gfxdata="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">
                 <v:imagedata r:id="rId98" o:title=""/>
               </v:shape>
             </w:pict>
@@ -6631,7 +6668,7 @@
           </mc:Choice>
           <mc:Fallback>
             <w:pict>
-              <v:shape w14:anchorId="6400434E" id="Ink 30" o:spid="_x0000_s1026" type="#_x0000_t75" style="position:absolute;margin-left:62.35pt;margin-top:137.95pt;width:3.6pt;height:6.65pt;z-index:251678720;visibility:visible;mso-wrap-style:square;mso-wrap-distance-left:9pt;mso-wrap-distance-top:0;mso-wrap-distance-right:9pt;mso-wrap-distance-bottom:0;mso-position-horizontal:absolute;mso-position-horizontal-relative:text;mso-position-vertical:absolute;mso-position-vertical-relative:text" o:gfxdata="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">
+              <v:shape w14:anchorId="4469FA16" id="Ink 30" o:spid="_x0000_s1026" type="#_x0000_t75" style="position:absolute;margin-left:62.35pt;margin-top:137.95pt;width:3.6pt;height:6.65pt;z-index:251678720;visibility:visible;mso-wrap-style:square;mso-wrap-distance-left:9pt;mso-wrap-distance-top:0;mso-wrap-distance-right:9pt;mso-wrap-distance-bottom:0;mso-position-horizontal:absolute;mso-position-horizontal-relative:text;mso-position-vertical:absolute;mso-position-vertical-relative:text" o:gfxdata="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">
                 <v:imagedata r:id="rId100" o:title=""/>
               </v:shape>
             </w:pict>
@@ -6676,7 +6713,7 @@
           </mc:Choice>
           <mc:Fallback>
             <w:pict>
-              <v:shape w14:anchorId="26A5ED1E" id="Ink 29" o:spid="_x0000_s1026" type="#_x0000_t75" style="position:absolute;margin-left:187.8pt;margin-top:133.6pt;width:2.75pt;height:5.5pt;z-index:251677696;visibility:visible;mso-wrap-style:square;mso-wrap-distance-left:9pt;mso-wrap-distance-top:0;mso-wrap-distance-right:9pt;mso-wrap-distance-bottom:0;mso-position-horizontal:absolute;mso-position-horizontal-relative:text;mso-position-vertical:absolute;mso-position-vertical-relative:text" o:gfxdata="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">
+              <v:shape w14:anchorId="6BB0DD84" id="Ink 29" o:spid="_x0000_s1026" type="#_x0000_t75" style="position:absolute;margin-left:187.8pt;margin-top:133.6pt;width:2.75pt;height:5.5pt;z-index:251677696;visibility:visible;mso-wrap-style:square;mso-wrap-distance-left:9pt;mso-wrap-distance-top:0;mso-wrap-distance-right:9pt;mso-wrap-distance-bottom:0;mso-position-horizontal:absolute;mso-position-horizontal-relative:text;mso-position-vertical:absolute;mso-position-vertical-relative:text" o:gfxdata="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">
                 <v:imagedata r:id="rId102" o:title=""/>
               </v:shape>
             </w:pict>
@@ -6721,7 +6758,7 @@
           </mc:Choice>
           <mc:Fallback>
             <w:pict>
-              <v:shape w14:anchorId="55C56EAC" id="Ink 26" o:spid="_x0000_s1026" type="#_x0000_t75" style="position:absolute;margin-left:189.4pt;margin-top:135.5pt;width:6.2pt;height:4.8pt;z-index:251676672;visibility:visible;mso-wrap-style:square;mso-wrap-distance-left:9pt;mso-wrap-distance-top:0;mso-wrap-distance-right:9pt;mso-wrap-distance-bottom:0;mso-position-horizontal:absolute;mso-position-horizontal-relative:text;mso-position-vertical:absolute;mso-position-vertical-relative:text" o:gfxdata="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">
+              <v:shape w14:anchorId="41F3AF03" id="Ink 26" o:spid="_x0000_s1026" type="#_x0000_t75" style="position:absolute;margin-left:189.4pt;margin-top:135.5pt;width:6.2pt;height:4.8pt;z-index:251676672;visibility:visible;mso-wrap-style:square;mso-wrap-distance-left:9pt;mso-wrap-distance-top:0;mso-wrap-distance-right:9pt;mso-wrap-distance-bottom:0;mso-position-horizontal:absolute;mso-position-horizontal-relative:text;mso-position-vertical:absolute;mso-position-vertical-relative:text" o:gfxdata="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">
                 <v:imagedata r:id="rId104" o:title=""/>
               </v:shape>
             </w:pict>
@@ -6766,7 +6803,7 @@
           </mc:Choice>
           <mc:Fallback>
             <w:pict>
-              <v:shape w14:anchorId="577B831E" id="Ink 25" o:spid="_x0000_s1026" type="#_x0000_t75" style="position:absolute;margin-left:189.55pt;margin-top:100.95pt;width:11.65pt;height:38.4pt;z-index:251675648;visibility:visible;mso-wrap-style:square;mso-wrap-distance-left:9pt;mso-wrap-distance-top:0;mso-wrap-distance-right:9pt;mso-wrap-distance-bottom:0;mso-position-horizontal:absolute;mso-position-horizontal-relative:text;mso-position-vertical:absolute;mso-position-vertical-relative:text" o:gfxdata="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">
+              <v:shape w14:anchorId="0E8D53C4" id="Ink 25" o:spid="_x0000_s1026" type="#_x0000_t75" style="position:absolute;margin-left:189.55pt;margin-top:100.95pt;width:11.65pt;height:38.4pt;z-index:251675648;visibility:visible;mso-wrap-style:square;mso-wrap-distance-left:9pt;mso-wrap-distance-top:0;mso-wrap-distance-right:9pt;mso-wrap-distance-bottom:0;mso-position-horizontal:absolute;mso-position-horizontal-relative:text;mso-position-vertical:absolute;mso-position-vertical-relative:text" o:gfxdata="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">
                 <v:imagedata r:id="rId106" o:title=""/>
               </v:shape>
             </w:pict>
@@ -6811,7 +6848,7 @@
           </mc:Choice>
           <mc:Fallback>
             <w:pict>
-              <v:shape w14:anchorId="4A546B84" id="Ink 23" o:spid="_x0000_s1026" type="#_x0000_t75" style="position:absolute;margin-left:62.7pt;margin-top:95.8pt;width:121.05pt;height:48.35pt;z-index:251673600;visibility:visible;mso-wrap-style:square;mso-wrap-distance-left:9pt;mso-wrap-distance-top:0;mso-wrap-distance-right:9pt;mso-wrap-distance-bottom:0;mso-position-horizontal:absolute;mso-position-horizontal-relative:text;mso-position-vertical:absolute;mso-position-vertical-relative:text" o:gfxdata="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">
+              <v:shape w14:anchorId="157BBD27" id="Ink 23" o:spid="_x0000_s1026" type="#_x0000_t75" style="position:absolute;margin-left:62.7pt;margin-top:95.8pt;width:121.05pt;height:48.35pt;z-index:251673600;visibility:visible;mso-wrap-style:square;mso-wrap-distance-left:9pt;mso-wrap-distance-top:0;mso-wrap-distance-right:9pt;mso-wrap-distance-bottom:0;mso-position-horizontal:absolute;mso-position-horizontal-relative:text;mso-position-vertical:absolute;mso-position-vertical-relative:text" o:gfxdata="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">
                 <v:imagedata r:id="rId108" o:title=""/>
               </v:shape>
             </w:pict>
@@ -6856,7 +6893,7 @@
           </mc:Choice>
           <mc:Fallback>
             <w:pict>
-              <v:shape w14:anchorId="06007952" id="Ink 20" o:spid="_x0000_s1026" type="#_x0000_t75" style="position:absolute;margin-left:259.9pt;margin-top:42.45pt;width:2.75pt;height:5.8pt;z-index:251671552;visibility:visible;mso-wrap-style:square;mso-wrap-distance-left:9pt;mso-wrap-distance-top:0;mso-wrap-distance-right:9pt;mso-wrap-distance-bottom:0;mso-position-horizontal:absolute;mso-position-horizontal-relative:text;mso-position-vertical:absolute;mso-position-vertical-relative:text" o:gfxdata="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">
+              <v:shape w14:anchorId="19D2FA55" id="Ink 20" o:spid="_x0000_s1026" type="#_x0000_t75" style="position:absolute;margin-left:259.9pt;margin-top:42.45pt;width:2.75pt;height:5.8pt;z-index:251671552;visibility:visible;mso-wrap-style:square;mso-wrap-distance-left:9pt;mso-wrap-distance-top:0;mso-wrap-distance-right:9pt;mso-wrap-distance-bottom:0;mso-position-horizontal:absolute;mso-position-horizontal-relative:text;mso-position-vertical:absolute;mso-position-vertical-relative:text" o:gfxdata="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">
                 <v:imagedata r:id="rId110" o:title=""/>
               </v:shape>
             </w:pict>
@@ -6901,7 +6938,7 @@
           </mc:Choice>
           <mc:Fallback>
             <w:pict>
-              <v:shape w14:anchorId="7173772B" id="Ink 17" o:spid="_x0000_s1026" type="#_x0000_t75" style="position:absolute;margin-left:242.5pt;margin-top:44.85pt;width:20.3pt;height:1.15pt;z-index:251668480;visibility:visible;mso-wrap-style:square;mso-wrap-distance-left:9pt;mso-wrap-distance-top:0;mso-wrap-distance-right:9pt;mso-wrap-distance-bottom:0;mso-position-horizontal:absolute;mso-position-horizontal-relative:text;mso-position-vertical:absolute;mso-position-vertical-relative:text" o:gfxdata="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">
+              <v:shape w14:anchorId="30177BC3" id="Ink 17" o:spid="_x0000_s1026" type="#_x0000_t75" style="position:absolute;margin-left:242.5pt;margin-top:44.85pt;width:20.3pt;height:1.15pt;z-index:251668480;visibility:visible;mso-wrap-style:square;mso-wrap-distance-left:9pt;mso-wrap-distance-top:0;mso-wrap-distance-right:9pt;mso-wrap-distance-bottom:0;mso-position-horizontal:absolute;mso-position-horizontal-relative:text;mso-position-vertical:absolute;mso-position-vertical-relative:text" o:gfxdata="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">
                 <v:imagedata r:id="rId112" o:title=""/>
               </v:shape>
             </w:pict>
@@ -6946,7 +6983,7 @@
           </mc:Choice>
           <mc:Fallback>
             <w:pict>
-              <v:shape w14:anchorId="0B3233A3" id="Ink 14" o:spid="_x0000_s1026" type="#_x0000_t75" style="position:absolute;margin-left:233.5pt;margin-top:41.2pt;width:9.5pt;height:9.5pt;z-index:251666432;visibility:visible;mso-wrap-style:square;mso-wrap-distance-left:9pt;mso-wrap-distance-top:0;mso-wrap-distance-right:9pt;mso-wrap-distance-bottom:0;mso-position-horizontal:absolute;mso-position-horizontal-relative:text;mso-position-vertical:absolute;mso-position-vertical-relative:text" o:gfxdata="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">
+              <v:shape w14:anchorId="00FF311E" id="Ink 14" o:spid="_x0000_s1026" type="#_x0000_t75" style="position:absolute;margin-left:233.5pt;margin-top:41.2pt;width:9.5pt;height:9.5pt;z-index:251666432;visibility:visible;mso-wrap-style:square;mso-wrap-distance-left:9pt;mso-wrap-distance-top:0;mso-wrap-distance-right:9pt;mso-wrap-distance-bottom:0;mso-position-horizontal:absolute;mso-position-horizontal-relative:text;mso-position-vertical:absolute;mso-position-vertical-relative:text" o:gfxdata="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">
                 <v:imagedata r:id="rId114" o:title=""/>
               </v:shape>
             </w:pict>
@@ -7018,12 +7055,8 @@
       </w:r>
     </w:p>
     <w:p>
-      <w:pPr>
-        <w:pStyle w:val="Heading2"/>
-      </w:pPr>
-    </w:p>
-    <w:p>
-      <w:r>
+      <w:r>
+        <w:lastRenderedPageBreak/>
         <w:t xml:space="preserve">After a simple login screen, </w:t>
       </w:r>
       <w:r>
@@ -7039,19 +7072,8 @@
         <w:t xml:space="preserve"> of user the user </w:t>
       </w:r>
       <w:r>
-        <w:rPr>
-          <w:color w:val="7F7F7F" w:themeColor="text1" w:themeTint="80"/>
-        </w:rPr>
-        <w:t>(forgive the repetition)</w:t>
-      </w:r>
-      <w:r>
-        <w:t xml:space="preserve"> </w:t>
-      </w:r>
-      <w:proofErr w:type="gramStart"/>
-      <w:r>
-        <w:t>actually will</w:t>
-      </w:r>
-      <w:proofErr w:type="gramEnd"/>
+        <w:t>will</w:t>
+      </w:r>
       <w:r>
         <w:t xml:space="preserve"> show a different dashboard:</w:t>
       </w:r>
@@ -7085,7 +7107,6 @@
         </w:rPr>
         <w:t xml:space="preserve">change </w:t>
       </w:r>
-      <w:proofErr w:type="gramStart"/>
       <w:r>
         <w:rPr>
           <w:u w:val="single"/>
@@ -7093,12 +7114,8 @@
         <w:t>password</w:t>
       </w:r>
       <w:r>
-        <w:t xml:space="preserve">  </w:t>
-      </w:r>
-      <w:r>
-        <w:t>(</w:t>
-      </w:r>
-      <w:proofErr w:type="gramEnd"/>
+        <w:t xml:space="preserve"> (</w:t>
+      </w:r>
       <w:r>
         <w:t>this option is available for every user i</w:t>
       </w:r>
@@ -7148,18 +7165,13 @@
         <w:t xml:space="preserve"> </w:t>
       </w:r>
       <w:r>
-        <w:t xml:space="preserve">whit specific </w:t>
-      </w:r>
-      <w:proofErr w:type="gramStart"/>
-      <w:r>
-        <w:t>handle</w:t>
-      </w:r>
-      <w:r>
-        <w:t>(</w:t>
-      </w:r>
-      <w:proofErr w:type="gramEnd"/>
-      <w:r>
-        <w:t xml:space="preserve">this option is available for every user il the left circle handle, </w:t>
+        <w:t>whit specific handle</w:t>
+      </w:r>
+      <w:r>
+        <w:t xml:space="preserve"> </w:t>
+      </w:r>
+      <w:r>
+        <w:t xml:space="preserve">(this option is available for every user il the left circle handle, </w:t>
       </w:r>
       <w:r>
         <w:rPr>
@@ -7180,15 +7192,7 @@
         </w:numPr>
       </w:pPr>
       <w:r>
-        <w:t xml:space="preserve">Is possible to </w:t>
-      </w:r>
-      <w:proofErr w:type="spellStart"/>
-      <w:r>
-        <w:t>chose</w:t>
-      </w:r>
-      <w:proofErr w:type="spellEnd"/>
-      <w:r>
-        <w:t xml:space="preserve"> what table manage, so only the order</w:t>
+        <w:t>Is possible to chose what table manage, so only the order</w:t>
       </w:r>
       <w:r>
         <w:t xml:space="preserve"> (to deliver)</w:t>
@@ -7263,15 +7267,7 @@
         </w:numPr>
       </w:pPr>
       <w:r>
-        <w:t xml:space="preserve">Is possible to go in a </w:t>
-      </w:r>
-      <w:proofErr w:type="gramStart"/>
-      <w:r>
-        <w:t>screen  dedicated</w:t>
-      </w:r>
-      <w:proofErr w:type="gramEnd"/>
-      <w:r>
-        <w:t xml:space="preserve"> to the menu, that show what product there are in that</w:t>
+        <w:t>Is possible to go in a screen dedicated to the menu, that show what product there are in that</w:t>
       </w:r>
     </w:p>
     <w:p>
@@ -7391,15 +7387,7 @@
         <w:t>urthermore</w:t>
       </w:r>
       <w:r>
-        <w:t xml:space="preserve"> a screen dedicated to </w:t>
-      </w:r>
-      <w:proofErr w:type="gramStart"/>
-      <w:r>
-        <w:t>configure</w:t>
-      </w:r>
-      <w:proofErr w:type="gramEnd"/>
-      <w:r>
-        <w:t xml:space="preserve"> DB</w:t>
+        <w:t xml:space="preserve"> a screen dedicated to configure DB</w:t>
       </w:r>
     </w:p>
     <w:p>
@@ -7411,12 +7399,12 @@
       <w:pPr>
         <w:pStyle w:val="Heading2"/>
       </w:pPr>
-      <w:bookmarkStart w:id="12" w:name="_Toc221377448"/>
+      <w:bookmarkStart w:id="11" w:name="_Toc221461384"/>
       <w:r>
         <w:lastRenderedPageBreak/>
         <w:t>Design:</w:t>
       </w:r>
-      <w:bookmarkEnd w:id="12"/>
+      <w:bookmarkEnd w:id="11"/>
     </w:p>
     <w:p>
       <w:r>
@@ -7433,11 +7421,11 @@
           <w:szCs w:val="24"/>
         </w:rPr>
       </w:pPr>
-      <w:bookmarkStart w:id="13" w:name="_Toc221377449"/>
+      <w:bookmarkStart w:id="12" w:name="_Toc221461385"/>
       <w:r>
         <w:t>Class diagram:</w:t>
       </w:r>
-      <w:bookmarkEnd w:id="13"/>
+      <w:bookmarkEnd w:id="12"/>
       <w:r>
         <w:rPr>
           <w:rFonts w:eastAsiaTheme="minorHAnsi" w:cstheme="minorBidi"/>
@@ -7476,14 +7464,32 @@
       </w:r>
     </w:p>
     <w:p>
+      <w:pPr>
+        <w:ind w:left="0"/>
+        <w:jc w:val="left"/>
+        <w:rPr>
+          <w:rFonts w:eastAsiaTheme="majorEastAsia" w:cstheme="majorBidi"/>
+          <w:i/>
+          <w:iCs/>
+          <w:color w:val="0F4761" w:themeColor="accent1" w:themeShade="BF"/>
+        </w:rPr>
+      </w:pPr>
       <w:r>
         <w:rPr>
           <w:noProof/>
         </w:rPr>
         <w:drawing>
-          <wp:inline distT="0" distB="0" distL="0" distR="0" wp14:anchorId="36B045BF" wp14:editId="61240F09">
+          <wp:anchor distT="0" distB="0" distL="114300" distR="114300" simplePos="0" relativeHeight="251801600" behindDoc="1" locked="0" layoutInCell="1" allowOverlap="1" wp14:anchorId="36B045BF" wp14:editId="3F21C4B0">
+            <wp:simplePos x="0" y="0"/>
+            <wp:positionH relativeFrom="column">
+              <wp:posOffset>-338692</wp:posOffset>
+            </wp:positionH>
+            <wp:positionV relativeFrom="paragraph">
+              <wp:posOffset>521778</wp:posOffset>
+            </wp:positionV>
             <wp:extent cx="6652260" cy="3522150"/>
             <wp:effectExtent l="0" t="0" r="0" b="2540"/>
+            <wp:wrapNone/>
             <wp:docPr id="2058774102" name="Graphic 1"/>
             <wp:cNvGraphicFramePr>
               <a:graphicFrameLocks xmlns:a="http://schemas.openxmlformats.org/drawingml/2006/main" noChangeAspect="1"/>
@@ -7510,7 +7516,7 @@
                   <pic:spPr>
                     <a:xfrm>
                       <a:off x="0" y="0"/>
-                      <a:ext cx="6662490" cy="3527567"/>
+                      <a:ext cx="6652260" cy="3522150"/>
                     </a:xfrm>
                     <a:prstGeom prst="rect">
                       <a:avLst/>
@@ -7519,17 +7525,25 @@
                 </pic:pic>
               </a:graphicData>
             </a:graphic>
-          </wp:inline>
+          </wp:anchor>
         </w:drawing>
       </w:r>
+      <w:r>
+        <w:br w:type="page"/>
+      </w:r>
+    </w:p>
+    <w:p>
+      <w:pPr>
+        <w:pStyle w:val="Heading4"/>
+      </w:pPr>
     </w:p>
     <w:p/>
+    <w:p/>
     <w:p>
       <w:pPr>
         <w:pStyle w:val="Heading4"/>
       </w:pPr>
       <w:r>
-        <w:lastRenderedPageBreak/>
         <w:t>Presentation Layer:</w:t>
       </w:r>
     </w:p>
@@ -8341,10 +8355,10 @@
           <w:noProof/>
         </w:rPr>
         <w:drawing>
-          <wp:anchor distT="0" distB="0" distL="114300" distR="114300" simplePos="0" relativeHeight="251795456" behindDoc="1" locked="0" layoutInCell="1" allowOverlap="1" wp14:anchorId="6943F3CF" wp14:editId="5B63225D">
+          <wp:anchor distT="0" distB="0" distL="114300" distR="114300" simplePos="0" relativeHeight="251795456" behindDoc="1" locked="0" layoutInCell="1" allowOverlap="1" wp14:anchorId="6943F3CF" wp14:editId="3ECFA46E">
             <wp:simplePos x="0" y="0"/>
             <wp:positionH relativeFrom="column">
-              <wp:posOffset>1367790</wp:posOffset>
+              <wp:posOffset>1814357</wp:posOffset>
             </wp:positionH>
             <wp:positionV relativeFrom="paragraph">
               <wp:posOffset>2058035</wp:posOffset>
@@ -8540,14 +8554,7 @@
       </w:r>
       <w:r>
         <w:tab/>
-      </w:r>
-      <w:proofErr w:type="spellStart"/>
-      <w:r>
-        <w:t>View.component</w:t>
-      </w:r>
-      <w:proofErr w:type="spellEnd"/>
-      <w:r>
-        <w:t>:</w:t>
+        <w:t>View.component:</w:t>
       </w:r>
     </w:p>
     <w:p>
@@ -8601,14 +8608,7 @@
       </w:r>
       <w:r>
         <w:tab/>
-      </w:r>
-      <w:proofErr w:type="spellStart"/>
-      <w:r>
-        <w:t>View.screens</w:t>
-      </w:r>
-      <w:proofErr w:type="spellEnd"/>
-      <w:r>
-        <w:t>:</w:t>
+        <w:t>View.screens:</w:t>
       </w:r>
     </w:p>
     <w:p>
@@ -8662,14 +8662,7 @@
       </w:r>
       <w:r>
         <w:tab/>
-      </w:r>
-      <w:proofErr w:type="spellStart"/>
-      <w:r>
-        <w:t>View.einkscreens</w:t>
-      </w:r>
-      <w:proofErr w:type="spellEnd"/>
-      <w:r>
-        <w:t>:</w:t>
+        <w:t>View.einkscreens:</w:t>
       </w:r>
     </w:p>
     <w:p>
@@ -8731,7 +8724,7 @@
       <w:pPr>
         <w:pStyle w:val="Heading3"/>
       </w:pPr>
-      <w:bookmarkStart w:id="14" w:name="_Toc221377450"/>
+      <w:bookmarkStart w:id="13" w:name="_Toc221461386"/>
       <w:r>
         <w:lastRenderedPageBreak/>
         <w:t>Design patterns</w:t>
@@ -8739,19 +8732,11 @@
       <w:r>
         <w:t>:</w:t>
       </w:r>
-      <w:bookmarkEnd w:id="14"/>
-    </w:p>
-    <w:p>
-      <w:r>
-        <w:t xml:space="preserve">In the context of the system, several design patterns have been adopted </w:t>
-      </w:r>
-      <w:proofErr w:type="gramStart"/>
-      <w:r>
-        <w:t>in order to</w:t>
-      </w:r>
-      <w:proofErr w:type="gramEnd"/>
-      <w:r>
-        <w:t xml:space="preserve"> improve modularity, maintainability, and separation of concerns.</w:t>
+      <w:bookmarkEnd w:id="13"/>
+    </w:p>
+    <w:p>
+      <w:r>
+        <w:t>In the context of the system, several design patterns have been adopted in order to improve modularity, maintainability, and separation of concerns.</w:t>
       </w:r>
     </w:p>
     <w:p>
@@ -8768,25 +8753,15 @@
       <w:r>
         <w:t xml:space="preserve"> pattern, whose main purpose is to guarantee the existence of a single shared instance of a specific object throughout the entire application lifecycle. This approach is used to maintain a consistent global state and to avoid incoherent </w:t>
       </w:r>
-      <w:proofErr w:type="spellStart"/>
-      <w:r>
-        <w:t>behaviors</w:t>
-      </w:r>
-      <w:proofErr w:type="spellEnd"/>
+      <w:r>
+        <w:t>behaviours</w:t>
+      </w:r>
       <w:r>
         <w:t xml:space="preserve"> caused by multiple instances managing the same responsibility.</w:t>
       </w:r>
       <w:r>
         <w:br/>
-        <w:t xml:space="preserve">In particular, the </w:t>
-      </w:r>
-      <w:proofErr w:type="spellStart"/>
-      <w:r>
-        <w:t>UserSession</w:t>
-      </w:r>
-      <w:proofErr w:type="spellEnd"/>
-      <w:r>
-        <w:t xml:space="preserve"> class implements the Singleton pattern to represent the currently authenticated user and its related runtime information. By doing so, all components that need access to the user context can retrieve it without explicitly passing it through constructors or method parameters. This design choice simplifies the interaction between layers and ensures that session-related data remains consistent during navigation across different application views.</w:t>
+        <w:t>In particular, the UserSession class implements the Singleton pattern to represent the currently authenticated user and its related runtime information. By doing so, all components that need access to the user context can retrieve it without explicitly passing it through constructors or method parameters. This design choice simplifies the interaction between layers and ensures that session-related data remains consistent during navigation across different application views.</w:t>
       </w:r>
     </w:p>
     <w:p>
@@ -8808,31 +8783,7 @@
       </w:r>
       <w:r>
         <w:br/>
-        <w:t xml:space="preserve">The </w:t>
-      </w:r>
-      <w:proofErr w:type="spellStart"/>
-      <w:r>
-        <w:t>UsersFactory</w:t>
-      </w:r>
-      <w:proofErr w:type="spellEnd"/>
-      <w:r>
-        <w:t xml:space="preserve"> class applies this pattern to centralize the creation of different User subclasses (</w:t>
-      </w:r>
-      <w:proofErr w:type="spellStart"/>
-      <w:r>
-        <w:t>ManagerUser</w:t>
-      </w:r>
-      <w:proofErr w:type="spellEnd"/>
-      <w:r>
-        <w:t xml:space="preserve">, WaiterUser, </w:t>
-      </w:r>
-      <w:proofErr w:type="spellStart"/>
-      <w:r>
-        <w:t>KitchenUser</w:t>
-      </w:r>
-      <w:proofErr w:type="spellEnd"/>
-      <w:r>
-        <w:t>) based on the role associated with a username. This solution improves extensibility, since introducing a new user role would require modifications only within the factory itself, without affecting the rest of the system.</w:t>
+        <w:t>The UsersFactory class applies this pattern to centralize the creation of different User subclasses (ManagerUser, WaiterUser, KitchenUser) based on the role associated with a username. This solution improves extensibility, since introducing a new user role would require modifications only within the factory itself, without affecting the rest of the system.</w:t>
       </w:r>
     </w:p>
     <w:p>
@@ -8847,71 +8798,7 @@
         <w:t>DAO (Data Access Object)</w:t>
       </w:r>
       <w:r>
-        <w:t xml:space="preserve"> pattern is widely used to separate persistence logic from business logic. Interfaces such as </w:t>
-      </w:r>
-      <w:proofErr w:type="spellStart"/>
-      <w:r>
-        <w:t>OrderDAO</w:t>
-      </w:r>
-      <w:proofErr w:type="spellEnd"/>
-      <w:r>
-        <w:t xml:space="preserve">, </w:t>
-      </w:r>
-      <w:proofErr w:type="spellStart"/>
-      <w:r>
-        <w:t>ProductDAO</w:t>
-      </w:r>
-      <w:proofErr w:type="spellEnd"/>
-      <w:r>
-        <w:t xml:space="preserve">, </w:t>
-      </w:r>
-      <w:proofErr w:type="spellStart"/>
-      <w:r>
-        <w:t>CategoryDAO</w:t>
-      </w:r>
-      <w:proofErr w:type="spellEnd"/>
-      <w:r>
-        <w:t xml:space="preserve">, and </w:t>
-      </w:r>
-      <w:proofErr w:type="spellStart"/>
-      <w:r>
-        <w:t>KitchenPreferencesDAO</w:t>
-      </w:r>
-      <w:proofErr w:type="spellEnd"/>
-      <w:r>
-        <w:t xml:space="preserve"> define a stable abstraction for data access, while concrete implementations (</w:t>
-      </w:r>
-      <w:proofErr w:type="spellStart"/>
-      <w:r>
-        <w:t>OrderDAOPostgres</w:t>
-      </w:r>
-      <w:proofErr w:type="spellEnd"/>
-      <w:r>
-        <w:t xml:space="preserve">, </w:t>
-      </w:r>
-      <w:proofErr w:type="spellStart"/>
-      <w:r>
-        <w:t>OrderDAOFile</w:t>
-      </w:r>
-      <w:proofErr w:type="spellEnd"/>
-      <w:r>
-        <w:t xml:space="preserve">, </w:t>
-      </w:r>
-      <w:proofErr w:type="spellStart"/>
-      <w:r>
-        <w:t>DatabaseProductDAO</w:t>
-      </w:r>
-      <w:proofErr w:type="spellEnd"/>
-      <w:r>
-        <w:t xml:space="preserve">, </w:t>
-      </w:r>
-      <w:proofErr w:type="spellStart"/>
-      <w:r>
-        <w:t>DatabaseCategoryDAO</w:t>
-      </w:r>
-      <w:proofErr w:type="spellEnd"/>
-      <w:r>
-        <w:t>, etc.) handle the actual persistence mechanism.</w:t>
+        <w:t xml:space="preserve"> pattern is widely used to separate persistence logic from business logic. Interfaces such as OrderDAO, ProductDAO, CategoryDAO, and KitchenPreferencesDAO define a stable abstraction for data access, while concrete implementations (OrderDAOPostgres, OrderDAOFile, DatabaseProductDAO, DatabaseCategoryDAO, etc.) handle the actual persistence mechanism.</w:t>
       </w:r>
       <w:r>
         <w:br/>
@@ -8930,23 +8817,7 @@
         <w:t>Dependency Injection by constructor</w:t>
       </w:r>
       <w:r>
-        <w:t xml:space="preserve">, particularly in service and controller classes such as </w:t>
-      </w:r>
-      <w:proofErr w:type="spellStart"/>
-      <w:r>
-        <w:t>MenuService</w:t>
-      </w:r>
-      <w:proofErr w:type="spellEnd"/>
-      <w:r>
-        <w:t xml:space="preserve"> and </w:t>
-      </w:r>
-      <w:proofErr w:type="spellStart"/>
-      <w:r>
-        <w:t>KitchenPreferencesController</w:t>
-      </w:r>
-      <w:proofErr w:type="spellEnd"/>
-      <w:r>
-        <w:t>. By receiving DAO interfaces rather than concrete implementations, these classes remain loosely coupled to the persistence layer and can be easily tested by injecting mock or alternative implementations.</w:t>
+        <w:t>, particularly in service and controller classes such as MenuService and KitchenPreferencesController. By receiving DAO interfaces rather than concrete implementations, these classes remain loosely coupled to the persistence layer and can be easily tested by injecting mock or alternative implementations.</w:t>
       </w:r>
     </w:p>
     <w:p>
@@ -8961,31 +8832,7 @@
         <w:t>Use Case Interfaces</w:t>
       </w:r>
       <w:r>
-        <w:t xml:space="preserve"> (for example </w:t>
-      </w:r>
-      <w:proofErr w:type="spellStart"/>
-      <w:r>
-        <w:t>OrderUseCase</w:t>
-      </w:r>
-      <w:proofErr w:type="spellEnd"/>
-      <w:r>
-        <w:t xml:space="preserve">, </w:t>
-      </w:r>
-      <w:proofErr w:type="spellStart"/>
-      <w:r>
-        <w:t>KitchenUseCase</w:t>
-      </w:r>
-      <w:proofErr w:type="spellEnd"/>
-      <w:r>
-        <w:t xml:space="preserve">, </w:t>
-      </w:r>
-      <w:proofErr w:type="spellStart"/>
-      <w:r>
-        <w:t>FinancialUseCase</w:t>
-      </w:r>
-      <w:proofErr w:type="spellEnd"/>
-      <w:r>
-        <w:t>) introduces a clear boundary between the application logic and the presentation layer. Controllers and services implement these interfaces to expose well-</w:t>
+        <w:t xml:space="preserve"> (for example OrderUseCase, KitchenUseCase, FinancialUseCase) introduces a clear boundary between the application logic and the presentation layer. Controllers and services implement these interfaces to expose well-</w:t>
       </w:r>
       <w:r>
         <w:lastRenderedPageBreak/>
@@ -9021,7 +8868,7 @@
           <w:szCs w:val="24"/>
         </w:rPr>
       </w:pPr>
-      <w:bookmarkStart w:id="15" w:name="_Toc221377451"/>
+      <w:bookmarkStart w:id="14" w:name="_Toc221461387"/>
       <w:r>
         <w:rPr>
           <w:noProof/>
@@ -9135,19 +8982,15 @@
                             <w:r>
                               <w:t>(</w:t>
                             </w:r>
-                            <w:proofErr w:type="gramStart"/>
                             <w:r>
-                              <w:t>furthermore</w:t>
+                              <w:t xml:space="preserve">furthermore, </w:t>
                             </w:r>
-                            <w:proofErr w:type="gramEnd"/>
                             <w:r>
-                              <w:t xml:space="preserve"> in the </w:t>
+                              <w:t xml:space="preserve">in the </w:t>
                             </w:r>
-                            <w:proofErr w:type="spellStart"/>
                             <w:r>
-                              <w:t>github</w:t>
+                              <w:t>GitHub</w:t>
                             </w:r>
-                            <w:proofErr w:type="spellEnd"/>
                             <w:r>
                               <w:t xml:space="preserve"> repo there ‘are all diagrams)</w:t>
                             </w:r>
@@ -9242,19 +9085,15 @@
                       <w:r>
                         <w:t>(</w:t>
                       </w:r>
-                      <w:proofErr w:type="gramStart"/>
                       <w:r>
-                        <w:t>furthermore</w:t>
+                        <w:t xml:space="preserve">furthermore, </w:t>
                       </w:r>
-                      <w:proofErr w:type="gramEnd"/>
                       <w:r>
-                        <w:t xml:space="preserve"> in the </w:t>
+                        <w:t xml:space="preserve">in the </w:t>
                       </w:r>
-                      <w:proofErr w:type="spellStart"/>
                       <w:r>
-                        <w:t>github</w:t>
+                        <w:t>GitHub</w:t>
                       </w:r>
-                      <w:proofErr w:type="spellEnd"/>
                       <w:r>
                         <w:t xml:space="preserve"> repo there ‘are all diagrams)</w:t>
                       </w:r>
@@ -9323,7 +9162,7 @@
       <w:r>
         <w:t>Activity diagram:</w:t>
       </w:r>
-      <w:bookmarkEnd w:id="15"/>
+      <w:bookmarkEnd w:id="14"/>
       <w:r>
         <w:rPr>
           <w:rFonts w:eastAsiaTheme="minorHAnsi" w:cstheme="minorBidi"/>
@@ -9427,7 +9266,7 @@
       <w:pPr>
         <w:pStyle w:val="Heading3"/>
       </w:pPr>
-      <w:bookmarkStart w:id="16" w:name="_Toc221377452"/>
+      <w:bookmarkStart w:id="15" w:name="_Toc221461388"/>
       <w:r>
         <w:lastRenderedPageBreak/>
         <w:t>Sequence</w:t>
@@ -9435,7 +9274,7 @@
       <w:r>
         <w:t xml:space="preserve"> diagram:</w:t>
       </w:r>
-      <w:bookmarkEnd w:id="16"/>
+      <w:bookmarkEnd w:id="15"/>
       <w:r>
         <w:t xml:space="preserve"> </w:t>
       </w:r>
@@ -9500,7 +9339,7 @@
       <w:pPr>
         <w:pStyle w:val="Heading3"/>
       </w:pPr>
-      <w:bookmarkStart w:id="17" w:name="_Toc221377453"/>
+      <w:bookmarkStart w:id="16" w:name="_Toc221461389"/>
       <w:r>
         <w:rPr>
           <w:noProof/>
@@ -9565,53 +9404,42 @@
       <w:r>
         <w:t>State diagram:</w:t>
       </w:r>
+      <w:bookmarkEnd w:id="16"/>
+    </w:p>
+    <w:p>
+      <w:pPr>
+        <w:ind w:right="4393"/>
+      </w:pPr>
+      <w:r>
+        <w:t xml:space="preserve">This diagram is attached near to this document to be able to have a closer look to it. </w:t>
+      </w:r>
+    </w:p>
+    <w:p>
+      <w:pPr>
+        <w:ind w:right="4393"/>
+      </w:pPr>
+      <w:r>
+        <w:t xml:space="preserve">The following state diagram </w:t>
+      </w:r>
+      <w:r>
+        <w:t>represents the lifecycle of the object order.</w:t>
+      </w:r>
+    </w:p>
+    <w:p>
+      <w:r>
+        <w:br w:type="page"/>
+      </w:r>
+    </w:p>
+    <w:p/>
+    <w:p>
+      <w:pPr>
+        <w:pStyle w:val="Heading2"/>
+      </w:pPr>
+      <w:bookmarkStart w:id="17" w:name="_Toc221461390"/>
+      <w:r>
+        <w:t>TESTING:</w:t>
+      </w:r>
       <w:bookmarkEnd w:id="17"/>
-    </w:p>
-    <w:p>
-      <w:pPr>
-        <w:ind w:right="4393"/>
-      </w:pPr>
-      <w:r>
-        <w:t xml:space="preserve">This diagram is attached near to this document to be able to have a closer look to it. </w:t>
-      </w:r>
-    </w:p>
-    <w:p>
-      <w:pPr>
-        <w:ind w:right="4393"/>
-      </w:pPr>
-      <w:r>
-        <w:t xml:space="preserve">The following state diagram </w:t>
-      </w:r>
-      <w:r>
-        <w:t>represents the lifecycle of the object order.</w:t>
-      </w:r>
-    </w:p>
-    <w:p>
-      <w:r>
-        <w:br w:type="page"/>
-      </w:r>
-    </w:p>
-    <w:p/>
-    <w:p>
-      <w:pPr>
-        <w:pStyle w:val="Heading3"/>
-      </w:pPr>
-      <w:r>
-        <w:rPr>
-          <w:noProof/>
-        </w:rPr>
-        <w:t xml:space="preserve"> </w:t>
-      </w:r>
-    </w:p>
-    <w:p>
-      <w:pPr>
-        <w:pStyle w:val="Heading2"/>
-      </w:pPr>
-      <w:bookmarkStart w:id="18" w:name="_Toc221377454"/>
-      <w:r>
-        <w:t>TESTING:</w:t>
-      </w:r>
-      <w:bookmarkEnd w:id="18"/>
     </w:p>
     <w:p>
       <w:r>
@@ -9630,31 +9458,7 @@
         <w:t>DBConfigControllerTest</w:t>
       </w:r>
       <w:r>
-        <w:t xml:space="preserve"> is responsible for testing the DBConfigController class. </w:t>
-      </w:r>
-      <w:proofErr w:type="gramStart"/>
-      <w:r>
-        <w:t>In particular, it</w:t>
-      </w:r>
-      <w:proofErr w:type="gramEnd"/>
-      <w:r>
-        <w:t xml:space="preserve"> verifies the correct loading of the current database configuration through </w:t>
-      </w:r>
-      <w:proofErr w:type="gramStart"/>
-      <w:r>
-        <w:t>loadConfig(</w:t>
-      </w:r>
-      <w:proofErr w:type="gramEnd"/>
-      <w:r>
-        <w:t xml:space="preserve">) and the behavior of </w:t>
-      </w:r>
-      <w:proofErr w:type="gramStart"/>
-      <w:r>
-        <w:t>saveConfig(</w:t>
-      </w:r>
-      <w:proofErr w:type="gramEnd"/>
-      <w:r>
-        <w:t>) under different conditions, such as invalid input, valid configuration saving, and reuse of an existing password when a new one is not provided.</w:t>
+        <w:t xml:space="preserve"> is responsible for testing the DBConfigController class. In particular, it verifies the correct loading of the current database configuration through loadConfig() and the behavior of saveConfig() under different conditions, such as invalid input, valid configuration saving, and reuse of an existing password when a new one is not provided.</w:t>
       </w:r>
     </w:p>
     <w:p>
@@ -9669,15 +9473,7 @@
         <w:t>UserAccountControllerTest</w:t>
       </w:r>
       <w:r>
-        <w:t xml:space="preserve"> focuses on the UserAccountController class. It tests the </w:t>
-      </w:r>
-      <w:proofErr w:type="gramStart"/>
-      <w:r>
-        <w:t>changePassword(</w:t>
-      </w:r>
-      <w:proofErr w:type="gramEnd"/>
-      <w:r>
-        <w:t>) method, checking that invalid passwords are rejected, that valid password changes are correctly delegated to the SecurityService, and that failures from the underlying service are properly propagated.</w:t>
+        <w:t xml:space="preserve"> focuses on the UserAccountController class. It tests the changePassword() method, checking that invalid passwords are rejected, that valid password changes are correctly delegated to the SecurityService, and that failures from the underlying service are properly propagated.</w:t>
       </w:r>
     </w:p>
     <w:p>
@@ -9692,31 +9488,7 @@
         <w:t>KitchenPreferencesControllerTest</w:t>
       </w:r>
       <w:r>
-        <w:t xml:space="preserve"> validates the KitchenPreferencesController. These tests ensure that the methods </w:t>
-      </w:r>
-      <w:proofErr w:type="gramStart"/>
-      <w:r>
-        <w:t>load(</w:t>
-      </w:r>
-      <w:proofErr w:type="gramEnd"/>
-      <w:r>
-        <w:t xml:space="preserve">), </w:t>
-      </w:r>
-      <w:proofErr w:type="gramStart"/>
-      <w:r>
-        <w:t>save(</w:t>
-      </w:r>
-      <w:proofErr w:type="gramEnd"/>
-      <w:r>
-        <w:t xml:space="preserve">), and </w:t>
-      </w:r>
-      <w:proofErr w:type="gramStart"/>
-      <w:r>
-        <w:t>reset(</w:t>
-      </w:r>
-      <w:proofErr w:type="gramEnd"/>
-      <w:r>
-        <w:t>) correctly delegate their operations to the corresponding KitchenPreferencesDAO, without introducing additional side effects.</w:t>
+        <w:t xml:space="preserve"> validates the KitchenPreferencesController. These tests ensure that the methods load(), save(), and reset() correctly delegate their operations to the corresponding KitchenPreferencesDAO, without introducing additional side effects.</w:t>
       </w:r>
     </w:p>
     <w:p>
@@ -9746,23 +9518,7 @@
         <w:t>DatabaseProductDAOTest</w:t>
       </w:r>
       <w:r>
-        <w:t xml:space="preserve"> is dedicated to the DatabaseProductDAO class. The tests cover the </w:t>
-      </w:r>
-      <w:proofErr w:type="gramStart"/>
-      <w:r>
-        <w:t>save(</w:t>
-      </w:r>
-      <w:proofErr w:type="gramEnd"/>
-      <w:r>
-        <w:t xml:space="preserve">) method for both new and existing products, ensuring that the correct database operation (addProduct or updateProduct) is invoked. Additionally, the </w:t>
-      </w:r>
-      <w:proofErr w:type="gramStart"/>
-      <w:r>
-        <w:t>delete(</w:t>
-      </w:r>
-      <w:proofErr w:type="gramEnd"/>
-      <w:r>
-        <w:t>) method is tested to confirm correct handling of null, invalid, and valid product identifiers.</w:t>
+        <w:t xml:space="preserve"> is dedicated to the DatabaseProductDAO class. The tests cover the save() method for both new and existing products, ensuring that the correct database operation (addProduct or updateProduct) is invoked. Additionally, the delete() method is tested to confirm correct handling of null, invalid, and valid product identifiers.</w:t>
       </w:r>
     </w:p>
     <w:p>
@@ -9782,16 +9538,16 @@
     </w:p>
     <w:p>
       <w:r>
+        <w:t xml:space="preserve">But as </w:t>
+      </w:r>
+      <w:r>
+        <w:t>required</w:t>
+      </w:r>
+      <w:r>
+        <w:t xml:space="preserve"> it’s also a tests for a complete use case, in particular it’s choised as for the diagram the creation of an order, so it was created a function to test </w:t>
+      </w:r>
+      <w:r>
         <w:lastRenderedPageBreak/>
-        <w:t xml:space="preserve">But as </w:t>
-      </w:r>
-      <w:r>
-        <w:t>required</w:t>
-      </w:r>
-      <w:r>
-        <w:t xml:space="preserve"> it’s also a tests for a complete use case, in particular it’s choised as for the diagram the creation of an order, so it was created a function to test </w:t>
-      </w:r>
-      <w:r>
         <w:t>TakeOrderController:</w:t>
       </w:r>
       <w:r>
@@ -9842,15 +9598,7 @@
         <w:t>ed</w:t>
       </w:r>
       <w:r>
-        <w:t xml:space="preserve"> on validating the order creation and order item handling logic. These tests verify that new orders are created only when valid input data is provided, that order items are correctly associated with the corresponding order, and that invalid scenarios (such as missing items or invalid table numbers) are properly handled. This ensures that the order-taking process is robust and that only consistent and complete orders </w:t>
-      </w:r>
-      <w:proofErr w:type="gramStart"/>
-      <w:r>
-        <w:t>are persisted</w:t>
-      </w:r>
-      <w:proofErr w:type="gramEnd"/>
-      <w:r>
-        <w:t xml:space="preserve"> and forwarded to the subsequent stages of the application workflow.</w:t>
+        <w:t xml:space="preserve"> on validating the order creation and order item handling logic. These tests verify that new orders are created only when valid input data is provided, that order items are correctly associated with the corresponding order, and that invalid scenarios (such as missing items or invalid table numbers) are properly handled. This ensures that the order-taking process is robust and that only consistent and complete orders are persisted and forwarded to the subsequent stages of the application workflow.</w:t>
       </w:r>
     </w:p>
     <w:p>
@@ -9858,15 +9606,7 @@
         <w:t xml:space="preserve">And the second </w:t>
       </w:r>
       <w:r>
-        <w:t xml:space="preserve">verify the correct behavior of the methods responsible for loading kitchen preferences and active orders, as well as updating the status of orders. </w:t>
-      </w:r>
-      <w:proofErr w:type="gramStart"/>
-      <w:r>
-        <w:t>In particular, these</w:t>
-      </w:r>
-      <w:proofErr w:type="gramEnd"/>
-      <w:r>
-        <w:t xml:space="preserve"> tests ensure that the controller correctly delegates operations to the underlying services, such as retrieving filtered or active kitchen orders, decomposing mixed-category orders when required, and updating order states (e.g., marking orders as ready). The goal of these tests is to guarantee that the kitchen workflow is managed consistently and that all operations affecting order preparation are correctly propagated to the data layer.</w:t>
+        <w:t>verify the correct behavior of the methods responsible for loading kitchen preferences and active orders, as well as updating the status of orders. In particular, these tests ensure that the controller correctly delegates operations to the underlying services, such as retrieving filtered or active kitchen orders, decomposing mixed-category orders when required, and updating order states (e.g., marking orders as ready). The goal of these tests is to guarantee that the kitchen workflow is managed consistently and that all operations affecting order preparation are correctly propagated to the data layer.</w:t>
       </w:r>
     </w:p>
     <w:p>
@@ -9878,16 +9618,11 @@
       <w:pPr>
         <w:pStyle w:val="Heading2"/>
       </w:pPr>
-    </w:p>
-    <w:p>
-      <w:pPr>
-        <w:pStyle w:val="Heading2"/>
-      </w:pPr>
-      <w:bookmarkStart w:id="19" w:name="_Toc221377455"/>
+      <w:bookmarkStart w:id="18" w:name="_Toc221461391"/>
       <w:r>
         <w:t>EXCEPTIONS:</w:t>
       </w:r>
-      <w:bookmarkEnd w:id="19"/>
+      <w:bookmarkEnd w:id="18"/>
     </w:p>
     <w:p>
       <w:r>
@@ -9901,15 +9636,7 @@
         <w:t>custom runtime exceptions</w:t>
       </w:r>
       <w:r>
-        <w:t xml:space="preserve"> combined with defensive programming techniques, </w:t>
-      </w:r>
-      <w:proofErr w:type="gramStart"/>
-      <w:r>
-        <w:t>in order to</w:t>
-      </w:r>
-      <w:proofErr w:type="gramEnd"/>
-      <w:r>
-        <w:t xml:space="preserve"> clearly represent abnormal application states while preserving overall system stability.</w:t>
+        <w:t xml:space="preserve"> combined with defensive programming techniques, in order to clearly represent abnormal application states while preserving overall system stability.</w:t>
       </w:r>
     </w:p>
     <w:p>
@@ -9959,7 +9686,6 @@
     </w:p>
     <w:p>
       <w:r>
-        <w:lastRenderedPageBreak/>
         <w:t xml:space="preserve">The </w:t>
       </w:r>
       <w:r>
@@ -9970,7 +9696,11 @@
         <w:t>InvalidUserSessionException</w:t>
       </w:r>
       <w:r>
-        <w:t xml:space="preserve"> is used to indicate an invalid, expired, or non-existent user session. It is thrown when session-dependent operations are invoked without a properly initialized session, enforcing correct session lifecycle management and preventing unauthorized access to protected functionalities.</w:t>
+        <w:t xml:space="preserve"> is used to indicate an invalid, expired, or non-existent user session. It is thrown when session-dependent operations are invoked </w:t>
+      </w:r>
+      <w:r>
+        <w:lastRenderedPageBreak/>
+        <w:t>without a properly initialized session, enforcing correct session lifecycle management and preventing unauthorized access to protected functionalities.</w:t>
       </w:r>
     </w:p>
     <w:p>
@@ -10003,16 +9733,10 @@
         <w:t>. In several controllers, services, and data access components, input parameters and application state are validated before performing critical operations. When an invalid condition or recoverable failure is detected, methods return safe values such as false, null</w:t>
       </w:r>
       <w:r>
-        <w:t xml:space="preserve"> (as Object Oriented </w:t>
-      </w:r>
-      <w:r>
-        <w:t>principles require</w:t>
-      </w:r>
-      <w:r>
-        <w:t>)</w:t>
-      </w:r>
-      <w:r>
-        <w:t xml:space="preserve"> or</w:t>
+        <w:t xml:space="preserve"> </w:t>
+      </w:r>
+      <w:r>
+        <w:t>or</w:t>
       </w:r>
       <w:r>
         <w:t xml:space="preserve"> in some case</w:t>
@@ -10051,31 +9775,31 @@
       <w:pPr>
         <w:pStyle w:val="Heading2"/>
       </w:pPr>
-      <w:bookmarkStart w:id="20" w:name="_Toc221377456"/>
+      <w:bookmarkStart w:id="19" w:name="_Toc221461392"/>
       <w:r>
         <w:t>DATA BASES:</w:t>
       </w:r>
+      <w:bookmarkEnd w:id="19"/>
+    </w:p>
+    <w:p>
+      <w:r>
+        <w:t>In the described system, data persistence is entirely managed through a relational database management system (RDBMS). During the development phase, the database is executed inside a Docker container, allowing a reproducible and isolated environment independent from the host operating system.</w:t>
+      </w:r>
+    </w:p>
+    <w:p>
+      <w:r>
+        <w:t>The application interacts with the database exclusively through the Data Access Object (DAO) pattern, ensuring a clear separation between business logic and data persistence logic.</w:t>
+      </w:r>
+    </w:p>
+    <w:p>
+      <w:pPr>
+        <w:pStyle w:val="Heading3"/>
+      </w:pPr>
+      <w:bookmarkStart w:id="20" w:name="_Toc221461393"/>
+      <w:r>
+        <w:t>RELATIONAL DATABASE (POSTGRESQL)</w:t>
+      </w:r>
       <w:bookmarkEnd w:id="20"/>
-    </w:p>
-    <w:p>
-      <w:r>
-        <w:t>In the described system, data persistence is entirely managed through a relational database management system (RDBMS). During the development phase, the database is executed inside a Docker container, allowing a reproducible and isolated environment independent from the host operating system.</w:t>
-      </w:r>
-    </w:p>
-    <w:p>
-      <w:r>
-        <w:t>The application interacts with the database exclusively through the Data Access Object (DAO) pattern, ensuring a clear separation between business logic and data persistence logic.</w:t>
-      </w:r>
-    </w:p>
-    <w:p>
-      <w:pPr>
-        <w:pStyle w:val="Heading3"/>
-      </w:pPr>
-      <w:bookmarkStart w:id="21" w:name="_Toc221377457"/>
-      <w:r>
-        <w:t>RELATIONAL DATABASE (POSTGRESQL)</w:t>
-      </w:r>
-      <w:bookmarkEnd w:id="21"/>
     </w:p>
     <w:p>
       <w:r>
@@ -10093,19 +9817,19 @@
     </w:p>
     <w:p>
       <w:r>
+        <w:t>Connection parameters (URL, username, and password) are provided at runtime and injected into DAO implementations, allowing flexible configuration and easy adaptation to different environments (development, testing, production).</w:t>
+      </w:r>
+    </w:p>
+    <w:p>
+      <w:pPr>
+        <w:pStyle w:val="Heading3"/>
+      </w:pPr>
+      <w:bookmarkStart w:id="21" w:name="_Toc221461394"/>
+      <w:r>
         <w:lastRenderedPageBreak/>
-        <w:t>Connection parameters (URL, username, and password) are provided at runtime and injected into DAO implementations, allowing flexible configuration and easy adaptation to different environments (development, testing, production).</w:t>
-      </w:r>
-    </w:p>
-    <w:p>
-      <w:pPr>
-        <w:pStyle w:val="Heading3"/>
-      </w:pPr>
-      <w:bookmarkStart w:id="22" w:name="_Toc221377458"/>
-      <w:r>
         <w:t>DATA ACCESS OBJECT (DAO) LAYER</w:t>
       </w:r>
-      <w:bookmarkEnd w:id="22"/>
+      <w:bookmarkEnd w:id="21"/>
     </w:p>
     <w:p>
       <w:r>
@@ -10213,11 +9937,11 @@
       <w:pPr>
         <w:pStyle w:val="Heading3"/>
       </w:pPr>
-      <w:bookmarkStart w:id="23" w:name="_Toc221377459"/>
+      <w:bookmarkStart w:id="22" w:name="_Toc221461395"/>
       <w:r>
         <w:t>DOCKER-BASED DEVELOPMENT ENVIRONMENT</w:t>
       </w:r>
-      <w:bookmarkEnd w:id="23"/>
+      <w:bookmarkEnd w:id="22"/>
     </w:p>
     <w:p>
       <w:r>
@@ -10241,9 +9965,13 @@
           <w:ilvl w:val="0"/>
           <w:numId w:val="15"/>
         </w:numPr>
-      </w:pPr>
-      <w:r>
-        <w:t>environnement isolation,</w:t>
+        <w:ind w:hanging="11"/>
+      </w:pPr>
+      <w:r>
+        <w:t>environment</w:t>
+      </w:r>
+      <w:r>
+        <w:t xml:space="preserve"> isolation,</w:t>
       </w:r>
     </w:p>
     <w:p>
@@ -10253,6 +9981,7 @@
           <w:ilvl w:val="0"/>
           <w:numId w:val="15"/>
         </w:numPr>
+        <w:ind w:hanging="11"/>
       </w:pPr>
       <w:r>
         <w:t>reproducibility of the database setup,</w:t>
@@ -10265,6 +9994,7 @@
           <w:ilvl w:val="0"/>
           <w:numId w:val="15"/>
         </w:numPr>
+        <w:ind w:hanging="11"/>
       </w:pPr>
       <w:r>
         <w:t>simplified configuration for testing and deployment.</w:t>
@@ -10279,11 +10009,11 @@
       <w:pPr>
         <w:pStyle w:val="Heading3"/>
       </w:pPr>
-      <w:bookmarkStart w:id="24" w:name="_Toc221377460"/>
+      <w:bookmarkStart w:id="23" w:name="_Toc221461396"/>
       <w:r>
         <w:t>FILE SYSTEM–BASED DAO IMPLEMENTATION</w:t>
       </w:r>
-      <w:bookmarkEnd w:id="24"/>
+      <w:bookmarkEnd w:id="23"/>
     </w:p>
     <w:p>
       <w:r>
@@ -10302,7 +10032,6 @@
     </w:p>
     <w:p>
       <w:r>
-        <w:lastRenderedPageBreak/>
         <w:t xml:space="preserve">This alternative implementation is represented by the class </w:t>
       </w:r>
       <w:r>
@@ -10313,7 +10042,11 @@
         <w:t>OrderDAOFile</w:t>
       </w:r>
       <w:r>
-        <w:t>, which implements the same OrderDAO interface used by the PostgreSQL-based DAO. The purpose of this implementation is to demonstrate the flexibility of the DAO pattern and to allow data persistence without relying on a DBMS, for example in simplified scenarios, testing contexts, or environments where a database server is not available.</w:t>
+        <w:t xml:space="preserve">, which implements the same OrderDAO interface used by the PostgreSQL-based DAO. The purpose of this implementation is to demonstrate the flexibility of the DAO pattern and </w:t>
+      </w:r>
+      <w:r>
+        <w:lastRenderedPageBreak/>
+        <w:t>to allow data persistence without relying on a DBMS, for example in simplified scenarios, testing contexts, or environments where a database server is not available.</w:t>
       </w:r>
     </w:p>
     <w:p>
@@ -10355,13 +10088,8 @@
         <w:ind w:left="1276" w:hanging="578"/>
       </w:pPr>
       <w:r>
-        <w:t>a main file (orders.csv) containing the core information of each order (identifier, date and time, table number, user, notes, and status</w:t>
-      </w:r>
-      <w:proofErr w:type="gramStart"/>
-      <w:r>
-        <w:t>);</w:t>
-      </w:r>
-      <w:proofErr w:type="gramEnd"/>
+        <w:t>a main file (orders.csv) containing the core information of each order (identifier, date and time, table number, user, notes, and status);</w:t>
+      </w:r>
     </w:p>
     <w:p>
       <w:pPr>
@@ -10404,11 +10132,9 @@
       <w:r>
         <w:t xml:space="preserve"> </w:t>
       </w:r>
-      <w:proofErr w:type="gramStart"/>
-      <w:r>
-        <w:t>highlights</w:t>
-      </w:r>
-      <w:proofErr w:type="gramEnd"/>
+      <w:r>
+        <w:t>highlight</w:t>
+      </w:r>
       <w:r>
         <w:t xml:space="preserve"> the effectiveness of the DAO abstraction, allowing the persistence mechanism to be replaced transparently without affecting the rest of the application.</w:t>
       </w:r>
@@ -10422,12 +10148,12 @@
       <w:pPr>
         <w:pStyle w:val="Heading2"/>
       </w:pPr>
-      <w:bookmarkStart w:id="25" w:name="_Toc221377461"/>
+      <w:bookmarkStart w:id="24" w:name="_Toc221461397"/>
       <w:r>
         <w:lastRenderedPageBreak/>
         <w:t>SONAR CLOUD</w:t>
       </w:r>
-      <w:bookmarkEnd w:id="25"/>
+      <w:bookmarkEnd w:id="24"/>
     </w:p>
     <w:p>
       <w:r>
@@ -10454,11 +10180,9 @@
       <w:r>
         <w:t xml:space="preserve">(is possible to see that every </w:t>
       </w:r>
-      <w:proofErr w:type="gramStart"/>
-      <w:r>
-        <w:t>parameters</w:t>
-      </w:r>
-      <w:proofErr w:type="gramEnd"/>
+      <w:r>
+        <w:t>parameter</w:t>
+      </w:r>
       <w:r>
         <w:t xml:space="preserve"> is “green” </w:t>
       </w:r>
@@ -10474,23 +10198,15 @@
       <w:pPr>
         <w:pStyle w:val="Heading2"/>
       </w:pPr>
-      <w:bookmarkStart w:id="26" w:name="_Toc221377462"/>
+      <w:bookmarkStart w:id="25" w:name="_Toc221461398"/>
       <w:r>
         <w:t>DEMOSTRATION</w:t>
       </w:r>
-      <w:bookmarkEnd w:id="26"/>
-    </w:p>
-    <w:p>
-      <w:r>
-        <w:t xml:space="preserve">you can finally see that the program </w:t>
-      </w:r>
-      <w:proofErr w:type="gramStart"/>
-      <w:r>
-        <w:t>actually works</w:t>
-      </w:r>
-      <w:proofErr w:type="gramEnd"/>
-      <w:r>
-        <w:t xml:space="preserve"> through this demonstration</w:t>
+      <w:bookmarkEnd w:id="25"/>
+    </w:p>
+    <w:p>
+      <w:r>
+        <w:t>The system behaviour is demonstrated in the following video</w:t>
       </w:r>
       <w:r>
         <w:t>:</w:t>
@@ -10512,11 +10228,11 @@
       <w:pPr>
         <w:pStyle w:val="Heading2"/>
       </w:pPr>
-      <w:bookmarkStart w:id="27" w:name="_Toc221377463"/>
+      <w:bookmarkStart w:id="26" w:name="_Toc221461399"/>
       <w:r>
         <w:t>DOWNLOAD SOURCE CODE</w:t>
       </w:r>
-      <w:bookmarkEnd w:id="27"/>
+      <w:bookmarkEnd w:id="26"/>
     </w:p>
     <w:p>
       <w:r>
@@ -11785,7 +11501,7 @@
       <w:lvlText w:val="-%1:"/>
       <w:lvlJc w:val="left"/>
       <w:pPr>
-        <w:ind w:left="360" w:hanging="360"/>
+        <w:ind w:left="502" w:hanging="360"/>
       </w:pPr>
       <w:rPr>
         <w:rFonts w:ascii="Abadi ExtraLight" w:hAnsi="Abadi ExtraLight" w:hint="default"/>
@@ -11801,7 +11517,7 @@
       <w:lvlText w:val="%2)"/>
       <w:lvlJc w:val="left"/>
       <w:pPr>
-        <w:ind w:left="720" w:hanging="360"/>
+        <w:ind w:left="862" w:hanging="360"/>
       </w:pPr>
     </w:lvl>
     <w:lvl w:ilvl="2">
@@ -11810,7 +11526,7 @@
       <w:lvlText w:val="%3)"/>
       <w:lvlJc w:val="left"/>
       <w:pPr>
-        <w:ind w:left="1080" w:hanging="360"/>
+        <w:ind w:left="1222" w:hanging="360"/>
       </w:pPr>
     </w:lvl>
     <w:lvl w:ilvl="3">
@@ -11819,7 +11535,7 @@
       <w:lvlText w:val="(%4)"/>
       <w:lvlJc w:val="left"/>
       <w:pPr>
-        <w:ind w:left="1440" w:hanging="360"/>
+        <w:ind w:left="1582" w:hanging="360"/>
       </w:pPr>
     </w:lvl>
     <w:lvl w:ilvl="4">
@@ -11828,7 +11544,7 @@
       <w:lvlText w:val="(%5)"/>
       <w:lvlJc w:val="left"/>
       <w:pPr>
-        <w:ind w:left="1800" w:hanging="360"/>
+        <w:ind w:left="1942" w:hanging="360"/>
       </w:pPr>
     </w:lvl>
     <w:lvl w:ilvl="5">
@@ -11837,7 +11553,7 @@
       <w:lvlText w:val="(%6)"/>
       <w:lvlJc w:val="left"/>
       <w:pPr>
-        <w:ind w:left="2160" w:hanging="360"/>
+        <w:ind w:left="2302" w:hanging="360"/>
       </w:pPr>
     </w:lvl>
     <w:lvl w:ilvl="6">
@@ -11846,7 +11562,7 @@
       <w:lvlText w:val="%7."/>
       <w:lvlJc w:val="left"/>
       <w:pPr>
-        <w:ind w:left="2520" w:hanging="360"/>
+        <w:ind w:left="2662" w:hanging="360"/>
       </w:pPr>
     </w:lvl>
     <w:lvl w:ilvl="7">
@@ -11855,7 +11571,7 @@
       <w:lvlText w:val="%8."/>
       <w:lvlJc w:val="left"/>
       <w:pPr>
-        <w:ind w:left="2880" w:hanging="360"/>
+        <w:ind w:left="3022" w:hanging="360"/>
       </w:pPr>
     </w:lvl>
     <w:lvl w:ilvl="8">
@@ -11864,7 +11580,7 @@
       <w:lvlText w:val="%9."/>
       <w:lvlJc w:val="left"/>
       <w:pPr>
-        <w:ind w:left="3240" w:hanging="360"/>
+        <w:ind w:left="3382" w:hanging="360"/>
       </w:pPr>
     </w:lvl>
   </w:abstractNum>
@@ -13267,7 +12983,6 @@
   <w:style w:type="character" w:default="1" w:styleId="DefaultParagraphFont">
     <w:name w:val="Default Paragraph Font"/>
     <w:uiPriority w:val="1"/>
-    <w:semiHidden/>
     <w:unhideWhenUsed/>
   </w:style>
   <w:style w:type="table" w:default="1" w:styleId="TableNormal">

</xml_diff>

<commit_message>
minor update + add diagrams
</commit_message>
<xml_diff>
--- a/documentation.docx
+++ b/documentation.docx
@@ -1018,7 +1018,7 @@
               </mc:Choice>
               <mc:Fallback>
                 <w:pict>
-                  <v:group w14:anchorId="04604F2E" id="Gruppo 2" o:spid="_x0000_s1026" style="position:absolute;margin-left:131.25pt;margin-top:197.85pt;width:468.75pt;height:531.15pt;z-index:-251656192;mso-position-horizontal-relative:page;mso-position-vertical-relative:page" coordsize="43291,44910" o:gfxdata="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">
+                  <v:group w14:anchorId="139B1555" id="Gruppo 2" o:spid="_x0000_s1026" style="position:absolute;margin-left:131.25pt;margin-top:197.85pt;width:468.75pt;height:531.15pt;z-index:-251656192;mso-position-horizontal-relative:page;mso-position-vertical-relative:page" coordsize="43291,44910" o:gfxdata="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">
                     <o:lock v:ext="edit" aspectratio="t"/>
                     <v:shape id="Figura a mano libera 64" o:spid="_x0000_s1027" style="position:absolute;left:15017;width:28274;height:28352;visibility:visible;mso-wrap-style:square;v-text-anchor:top" coordsize="1781,1786" o:gfxdata="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" path="m4,1786l,1782,1776,r5,5l4,1786xe" filled="f" stroked="f">
                       <v:path arrowok="t" o:connecttype="custom" o:connectlocs="6350,2835275;0,2828925;2819400,0;2827338,7938;6350,2835275" o:connectangles="0,0,0,0,0"/>
@@ -3007,23 +3007,253 @@
       <w:bookmarkEnd w:id="1"/>
     </w:p>
     <w:p>
-      <w:r>
-        <w:t>This document describes the requirements and architecture of the Restaurant Manager system</w:t>
-      </w:r>
-      <w:r>
-        <w:t>;</w:t>
-      </w:r>
-      <w:r>
-        <w:t xml:space="preserve"> </w:t>
-      </w:r>
-      <w:r>
-        <w:t xml:space="preserve">This </w:t>
-      </w:r>
-      <w:r>
-        <w:t>paper</w:t>
-      </w:r>
-      <w:r>
-        <w:t xml:space="preserve"> presents a review of the main internal and external aspects of the system, supported by illustrative diagrams.</w:t>
+      <w:pPr>
+        <w:rPr>
+          <w:rFonts w:hint="cs"/>
+        </w:rPr>
+      </w:pPr>
+      <w:r>
+        <w:rPr>
+          <w:rFonts w:hint="cs"/>
+        </w:rPr>
+        <w:t>The purpose of this document is to provide a comprehensive and formal description of the software requirements, architectural design, and implementation choices adopted in the development of Restaurant Manager, an application for restaurant operations management;</w:t>
+      </w:r>
+    </w:p>
+    <w:p>
+      <w:pPr>
+        <w:rPr>
+          <w:rFonts w:hint="cs"/>
+        </w:rPr>
+      </w:pPr>
+      <w:r>
+        <w:rPr>
+          <w:rFonts w:hint="cs"/>
+        </w:rPr>
+        <w:t>The document covers the functional specification, use case analysis, design diagrams, testing strategy, exception handling model, and database architecture of the system, serving as the primary technical reference for evaluation and future maintenance.</w:t>
+      </w:r>
+    </w:p>
+    <w:p>
+      <w:pPr>
+        <w:pStyle w:val="Heading3"/>
+      </w:pPr>
+      <w:bookmarkStart w:id="2" w:name="_Toc221461375"/>
+      <w:r>
+        <w:t>OVERVIEW</w:t>
+      </w:r>
+      <w:r>
+        <w:t xml:space="preserve"> OF THE DEFINED SYSTEM</w:t>
+      </w:r>
+      <w:bookmarkEnd w:id="2"/>
+    </w:p>
+    <w:p>
+      <w:r>
+        <w:t xml:space="preserve">Restaurant Manager is a multi-role desktop application designed to coordinate and synchronize the operational workflow of a restaurant environment, supporting the following user roles: </w:t>
+      </w:r>
+      <w:r>
+        <w:rPr>
+          <w:b/>
+          <w:bCs/>
+        </w:rPr>
+        <w:t>Manager</w:t>
+      </w:r>
+      <w:r>
+        <w:t xml:space="preserve">, </w:t>
+      </w:r>
+      <w:r>
+        <w:rPr>
+          <w:b/>
+          <w:bCs/>
+        </w:rPr>
+        <w:t>Waiter</w:t>
+      </w:r>
+      <w:r>
+        <w:t xml:space="preserve">, </w:t>
+      </w:r>
+      <w:r>
+        <w:rPr>
+          <w:b/>
+          <w:bCs/>
+        </w:rPr>
+        <w:t>Kitchen Staff</w:t>
+      </w:r>
+      <w:r>
+        <w:t xml:space="preserve">, and </w:t>
+      </w:r>
+      <w:r>
+        <w:rPr>
+          <w:b/>
+          <w:bCs/>
+        </w:rPr>
+        <w:t>Cashier</w:t>
+      </w:r>
+      <w:r>
+        <w:t>.</w:t>
+      </w:r>
+    </w:p>
+    <w:p>
+      <w:r>
+        <w:t>The system provides two distinct entry points:</w:t>
+      </w:r>
+    </w:p>
+    <w:p>
+      <w:pPr>
+        <w:numPr>
+          <w:ilvl w:val="0"/>
+          <w:numId w:val="17"/>
+        </w:numPr>
+        <w:tabs>
+          <w:tab w:val="num" w:pos="720"/>
+        </w:tabs>
+      </w:pPr>
+      <w:r>
+        <w:t xml:space="preserve">A </w:t>
+      </w:r>
+      <w:r>
+        <w:rPr>
+          <w:b/>
+          <w:bCs/>
+        </w:rPr>
+        <w:t>Graphical User Interface (GUI)</w:t>
+      </w:r>
+      <w:r>
+        <w:t>, implemented in JavaFX, accessible to all roles and presenting role-specific dashboards upon authentication.</w:t>
+      </w:r>
+    </w:p>
+    <w:p>
+      <w:pPr>
+        <w:numPr>
+          <w:ilvl w:val="0"/>
+          <w:numId w:val="17"/>
+        </w:numPr>
+        <w:tabs>
+          <w:tab w:val="num" w:pos="720"/>
+        </w:tabs>
+      </w:pPr>
+      <w:r>
+        <w:t xml:space="preserve">A </w:t>
+      </w:r>
+      <w:r>
+        <w:rPr>
+          <w:b/>
+          <w:bCs/>
+        </w:rPr>
+        <w:t>Command-Line Interface (CLI)</w:t>
+      </w:r>
+      <w:r>
+        <w:t xml:space="preserve"> (CliApp), reserved exclusively for the Manager role, enabling menu management and financial reporting operations without launching the graphical environment.</w:t>
+      </w:r>
+    </w:p>
+    <w:p>
+      <w:r>
+        <w:t xml:space="preserve">From a technical standpoint, the application is engineered in </w:t>
+      </w:r>
+      <w:r>
+        <w:rPr>
+          <w:b/>
+          <w:bCs/>
+        </w:rPr>
+        <w:t>Java 21</w:t>
+      </w:r>
+      <w:r>
+        <w:t xml:space="preserve"> following a layered architectural model that enforces a strict separation of concerns across five distinct layers: Presentation, Business, Data Access, Domain</w:t>
+      </w:r>
+      <w:r>
+        <w:t>.</w:t>
+      </w:r>
+    </w:p>
+    <w:p>
+      <w:r>
+        <w:t>The system supports the following core functionalities:</w:t>
+      </w:r>
+    </w:p>
+    <w:p>
+      <w:pPr>
+        <w:numPr>
+          <w:ilvl w:val="0"/>
+          <w:numId w:val="18"/>
+        </w:numPr>
+      </w:pPr>
+      <w:r>
+        <w:rPr>
+          <w:b/>
+          <w:bCs/>
+        </w:rPr>
+        <w:t>User Management:</w:t>
+      </w:r>
+      <w:r>
+        <w:t xml:space="preserve"> role-based authentication with support for password change.</w:t>
+      </w:r>
+    </w:p>
+    <w:p>
+      <w:pPr>
+        <w:numPr>
+          <w:ilvl w:val="0"/>
+          <w:numId w:val="18"/>
+        </w:numPr>
+      </w:pPr>
+      <w:r>
+        <w:rPr>
+          <w:b/>
+          <w:bCs/>
+        </w:rPr>
+        <w:t>Order Management:</w:t>
+      </w:r>
+      <w:r>
+        <w:t xml:space="preserve"> creation, customization, real-time state tracking, and cancellation of orders.</w:t>
+      </w:r>
+    </w:p>
+    <w:p>
+      <w:pPr>
+        <w:numPr>
+          <w:ilvl w:val="0"/>
+          <w:numId w:val="18"/>
+        </w:numPr>
+      </w:pPr>
+      <w:r>
+        <w:rPr>
+          <w:b/>
+          <w:bCs/>
+        </w:rPr>
+        <w:t>Menu Management:</w:t>
+      </w:r>
+      <w:r>
+        <w:t xml:space="preserve"> addition, modification, and deletion of menu items with cost tracking.</w:t>
+      </w:r>
+    </w:p>
+    <w:p>
+      <w:pPr>
+        <w:numPr>
+          <w:ilvl w:val="0"/>
+          <w:numId w:val="18"/>
+        </w:numPr>
+      </w:pPr>
+      <w:r>
+        <w:rPr>
+          <w:b/>
+          <w:bCs/>
+        </w:rPr>
+        <w:t>Financial Reporting:</w:t>
+      </w:r>
+      <w:r>
+        <w:t xml:space="preserve"> historical order consultation with filtering and aggregated data display.</w:t>
+      </w:r>
+    </w:p>
+    <w:p>
+      <w:pPr>
+        <w:numPr>
+          <w:ilvl w:val="0"/>
+          <w:numId w:val="18"/>
+        </w:numPr>
+      </w:pPr>
+      <w:r>
+        <w:rPr>
+          <w:b/>
+          <w:bCs/>
+        </w:rPr>
+        <w:t>Persistence Flexibility:</w:t>
+      </w:r>
+      <w:r>
+        <w:t xml:space="preserve"> switchable persistence layer supporting both a relational database (PostgreSQL) and a file system–based implementation, selectable transparently via the DAO abstraction.</w:t>
       </w:r>
     </w:p>
     <w:p/>
@@ -3032,309 +3262,2120 @@
       <w:pPr>
         <w:pStyle w:val="Heading3"/>
       </w:pPr>
-      <w:bookmarkStart w:id="2" w:name="_Toc221461375"/>
-      <w:r>
-        <w:t>OVERVIEW</w:t>
-      </w:r>
-      <w:r>
-        <w:t xml:space="preserve"> OF THE DEFINED SYSTEM</w:t>
-      </w:r>
-      <w:bookmarkEnd w:id="2"/>
-    </w:p>
-    <w:p>
-      <w:r>
-        <w:t xml:space="preserve">this product </w:t>
-      </w:r>
-      <w:r>
-        <w:t>provides</w:t>
-      </w:r>
-      <w:r>
-        <w:t xml:space="preserve"> the instruments to manage a small activity, </w:t>
-      </w:r>
-      <w:r>
-        <w:t>operating in the restaurant domain</w:t>
-      </w:r>
-      <w:r>
-        <w:t>.</w:t>
-      </w:r>
-    </w:p>
-    <w:p>
-      <w:r>
-        <w:t xml:space="preserve">It </w:t>
-      </w:r>
-      <w:r>
-        <w:t>offers</w:t>
-      </w:r>
-      <w:r>
-        <w:t xml:space="preserve"> some tool to </w:t>
-      </w:r>
-      <w:r>
-        <w:t>synchronize</w:t>
-      </w:r>
-      <w:r>
-        <w:t xml:space="preserve"> in real time the order</w:t>
-      </w:r>
-      <w:r>
-        <w:t>,</w:t>
-      </w:r>
-      <w:r>
-        <w:t xml:space="preserve"> between the "the hall", the kitchen and the cash desk, but also the management, in fact the system also keep</w:t>
-      </w:r>
-      <w:r>
-        <w:t>s</w:t>
-      </w:r>
-      <w:r>
-        <w:t xml:space="preserve"> track </w:t>
-      </w:r>
-      <w:r>
-        <w:t>of orders, what they contain and, how it cost at the moment of order</w:t>
-      </w:r>
-      <w:r>
-        <w:t>.</w:t>
-      </w:r>
-      <w:r>
-        <w:t xml:space="preserve"> </w:t>
+      <w:bookmarkStart w:id="3" w:name="_Toc221461376"/>
+      <w:r>
+        <w:t>HARDWARE AND SOFTWARE REQUIREMENTS</w:t>
+      </w:r>
+      <w:bookmarkEnd w:id="3"/>
+    </w:p>
+    <w:p>
+      <w:pPr>
+        <w:rPr>
+          <w:b/>
+          <w:bCs/>
+          <w:lang w:val="it-IT"/>
+        </w:rPr>
+      </w:pPr>
+      <w:r>
+        <w:rPr>
+          <w:b/>
+          <w:bCs/>
+          <w:lang w:val="it-IT"/>
+        </w:rPr>
+        <w:t>Software Requirements</w:t>
+      </w:r>
+    </w:p>
+    <w:tbl>
+      <w:tblPr>
+        <w:tblW w:w="8221" w:type="dxa"/>
+        <w:tblCellSpacing w:w="15" w:type="dxa"/>
+        <w:tblInd w:w="846" w:type="dxa"/>
+        <w:tblBorders>
+          <w:top w:val="single" w:sz="4" w:space="0" w:color="auto"/>
+          <w:left w:val="single" w:sz="4" w:space="0" w:color="auto"/>
+          <w:bottom w:val="single" w:sz="4" w:space="0" w:color="auto"/>
+          <w:right w:val="single" w:sz="4" w:space="0" w:color="auto"/>
+          <w:insideH w:val="triple" w:sz="4" w:space="0" w:color="E97132" w:themeColor="accent2"/>
+          <w:insideV w:val="triple" w:sz="4" w:space="0" w:color="E97132" w:themeColor="accent2"/>
+        </w:tblBorders>
+        <w:tblCellMar>
+          <w:top w:w="15" w:type="dxa"/>
+          <w:left w:w="15" w:type="dxa"/>
+          <w:bottom w:w="15" w:type="dxa"/>
+          <w:right w:w="15" w:type="dxa"/>
+        </w:tblCellMar>
+        <w:tblLook w:val="04A0" w:firstRow="1" w:lastRow="0" w:firstColumn="1" w:lastColumn="0" w:noHBand="0" w:noVBand="1"/>
+      </w:tblPr>
+      <w:tblGrid>
+        <w:gridCol w:w="3285"/>
+        <w:gridCol w:w="4936"/>
+      </w:tblGrid>
+      <w:tr>
+        <w:trPr>
+          <w:tblHeader/>
+          <w:tblCellSpacing w:w="15" w:type="dxa"/>
+        </w:trPr>
+        <w:tc>
+          <w:tcPr>
+            <w:tcW w:w="0" w:type="auto"/>
+            <w:tcBorders>
+              <w:top w:val="thinThickLargeGap" w:sz="24" w:space="0" w:color="83CAEB" w:themeColor="accent1" w:themeTint="66"/>
+              <w:bottom w:val="thinThickLargeGap" w:sz="24" w:space="0" w:color="83CAEB" w:themeColor="accent1" w:themeTint="66"/>
+              <w:right w:val="thinThickLargeGap" w:sz="24" w:space="0" w:color="83CAEB" w:themeColor="accent1" w:themeTint="66"/>
+            </w:tcBorders>
+            <w:vAlign w:val="center"/>
+            <w:hideMark/>
+          </w:tcPr>
+          <w:p>
+            <w:pPr>
+              <w:rPr>
+                <w:b/>
+                <w:bCs/>
+                <w:lang w:val="it-IT"/>
+              </w:rPr>
+            </w:pPr>
+            <w:r>
+              <w:rPr>
+                <w:b/>
+                <w:bCs/>
+                <w:lang w:val="it-IT"/>
+              </w:rPr>
+              <w:t>Component</w:t>
+            </w:r>
+          </w:p>
+        </w:tc>
+        <w:tc>
+          <w:tcPr>
+            <w:tcW w:w="4891" w:type="dxa"/>
+            <w:tcBorders>
+              <w:top w:val="thinThickLargeGap" w:sz="24" w:space="0" w:color="83CAEB" w:themeColor="accent1" w:themeTint="66"/>
+              <w:left w:val="thinThickLargeGap" w:sz="24" w:space="0" w:color="83CAEB" w:themeColor="accent1" w:themeTint="66"/>
+              <w:bottom w:val="thinThickLargeGap" w:sz="24" w:space="0" w:color="83CAEB" w:themeColor="accent1" w:themeTint="66"/>
+            </w:tcBorders>
+            <w:vAlign w:val="center"/>
+            <w:hideMark/>
+          </w:tcPr>
+          <w:p>
+            <w:pPr>
+              <w:rPr>
+                <w:b/>
+                <w:bCs/>
+                <w:lang w:val="it-IT"/>
+              </w:rPr>
+            </w:pPr>
+            <w:r>
+              <w:rPr>
+                <w:b/>
+                <w:bCs/>
+                <w:lang w:val="it-IT"/>
+              </w:rPr>
+              <w:t>Specification</w:t>
+            </w:r>
+          </w:p>
+        </w:tc>
+      </w:tr>
+      <w:tr>
+        <w:trPr>
+          <w:tblCellSpacing w:w="15" w:type="dxa"/>
+        </w:trPr>
+        <w:tc>
+          <w:tcPr>
+            <w:tcW w:w="0" w:type="auto"/>
+            <w:tcBorders>
+              <w:top w:val="thinThickLargeGap" w:sz="24" w:space="0" w:color="83CAEB" w:themeColor="accent1" w:themeTint="66"/>
+              <w:bottom w:val="thinThickLargeGap" w:sz="24" w:space="0" w:color="83CAEB" w:themeColor="accent1" w:themeTint="66"/>
+              <w:right w:val="thinThickLargeGap" w:sz="24" w:space="0" w:color="83CAEB" w:themeColor="accent1" w:themeTint="66"/>
+            </w:tcBorders>
+            <w:vAlign w:val="center"/>
+            <w:hideMark/>
+          </w:tcPr>
+          <w:p>
+            <w:pPr>
+              <w:rPr>
+                <w:lang w:val="it-IT"/>
+              </w:rPr>
+            </w:pPr>
+            <w:r>
+              <w:rPr>
+                <w:lang w:val="it-IT"/>
+              </w:rPr>
+              <w:t>Operating System</w:t>
+            </w:r>
+          </w:p>
+        </w:tc>
+        <w:tc>
+          <w:tcPr>
+            <w:tcW w:w="4891" w:type="dxa"/>
+            <w:tcBorders>
+              <w:top w:val="thinThickLargeGap" w:sz="24" w:space="0" w:color="83CAEB" w:themeColor="accent1" w:themeTint="66"/>
+              <w:left w:val="thinThickLargeGap" w:sz="24" w:space="0" w:color="83CAEB" w:themeColor="accent1" w:themeTint="66"/>
+              <w:bottom w:val="thinThickLargeGap" w:sz="24" w:space="0" w:color="83CAEB" w:themeColor="accent1" w:themeTint="66"/>
+            </w:tcBorders>
+            <w:vAlign w:val="center"/>
+            <w:hideMark/>
+          </w:tcPr>
+          <w:p>
+            <w:pPr>
+              <w:ind w:right="647"/>
+            </w:pPr>
+            <w:r>
+              <w:t>Cross-platform (Windows 10/11, macOS 12+, Linux Ubuntu 20.04+)</w:t>
+            </w:r>
+          </w:p>
+        </w:tc>
+      </w:tr>
+      <w:tr>
+        <w:trPr>
+          <w:tblCellSpacing w:w="15" w:type="dxa"/>
+        </w:trPr>
+        <w:tc>
+          <w:tcPr>
+            <w:tcW w:w="0" w:type="auto"/>
+            <w:tcBorders>
+              <w:top w:val="thinThickLargeGap" w:sz="24" w:space="0" w:color="83CAEB" w:themeColor="accent1" w:themeTint="66"/>
+              <w:bottom w:val="thinThickLargeGap" w:sz="24" w:space="0" w:color="83CAEB" w:themeColor="accent1" w:themeTint="66"/>
+              <w:right w:val="thinThickLargeGap" w:sz="24" w:space="0" w:color="83CAEB" w:themeColor="accent1" w:themeTint="66"/>
+            </w:tcBorders>
+            <w:vAlign w:val="center"/>
+            <w:hideMark/>
+          </w:tcPr>
+          <w:p>
+            <w:pPr>
+              <w:rPr>
+                <w:lang w:val="it-IT"/>
+              </w:rPr>
+            </w:pPr>
+            <w:r>
+              <w:rPr>
+                <w:lang w:val="it-IT"/>
+              </w:rPr>
+              <w:t>Runtime Environment</w:t>
+            </w:r>
+          </w:p>
+        </w:tc>
+        <w:tc>
+          <w:tcPr>
+            <w:tcW w:w="4891" w:type="dxa"/>
+            <w:tcBorders>
+              <w:top w:val="thinThickLargeGap" w:sz="24" w:space="0" w:color="83CAEB" w:themeColor="accent1" w:themeTint="66"/>
+              <w:left w:val="thinThickLargeGap" w:sz="24" w:space="0" w:color="83CAEB" w:themeColor="accent1" w:themeTint="66"/>
+              <w:bottom w:val="thinThickLargeGap" w:sz="24" w:space="0" w:color="83CAEB" w:themeColor="accent1" w:themeTint="66"/>
+            </w:tcBorders>
+            <w:vAlign w:val="center"/>
+            <w:hideMark/>
+          </w:tcPr>
+          <w:p>
+            <w:pPr>
+              <w:ind w:right="506"/>
+            </w:pPr>
+            <w:r>
+              <w:t>Java Development Kit (JDK) 21 LTS or higher</w:t>
+            </w:r>
+          </w:p>
+        </w:tc>
+      </w:tr>
+      <w:tr>
+        <w:trPr>
+          <w:tblCellSpacing w:w="15" w:type="dxa"/>
+        </w:trPr>
+        <w:tc>
+          <w:tcPr>
+            <w:tcW w:w="0" w:type="auto"/>
+            <w:tcBorders>
+              <w:top w:val="thinThickLargeGap" w:sz="24" w:space="0" w:color="83CAEB" w:themeColor="accent1" w:themeTint="66"/>
+              <w:bottom w:val="thinThickLargeGap" w:sz="24" w:space="0" w:color="83CAEB" w:themeColor="accent1" w:themeTint="66"/>
+              <w:right w:val="thinThickLargeGap" w:sz="24" w:space="0" w:color="83CAEB" w:themeColor="accent1" w:themeTint="66"/>
+            </w:tcBorders>
+            <w:vAlign w:val="center"/>
+            <w:hideMark/>
+          </w:tcPr>
+          <w:p>
+            <w:pPr>
+              <w:jc w:val="center"/>
+              <w:rPr>
+                <w:lang w:val="it-IT"/>
+              </w:rPr>
+            </w:pPr>
+            <w:r>
+              <w:rPr>
+                <w:lang w:val="it-IT"/>
+              </w:rPr>
+              <w:t>User Interface Framework</w:t>
+            </w:r>
+          </w:p>
+        </w:tc>
+        <w:tc>
+          <w:tcPr>
+            <w:tcW w:w="4891" w:type="dxa"/>
+            <w:tcBorders>
+              <w:top w:val="thinThickLargeGap" w:sz="24" w:space="0" w:color="83CAEB" w:themeColor="accent1" w:themeTint="66"/>
+              <w:left w:val="thinThickLargeGap" w:sz="24" w:space="0" w:color="83CAEB" w:themeColor="accent1" w:themeTint="66"/>
+              <w:bottom w:val="thinThickLargeGap" w:sz="24" w:space="0" w:color="83CAEB" w:themeColor="accent1" w:themeTint="66"/>
+            </w:tcBorders>
+            <w:vAlign w:val="center"/>
+            <w:hideMark/>
+          </w:tcPr>
+          <w:p>
+            <w:pPr>
+              <w:rPr>
+                <w:lang w:val="it-IT"/>
+              </w:rPr>
+            </w:pPr>
+            <w:r>
+              <w:rPr>
+                <w:lang w:val="it-IT"/>
+              </w:rPr>
+              <w:t>JavaFX SDK 21</w:t>
+            </w:r>
+          </w:p>
+        </w:tc>
+      </w:tr>
+      <w:tr>
+        <w:trPr>
+          <w:tblCellSpacing w:w="15" w:type="dxa"/>
+        </w:trPr>
+        <w:tc>
+          <w:tcPr>
+            <w:tcW w:w="0" w:type="auto"/>
+            <w:tcBorders>
+              <w:top w:val="thinThickLargeGap" w:sz="24" w:space="0" w:color="83CAEB" w:themeColor="accent1" w:themeTint="66"/>
+              <w:bottom w:val="thinThickLargeGap" w:sz="24" w:space="0" w:color="83CAEB" w:themeColor="accent1" w:themeTint="66"/>
+              <w:right w:val="thinThickLargeGap" w:sz="24" w:space="0" w:color="83CAEB" w:themeColor="accent1" w:themeTint="66"/>
+            </w:tcBorders>
+            <w:vAlign w:val="center"/>
+            <w:hideMark/>
+          </w:tcPr>
+          <w:p>
+            <w:pPr>
+              <w:rPr>
+                <w:lang w:val="it-IT"/>
+              </w:rPr>
+            </w:pPr>
+            <w:r>
+              <w:rPr>
+                <w:lang w:val="it-IT"/>
+              </w:rPr>
+              <w:t>Build Automation</w:t>
+            </w:r>
+          </w:p>
+        </w:tc>
+        <w:tc>
+          <w:tcPr>
+            <w:tcW w:w="4891" w:type="dxa"/>
+            <w:tcBorders>
+              <w:top w:val="thinThickLargeGap" w:sz="24" w:space="0" w:color="83CAEB" w:themeColor="accent1" w:themeTint="66"/>
+              <w:left w:val="thinThickLargeGap" w:sz="24" w:space="0" w:color="83CAEB" w:themeColor="accent1" w:themeTint="66"/>
+              <w:bottom w:val="thinThickLargeGap" w:sz="24" w:space="0" w:color="83CAEB" w:themeColor="accent1" w:themeTint="66"/>
+            </w:tcBorders>
+            <w:vAlign w:val="center"/>
+            <w:hideMark/>
+          </w:tcPr>
+          <w:p>
+            <w:pPr>
+              <w:rPr>
+                <w:lang w:val="it-IT"/>
+              </w:rPr>
+            </w:pPr>
+            <w:r>
+              <w:rPr>
+                <w:lang w:val="it-IT"/>
+              </w:rPr>
+              <w:t>Apache Maven 3.8+</w:t>
+            </w:r>
+          </w:p>
+        </w:tc>
+      </w:tr>
+      <w:tr>
+        <w:trPr>
+          <w:tblCellSpacing w:w="15" w:type="dxa"/>
+        </w:trPr>
+        <w:tc>
+          <w:tcPr>
+            <w:tcW w:w="0" w:type="auto"/>
+            <w:tcBorders>
+              <w:top w:val="thinThickLargeGap" w:sz="24" w:space="0" w:color="83CAEB" w:themeColor="accent1" w:themeTint="66"/>
+              <w:bottom w:val="thinThickLargeGap" w:sz="24" w:space="0" w:color="83CAEB" w:themeColor="accent1" w:themeTint="66"/>
+              <w:right w:val="thinThickLargeGap" w:sz="24" w:space="0" w:color="83CAEB" w:themeColor="accent1" w:themeTint="66"/>
+            </w:tcBorders>
+            <w:vAlign w:val="center"/>
+            <w:hideMark/>
+          </w:tcPr>
+          <w:p>
+            <w:pPr>
+              <w:rPr>
+                <w:lang w:val="it-IT"/>
+              </w:rPr>
+            </w:pPr>
+            <w:r>
+              <w:rPr>
+                <w:lang w:val="it-IT"/>
+              </w:rPr>
+              <w:t>Primary Database</w:t>
+            </w:r>
+          </w:p>
+        </w:tc>
+        <w:tc>
+          <w:tcPr>
+            <w:tcW w:w="4891" w:type="dxa"/>
+            <w:tcBorders>
+              <w:top w:val="thinThickLargeGap" w:sz="24" w:space="0" w:color="83CAEB" w:themeColor="accent1" w:themeTint="66"/>
+              <w:left w:val="thinThickLargeGap" w:sz="24" w:space="0" w:color="83CAEB" w:themeColor="accent1" w:themeTint="66"/>
+              <w:bottom w:val="thinThickLargeGap" w:sz="24" w:space="0" w:color="83CAEB" w:themeColor="accent1" w:themeTint="66"/>
+            </w:tcBorders>
+            <w:vAlign w:val="center"/>
+            <w:hideMark/>
+          </w:tcPr>
+          <w:p>
+            <w:pPr>
+              <w:rPr>
+                <w:lang w:val="it-IT"/>
+              </w:rPr>
+            </w:pPr>
+            <w:r>
+              <w:rPr>
+                <w:lang w:val="it-IT"/>
+              </w:rPr>
+              <w:t>PostgreSQL 15+</w:t>
+            </w:r>
+          </w:p>
+        </w:tc>
+      </w:tr>
+      <w:tr>
+        <w:trPr>
+          <w:tblCellSpacing w:w="15" w:type="dxa"/>
+        </w:trPr>
+        <w:tc>
+          <w:tcPr>
+            <w:tcW w:w="0" w:type="auto"/>
+            <w:tcBorders>
+              <w:top w:val="thinThickLargeGap" w:sz="24" w:space="0" w:color="83CAEB" w:themeColor="accent1" w:themeTint="66"/>
+              <w:bottom w:val="thinThickLargeGap" w:sz="24" w:space="0" w:color="83CAEB" w:themeColor="accent1" w:themeTint="66"/>
+              <w:right w:val="thinThickLargeGap" w:sz="24" w:space="0" w:color="83CAEB" w:themeColor="accent1" w:themeTint="66"/>
+            </w:tcBorders>
+            <w:vAlign w:val="center"/>
+            <w:hideMark/>
+          </w:tcPr>
+          <w:p>
+            <w:pPr>
+              <w:rPr>
+                <w:lang w:val="it-IT"/>
+              </w:rPr>
+            </w:pPr>
+            <w:r>
+              <w:rPr>
+                <w:lang w:val="it-IT"/>
+              </w:rPr>
+              <w:t>Development Environment</w:t>
+            </w:r>
+          </w:p>
+        </w:tc>
+        <w:tc>
+          <w:tcPr>
+            <w:tcW w:w="4891" w:type="dxa"/>
+            <w:tcBorders>
+              <w:top w:val="thinThickLargeGap" w:sz="24" w:space="0" w:color="83CAEB" w:themeColor="accent1" w:themeTint="66"/>
+              <w:left w:val="thinThickLargeGap" w:sz="24" w:space="0" w:color="83CAEB" w:themeColor="accent1" w:themeTint="66"/>
+              <w:bottom w:val="thinThickLargeGap" w:sz="24" w:space="0" w:color="83CAEB" w:themeColor="accent1" w:themeTint="66"/>
+            </w:tcBorders>
+            <w:vAlign w:val="center"/>
+            <w:hideMark/>
+          </w:tcPr>
+          <w:p>
+            <w:pPr>
+              <w:ind w:right="506"/>
+            </w:pPr>
+            <w:r>
+              <w:t>Docker (for containerized PostgreSQL instance)</w:t>
+            </w:r>
+          </w:p>
+        </w:tc>
+      </w:tr>
+      <w:tr>
+        <w:trPr>
+          <w:tblCellSpacing w:w="15" w:type="dxa"/>
+        </w:trPr>
+        <w:tc>
+          <w:tcPr>
+            <w:tcW w:w="0" w:type="auto"/>
+            <w:tcBorders>
+              <w:top w:val="thinThickLargeGap" w:sz="24" w:space="0" w:color="83CAEB" w:themeColor="accent1" w:themeTint="66"/>
+              <w:bottom w:val="thinThickLargeGap" w:sz="24" w:space="0" w:color="83CAEB" w:themeColor="accent1" w:themeTint="66"/>
+              <w:right w:val="thinThickLargeGap" w:sz="24" w:space="0" w:color="83CAEB" w:themeColor="accent1" w:themeTint="66"/>
+            </w:tcBorders>
+            <w:vAlign w:val="center"/>
+            <w:hideMark/>
+          </w:tcPr>
+          <w:p>
+            <w:pPr>
+              <w:rPr>
+                <w:lang w:val="it-IT"/>
+              </w:rPr>
+            </w:pPr>
+            <w:r>
+              <w:rPr>
+                <w:lang w:val="it-IT"/>
+              </w:rPr>
+              <w:t>Version Control</w:t>
+            </w:r>
+          </w:p>
+        </w:tc>
+        <w:tc>
+          <w:tcPr>
+            <w:tcW w:w="4891" w:type="dxa"/>
+            <w:tcBorders>
+              <w:top w:val="thinThickLargeGap" w:sz="24" w:space="0" w:color="83CAEB" w:themeColor="accent1" w:themeTint="66"/>
+              <w:left w:val="thinThickLargeGap" w:sz="24" w:space="0" w:color="83CAEB" w:themeColor="accent1" w:themeTint="66"/>
+              <w:bottom w:val="thinThickLargeGap" w:sz="24" w:space="0" w:color="83CAEB" w:themeColor="accent1" w:themeTint="66"/>
+            </w:tcBorders>
+            <w:vAlign w:val="center"/>
+            <w:hideMark/>
+          </w:tcPr>
+          <w:p>
+            <w:pPr>
+              <w:rPr>
+                <w:lang w:val="it-IT"/>
+              </w:rPr>
+            </w:pPr>
+            <w:r>
+              <w:rPr>
+                <w:lang w:val="it-IT"/>
+              </w:rPr>
+              <w:t>Git</w:t>
+            </w:r>
+          </w:p>
+        </w:tc>
+      </w:tr>
+      <w:tr>
+        <w:trPr>
+          <w:tblCellSpacing w:w="15" w:type="dxa"/>
+        </w:trPr>
+        <w:tc>
+          <w:tcPr>
+            <w:tcW w:w="0" w:type="auto"/>
+            <w:tcBorders>
+              <w:top w:val="thinThickLargeGap" w:sz="24" w:space="0" w:color="83CAEB" w:themeColor="accent1" w:themeTint="66"/>
+              <w:bottom w:val="thinThickLargeGap" w:sz="24" w:space="0" w:color="83CAEB" w:themeColor="accent1" w:themeTint="66"/>
+              <w:right w:val="thinThickLargeGap" w:sz="24" w:space="0" w:color="83CAEB" w:themeColor="accent1" w:themeTint="66"/>
+            </w:tcBorders>
+            <w:vAlign w:val="center"/>
+            <w:hideMark/>
+          </w:tcPr>
+          <w:p>
+            <w:pPr>
+              <w:rPr>
+                <w:lang w:val="it-IT"/>
+              </w:rPr>
+            </w:pPr>
+            <w:r>
+              <w:rPr>
+                <w:lang w:val="it-IT"/>
+              </w:rPr>
+              <w:t>IDE (optional)</w:t>
+            </w:r>
+          </w:p>
+        </w:tc>
+        <w:tc>
+          <w:tcPr>
+            <w:tcW w:w="4891" w:type="dxa"/>
+            <w:tcBorders>
+              <w:top w:val="thinThickLargeGap" w:sz="24" w:space="0" w:color="83CAEB" w:themeColor="accent1" w:themeTint="66"/>
+              <w:left w:val="thinThickLargeGap" w:sz="24" w:space="0" w:color="83CAEB" w:themeColor="accent1" w:themeTint="66"/>
+              <w:bottom w:val="thinThickLargeGap" w:sz="24" w:space="0" w:color="83CAEB" w:themeColor="accent1" w:themeTint="66"/>
+            </w:tcBorders>
+            <w:vAlign w:val="center"/>
+            <w:hideMark/>
+          </w:tcPr>
+          <w:p>
+            <w:r>
+              <w:t>IntelliJ IDEA or Eclipse IDE</w:t>
+            </w:r>
+          </w:p>
+        </w:tc>
+      </w:tr>
+    </w:tbl>
+    <w:p/>
+    <w:p>
+      <w:pPr>
+        <w:ind w:left="0"/>
+        <w:jc w:val="left"/>
+        <w:rPr>
+          <w:b/>
+          <w:bCs/>
+          <w:lang w:val="it-IT"/>
+        </w:rPr>
+      </w:pPr>
+      <w:r>
+        <w:rPr>
+          <w:b/>
+          <w:bCs/>
+          <w:lang w:val="it-IT"/>
+        </w:rPr>
+        <w:br w:type="page"/>
+      </w:r>
+    </w:p>
+    <w:p>
+      <w:pPr>
+        <w:rPr>
+          <w:b/>
+          <w:bCs/>
+          <w:lang w:val="it-IT"/>
+        </w:rPr>
+      </w:pPr>
+      <w:r>
+        <w:rPr>
+          <w:b/>
+          <w:bCs/>
+          <w:lang w:val="it-IT"/>
+        </w:rPr>
+        <w:lastRenderedPageBreak/>
+        <w:t xml:space="preserve">Hardware </w:t>
+      </w:r>
+      <w:proofErr w:type="spellStart"/>
+      <w:r>
+        <w:rPr>
+          <w:b/>
+          <w:bCs/>
+          <w:lang w:val="it-IT"/>
+        </w:rPr>
+        <w:t>Requirements</w:t>
+      </w:r>
+      <w:proofErr w:type="spellEnd"/>
+    </w:p>
+    <w:tbl>
+      <w:tblPr>
+        <w:tblW w:w="8221" w:type="dxa"/>
+        <w:tblCellSpacing w:w="15" w:type="dxa"/>
+        <w:tblInd w:w="826" w:type="dxa"/>
+        <w:tblBorders>
+          <w:top w:val="triple" w:sz="4" w:space="0" w:color="E97132" w:themeColor="accent2"/>
+          <w:left w:val="triple" w:sz="4" w:space="0" w:color="E97132" w:themeColor="accent2"/>
+          <w:bottom w:val="triple" w:sz="4" w:space="0" w:color="E97132" w:themeColor="accent2"/>
+          <w:right w:val="triple" w:sz="4" w:space="0" w:color="E97132" w:themeColor="accent2"/>
+          <w:insideH w:val="triple" w:sz="4" w:space="0" w:color="E97132" w:themeColor="accent2"/>
+          <w:insideV w:val="triple" w:sz="4" w:space="0" w:color="E97132" w:themeColor="accent2"/>
+        </w:tblBorders>
+        <w:tblCellMar>
+          <w:top w:w="15" w:type="dxa"/>
+          <w:left w:w="15" w:type="dxa"/>
+          <w:bottom w:w="15" w:type="dxa"/>
+          <w:right w:w="15" w:type="dxa"/>
+        </w:tblCellMar>
+        <w:tblLook w:val="04A0" w:firstRow="1" w:lastRow="0" w:firstColumn="1" w:lastColumn="0" w:noHBand="0" w:noVBand="1"/>
+      </w:tblPr>
+      <w:tblGrid>
+        <w:gridCol w:w="2179"/>
+        <w:gridCol w:w="2880"/>
+        <w:gridCol w:w="3162"/>
+      </w:tblGrid>
+      <w:tr>
+        <w:trPr>
+          <w:tblHeader/>
+          <w:tblCellSpacing w:w="15" w:type="dxa"/>
+        </w:trPr>
+        <w:tc>
+          <w:tcPr>
+            <w:tcW w:w="0" w:type="auto"/>
+            <w:vAlign w:val="center"/>
+            <w:hideMark/>
+          </w:tcPr>
+          <w:p>
+            <w:pPr>
+              <w:rPr>
+                <w:b/>
+                <w:bCs/>
+                <w:lang w:val="it-IT"/>
+              </w:rPr>
+            </w:pPr>
+            <w:r>
+              <w:rPr>
+                <w:b/>
+                <w:bCs/>
+                <w:lang w:val="it-IT"/>
+              </w:rPr>
+              <w:t>Component</w:t>
+            </w:r>
+          </w:p>
+        </w:tc>
+        <w:tc>
+          <w:tcPr>
+            <w:tcW w:w="0" w:type="auto"/>
+            <w:vAlign w:val="center"/>
+            <w:hideMark/>
+          </w:tcPr>
+          <w:p>
+            <w:pPr>
+              <w:rPr>
+                <w:b/>
+                <w:bCs/>
+                <w:lang w:val="it-IT"/>
+              </w:rPr>
+            </w:pPr>
+            <w:r>
+              <w:rPr>
+                <w:b/>
+                <w:bCs/>
+                <w:lang w:val="it-IT"/>
+              </w:rPr>
+              <w:t>Minimum</w:t>
+            </w:r>
+          </w:p>
+        </w:tc>
+        <w:tc>
+          <w:tcPr>
+            <w:tcW w:w="2397" w:type="dxa"/>
+            <w:vAlign w:val="center"/>
+            <w:hideMark/>
+          </w:tcPr>
+          <w:p>
+            <w:pPr>
+              <w:ind w:right="610"/>
+              <w:rPr>
+                <w:b/>
+                <w:bCs/>
+                <w:lang w:val="it-IT"/>
+              </w:rPr>
+            </w:pPr>
+            <w:r>
+              <w:rPr>
+                <w:b/>
+                <w:bCs/>
+                <w:lang w:val="it-IT"/>
+              </w:rPr>
+              <w:t>Recommended</w:t>
+            </w:r>
+          </w:p>
+        </w:tc>
+      </w:tr>
+      <w:tr>
+        <w:trPr>
+          <w:tblCellSpacing w:w="15" w:type="dxa"/>
+        </w:trPr>
+        <w:tc>
+          <w:tcPr>
+            <w:tcW w:w="0" w:type="auto"/>
+            <w:vAlign w:val="center"/>
+            <w:hideMark/>
+          </w:tcPr>
+          <w:p>
+            <w:pPr>
+              <w:rPr>
+                <w:lang w:val="it-IT"/>
+              </w:rPr>
+            </w:pPr>
+            <w:r>
+              <w:rPr>
+                <w:lang w:val="it-IT"/>
+              </w:rPr>
+              <w:t>Processor</w:t>
+            </w:r>
+          </w:p>
+        </w:tc>
+        <w:tc>
+          <w:tcPr>
+            <w:tcW w:w="0" w:type="auto"/>
+            <w:vAlign w:val="center"/>
+            <w:hideMark/>
+          </w:tcPr>
+          <w:p>
+            <w:pPr>
+              <w:rPr>
+                <w:lang w:val="it-IT"/>
+              </w:rPr>
+            </w:pPr>
+            <w:r>
+              <w:rPr>
+                <w:lang w:val="it-IT"/>
+              </w:rPr>
+              <w:t>Dual-core 1.8 GHz</w:t>
+            </w:r>
+          </w:p>
+        </w:tc>
+        <w:tc>
+          <w:tcPr>
+            <w:tcW w:w="2397" w:type="dxa"/>
+            <w:vAlign w:val="center"/>
+            <w:hideMark/>
+          </w:tcPr>
+          <w:p>
+            <w:pPr>
+              <w:ind w:right="469"/>
+            </w:pPr>
+            <w:r>
+              <w:t>Quad-core 2.5 GHz or higher</w:t>
+            </w:r>
+          </w:p>
+        </w:tc>
+      </w:tr>
+      <w:tr>
+        <w:trPr>
+          <w:tblCellSpacing w:w="15" w:type="dxa"/>
+        </w:trPr>
+        <w:tc>
+          <w:tcPr>
+            <w:tcW w:w="0" w:type="auto"/>
+            <w:vAlign w:val="center"/>
+            <w:hideMark/>
+          </w:tcPr>
+          <w:p>
+            <w:pPr>
+              <w:rPr>
+                <w:lang w:val="it-IT"/>
+              </w:rPr>
+            </w:pPr>
+            <w:r>
+              <w:rPr>
+                <w:lang w:val="it-IT"/>
+              </w:rPr>
+              <w:t>RAM</w:t>
+            </w:r>
+          </w:p>
+        </w:tc>
+        <w:tc>
+          <w:tcPr>
+            <w:tcW w:w="0" w:type="auto"/>
+            <w:vAlign w:val="center"/>
+            <w:hideMark/>
+          </w:tcPr>
+          <w:p>
+            <w:pPr>
+              <w:rPr>
+                <w:lang w:val="it-IT"/>
+              </w:rPr>
+            </w:pPr>
+            <w:r>
+              <w:rPr>
+                <w:lang w:val="it-IT"/>
+              </w:rPr>
+              <w:t>4 GB</w:t>
+            </w:r>
+          </w:p>
+        </w:tc>
+        <w:tc>
+          <w:tcPr>
+            <w:tcW w:w="2397" w:type="dxa"/>
+            <w:vAlign w:val="center"/>
+            <w:hideMark/>
+          </w:tcPr>
+          <w:p>
+            <w:pPr>
+              <w:rPr>
+                <w:lang w:val="it-IT"/>
+              </w:rPr>
+            </w:pPr>
+            <w:r>
+              <w:rPr>
+                <w:lang w:val="it-IT"/>
+              </w:rPr>
+              <w:t>8 GB</w:t>
+            </w:r>
+          </w:p>
+        </w:tc>
+      </w:tr>
+      <w:tr>
+        <w:trPr>
+          <w:tblCellSpacing w:w="15" w:type="dxa"/>
+        </w:trPr>
+        <w:tc>
+          <w:tcPr>
+            <w:tcW w:w="0" w:type="auto"/>
+            <w:vAlign w:val="center"/>
+            <w:hideMark/>
+          </w:tcPr>
+          <w:p>
+            <w:pPr>
+              <w:rPr>
+                <w:lang w:val="it-IT"/>
+              </w:rPr>
+            </w:pPr>
+            <w:r>
+              <w:rPr>
+                <w:lang w:val="it-IT"/>
+              </w:rPr>
+              <w:t>Storage</w:t>
+            </w:r>
+          </w:p>
+        </w:tc>
+        <w:tc>
+          <w:tcPr>
+            <w:tcW w:w="0" w:type="auto"/>
+            <w:vAlign w:val="center"/>
+            <w:hideMark/>
+          </w:tcPr>
+          <w:p>
+            <w:pPr>
+              <w:rPr>
+                <w:lang w:val="it-IT"/>
+              </w:rPr>
+            </w:pPr>
+            <w:r>
+              <w:rPr>
+                <w:lang w:val="it-IT"/>
+              </w:rPr>
+              <w:t>300 MB free disk space</w:t>
+            </w:r>
+          </w:p>
+        </w:tc>
+        <w:tc>
+          <w:tcPr>
+            <w:tcW w:w="2397" w:type="dxa"/>
+            <w:vAlign w:val="center"/>
+            <w:hideMark/>
+          </w:tcPr>
+          <w:p>
+            <w:pPr>
+              <w:ind w:right="469"/>
+              <w:rPr>
+                <w:lang w:val="it-IT"/>
+              </w:rPr>
+            </w:pPr>
+            <w:r>
+              <w:rPr>
+                <w:lang w:val="it-IT"/>
+              </w:rPr>
+              <w:t>1 GB (including Docker image)</w:t>
+            </w:r>
+          </w:p>
+        </w:tc>
+      </w:tr>
+      <w:tr>
+        <w:trPr>
+          <w:tblCellSpacing w:w="15" w:type="dxa"/>
+        </w:trPr>
+        <w:tc>
+          <w:tcPr>
+            <w:tcW w:w="0" w:type="auto"/>
+            <w:vAlign w:val="center"/>
+            <w:hideMark/>
+          </w:tcPr>
+          <w:p>
+            <w:pPr>
+              <w:rPr>
+                <w:lang w:val="it-IT"/>
+              </w:rPr>
+            </w:pPr>
+            <w:r>
+              <w:rPr>
+                <w:lang w:val="it-IT"/>
+              </w:rPr>
+              <w:t>Display</w:t>
+            </w:r>
+          </w:p>
+        </w:tc>
+        <w:tc>
+          <w:tcPr>
+            <w:tcW w:w="0" w:type="auto"/>
+            <w:vAlign w:val="center"/>
+            <w:hideMark/>
+          </w:tcPr>
+          <w:p>
+            <w:pPr>
+              <w:rPr>
+                <w:lang w:val="it-IT"/>
+              </w:rPr>
+            </w:pPr>
+            <w:r>
+              <w:rPr>
+                <w:lang w:val="it-IT"/>
+              </w:rPr>
+              <w:t>1280×720</w:t>
+            </w:r>
+          </w:p>
+        </w:tc>
+        <w:tc>
+          <w:tcPr>
+            <w:tcW w:w="2397" w:type="dxa"/>
+            <w:vAlign w:val="center"/>
+            <w:hideMark/>
+          </w:tcPr>
+          <w:p>
+            <w:pPr>
+              <w:rPr>
+                <w:lang w:val="it-IT"/>
+              </w:rPr>
+            </w:pPr>
+            <w:r>
+              <w:rPr>
+                <w:lang w:val="it-IT"/>
+              </w:rPr>
+              <w:t>1920×1080</w:t>
+            </w:r>
+          </w:p>
+        </w:tc>
+      </w:tr>
+      <w:tr>
+        <w:trPr>
+          <w:tblCellSpacing w:w="15" w:type="dxa"/>
+        </w:trPr>
+        <w:tc>
+          <w:tcPr>
+            <w:tcW w:w="0" w:type="auto"/>
+            <w:vAlign w:val="center"/>
+            <w:hideMark/>
+          </w:tcPr>
+          <w:p>
+            <w:pPr>
+              <w:rPr>
+                <w:lang w:val="it-IT"/>
+              </w:rPr>
+            </w:pPr>
+            <w:r>
+              <w:rPr>
+                <w:lang w:val="it-IT"/>
+              </w:rPr>
+              <w:t>Network</w:t>
+            </w:r>
+          </w:p>
+        </w:tc>
+        <w:tc>
+          <w:tcPr>
+            <w:tcW w:w="0" w:type="auto"/>
+            <w:vAlign w:val="center"/>
+            <w:hideMark/>
+          </w:tcPr>
+          <w:p>
+            <w:pPr>
+              <w:rPr>
+                <w:lang w:val="it-IT"/>
+              </w:rPr>
+            </w:pPr>
+            <w:r>
+              <w:rPr>
+                <w:lang w:val="it-IT"/>
+              </w:rPr>
+              <w:t>Required for DB connectivity</w:t>
+            </w:r>
+          </w:p>
+        </w:tc>
+        <w:tc>
+          <w:tcPr>
+            <w:tcW w:w="2397" w:type="dxa"/>
+            <w:vAlign w:val="center"/>
+            <w:hideMark/>
+          </w:tcPr>
+          <w:p>
+            <w:pPr>
+              <w:ind w:right="469"/>
+              <w:rPr>
+                <w:lang w:val="it-IT"/>
+              </w:rPr>
+            </w:pPr>
+            <w:r>
+              <w:rPr>
+                <w:lang w:val="it-IT"/>
+              </w:rPr>
+              <w:t>Stable LAN connection</w:t>
+            </w:r>
+          </w:p>
+        </w:tc>
+      </w:tr>
+    </w:tbl>
+    <w:p/>
+    <w:p>
+      <w:pPr>
+        <w:pStyle w:val="Heading3"/>
+        <w:rPr>
+          <w:rFonts w:eastAsiaTheme="minorHAnsi" w:cstheme="minorBidi"/>
+          <w:color w:val="auto"/>
+          <w:sz w:val="24"/>
+          <w:szCs w:val="24"/>
+        </w:rPr>
+      </w:pPr>
+      <w:bookmarkStart w:id="4" w:name="_Toc221461377"/>
+      <w:r>
+        <w:rPr>
+          <w:rFonts w:eastAsiaTheme="minorHAnsi" w:cstheme="minorBidi"/>
+          <w:b/>
+          <w:bCs/>
+          <w:color w:val="auto"/>
+          <w:sz w:val="24"/>
+          <w:szCs w:val="24"/>
+        </w:rPr>
+        <w:t>Note:</w:t>
+      </w:r>
+      <w:r>
+        <w:rPr>
+          <w:rFonts w:eastAsiaTheme="minorHAnsi" w:cstheme="minorBidi"/>
+          <w:color w:val="auto"/>
+          <w:sz w:val="24"/>
+          <w:szCs w:val="24"/>
+        </w:rPr>
+        <w:t xml:space="preserve"> Local storage requirements are minimal, as persistent data resides exclusively in the database. The file system–based DAO implementation (OrderDAOFile) generates CSV files of negligible size.</w:t>
+      </w:r>
+    </w:p>
+    <w:p>
+      <w:pPr>
+        <w:pStyle w:val="Heading3"/>
+      </w:pPr>
+      <w:r>
+        <w:t>RELATED SYSTEMS, PROS AND CONS</w:t>
+      </w:r>
+      <w:bookmarkEnd w:id="4"/>
+    </w:p>
+    <w:p>
+      <w:pPr>
+        <w:rPr>
+          <w:b/>
+          <w:bCs/>
+        </w:rPr>
+      </w:pPr>
+      <w:r>
+        <w:rPr>
+          <w:b/>
+          <w:bCs/>
+        </w:rPr>
+        <w:t>1.1.4 RELATED SYSTEMS, PROS AND CONS</w:t>
+      </w:r>
+    </w:p>
+    <w:p>
+      <w:pPr>
+        <w:rPr>
+          <w:b/>
+          <w:bCs/>
+        </w:rPr>
+      </w:pPr>
+      <w:r>
+        <w:rPr>
+          <w:b/>
+          <w:bCs/>
+        </w:rPr>
+        <w:t>Lightspeed Restaurant</w:t>
+      </w:r>
+    </w:p>
+    <w:p>
+      <w:r>
+        <w:t>Lightspeed Restaurant is a commercial, cloud-based restaurant management platform designed for order management, table coordination, staff role assignment, inventory tracking, and billing operations.</w:t>
+      </w:r>
+    </w:p>
+    <w:p>
+      <w:pPr>
+        <w:rPr>
+          <w:lang w:val="it-IT"/>
+        </w:rPr>
+      </w:pPr>
+      <w:r>
+        <w:rPr>
+          <w:b/>
+          <w:bCs/>
+          <w:lang w:val="it-IT"/>
+        </w:rPr>
+        <w:t>Pros:</w:t>
+      </w:r>
+    </w:p>
+    <w:p>
+      <w:pPr>
+        <w:numPr>
+          <w:ilvl w:val="0"/>
+          <w:numId w:val="19"/>
+        </w:numPr>
+        <w:tabs>
+          <w:tab w:val="num" w:pos="720"/>
+        </w:tabs>
+      </w:pPr>
+      <w:r>
+        <w:t>Comprehensive feature set covering inventory management, analytics, and cloud-based multi-device access.</w:t>
+      </w:r>
+    </w:p>
+    <w:p>
+      <w:pPr>
+        <w:numPr>
+          <w:ilvl w:val="0"/>
+          <w:numId w:val="19"/>
+        </w:numPr>
+        <w:tabs>
+          <w:tab w:val="num" w:pos="720"/>
+        </w:tabs>
+      </w:pPr>
+      <w:r>
+        <w:t>Suitable for medium and large restaurant operations with complex workflows.</w:t>
+      </w:r>
+    </w:p>
+    <w:p>
+      <w:pPr>
+        <w:numPr>
+          <w:ilvl w:val="0"/>
+          <w:numId w:val="19"/>
+        </w:numPr>
+        <w:tabs>
+          <w:tab w:val="num" w:pos="720"/>
+        </w:tabs>
+      </w:pPr>
+      <w:r>
+        <w:t>Continuous updates and professional vendor support.</w:t>
+      </w:r>
+    </w:p>
+    <w:p>
+      <w:pPr>
+        <w:rPr>
+          <w:lang w:val="it-IT"/>
+        </w:rPr>
+      </w:pPr>
+      <w:r>
+        <w:rPr>
+          <w:b/>
+          <w:bCs/>
+          <w:lang w:val="it-IT"/>
+        </w:rPr>
+        <w:t>Cons:</w:t>
+      </w:r>
+    </w:p>
+    <w:p>
+      <w:pPr>
+        <w:numPr>
+          <w:ilvl w:val="0"/>
+          <w:numId w:val="20"/>
+        </w:numPr>
+      </w:pPr>
+      <w:r>
+        <w:t>Closed and proprietary architecture, offering no customization of internal workflows.</w:t>
+      </w:r>
+    </w:p>
+    <w:p>
+      <w:pPr>
+        <w:numPr>
+          <w:ilvl w:val="0"/>
+          <w:numId w:val="20"/>
+        </w:numPr>
+      </w:pPr>
+      <w:r>
+        <w:t>Strong dependency on a stable internet connection; unsuitable for offline scenarios.</w:t>
+      </w:r>
+    </w:p>
+    <w:p>
+      <w:pPr>
+        <w:numPr>
+          <w:ilvl w:val="0"/>
+          <w:numId w:val="20"/>
+        </w:numPr>
+      </w:pPr>
+      <w:r>
+        <w:lastRenderedPageBreak/>
+        <w:t>Excessive complexity and cost for small operations; requires a significant learning curve.</w:t>
+      </w:r>
+    </w:p>
+    <w:p>
+      <w:pPr>
+        <w:rPr>
+          <w:b/>
+          <w:bCs/>
+        </w:rPr>
+      </w:pPr>
+      <w:r>
+        <w:rPr>
+          <w:b/>
+          <w:bCs/>
+        </w:rPr>
+        <w:t>Square for Restaurants</w:t>
+      </w:r>
+    </w:p>
+    <w:p>
+      <w:r>
+        <w:t>Square for Restaurants is a point-of-sale system oriented toward order management, basic staff coordination, and billing.</w:t>
+      </w:r>
+    </w:p>
+    <w:p>
+      <w:pPr>
+        <w:rPr>
+          <w:lang w:val="it-IT"/>
+        </w:rPr>
+      </w:pPr>
+      <w:r>
+        <w:rPr>
+          <w:b/>
+          <w:bCs/>
+          <w:lang w:val="it-IT"/>
+        </w:rPr>
+        <w:t>Pros:</w:t>
+      </w:r>
+    </w:p>
+    <w:p>
+      <w:pPr>
+        <w:numPr>
+          <w:ilvl w:val="0"/>
+          <w:numId w:val="21"/>
+        </w:numPr>
+        <w:tabs>
+          <w:tab w:val="num" w:pos="720"/>
+        </w:tabs>
+      </w:pPr>
+      <w:r>
+        <w:t>Simple and modern interface with fast onboarding.</w:t>
+      </w:r>
+    </w:p>
+    <w:p>
+      <w:pPr>
+        <w:numPr>
+          <w:ilvl w:val="0"/>
+          <w:numId w:val="21"/>
+        </w:numPr>
+        <w:tabs>
+          <w:tab w:val="num" w:pos="720"/>
+        </w:tabs>
+      </w:pPr>
+      <w:r>
+        <w:t>Native integration with payment processing systems.</w:t>
+      </w:r>
+    </w:p>
+    <w:p>
+      <w:pPr>
+        <w:numPr>
+          <w:ilvl w:val="0"/>
+          <w:numId w:val="21"/>
+        </w:numPr>
+        <w:tabs>
+          <w:tab w:val="num" w:pos="720"/>
+        </w:tabs>
+      </w:pPr>
+      <w:r>
+        <w:t>Free tier available for basic usage.</w:t>
+      </w:r>
+    </w:p>
+    <w:p>
+      <w:pPr>
+        <w:rPr>
+          <w:lang w:val="it-IT"/>
+        </w:rPr>
+      </w:pPr>
+      <w:r>
+        <w:rPr>
+          <w:b/>
+          <w:bCs/>
+          <w:lang w:val="it-IT"/>
+        </w:rPr>
+        <w:t>Cons:</w:t>
+      </w:r>
+    </w:p>
+    <w:p>
+      <w:pPr>
+        <w:numPr>
+          <w:ilvl w:val="0"/>
+          <w:numId w:val="22"/>
+        </w:numPr>
+        <w:tabs>
+          <w:tab w:val="num" w:pos="720"/>
+        </w:tabs>
+      </w:pPr>
+      <w:r>
+        <w:t>Primarily focused on billing; offers limited support for role-based internal workflow customization.</w:t>
+      </w:r>
+    </w:p>
+    <w:p>
+      <w:pPr>
+        <w:numPr>
+          <w:ilvl w:val="0"/>
+          <w:numId w:val="22"/>
+        </w:numPr>
+        <w:tabs>
+          <w:tab w:val="num" w:pos="720"/>
+        </w:tabs>
+      </w:pPr>
+      <w:r>
+        <w:t>Advanced features (e.g., detailed reporting, multi-location management) require paid subscription plans.</w:t>
+      </w:r>
+    </w:p>
+    <w:p>
+      <w:pPr>
+        <w:numPr>
+          <w:ilvl w:val="0"/>
+          <w:numId w:val="22"/>
+        </w:numPr>
+        <w:tabs>
+          <w:tab w:val="num" w:pos="720"/>
+        </w:tabs>
+      </w:pPr>
+      <w:r>
+        <w:t>No native support for kitchen-side order state tracking.</w:t>
+      </w:r>
+    </w:p>
+    <w:p>
+      <w:pPr>
+        <w:rPr>
+          <w:b/>
+          <w:bCs/>
+        </w:rPr>
+      </w:pPr>
+      <w:r>
+        <w:rPr>
+          <w:b/>
+          <w:bCs/>
+        </w:rPr>
+        <w:t>Positioning of Restaurant Manager</w:t>
+      </w:r>
+    </w:p>
+    <w:p>
+      <w:r>
+        <w:t xml:space="preserve">Compared to the systems above, Restaurant Manager prioritizes a </w:t>
+      </w:r>
+      <w:r>
+        <w:rPr>
+          <w:b/>
+          <w:bCs/>
+        </w:rPr>
+        <w:t>clear architectural separation of roles</w:t>
+      </w:r>
+      <w:r>
+        <w:t xml:space="preserve"> (Manager, Waiter, Kitchen Staff, Cashier) and a </w:t>
+      </w:r>
+      <w:r>
+        <w:rPr>
+          <w:b/>
+          <w:bCs/>
+        </w:rPr>
+        <w:t>modular, layered internal structure</w:t>
+      </w:r>
+      <w:r>
+        <w:t xml:space="preserve">, favoring maintainability, extensibility, and testability over commercial completeness. The system is specifically designed to operate in a </w:t>
+      </w:r>
+      <w:r>
+        <w:rPr>
+          <w:b/>
+          <w:bCs/>
+        </w:rPr>
+        <w:t>local network environment</w:t>
+      </w:r>
+      <w:r>
+        <w:t xml:space="preserve"> without mandatory dependency on external cloud services, and its </w:t>
+      </w:r>
+      <w:r>
+        <w:rPr>
+          <w:b/>
+          <w:bCs/>
+        </w:rPr>
+        <w:t>dual persistence strategy</w:t>
+      </w:r>
+      <w:r>
+        <w:t xml:space="preserve"> (PostgreSQL and file system) further enhances deployment flexibility.</w:t>
       </w:r>
     </w:p>
     <w:p/>
     <w:p/>
     <w:p>
       <w:pPr>
-        <w:pStyle w:val="Heading3"/>
-      </w:pPr>
-      <w:bookmarkStart w:id="3" w:name="_Toc221461376"/>
-      <w:r>
-        <w:t>HARDWARE AND SOFTWARE REQUIREMENTS</w:t>
-      </w:r>
-      <w:bookmarkEnd w:id="3"/>
-    </w:p>
-    <w:p>
-      <w:r>
-        <w:t xml:space="preserve">The basic hardware requirements of the system are a </w:t>
-      </w:r>
-      <w:r>
-        <w:t>device</w:t>
-      </w:r>
-      <w:r>
-        <w:t xml:space="preserve"> for each user</w:t>
-      </w:r>
-      <w:r>
-        <w:t xml:space="preserve"> that can run JAR files</w:t>
-      </w:r>
-      <w:r>
-        <w:t xml:space="preserve"> (client)</w:t>
-      </w:r>
-      <w:r>
-        <w:t xml:space="preserve">, that have </w:t>
-      </w:r>
-      <w:r>
-        <w:t>at least</w:t>
-      </w:r>
-      <w:r>
-        <w:t xml:space="preserve"> Java 21, f</w:t>
-      </w:r>
-      <w:r>
-        <w:t>urthermore</w:t>
-      </w:r>
-      <w:r>
-        <w:t xml:space="preserve"> is necessary a </w:t>
-      </w:r>
-      <w:r>
-        <w:t xml:space="preserve">server over that run a </w:t>
-      </w:r>
-      <w:r>
-        <w:t>DB</w:t>
-      </w:r>
-      <w:r>
-        <w:t>MS</w:t>
-      </w:r>
-      <w:r>
-        <w:t xml:space="preserve"> to connect</w:t>
-      </w:r>
-      <w:r>
-        <w:t xml:space="preserve"> the clients</w:t>
-      </w:r>
-      <w:r>
-        <w:t xml:space="preserve"> (technically the software can start also without </w:t>
-      </w:r>
-      <w:r>
-        <w:t>that but</w:t>
-      </w:r>
-      <w:r>
-        <w:t xml:space="preserve"> is simply useless)</w:t>
-      </w:r>
-      <w:r>
-        <w:t>.</w:t>
+        <w:ind w:left="0"/>
+        <w:jc w:val="left"/>
+        <w:rPr>
+          <w:rFonts w:asciiTheme="majorHAnsi" w:eastAsiaTheme="majorEastAsia" w:hAnsiTheme="majorHAnsi" w:cstheme="majorBidi"/>
+          <w:color w:val="0F4761" w:themeColor="accent1" w:themeShade="BF"/>
+          <w:sz w:val="32"/>
+          <w:szCs w:val="32"/>
+        </w:rPr>
+      </w:pPr>
+      <w:bookmarkStart w:id="5" w:name="_Toc221461378"/>
+      <w:r>
+        <w:br w:type="page"/>
+      </w:r>
+    </w:p>
+    <w:p>
+      <w:pPr>
+        <w:pStyle w:val="Heading2"/>
+      </w:pPr>
+      <w:r>
+        <w:lastRenderedPageBreak/>
+        <w:t>USER STOR</w:t>
+      </w:r>
+      <w:r>
+        <w:t>IES</w:t>
+      </w:r>
+      <w:r>
+        <w:t>:</w:t>
+      </w:r>
+      <w:bookmarkEnd w:id="5"/>
+    </w:p>
+    <w:p>
+      <w:pPr>
+        <w:rPr>
+          <w:color w:val="ADADAD" w:themeColor="background2" w:themeShade="BF"/>
+        </w:rPr>
+      </w:pPr>
+      <w:r>
+        <w:rPr>
+          <w:color w:val="ADADAD" w:themeColor="background2" w:themeShade="BF"/>
+        </w:rPr>
+        <w:t>(The following user stories define the functional scope of the system from the perspective of each identified actor. Stories are grouped by role for clarity and traceability with the Use Case Overview Diagram)</w:t>
+      </w:r>
+    </w:p>
+    <w:p>
+      <w:pPr>
+        <w:rPr>
+          <w:color w:val="ADADAD" w:themeColor="background2" w:themeShade="BF"/>
+        </w:rPr>
+      </w:pPr>
+      <w:r>
+        <w:rPr>
+          <w:color w:val="ADADAD" w:themeColor="background2" w:themeShade="BF"/>
+        </w:rPr>
+        <w:t>(Manager)</w:t>
+      </w:r>
+    </w:p>
+    <w:p>
+      <w:pPr>
+        <w:ind w:left="1276" w:hanging="567"/>
+        <w:rPr>
+          <w:sz w:val="22"/>
+          <w:szCs w:val="22"/>
+        </w:rPr>
+      </w:pPr>
+      <w:r>
+        <w:rPr>
+          <w:color w:val="E97132" w:themeColor="accent2"/>
+          <w:sz w:val="22"/>
+          <w:szCs w:val="22"/>
+        </w:rPr>
+        <w:t xml:space="preserve">US-1: </w:t>
+      </w:r>
+      <w:r>
+        <w:rPr>
+          <w:sz w:val="22"/>
+          <w:szCs w:val="22"/>
+        </w:rPr>
+        <w:t>As a restaurant manager, I want to view all historical orders with their associated financial data, filtered by time range and status, so that I can monitor operational performance and revenue trends.</w:t>
+      </w:r>
+    </w:p>
+    <w:p>
+      <w:pPr>
+        <w:ind w:left="1276" w:hanging="567"/>
+        <w:rPr>
+          <w:sz w:val="22"/>
+          <w:szCs w:val="22"/>
+        </w:rPr>
+      </w:pPr>
+      <w:r>
+        <w:rPr>
+          <w:color w:val="E97132" w:themeColor="accent2"/>
+          <w:sz w:val="22"/>
+          <w:szCs w:val="22"/>
+        </w:rPr>
+        <w:t xml:space="preserve">US-2: </w:t>
+      </w:r>
+      <w:r>
+        <w:rPr>
+          <w:sz w:val="22"/>
+          <w:szCs w:val="22"/>
+        </w:rPr>
+        <w:t>As a restaurant manager, I want to add, edit, and delete items in the menu, so that I can keep the product catalogue accurate and up to date.</w:t>
+      </w:r>
+    </w:p>
+    <w:p>
+      <w:pPr>
+        <w:ind w:left="1276" w:hanging="567"/>
+        <w:rPr>
+          <w:sz w:val="22"/>
+          <w:szCs w:val="22"/>
+        </w:rPr>
+      </w:pPr>
+      <w:r>
+        <w:rPr>
+          <w:color w:val="E97132" w:themeColor="accent2"/>
+          <w:sz w:val="22"/>
+          <w:szCs w:val="22"/>
+        </w:rPr>
+        <w:t xml:space="preserve">US-3 </w:t>
+      </w:r>
+      <w:r>
+        <w:rPr>
+          <w:sz w:val="22"/>
+          <w:szCs w:val="22"/>
+        </w:rPr>
+        <w:t>As a restaurant manager, I want to manage the staff accounts registered in the system, so that I can control access permissions and maintain an accurate list of active personnel.</w:t>
+      </w:r>
+    </w:p>
+    <w:p>
+      <w:pPr>
+        <w:ind w:left="1276" w:hanging="567"/>
+        <w:rPr>
+          <w:color w:val="ADADAD" w:themeColor="background2" w:themeShade="BF"/>
+          <w:sz w:val="22"/>
+          <w:szCs w:val="22"/>
+        </w:rPr>
+      </w:pPr>
+      <w:r>
+        <w:rPr>
+          <w:color w:val="ADADAD" w:themeColor="background2" w:themeShade="BF"/>
+          <w:sz w:val="22"/>
+          <w:szCs w:val="22"/>
+        </w:rPr>
+        <w:t>(Waiter)</w:t>
+      </w:r>
+    </w:p>
+    <w:p>
+      <w:pPr>
+        <w:ind w:left="1276" w:hanging="567"/>
+        <w:rPr>
+          <w:sz w:val="22"/>
+          <w:szCs w:val="22"/>
+        </w:rPr>
+      </w:pPr>
+      <w:r>
+        <w:rPr>
+          <w:color w:val="E97132" w:themeColor="accent2"/>
+          <w:sz w:val="22"/>
+          <w:szCs w:val="22"/>
+        </w:rPr>
+        <w:t>US-</w:t>
+      </w:r>
+      <w:r>
+        <w:rPr>
+          <w:color w:val="E97132" w:themeColor="accent2"/>
+          <w:sz w:val="22"/>
+          <w:szCs w:val="22"/>
+        </w:rPr>
+        <w:t>4</w:t>
+      </w:r>
+      <w:r>
+        <w:rPr>
+          <w:color w:val="E97132" w:themeColor="accent2"/>
+          <w:sz w:val="22"/>
+          <w:szCs w:val="22"/>
+        </w:rPr>
+        <w:t xml:space="preserve">: </w:t>
+      </w:r>
+      <w:r>
+        <w:rPr>
+          <w:sz w:val="22"/>
+          <w:szCs w:val="22"/>
+        </w:rPr>
+        <w:t>As a waiter, I want to compose and send an order for a specific table by selecting items from the menu, so that the kitchen and the cash desk are immediately notified of what the customer has requested.</w:t>
+      </w:r>
+    </w:p>
+    <w:p>
+      <w:pPr>
+        <w:ind w:left="1276" w:hanging="567"/>
+        <w:rPr>
+          <w:sz w:val="22"/>
+          <w:szCs w:val="22"/>
+        </w:rPr>
+      </w:pPr>
+      <w:r>
+        <w:rPr>
+          <w:color w:val="E97132" w:themeColor="accent2"/>
+          <w:sz w:val="22"/>
+          <w:szCs w:val="22"/>
+        </w:rPr>
+        <w:t>US-</w:t>
+      </w:r>
+      <w:r>
+        <w:rPr>
+          <w:color w:val="E97132" w:themeColor="accent2"/>
+          <w:sz w:val="22"/>
+          <w:szCs w:val="22"/>
+        </w:rPr>
+        <w:t>5</w:t>
+      </w:r>
+      <w:r>
+        <w:rPr>
+          <w:color w:val="E97132" w:themeColor="accent2"/>
+          <w:sz w:val="22"/>
+          <w:szCs w:val="22"/>
+        </w:rPr>
+        <w:t xml:space="preserve">: </w:t>
+      </w:r>
+      <w:r>
+        <w:rPr>
+          <w:sz w:val="22"/>
+          <w:szCs w:val="22"/>
+        </w:rPr>
+        <w:t>As a waiter, I want to apply predefined customization options to an order item and add a free-text note to the entire order, so that the kitchen receives accurate preparation instructions reflecting the customer's preferences.</w:t>
+      </w:r>
+    </w:p>
+    <w:p>
+      <w:pPr>
+        <w:ind w:left="1276" w:hanging="567"/>
+        <w:rPr>
+          <w:color w:val="ADADAD" w:themeColor="background2" w:themeShade="BF"/>
+          <w:sz w:val="22"/>
+          <w:szCs w:val="22"/>
+        </w:rPr>
+      </w:pPr>
+      <w:r>
+        <w:rPr>
+          <w:color w:val="E97132" w:themeColor="accent2"/>
+          <w:sz w:val="22"/>
+          <w:szCs w:val="22"/>
+        </w:rPr>
+        <w:t>US-</w:t>
+      </w:r>
+      <w:r>
+        <w:rPr>
+          <w:color w:val="E97132" w:themeColor="accent2"/>
+          <w:sz w:val="22"/>
+          <w:szCs w:val="22"/>
+        </w:rPr>
+        <w:t>6</w:t>
+      </w:r>
+      <w:r>
+        <w:rPr>
+          <w:color w:val="E97132" w:themeColor="accent2"/>
+          <w:sz w:val="22"/>
+          <w:szCs w:val="22"/>
+        </w:rPr>
+        <w:t xml:space="preserve">: </w:t>
+      </w:r>
+      <w:r>
+        <w:rPr>
+          <w:sz w:val="22"/>
+          <w:szCs w:val="22"/>
+        </w:rPr>
+        <w:t>As a waiter, I want to remove an order item from the cart before confirming the order, so that I can correct mistakes or accommodate last-minute changes from the customer.</w:t>
+      </w:r>
+    </w:p>
+    <w:p>
+      <w:pPr>
+        <w:ind w:left="1276" w:hanging="567"/>
+        <w:rPr>
+          <w:color w:val="ADADAD" w:themeColor="background2" w:themeShade="BF"/>
+          <w:sz w:val="22"/>
+          <w:szCs w:val="22"/>
+        </w:rPr>
+      </w:pPr>
+      <w:r>
+        <w:rPr>
+          <w:color w:val="ADADAD" w:themeColor="background2" w:themeShade="BF"/>
+          <w:sz w:val="22"/>
+          <w:szCs w:val="22"/>
+        </w:rPr>
+        <w:t>(Kitchen Staff)</w:t>
+      </w:r>
+    </w:p>
+    <w:p>
+      <w:pPr>
+        <w:ind w:left="1276" w:hanging="567"/>
+        <w:rPr>
+          <w:sz w:val="22"/>
+          <w:szCs w:val="22"/>
+        </w:rPr>
+      </w:pPr>
+      <w:r>
+        <w:rPr>
+          <w:color w:val="E97132" w:themeColor="accent2"/>
+          <w:sz w:val="22"/>
+          <w:szCs w:val="22"/>
+        </w:rPr>
+        <w:t>US-</w:t>
+      </w:r>
+      <w:r>
+        <w:rPr>
+          <w:color w:val="E97132" w:themeColor="accent2"/>
+          <w:sz w:val="22"/>
+          <w:szCs w:val="22"/>
+        </w:rPr>
+        <w:t>7</w:t>
+      </w:r>
+      <w:r>
+        <w:rPr>
+          <w:color w:val="E97132" w:themeColor="accent2"/>
+          <w:sz w:val="22"/>
+          <w:szCs w:val="22"/>
+        </w:rPr>
+        <w:t xml:space="preserve">: </w:t>
+      </w:r>
+      <w:r>
+        <w:rPr>
+          <w:sz w:val="22"/>
+          <w:szCs w:val="22"/>
+        </w:rPr>
+        <w:t>As a kitchen staff member, I want to view all incoming orders filtered by the product categories assigned to my station, so that I can focus exclusively on the preparations relevant to my role without being distracted by unrelated orders.</w:t>
+      </w:r>
+    </w:p>
+    <w:p>
+      <w:pPr>
+        <w:ind w:left="1276" w:hanging="567"/>
+        <w:rPr>
+          <w:sz w:val="22"/>
+          <w:szCs w:val="22"/>
+        </w:rPr>
+      </w:pPr>
+      <w:r>
+        <w:rPr>
+          <w:color w:val="E97132" w:themeColor="accent2"/>
+          <w:sz w:val="22"/>
+          <w:szCs w:val="22"/>
+        </w:rPr>
+        <w:t xml:space="preserve">US-8: </w:t>
+      </w:r>
+      <w:r>
+        <w:rPr>
+          <w:sz w:val="22"/>
+          <w:szCs w:val="22"/>
+        </w:rPr>
+        <w:t>As a kitchen staff member, I want to mark an order as ready, so that the waiter is automatically notified and can proceed with delivery to the correct table.</w:t>
+      </w:r>
+    </w:p>
+    <w:p>
+      <w:pPr>
+        <w:ind w:left="1276" w:hanging="567"/>
+        <w:rPr>
+          <w:color w:val="ADADAD" w:themeColor="background2" w:themeShade="BF"/>
+          <w:sz w:val="22"/>
+          <w:szCs w:val="22"/>
+        </w:rPr>
+      </w:pPr>
+      <w:r>
+        <w:rPr>
+          <w:color w:val="ADADAD" w:themeColor="background2" w:themeShade="BF"/>
+          <w:sz w:val="22"/>
+          <w:szCs w:val="22"/>
+        </w:rPr>
+        <w:t>(Cashier)</w:t>
+      </w:r>
+    </w:p>
+    <w:p>
+      <w:pPr>
+        <w:ind w:left="1418" w:hanging="710"/>
+        <w:rPr>
+          <w:sz w:val="22"/>
+          <w:szCs w:val="22"/>
+        </w:rPr>
+      </w:pPr>
+      <w:r>
+        <w:rPr>
+          <w:color w:val="E97132" w:themeColor="accent2"/>
+          <w:sz w:val="22"/>
+          <w:szCs w:val="22"/>
+        </w:rPr>
+        <w:t xml:space="preserve">US-9: </w:t>
+      </w:r>
+      <w:r>
+        <w:rPr>
+          <w:sz w:val="22"/>
+          <w:szCs w:val="22"/>
+        </w:rPr>
+        <w:t>As a cashier, I want to view the complete list of order items associated with a specific table, including their individual prices at the time of ordering, so that I can verify the bill before presenting it to the customer.</w:t>
+      </w:r>
+    </w:p>
+    <w:p>
+      <w:pPr>
+        <w:ind w:left="1418" w:hanging="710"/>
+        <w:rPr>
+          <w:sz w:val="22"/>
+          <w:szCs w:val="22"/>
+        </w:rPr>
+      </w:pPr>
+      <w:r>
+        <w:rPr>
+          <w:color w:val="E97132" w:themeColor="accent2"/>
+          <w:sz w:val="22"/>
+          <w:szCs w:val="22"/>
+        </w:rPr>
+        <w:t xml:space="preserve">US-10: </w:t>
+      </w:r>
+      <w:r>
+        <w:rPr>
+          <w:sz w:val="22"/>
+          <w:szCs w:val="22"/>
+        </w:rPr>
+        <w:t>As a cashier, I want to calculate the total bill for a table, apply an optional discount, and close the order, so that the payment process is completed accurately and the order is removed from the active views of all other roles.</w:t>
+      </w:r>
+    </w:p>
+    <w:p>
+      <w:pPr>
+        <w:pStyle w:val="Heading2"/>
+      </w:pPr>
+      <w:bookmarkStart w:id="6" w:name="_Toc221461379"/>
+      <w:r>
+        <w:lastRenderedPageBreak/>
+        <w:t>FUN</w:t>
+      </w:r>
+      <w:r>
+        <w:t>C</w:t>
+      </w:r>
+      <w:r>
+        <w:t>TIONAL REQUIREMENTS:</w:t>
+      </w:r>
+      <w:bookmarkEnd w:id="6"/>
+    </w:p>
+    <w:p>
+      <w:pPr>
+        <w:ind w:right="1133"/>
+        <w:rPr>
+          <w:color w:val="ADADAD" w:themeColor="background2" w:themeShade="BF"/>
+        </w:rPr>
+      </w:pPr>
+      <w:r>
+        <w:rPr>
+          <w:color w:val="ADADAD" w:themeColor="background2" w:themeShade="BF"/>
+        </w:rPr>
+        <w:t>The following functional requirements are derived directly from the implemented codebase and are fully traceable to the User Stories defined in Section 1.2. Requirements are organized by functional domain.</w:t>
+      </w:r>
+    </w:p>
+    <w:p/>
+    <w:p>
+      <w:pPr>
+        <w:ind w:left="1701" w:hanging="993"/>
+      </w:pPr>
+      <w:r>
+        <w:rPr>
+          <w:color w:val="E97132" w:themeColor="accent2"/>
+        </w:rPr>
+        <w:t>F_R1</w:t>
+      </w:r>
+      <w:r>
+        <w:t xml:space="preserve">: </w:t>
+      </w:r>
+      <w:r>
+        <w:t>The system shall authenticate users by verifying their username against a stored hashed password, granting access exclusively to the role-specific dashboard corresponding to the authenticated account.</w:t>
+      </w:r>
+    </w:p>
+    <w:p>
+      <w:pPr>
+        <w:ind w:left="1701" w:hanging="993"/>
+      </w:pPr>
+      <w:r>
+        <w:rPr>
+          <w:color w:val="E97132" w:themeColor="accent2"/>
+        </w:rPr>
+        <w:t>F_R2</w:t>
+      </w:r>
+      <w:r>
+        <w:t>:</w:t>
       </w:r>
       <w:r>
         <w:t xml:space="preserve"> </w:t>
       </w:r>
-    </w:p>
-    <w:p>
-      <w:r>
-        <w:t xml:space="preserve">The stored data </w:t>
-      </w:r>
-      <w:r>
-        <w:t xml:space="preserve">(locally and </w:t>
-      </w:r>
-      <w:r>
-        <w:rPr>
-          <w:u w:val="single"/>
-        </w:rPr>
-        <w:t>not</w:t>
-      </w:r>
-      <w:r>
-        <w:t xml:space="preserve"> in the DB) </w:t>
-      </w:r>
-      <w:r>
-        <w:t>is extremally small</w:t>
-      </w:r>
-      <w:r>
-        <w:t xml:space="preserve">, so it’s not necessary a large amount of </w:t>
-      </w:r>
-      <w:r>
-        <w:t>storage.</w:t>
-      </w:r>
-    </w:p>
-    <w:p>
-      <w:r>
-        <w:t xml:space="preserve">The performance could change </w:t>
-      </w:r>
-      <w:r>
-        <w:t>depending on</w:t>
-      </w:r>
-      <w:r>
-        <w:t xml:space="preserve"> the hardware over the software run, </w:t>
-      </w:r>
-      <w:r>
-        <w:t>the most critical component is the connection speed to the DB and its performance</w:t>
-      </w:r>
-      <w:r>
-        <w:t>.</w:t>
-      </w:r>
-    </w:p>
-    <w:p>
-      <w:pPr>
-        <w:pStyle w:val="Heading3"/>
-      </w:pPr>
-      <w:bookmarkStart w:id="4" w:name="_Toc221461377"/>
-      <w:r>
-        <w:t>RELATED SYSTEMS, PROS AND CONS</w:t>
-      </w:r>
-      <w:bookmarkEnd w:id="4"/>
-    </w:p>
-    <w:p>
-      <w:r>
-        <w:t>Other systems related to the one described in this document are the following:</w:t>
-      </w:r>
-    </w:p>
-    <w:p>
+      <w:r>
+        <w:t>The system shall enforce role-based access control, ensuring that each user can access only the functionalities and views permitted for their assigned role (Manager, Waiter, Kitchen Staff, Cashier).</w:t>
+      </w:r>
+    </w:p>
+    <w:p>
+      <w:pPr>
+        <w:ind w:left="1701" w:hanging="993"/>
+      </w:pPr>
+      <w:r>
+        <w:rPr>
+          <w:color w:val="E97132" w:themeColor="accent2"/>
+        </w:rPr>
+        <w:t>F_R3</w:t>
+      </w:r>
+      <w:r>
+        <w:t xml:space="preserve">: </w:t>
+      </w:r>
+      <w:r>
+        <w:t>The system shall allow any authenticated user to change their account password, provided that the current password is correctly supplied and the new password satisfies the minimum length constraint.</w:t>
+      </w:r>
+    </w:p>
+    <w:p>
+      <w:pPr>
+        <w:ind w:left="1701" w:hanging="993"/>
+      </w:pPr>
+      <w:r>
+        <w:rPr>
+          <w:color w:val="E97132" w:themeColor="accent2"/>
+        </w:rPr>
+        <w:t>F_R4</w:t>
+      </w:r>
+      <w:r>
+        <w:t>:</w:t>
+      </w:r>
+      <w:r>
+        <w:t xml:space="preserve"> </w:t>
+      </w:r>
+      <w:r>
+        <w:t xml:space="preserve">The system shall allow a Waiter to compose an order for a specified table by selecting one or more items from the current menu </w:t>
+      </w:r>
+      <w:r>
+        <w:t>catalogue and</w:t>
+      </w:r>
+      <w:r>
+        <w:t xml:space="preserve"> optionally attaching a free-text note to the entire order.</w:t>
+      </w:r>
+    </w:p>
+    <w:p>
+      <w:pPr>
+        <w:ind w:left="1701" w:hanging="993"/>
+      </w:pPr>
+      <w:r>
+        <w:rPr>
+          <w:color w:val="E97132" w:themeColor="accent2"/>
+        </w:rPr>
+        <w:t>F_R5</w:t>
+      </w:r>
+      <w:r>
+        <w:t xml:space="preserve">: </w:t>
+      </w:r>
+      <w:r>
+        <w:t>The system shall allow a Waiter to remove individual items from the local cart at any point during order composition, prior to submission.</w:t>
+      </w:r>
+    </w:p>
+    <w:p>
+      <w:pPr>
+        <w:ind w:left="1701" w:hanging="993"/>
+      </w:pPr>
+      <w:r>
+        <w:rPr>
+          <w:color w:val="E97132" w:themeColor="accent2"/>
+        </w:rPr>
+        <w:t>F_R6</w:t>
+      </w:r>
+      <w:r>
+        <w:t xml:space="preserve">: </w:t>
+      </w:r>
+      <w:r>
+        <w:t xml:space="preserve">The system shall persist a confirmed order as a transactional unit, recording for each order item a </w:t>
+      </w:r>
       <w:r>
         <w:rPr>
           <w:b/>
           <w:bCs/>
         </w:rPr>
-        <w:t>Lightspeed Restaurant</w:t>
-      </w:r>
-      <w:r>
-        <w:br/>
-        <w:t>Lightspeed Restaurant is a commercial restaurant management system designed for handling orders, tables, staff roles and billing operations.</w:t>
-      </w:r>
-      <w:r>
-        <w:br/>
-        <w:t>Among its main advantages there is a very complete set of features, including inventory management, analytics and cloud-based access, which makes it suitable for medium and large restaurants.</w:t>
-      </w:r>
-      <w:r>
-        <w:br/>
-        <w:t xml:space="preserve">However, as a drawback, it is a closed and proprietary system, not easily customizable, </w:t>
-      </w:r>
-      <w:r>
-        <w:lastRenderedPageBreak/>
-        <w:t>and strongly dependent on a stable internet connection. Moreover, its complexity can be excessive for small restaurants and requires a non-negligible learning curve.</w:t>
-      </w:r>
-    </w:p>
-    <w:p>
+        <w:t>price snapshot</w:t>
+      </w:r>
+      <w:r>
+        <w:t xml:space="preserve"> and a </w:t>
+      </w:r>
       <w:r>
         <w:rPr>
           <w:b/>
           <w:bCs/>
         </w:rPr>
-        <w:t>Square for Restaurants</w:t>
-      </w:r>
-      <w:r>
-        <w:br/>
-        <w:t>Square for Restaurants is a point-of-sale system that allows order management, staff coordination and basic reporting functionalities.</w:t>
-      </w:r>
-      <w:r>
-        <w:br/>
-        <w:t>Its main strengths are the simplicity of use, the modern interface and the integration with payment systems.</w:t>
-      </w:r>
-      <w:r>
-        <w:br/>
-        <w:t>On the other hand, the system is primarily focused on sales and billing, offering limited flexibility in role-based workflow customization and internal process management. In addition, advanced features are available only through paid plans.</w:t>
-      </w:r>
-    </w:p>
-    <w:p>
-      <w:r>
-        <w:t>Compared to these systems, the developed application focuses on a clearer separation of roles (manager, waiter and kitchen staff) and on a structured internal architecture, prioritizing modularity and clarity of responsibilities over commercial completeness.</w:t>
-      </w:r>
-    </w:p>
-    <w:p/>
-    <w:p/>
-    <w:p>
-      <w:pPr>
-        <w:pStyle w:val="Heading2"/>
-      </w:pPr>
-      <w:bookmarkStart w:id="5" w:name="_Toc221461378"/>
-      <w:r>
-        <w:t>USER STOR</w:t>
-      </w:r>
-      <w:r>
-        <w:t>IES</w:t>
+        <w:t>cost snapshot</w:t>
+      </w:r>
+      <w:r>
+        <w:t xml:space="preserve"> capturing the selling price and production cost at the exact moment of order creation, independently of any subsequent modifications to the menu catalogue.</w:t>
+      </w:r>
+    </w:p>
+    <w:p>
+      <w:pPr>
+        <w:ind w:left="1701" w:hanging="992"/>
+      </w:pPr>
+      <w:r>
+        <w:rPr>
+          <w:color w:val="E97132" w:themeColor="accent2"/>
+        </w:rPr>
+        <w:t>F_R</w:t>
+      </w:r>
+      <w:r>
+        <w:rPr>
+          <w:color w:val="E97132" w:themeColor="accent2"/>
+        </w:rPr>
+        <w:t>7</w:t>
       </w:r>
       <w:r>
         <w:t>:</w:t>
       </w:r>
-      <w:bookmarkEnd w:id="5"/>
-    </w:p>
-    <w:p>
-      <w:pPr>
-        <w:ind w:left="1276" w:hanging="567"/>
+      <w:r>
+        <w:t xml:space="preserve"> </w:t>
+      </w:r>
+      <w:r>
+        <w:t>The system shall propagate order state changes (creation, status update, cancellation) to all connected client instances of the Kitchen and Cash Desk roles within the polling interval, by means of periodic database queries executed on a fixed-interval timeline.</w:t>
+      </w:r>
+    </w:p>
+    <w:p>
+      <w:pPr>
+        <w:ind w:left="1701" w:hanging="992"/>
       </w:pPr>
       <w:r>
         <w:rPr>
           <w:color w:val="E97132" w:themeColor="accent2"/>
         </w:rPr>
-        <w:t xml:space="preserve">US-1: </w:t>
-      </w:r>
-      <w:r>
-        <w:t xml:space="preserve">As a restaurant manager, I want to </w:t>
-      </w:r>
-      <w:r>
-        <w:t>keep track of all customer orders and their status</w:t>
-      </w:r>
-      <w:r>
-        <w:t xml:space="preserve">, so that I can improve service and </w:t>
-      </w:r>
-      <w:r>
-        <w:t>accuracy.</w:t>
-      </w:r>
-    </w:p>
-    <w:p>
-      <w:pPr>
-        <w:pStyle w:val="ListParagraph"/>
-        <w:ind w:left="1276" w:hanging="567"/>
-      </w:pPr>
+        <w:t>F_R</w:t>
+      </w:r>
       <w:r>
         <w:rPr>
           <w:color w:val="E97132" w:themeColor="accent2"/>
         </w:rPr>
-        <w:t>US-</w:t>
-      </w:r>
+        <w:t>8</w:t>
+      </w:r>
+      <w:r>
+        <w:t>:</w:t>
+      </w:r>
+      <w:r>
+        <w:t xml:space="preserve"> </w:t>
+      </w:r>
+      <w:r>
+        <w:t>The system shall allow Kitchen Staff to mark an order as ready, triggering a status transition that renders the order visible in the Waiter's notification view for delivery.</w:t>
+      </w:r>
+    </w:p>
+    <w:p>
+      <w:pPr>
+        <w:ind w:left="1701" w:hanging="992"/>
+      </w:pPr>
       <w:r>
         <w:rPr>
           <w:color w:val="E97132" w:themeColor="accent2"/>
         </w:rPr>
+        <w:t>F_R</w:t>
+      </w:r>
+      <w:r>
+        <w:rPr>
+          <w:color w:val="E97132" w:themeColor="accent2"/>
+        </w:rPr>
+        <w:t>9</w:t>
+      </w:r>
+      <w:r>
+        <w:t>:</w:t>
+      </w:r>
+      <w:r>
+        <w:t xml:space="preserve"> </w:t>
+      </w:r>
+      <w:r>
+        <w:t>The system shall automatically decompose an order containing items belonging to multiple product categories into distinct sub-orders, one per category, when the Kitchen Staff's split preference is enabled.</w:t>
+      </w:r>
+    </w:p>
+    <w:p>
+      <w:pPr>
+        <w:ind w:left="1701" w:hanging="992"/>
+      </w:pPr>
+      <w:r>
+        <w:rPr>
+          <w:color w:val="E97132" w:themeColor="accent2"/>
+        </w:rPr>
+        <w:t>F_R</w:t>
+      </w:r>
+      <w:r>
+        <w:rPr>
+          <w:color w:val="E97132" w:themeColor="accent2"/>
+        </w:rPr>
+        <w:t>10</w:t>
+      </w:r>
+      <w:r>
+        <w:t>:</w:t>
+      </w:r>
+      <w:r>
+        <w:t xml:space="preserve"> </w:t>
+      </w:r>
+      <w:r>
+        <w:t>The system shall allow a Cashier to apply an optional percentage-based or fixed discount to the total bill of a table before closing the order.</w:t>
+      </w:r>
+    </w:p>
+    <w:p>
+      <w:pPr>
+        <w:ind w:left="1701" w:hanging="992"/>
+      </w:pPr>
+      <w:r>
+        <w:rPr>
+          <w:color w:val="E97132" w:themeColor="accent2"/>
+        </w:rPr>
+        <w:lastRenderedPageBreak/>
+        <w:t>F_R</w:t>
+      </w:r>
+      <w:r>
+        <w:rPr>
+          <w:color w:val="E97132" w:themeColor="accent2"/>
+        </w:rPr>
+        <w:t>11</w:t>
+      </w:r>
+      <w:r>
+        <w:t>:</w:t>
+      </w:r>
+      <w:r>
+        <w:t xml:space="preserve"> </w:t>
+      </w:r>
+      <w:r>
+        <w:t>The system shall allow a Manager to add a new product to the menu catalogue, specifying its name, category, selling price, production cost, and allergen information.</w:t>
+      </w:r>
+    </w:p>
+    <w:p>
+      <w:pPr>
+        <w:ind w:left="1701" w:hanging="992"/>
+      </w:pPr>
+      <w:r>
+        <w:rPr>
+          <w:color w:val="E97132" w:themeColor="accent2"/>
+        </w:rPr>
+        <w:t>F_R1</w:t>
+      </w:r>
+      <w:r>
+        <w:rPr>
+          <w:color w:val="E97132" w:themeColor="accent2"/>
+        </w:rPr>
         <w:t>2</w:t>
       </w:r>
       <w:r>
@@ -3350,27 +5391,18 @@
         <w:t xml:space="preserve"> </w:t>
       </w:r>
       <w:r>
-        <w:t xml:space="preserve">As a waiter, I want to </w:t>
-      </w:r>
-      <w:r>
-        <w:t>send orders to the kitchen in real time</w:t>
-      </w:r>
-      <w:r>
-        <w:t xml:space="preserve">, so that customers receive their food </w:t>
-      </w:r>
-      <w:r>
-        <w:t>faster.</w:t>
-      </w:r>
-    </w:p>
-    <w:p>
-      <w:pPr>
-        <w:ind w:left="1276" w:hanging="567"/>
+        <w:t>The system shall allow a Manager to modify the attributes of an existing menu product.</w:t>
+      </w:r>
+    </w:p>
+    <w:p>
+      <w:pPr>
+        <w:ind w:left="1701" w:hanging="992"/>
       </w:pPr>
       <w:r>
         <w:rPr>
           <w:color w:val="E97132" w:themeColor="accent2"/>
         </w:rPr>
-        <w:t>US-</w:t>
+        <w:t>F_R1</w:t>
       </w:r>
       <w:r>
         <w:rPr>
@@ -3391,255 +5423,13 @@
         <w:t xml:space="preserve"> </w:t>
       </w:r>
       <w:r>
-        <w:t xml:space="preserve">As a cashier, I want to see everything a table has ordered, so that I can prepare the bill </w:t>
-      </w:r>
-      <w:r>
-        <w:t>efficiently.</w:t>
-      </w:r>
-    </w:p>
-    <w:p>
-      <w:pPr>
-        <w:pStyle w:val="ListParagraph"/>
-        <w:ind w:left="1276" w:hanging="567"/>
-      </w:pPr>
-      <w:r>
-        <w:rPr>
-          <w:color w:val="E97132" w:themeColor="accent2"/>
-        </w:rPr>
-        <w:t>US-</w:t>
-      </w:r>
-      <w:r>
-        <w:rPr>
-          <w:color w:val="E97132" w:themeColor="accent2"/>
-        </w:rPr>
-        <w:t>4</w:t>
-      </w:r>
-      <w:r>
-        <w:rPr>
-          <w:color w:val="E97132" w:themeColor="accent2"/>
-        </w:rPr>
-        <w:t>:</w:t>
-      </w:r>
-      <w:r>
-        <w:rPr>
-          <w:color w:val="E97132" w:themeColor="accent2"/>
-        </w:rPr>
-        <w:t xml:space="preserve"> </w:t>
-      </w:r>
-      <w:r>
-        <w:t>As a cashier, I want to see the total bill, so that I can charge the customer correctly.</w:t>
-      </w:r>
-    </w:p>
-    <w:p>
-      <w:pPr>
-        <w:ind w:left="1276" w:hanging="567"/>
-      </w:pPr>
-      <w:r>
-        <w:rPr>
-          <w:color w:val="E97132" w:themeColor="accent2"/>
-        </w:rPr>
-        <w:t>US-</w:t>
-      </w:r>
-      <w:r>
-        <w:rPr>
-          <w:color w:val="E97132" w:themeColor="accent2"/>
-        </w:rPr>
-        <w:t>5</w:t>
-      </w:r>
-      <w:r>
-        <w:rPr>
-          <w:color w:val="E97132" w:themeColor="accent2"/>
-        </w:rPr>
-        <w:t>:</w:t>
-      </w:r>
-      <w:r>
-        <w:rPr>
-          <w:color w:val="E97132" w:themeColor="accent2"/>
-        </w:rPr>
-        <w:t xml:space="preserve"> </w:t>
-      </w:r>
-      <w:r>
-        <w:t xml:space="preserve">As a waiter, I want to be able to </w:t>
-      </w:r>
-      <w:r>
-        <w:t>customize an order</w:t>
-      </w:r>
-      <w:r>
-        <w:t>, so that the customer can have a customized item.</w:t>
-      </w:r>
-    </w:p>
-    <w:p>
-      <w:pPr>
-        <w:ind w:left="1276" w:hanging="567"/>
-      </w:pPr>
-      <w:r>
-        <w:rPr>
-          <w:color w:val="E97132" w:themeColor="accent2"/>
-        </w:rPr>
-        <w:t>US-</w:t>
-      </w:r>
-      <w:r>
-        <w:rPr>
-          <w:color w:val="E97132" w:themeColor="accent2"/>
-        </w:rPr>
-        <w:t>6</w:t>
-      </w:r>
-      <w:r>
-        <w:rPr>
-          <w:color w:val="E97132" w:themeColor="accent2"/>
-        </w:rPr>
-        <w:t>:</w:t>
-      </w:r>
-      <w:r>
-        <w:rPr>
-          <w:color w:val="E97132" w:themeColor="accent2"/>
-        </w:rPr>
-        <w:t xml:space="preserve"> </w:t>
-      </w:r>
-      <w:r>
-        <w:t>As a waiter, I want to be able to delete</w:t>
-      </w:r>
-      <w:r>
-        <w:t xml:space="preserve"> </w:t>
-      </w:r>
-      <w:r>
-        <w:t>an order</w:t>
-      </w:r>
-      <w:r>
-        <w:t xml:space="preserve">, </w:t>
-      </w:r>
-      <w:r>
-        <w:t>so that I can easily handle situations when the customer changes their mind</w:t>
-      </w:r>
-      <w:r>
-        <w:t>.</w:t>
-      </w:r>
-    </w:p>
-    <w:p/>
-    <w:p>
-      <w:pPr>
-        <w:pStyle w:val="Heading2"/>
-      </w:pPr>
-      <w:bookmarkStart w:id="6" w:name="_Toc221461379"/>
-      <w:r>
-        <w:t>FUN</w:t>
-      </w:r>
-      <w:r>
-        <w:t>C</w:t>
-      </w:r>
-      <w:r>
-        <w:t>TIONAL REQUIREMENTS:</w:t>
-      </w:r>
-      <w:bookmarkEnd w:id="6"/>
-    </w:p>
-    <w:p>
-      <w:pPr>
-        <w:ind w:left="1701" w:hanging="993"/>
-      </w:pPr>
-      <w:r>
-        <w:rPr>
-          <w:color w:val="E97132" w:themeColor="accent2"/>
-        </w:rPr>
-        <w:t>F_Req1</w:t>
-      </w:r>
-      <w:r>
-        <w:t xml:space="preserve">: </w:t>
-      </w:r>
-      <w:r>
-        <w:t>The system shall persist all placed orders and their associated status throughout their lifecycle.</w:t>
-      </w:r>
-    </w:p>
-    <w:p>
-      <w:pPr>
-        <w:ind w:left="1701" w:hanging="993"/>
-      </w:pPr>
-      <w:r>
-        <w:rPr>
-          <w:color w:val="E97132" w:themeColor="accent2"/>
-        </w:rPr>
-        <w:t>F_Req2</w:t>
-      </w:r>
-      <w:r>
-        <w:t>:</w:t>
-      </w:r>
-      <w:r>
-        <w:t xml:space="preserve"> </w:t>
-      </w:r>
-      <w:r>
-        <w:t>The system shall notify all subscribed client components of order creation and status updates.</w:t>
-      </w:r>
-    </w:p>
-    <w:p>
-      <w:pPr>
-        <w:ind w:left="1701" w:hanging="993"/>
-      </w:pPr>
-      <w:r>
-        <w:rPr>
-          <w:color w:val="E97132" w:themeColor="accent2"/>
-        </w:rPr>
-        <w:lastRenderedPageBreak/>
-        <w:t>F_Req3</w:t>
-      </w:r>
-      <w:r>
-        <w:t xml:space="preserve">: </w:t>
-      </w:r>
-      <w:r>
-        <w:t>The system shall allow authorized users to retrieve active and historical orders associated with a specific table, with optional filtering by status and time range.</w:t>
-      </w:r>
-    </w:p>
-    <w:p>
-      <w:pPr>
-        <w:ind w:left="1701" w:hanging="993"/>
-      </w:pPr>
-      <w:r>
-        <w:rPr>
-          <w:color w:val="E97132" w:themeColor="accent2"/>
-        </w:rPr>
-        <w:t>F_Req4</w:t>
-      </w:r>
-      <w:r>
-        <w:t>:</w:t>
-      </w:r>
-      <w:r>
-        <w:t xml:space="preserve"> </w:t>
-      </w:r>
-      <w:r>
-        <w:t>The system shall compute and display the total bill for a table based on the prices of the associated order items at the time of ordering.</w:t>
+        <w:t>The system shall allow a Manager to permanently delete a product from the menu catalogue. Deletion shall not affect the historical integrity of past orders, which retain their recorded price snapshots independently.</w:t>
       </w:r>
     </w:p>
     <w:p>
       <w:pPr>
         <w:ind w:left="1701" w:hanging="992"/>
       </w:pPr>
-      <w:r>
-        <w:rPr>
-          <w:color w:val="E97132" w:themeColor="accent2"/>
-        </w:rPr>
-        <w:t>F_Req5</w:t>
-      </w:r>
-      <w:r>
-        <w:t xml:space="preserve">: </w:t>
-      </w:r>
-      <w:r>
-        <w:t>The system shall allow authorized users to add predefined customizations and free-text notes to individual order items.</w:t>
-      </w:r>
-    </w:p>
-    <w:p>
-      <w:pPr>
-        <w:ind w:left="1701" w:hanging="992"/>
-      </w:pPr>
-      <w:r>
-        <w:rPr>
-          <w:color w:val="E97132" w:themeColor="accent2"/>
-        </w:rPr>
-        <w:t>F_Req6</w:t>
-      </w:r>
-      <w:r>
-        <w:t xml:space="preserve">: </w:t>
-      </w:r>
-      <w:r>
-        <w:t>The system shall allow authorized users to delete an order or order item before billing confirmation.</w:t>
-      </w:r>
     </w:p>
     <w:p>
       <w:pPr>
@@ -3684,6 +5474,9 @@
         </w:rPr>
       </w:pPr>
       <w:r>
+        <w:rPr>
+          <w:noProof/>
+        </w:rPr>
         <w:drawing>
           <wp:anchor distT="0" distB="0" distL="114300" distR="114300" simplePos="0" relativeHeight="251798528" behindDoc="1" locked="0" layoutInCell="1" allowOverlap="1" wp14:anchorId="660E661E" wp14:editId="51256F90">
             <wp:simplePos x="0" y="0"/>
@@ -4642,7 +6435,7 @@
           </mc:Choice>
           <mc:Fallback>
             <w:pict>
-              <v:shapetype w14:anchorId="4484A07D" id="_x0000_t75" coordsize="21600,21600" o:spt="75" o:preferrelative="t" path="m@4@5l@4@11@9@11@9@5xe" filled="f" stroked="f">
+              <v:shapetype w14:anchorId="3BA3A284" id="_x0000_t75" coordsize="21600,21600" o:spt="75" o:preferrelative="t" path="m@4@5l@4@11@9@11@9@5xe" filled="f" stroked="f">
                 <v:stroke joinstyle="miter"/>
                 <v:formulas>
                   <v:f eqn="if lineDrawn pixelLineWidth 0"/>
@@ -4706,7 +6499,7 @@
           </mc:Choice>
           <mc:Fallback>
             <w:pict>
-              <v:shape w14:anchorId="0D2662D4" id="Ink 173" o:spid="_x0000_s1026" type="#_x0000_t75" style="position:absolute;margin-left:283.45pt;margin-top:220.9pt;width:1.25pt;height:9.55pt;z-index:251789312;visibility:visible;mso-wrap-style:square;mso-wrap-distance-left:9pt;mso-wrap-distance-top:0;mso-wrap-distance-right:9pt;mso-wrap-distance-bottom:0;mso-position-horizontal:absolute;mso-position-horizontal-relative:text;mso-position-vertical:absolute;mso-position-vertical-relative:text" o:gfxdata="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">
+              <v:shape w14:anchorId="53909309" id="Ink 173" o:spid="_x0000_s1026" type="#_x0000_t75" style="position:absolute;margin-left:283.45pt;margin-top:220.9pt;width:1.25pt;height:9.55pt;z-index:251789312;visibility:visible;mso-wrap-style:square;mso-wrap-distance-left:9pt;mso-wrap-distance-top:0;mso-wrap-distance-right:9pt;mso-wrap-distance-bottom:0;mso-position-horizontal:absolute;mso-position-horizontal-relative:text;mso-position-vertical:absolute;mso-position-vertical-relative:text" o:gfxdata="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">
                 <v:imagedata r:id="rId14" o:title=""/>
               </v:shape>
             </w:pict>
@@ -4751,7 +6544,7 @@
           </mc:Choice>
           <mc:Fallback>
             <w:pict>
-              <v:shape w14:anchorId="32607CC6" id="Ink 168" o:spid="_x0000_s1026" type="#_x0000_t75" style="position:absolute;margin-left:285.8pt;margin-top:113.4pt;width:6.8pt;height:6.45pt;z-index:251786240;visibility:visible;mso-wrap-style:square;mso-wrap-distance-left:9pt;mso-wrap-distance-top:0;mso-wrap-distance-right:9pt;mso-wrap-distance-bottom:0;mso-position-horizontal:absolute;mso-position-horizontal-relative:text;mso-position-vertical:absolute;mso-position-vertical-relative:text" o:gfxdata="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">
+              <v:shape w14:anchorId="06BDB101" id="Ink 168" o:spid="_x0000_s1026" type="#_x0000_t75" style="position:absolute;margin-left:285.8pt;margin-top:113.4pt;width:6.8pt;height:6.45pt;z-index:251786240;visibility:visible;mso-wrap-style:square;mso-wrap-distance-left:9pt;mso-wrap-distance-top:0;mso-wrap-distance-right:9pt;mso-wrap-distance-bottom:0;mso-position-horizontal:absolute;mso-position-horizontal-relative:text;mso-position-vertical:absolute;mso-position-vertical-relative:text" o:gfxdata="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">
                 <v:imagedata r:id="rId16" o:title=""/>
               </v:shape>
             </w:pict>
@@ -4796,7 +6589,7 @@
           </mc:Choice>
           <mc:Fallback>
             <w:pict>
-              <v:shape w14:anchorId="3BC2C6F8" id="Ink 167" o:spid="_x0000_s1026" type="#_x0000_t75" style="position:absolute;margin-left:47.25pt;margin-top:367.55pt;width:3.3pt;height:7.5pt;z-index:251785216;visibility:visible;mso-wrap-style:square;mso-wrap-distance-left:9pt;mso-wrap-distance-top:0;mso-wrap-distance-right:9pt;mso-wrap-distance-bottom:0;mso-position-horizontal:absolute;mso-position-horizontal-relative:text;mso-position-vertical:absolute;mso-position-vertical-relative:text" o:gfxdata="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">
+              <v:shape w14:anchorId="2976B7A1" id="Ink 167" o:spid="_x0000_s1026" type="#_x0000_t75" style="position:absolute;margin-left:47.25pt;margin-top:367.55pt;width:3.3pt;height:7.5pt;z-index:251785216;visibility:visible;mso-wrap-style:square;mso-wrap-distance-left:9pt;mso-wrap-distance-top:0;mso-wrap-distance-right:9pt;mso-wrap-distance-bottom:0;mso-position-horizontal:absolute;mso-position-horizontal-relative:text;mso-position-vertical:absolute;mso-position-vertical-relative:text" o:gfxdata="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">
                 <v:imagedata r:id="rId18" o:title=""/>
               </v:shape>
             </w:pict>
@@ -4841,7 +6634,7 @@
           </mc:Choice>
           <mc:Fallback>
             <w:pict>
-              <v:shape w14:anchorId="5CAE85B0" id="Ink 163" o:spid="_x0000_s1026" type="#_x0000_t75" style="position:absolute;margin-left:49.2pt;margin-top:241.15pt;width:4.3pt;height:5.6pt;z-index:251784192;visibility:visible;mso-wrap-style:square;mso-wrap-distance-left:9pt;mso-wrap-distance-top:0;mso-wrap-distance-right:9pt;mso-wrap-distance-bottom:0;mso-position-horizontal:absolute;mso-position-horizontal-relative:text;mso-position-vertical:absolute;mso-position-vertical-relative:text" o:gfxdata="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">
+              <v:shape w14:anchorId="0E34EE0B" id="Ink 163" o:spid="_x0000_s1026" type="#_x0000_t75" style="position:absolute;margin-left:49.2pt;margin-top:241.15pt;width:4.3pt;height:5.6pt;z-index:251784192;visibility:visible;mso-wrap-style:square;mso-wrap-distance-left:9pt;mso-wrap-distance-top:0;mso-wrap-distance-right:9pt;mso-wrap-distance-bottom:0;mso-position-horizontal:absolute;mso-position-horizontal-relative:text;mso-position-vertical:absolute;mso-position-vertical-relative:text" o:gfxdata="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">
                 <v:imagedata r:id="rId20" o:title=""/>
               </v:shape>
             </w:pict>
@@ -4889,7 +6682,7 @@
           </mc:Choice>
           <mc:Fallback>
             <w:pict>
-              <v:shape w14:anchorId="5FF7D26A" id="Ink 161" o:spid="_x0000_s1026" type="#_x0000_t75" style="position:absolute;margin-left:46.5pt;margin-top:240.4pt;width:1.25pt;height:7.3pt;z-index:251783168;visibility:visible;mso-wrap-style:square;mso-width-percent:0;mso-wrap-distance-left:9pt;mso-wrap-distance-top:0;mso-wrap-distance-right:9pt;mso-wrap-distance-bottom:0;mso-position-horizontal:absolute;mso-position-horizontal-relative:text;mso-position-vertical:absolute;mso-position-vertical-relative:text;mso-width-percent:0;mso-width-relative:margin" o:gfxdata="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">
+              <v:shape w14:anchorId="513834E3" id="Ink 161" o:spid="_x0000_s1026" type="#_x0000_t75" style="position:absolute;margin-left:46.5pt;margin-top:240.4pt;width:1.25pt;height:7.3pt;z-index:251783168;visibility:visible;mso-wrap-style:square;mso-width-percent:0;mso-wrap-distance-left:9pt;mso-wrap-distance-top:0;mso-wrap-distance-right:9pt;mso-wrap-distance-bottom:0;mso-position-horizontal:absolute;mso-position-horizontal-relative:text;mso-position-vertical:absolute;mso-position-vertical-relative:text;mso-width-percent:0;mso-width-relative:margin" o:gfxdata="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">
                 <v:imagedata r:id="rId22" o:title=""/>
               </v:shape>
             </w:pict>
@@ -4934,7 +6727,7 @@
           </mc:Choice>
           <mc:Fallback>
             <w:pict>
-              <v:shape w14:anchorId="11D5EBCE" id="Ink 154" o:spid="_x0000_s1026" type="#_x0000_t75" style="position:absolute;margin-left:-28.7pt;margin-top:202.6pt;width:1.3pt;height:12.25pt;z-index:251779072;visibility:visible;mso-wrap-style:square;mso-wrap-distance-left:9pt;mso-wrap-distance-top:0;mso-wrap-distance-right:9pt;mso-wrap-distance-bottom:0;mso-position-horizontal:absolute;mso-position-horizontal-relative:text;mso-position-vertical:absolute;mso-position-vertical-relative:text" o:gfxdata="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">
+              <v:shape w14:anchorId="5DE53B78" id="Ink 154" o:spid="_x0000_s1026" type="#_x0000_t75" style="position:absolute;margin-left:-28.7pt;margin-top:202.6pt;width:1.3pt;height:12.25pt;z-index:251779072;visibility:visible;mso-wrap-style:square;mso-wrap-distance-left:9pt;mso-wrap-distance-top:0;mso-wrap-distance-right:9pt;mso-wrap-distance-bottom:0;mso-position-horizontal:absolute;mso-position-horizontal-relative:text;mso-position-vertical:absolute;mso-position-vertical-relative:text" o:gfxdata="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">
                 <v:imagedata r:id="rId24" o:title=""/>
               </v:shape>
             </w:pict>
@@ -4979,7 +6772,7 @@
           </mc:Choice>
           <mc:Fallback>
             <w:pict>
-              <v:shape w14:anchorId="6CA91DB9" id="Ink 146" o:spid="_x0000_s1026" type="#_x0000_t75" style="position:absolute;margin-left:-31.2pt;margin-top:263.9pt;width:5.6pt;height:5.7pt;z-index:251776000;visibility:visible;mso-wrap-style:square;mso-wrap-distance-left:9pt;mso-wrap-distance-top:0;mso-wrap-distance-right:9pt;mso-wrap-distance-bottom:0;mso-position-horizontal:absolute;mso-position-horizontal-relative:text;mso-position-vertical:absolute;mso-position-vertical-relative:text" o:gfxdata="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">
+              <v:shape w14:anchorId="0D1F325D" id="Ink 146" o:spid="_x0000_s1026" type="#_x0000_t75" style="position:absolute;margin-left:-31.2pt;margin-top:263.9pt;width:5.6pt;height:5.7pt;z-index:251776000;visibility:visible;mso-wrap-style:square;mso-wrap-distance-left:9pt;mso-wrap-distance-top:0;mso-wrap-distance-right:9pt;mso-wrap-distance-bottom:0;mso-position-horizontal:absolute;mso-position-horizontal-relative:text;mso-position-vertical:absolute;mso-position-vertical-relative:text" o:gfxdata="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">
                 <v:imagedata r:id="rId26" o:title=""/>
               </v:shape>
             </w:pict>
@@ -5024,7 +6817,7 @@
           </mc:Choice>
           <mc:Fallback>
             <w:pict>
-              <v:shape w14:anchorId="1950B896" id="Ink 143" o:spid="_x0000_s1026" type="#_x0000_t75" style="position:absolute;margin-left:237.4pt;margin-top:365.65pt;width:4.45pt;height:9pt;z-index:251772928;visibility:visible;mso-wrap-style:square;mso-wrap-distance-left:9pt;mso-wrap-distance-top:0;mso-wrap-distance-right:9pt;mso-wrap-distance-bottom:0;mso-position-horizontal:absolute;mso-position-horizontal-relative:text;mso-position-vertical:absolute;mso-position-vertical-relative:text" o:gfxdata="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">
+              <v:shape w14:anchorId="6431EEC0" id="Ink 143" o:spid="_x0000_s1026" type="#_x0000_t75" style="position:absolute;margin-left:237.4pt;margin-top:365.65pt;width:4.45pt;height:9pt;z-index:251772928;visibility:visible;mso-wrap-style:square;mso-wrap-distance-left:9pt;mso-wrap-distance-top:0;mso-wrap-distance-right:9pt;mso-wrap-distance-bottom:0;mso-position-horizontal:absolute;mso-position-horizontal-relative:text;mso-position-vertical:absolute;mso-position-vertical-relative:text" o:gfxdata="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">
                 <v:imagedata r:id="rId28" o:title=""/>
               </v:shape>
             </w:pict>
@@ -5069,7 +6862,7 @@
           </mc:Choice>
           <mc:Fallback>
             <w:pict>
-              <v:shape w14:anchorId="30180D4D" id="Ink 142" o:spid="_x0000_s1026" type="#_x0000_t75" style="position:absolute;margin-left:96.4pt;margin-top:347.9pt;width:5.85pt;height:7.75pt;z-index:251771904;visibility:visible;mso-wrap-style:square;mso-wrap-distance-left:9pt;mso-wrap-distance-top:0;mso-wrap-distance-right:9pt;mso-wrap-distance-bottom:0;mso-position-horizontal:absolute;mso-position-horizontal-relative:text;mso-position-vertical:absolute;mso-position-vertical-relative:text" o:gfxdata="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">
+              <v:shape w14:anchorId="21286135" id="Ink 142" o:spid="_x0000_s1026" type="#_x0000_t75" style="position:absolute;margin-left:96.4pt;margin-top:347.9pt;width:5.85pt;height:7.75pt;z-index:251771904;visibility:visible;mso-wrap-style:square;mso-wrap-distance-left:9pt;mso-wrap-distance-top:0;mso-wrap-distance-right:9pt;mso-wrap-distance-bottom:0;mso-position-horizontal:absolute;mso-position-horizontal-relative:text;mso-position-vertical:absolute;mso-position-vertical-relative:text" o:gfxdata="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">
                 <v:imagedata r:id="rId30" o:title=""/>
               </v:shape>
             </w:pict>
@@ -5114,7 +6907,7 @@
           </mc:Choice>
           <mc:Fallback>
             <w:pict>
-              <v:shape w14:anchorId="233E1C96" id="Ink 141" o:spid="_x0000_s1026" type="#_x0000_t75" style="position:absolute;margin-left:178.25pt;margin-top:347pt;width:3.65pt;height:7.45pt;z-index:251770880;visibility:visible;mso-wrap-style:square;mso-wrap-distance-left:9pt;mso-wrap-distance-top:0;mso-wrap-distance-right:9pt;mso-wrap-distance-bottom:0;mso-position-horizontal:absolute;mso-position-horizontal-relative:text;mso-position-vertical:absolute;mso-position-vertical-relative:text" o:gfxdata="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">
+              <v:shape w14:anchorId="0A8BB48C" id="Ink 141" o:spid="_x0000_s1026" type="#_x0000_t75" style="position:absolute;margin-left:178.25pt;margin-top:347pt;width:3.65pt;height:7.45pt;z-index:251770880;visibility:visible;mso-wrap-style:square;mso-wrap-distance-left:9pt;mso-wrap-distance-top:0;mso-wrap-distance-right:9pt;mso-wrap-distance-bottom:0;mso-position-horizontal:absolute;mso-position-horizontal-relative:text;mso-position-vertical:absolute;mso-position-vertical-relative:text" o:gfxdata="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">
                 <v:imagedata r:id="rId32" o:title=""/>
               </v:shape>
             </w:pict>
@@ -5159,7 +6952,7 @@
           </mc:Choice>
           <mc:Fallback>
             <w:pict>
-              <v:shape w14:anchorId="7E221923" id="Ink 140" o:spid="_x0000_s1026" type="#_x0000_t75" style="position:absolute;margin-left:159.1pt;margin-top:250.9pt;width:3.65pt;height:6.45pt;z-index:251769856;visibility:visible;mso-wrap-style:square;mso-wrap-distance-left:9pt;mso-wrap-distance-top:0;mso-wrap-distance-right:9pt;mso-wrap-distance-bottom:0;mso-position-horizontal:absolute;mso-position-horizontal-relative:text;mso-position-vertical:absolute;mso-position-vertical-relative:text" o:gfxdata="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">
+              <v:shape w14:anchorId="0E128C3A" id="Ink 140" o:spid="_x0000_s1026" type="#_x0000_t75" style="position:absolute;margin-left:159.1pt;margin-top:250.9pt;width:3.65pt;height:6.45pt;z-index:251769856;visibility:visible;mso-wrap-style:square;mso-wrap-distance-left:9pt;mso-wrap-distance-top:0;mso-wrap-distance-right:9pt;mso-wrap-distance-bottom:0;mso-position-horizontal:absolute;mso-position-horizontal-relative:text;mso-position-vertical:absolute;mso-position-vertical-relative:text" o:gfxdata="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">
                 <v:imagedata r:id="rId34" o:title=""/>
               </v:shape>
             </w:pict>
@@ -5204,7 +6997,7 @@
           </mc:Choice>
           <mc:Fallback>
             <w:pict>
-              <v:shape w14:anchorId="2E152BBB" id="Ink 137" o:spid="_x0000_s1026" type="#_x0000_t75" style="position:absolute;margin-left:220.85pt;margin-top:245.95pt;width:6pt;height:6.35pt;z-index:251766784;visibility:visible;mso-wrap-style:square;mso-wrap-distance-left:9pt;mso-wrap-distance-top:0;mso-wrap-distance-right:9pt;mso-wrap-distance-bottom:0;mso-position-horizontal:absolute;mso-position-horizontal-relative:text;mso-position-vertical:absolute;mso-position-vertical-relative:text" o:gfxdata="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">
+              <v:shape w14:anchorId="09642557" id="Ink 137" o:spid="_x0000_s1026" type="#_x0000_t75" style="position:absolute;margin-left:220.85pt;margin-top:245.95pt;width:6pt;height:6.35pt;z-index:251766784;visibility:visible;mso-wrap-style:square;mso-wrap-distance-left:9pt;mso-wrap-distance-top:0;mso-wrap-distance-right:9pt;mso-wrap-distance-bottom:0;mso-position-horizontal:absolute;mso-position-horizontal-relative:text;mso-position-vertical:absolute;mso-position-vertical-relative:text" o:gfxdata="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">
                 <v:imagedata r:id="rId36" o:title=""/>
               </v:shape>
             </w:pict>
@@ -5249,7 +7042,7 @@
           </mc:Choice>
           <mc:Fallback>
             <w:pict>
-              <v:shape w14:anchorId="092882C7" id="Ink 124" o:spid="_x0000_s1026" type="#_x0000_t75" style="position:absolute;margin-left:199.4pt;margin-top:113pt;width:9.4pt;height:12.4pt;z-index:251756544;visibility:visible;mso-wrap-style:square;mso-wrap-distance-left:9pt;mso-wrap-distance-top:0;mso-wrap-distance-right:9pt;mso-wrap-distance-bottom:0;mso-position-horizontal:absolute;mso-position-horizontal-relative:text;mso-position-vertical:absolute;mso-position-vertical-relative:text" o:gfxdata="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">
+              <v:shape w14:anchorId="5FFF724C" id="Ink 124" o:spid="_x0000_s1026" type="#_x0000_t75" style="position:absolute;margin-left:199.4pt;margin-top:113pt;width:9.4pt;height:12.4pt;z-index:251756544;visibility:visible;mso-wrap-style:square;mso-wrap-distance-left:9pt;mso-wrap-distance-top:0;mso-wrap-distance-right:9pt;mso-wrap-distance-bottom:0;mso-position-horizontal:absolute;mso-position-horizontal-relative:text;mso-position-vertical:absolute;mso-position-vertical-relative:text" o:gfxdata="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">
                 <v:imagedata r:id="rId38" o:title=""/>
               </v:shape>
             </w:pict>
@@ -5294,7 +7087,7 @@
           </mc:Choice>
           <mc:Fallback>
             <w:pict>
-              <v:shape w14:anchorId="565877E1" id="Ink 121" o:spid="_x0000_s1026" type="#_x0000_t75" style="position:absolute;margin-left:102.75pt;margin-top:103.15pt;width:11.75pt;height:18pt;z-index:251753472;visibility:visible;mso-wrap-style:square;mso-wrap-distance-left:9pt;mso-wrap-distance-top:0;mso-wrap-distance-right:9pt;mso-wrap-distance-bottom:0;mso-position-horizontal:absolute;mso-position-horizontal-relative:text;mso-position-vertical:absolute;mso-position-vertical-relative:text" o:gfxdata="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">
+              <v:shape w14:anchorId="101381FE" id="Ink 121" o:spid="_x0000_s1026" type="#_x0000_t75" style="position:absolute;margin-left:102.75pt;margin-top:103.15pt;width:11.75pt;height:18pt;z-index:251753472;visibility:visible;mso-wrap-style:square;mso-wrap-distance-left:9pt;mso-wrap-distance-top:0;mso-wrap-distance-right:9pt;mso-wrap-distance-bottom:0;mso-position-horizontal:absolute;mso-position-horizontal-relative:text;mso-position-vertical:absolute;mso-position-vertical-relative:text" o:gfxdata="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">
                 <v:imagedata r:id="rId40" o:title=""/>
               </v:shape>
             </w:pict>
@@ -5345,7 +7138,7 @@
           </mc:Choice>
           <mc:Fallback>
             <w:pict>
-              <v:shape w14:anchorId="65E79A34" id="Ink 120" o:spid="_x0000_s1026" type="#_x0000_t75" style="position:absolute;margin-left:99.5pt;margin-top:111.7pt;width:10.45pt;height:8.95pt;z-index:251752448;visibility:visible;mso-wrap-style:square;mso-width-percent:0;mso-height-percent:0;mso-wrap-distance-left:9pt;mso-wrap-distance-top:0;mso-wrap-distance-right:9pt;mso-wrap-distance-bottom:0;mso-position-horizontal:absolute;mso-position-horizontal-relative:text;mso-position-vertical:absolute;mso-position-vertical-relative:text;mso-width-percent:0;mso-height-percent:0;mso-width-relative:margin;mso-height-relative:margin" o:gfxdata="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">
+              <v:shape w14:anchorId="6CC4194B" id="Ink 120" o:spid="_x0000_s1026" type="#_x0000_t75" style="position:absolute;margin-left:99.5pt;margin-top:111.7pt;width:10.45pt;height:8.95pt;z-index:251752448;visibility:visible;mso-wrap-style:square;mso-width-percent:0;mso-height-percent:0;mso-wrap-distance-left:9pt;mso-wrap-distance-top:0;mso-wrap-distance-right:9pt;mso-wrap-distance-bottom:0;mso-position-horizontal:absolute;mso-position-horizontal-relative:text;mso-position-vertical:absolute;mso-position-vertical-relative:text;mso-width-percent:0;mso-height-percent:0;mso-width-relative:margin;mso-height-relative:margin" o:gfxdata="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">
                 <v:imagedata r:id="rId42" o:title=""/>
               </v:shape>
             </w:pict>
@@ -5390,7 +7183,7 @@
           </mc:Choice>
           <mc:Fallback>
             <w:pict>
-              <v:shape w14:anchorId="1BD008EC" id="Ink 115" o:spid="_x0000_s1026" type="#_x0000_t75" style="position:absolute;margin-left:113.7pt;margin-top:382.15pt;width:43.15pt;height:15.55pt;z-index:251748352;visibility:visible;mso-wrap-style:square;mso-wrap-distance-left:9pt;mso-wrap-distance-top:0;mso-wrap-distance-right:9pt;mso-wrap-distance-bottom:0;mso-position-horizontal:absolute;mso-position-horizontal-relative:text;mso-position-vertical:absolute;mso-position-vertical-relative:text" o:gfxdata="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">
+              <v:shape w14:anchorId="653D8B78" id="Ink 115" o:spid="_x0000_s1026" type="#_x0000_t75" style="position:absolute;margin-left:113.7pt;margin-top:382.15pt;width:43.15pt;height:15.55pt;z-index:251748352;visibility:visible;mso-wrap-style:square;mso-wrap-distance-left:9pt;mso-wrap-distance-top:0;mso-wrap-distance-right:9pt;mso-wrap-distance-bottom:0;mso-position-horizontal:absolute;mso-position-horizontal-relative:text;mso-position-vertical:absolute;mso-position-vertical-relative:text" o:gfxdata="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">
                 <v:imagedata r:id="rId44" o:title=""/>
               </v:shape>
             </w:pict>
@@ -5435,7 +7228,7 @@
           </mc:Choice>
           <mc:Fallback>
             <w:pict>
-              <v:shape w14:anchorId="322CCCD4" id="Ink 110" o:spid="_x0000_s1026" type="#_x0000_t75" style="position:absolute;margin-left:108.25pt;margin-top:393.35pt;width:8.55pt;height:1.6pt;z-index:251745280;visibility:visible;mso-wrap-style:square;mso-wrap-distance-left:9pt;mso-wrap-distance-top:0;mso-wrap-distance-right:9pt;mso-wrap-distance-bottom:0;mso-position-horizontal:absolute;mso-position-horizontal-relative:text;mso-position-vertical:absolute;mso-position-vertical-relative:text" o:gfxdata="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">
+              <v:shape w14:anchorId="53881743" id="Ink 110" o:spid="_x0000_s1026" type="#_x0000_t75" style="position:absolute;margin-left:108.25pt;margin-top:393.35pt;width:8.55pt;height:1.6pt;z-index:251745280;visibility:visible;mso-wrap-style:square;mso-wrap-distance-left:9pt;mso-wrap-distance-top:0;mso-wrap-distance-right:9pt;mso-wrap-distance-bottom:0;mso-position-horizontal:absolute;mso-position-horizontal-relative:text;mso-position-vertical:absolute;mso-position-vertical-relative:text" o:gfxdata="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">
                 <v:imagedata r:id="rId46" o:title=""/>
               </v:shape>
             </w:pict>
@@ -5480,7 +7273,7 @@
           </mc:Choice>
           <mc:Fallback>
             <w:pict>
-              <v:shape w14:anchorId="29656613" id="Ink 109" o:spid="_x0000_s1026" type="#_x0000_t75" style="position:absolute;margin-left:98.15pt;margin-top:384.75pt;width:6.05pt;height:6.1pt;z-index:251744256;visibility:visible;mso-wrap-style:square;mso-wrap-distance-left:9pt;mso-wrap-distance-top:0;mso-wrap-distance-right:9pt;mso-wrap-distance-bottom:0;mso-position-horizontal:absolute;mso-position-horizontal-relative:text;mso-position-vertical:absolute;mso-position-vertical-relative:text" o:gfxdata="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">
+              <v:shape w14:anchorId="4F569CEF" id="Ink 109" o:spid="_x0000_s1026" type="#_x0000_t75" style="position:absolute;margin-left:98.15pt;margin-top:384.75pt;width:6.05pt;height:6.1pt;z-index:251744256;visibility:visible;mso-wrap-style:square;mso-wrap-distance-left:9pt;mso-wrap-distance-top:0;mso-wrap-distance-right:9pt;mso-wrap-distance-bottom:0;mso-position-horizontal:absolute;mso-position-horizontal-relative:text;mso-position-vertical:absolute;mso-position-vertical-relative:text" o:gfxdata="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">
                 <v:imagedata r:id="rId48" o:title=""/>
               </v:shape>
             </w:pict>
@@ -5525,7 +7318,7 @@
           </mc:Choice>
           <mc:Fallback>
             <w:pict>
-              <v:shape w14:anchorId="2DEBC135" id="Ink 108" o:spid="_x0000_s1026" type="#_x0000_t75" style="position:absolute;margin-left:100.25pt;margin-top:297.7pt;width:13.2pt;height:93.3pt;z-index:251743232;visibility:visible;mso-wrap-style:square;mso-wrap-distance-left:9pt;mso-wrap-distance-top:0;mso-wrap-distance-right:9pt;mso-wrap-distance-bottom:0;mso-position-horizontal:absolute;mso-position-horizontal-relative:text;mso-position-vertical:absolute;mso-position-vertical-relative:text" o:gfxdata="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">
+              <v:shape w14:anchorId="56126400" id="Ink 108" o:spid="_x0000_s1026" type="#_x0000_t75" style="position:absolute;margin-left:100.25pt;margin-top:297.7pt;width:13.2pt;height:93.3pt;z-index:251743232;visibility:visible;mso-wrap-style:square;mso-wrap-distance-left:9pt;mso-wrap-distance-top:0;mso-wrap-distance-right:9pt;mso-wrap-distance-bottom:0;mso-position-horizontal:absolute;mso-position-horizontal-relative:text;mso-position-vertical:absolute;mso-position-vertical-relative:text" o:gfxdata="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">
                 <v:imagedata r:id="rId50" o:title=""/>
               </v:shape>
             </w:pict>
@@ -5570,7 +7363,7 @@
           </mc:Choice>
           <mc:Fallback>
             <w:pict>
-              <v:shape w14:anchorId="2615D37D" id="Ink 106" o:spid="_x0000_s1026" type="#_x0000_t75" style="position:absolute;margin-left:36.8pt;margin-top:359.2pt;width:27.15pt;height:2pt;z-index:251741184;visibility:visible;mso-wrap-style:square;mso-wrap-distance-left:9pt;mso-wrap-distance-top:0;mso-wrap-distance-right:9pt;mso-wrap-distance-bottom:0;mso-position-horizontal:absolute;mso-position-horizontal-relative:text;mso-position-vertical:absolute;mso-position-vertical-relative:text" o:gfxdata="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">
+              <v:shape w14:anchorId="587CC88D" id="Ink 106" o:spid="_x0000_s1026" type="#_x0000_t75" style="position:absolute;margin-left:36.8pt;margin-top:359.2pt;width:27.15pt;height:2pt;z-index:251741184;visibility:visible;mso-wrap-style:square;mso-wrap-distance-left:9pt;mso-wrap-distance-top:0;mso-wrap-distance-right:9pt;mso-wrap-distance-bottom:0;mso-position-horizontal:absolute;mso-position-horizontal-relative:text;mso-position-vertical:absolute;mso-position-vertical-relative:text" o:gfxdata="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">
                 <v:imagedata r:id="rId52" o:title=""/>
               </v:shape>
             </w:pict>
@@ -5615,7 +7408,7 @@
           </mc:Choice>
           <mc:Fallback>
             <w:pict>
-              <v:shape w14:anchorId="09DB674E" id="Ink 102" o:spid="_x0000_s1026" type="#_x0000_t75" style="position:absolute;margin-left:39.45pt;margin-top:384.05pt;width:5.5pt;height:5.4pt;z-index:251739136;visibility:visible;mso-wrap-style:square;mso-wrap-distance-left:9pt;mso-wrap-distance-top:0;mso-wrap-distance-right:9pt;mso-wrap-distance-bottom:0;mso-position-horizontal:absolute;mso-position-horizontal-relative:text;mso-position-vertical:absolute;mso-position-vertical-relative:text" o:gfxdata="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">
+              <v:shape w14:anchorId="328F235C" id="Ink 102" o:spid="_x0000_s1026" type="#_x0000_t75" style="position:absolute;margin-left:39.45pt;margin-top:384.05pt;width:5.5pt;height:5.4pt;z-index:251739136;visibility:visible;mso-wrap-style:square;mso-wrap-distance-left:9pt;mso-wrap-distance-top:0;mso-wrap-distance-right:9pt;mso-wrap-distance-bottom:0;mso-position-horizontal:absolute;mso-position-horizontal-relative:text;mso-position-vertical:absolute;mso-position-vertical-relative:text" o:gfxdata="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">
                 <v:imagedata r:id="rId54" o:title=""/>
               </v:shape>
             </w:pict>
@@ -5660,7 +7453,7 @@
           </mc:Choice>
           <mc:Fallback>
             <w:pict>
-              <v:shape w14:anchorId="306EC469" id="Ink 99" o:spid="_x0000_s1026" type="#_x0000_t75" style="position:absolute;margin-left:40.95pt;margin-top:359.45pt;width:7.45pt;height:29.3pt;z-index:251736064;visibility:visible;mso-wrap-style:square;mso-wrap-distance-left:9pt;mso-wrap-distance-top:0;mso-wrap-distance-right:9pt;mso-wrap-distance-bottom:0;mso-position-horizontal:absolute;mso-position-horizontal-relative:text;mso-position-vertical:absolute;mso-position-vertical-relative:text" o:gfxdata="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">
+              <v:shape w14:anchorId="1CCAD1E0" id="Ink 99" o:spid="_x0000_s1026" type="#_x0000_t75" style="position:absolute;margin-left:40.95pt;margin-top:359.45pt;width:7.45pt;height:29.3pt;z-index:251736064;visibility:visible;mso-wrap-style:square;mso-wrap-distance-left:9pt;mso-wrap-distance-top:0;mso-wrap-distance-right:9pt;mso-wrap-distance-bottom:0;mso-position-horizontal:absolute;mso-position-horizontal-relative:text;mso-position-vertical:absolute;mso-position-vertical-relative:text" o:gfxdata="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">
                 <v:imagedata r:id="rId56" o:title=""/>
               </v:shape>
             </w:pict>
@@ -5705,7 +7498,7 @@
           </mc:Choice>
           <mc:Fallback>
             <w:pict>
-              <v:shape w14:anchorId="520FE676" id="Ink 97" o:spid="_x0000_s1026" type="#_x0000_t75" style="position:absolute;margin-left:44.6pt;margin-top:264.85pt;width:5.2pt;height:5.1pt;z-index:251734016;visibility:visible;mso-wrap-style:square;mso-wrap-distance-left:9pt;mso-wrap-distance-top:0;mso-wrap-distance-right:9pt;mso-wrap-distance-bottom:0;mso-position-horizontal:absolute;mso-position-horizontal-relative:text;mso-position-vertical:absolute;mso-position-vertical-relative:text" o:gfxdata="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">
+              <v:shape w14:anchorId="5588F69E" id="Ink 97" o:spid="_x0000_s1026" type="#_x0000_t75" style="position:absolute;margin-left:44.6pt;margin-top:264.85pt;width:5.2pt;height:5.1pt;z-index:251734016;visibility:visible;mso-wrap-style:square;mso-wrap-distance-left:9pt;mso-wrap-distance-top:0;mso-wrap-distance-right:9pt;mso-wrap-distance-bottom:0;mso-position-horizontal:absolute;mso-position-horizontal-relative:text;mso-position-vertical:absolute;mso-position-vertical-relative:text" o:gfxdata="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">
                 <v:imagedata r:id="rId58" o:title=""/>
               </v:shape>
             </w:pict>
@@ -5750,7 +7543,7 @@
           </mc:Choice>
           <mc:Fallback>
             <w:pict>
-              <v:shape w14:anchorId="3FA66877" id="Ink 93" o:spid="_x0000_s1026" type="#_x0000_t75" style="position:absolute;margin-left:37.4pt;margin-top:215.3pt;width:10.95pt;height:54.55pt;z-index:251730944;visibility:visible;mso-wrap-style:square;mso-wrap-distance-left:9pt;mso-wrap-distance-top:0;mso-wrap-distance-right:9pt;mso-wrap-distance-bottom:0;mso-position-horizontal:absolute;mso-position-horizontal-relative:text;mso-position-vertical:absolute;mso-position-vertical-relative:text" o:gfxdata="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">
+              <v:shape w14:anchorId="26D801C2" id="Ink 93" o:spid="_x0000_s1026" type="#_x0000_t75" style="position:absolute;margin-left:37.4pt;margin-top:215.3pt;width:10.95pt;height:54.55pt;z-index:251730944;visibility:visible;mso-wrap-style:square;mso-wrap-distance-left:9pt;mso-wrap-distance-top:0;mso-wrap-distance-right:9pt;mso-wrap-distance-bottom:0;mso-position-horizontal:absolute;mso-position-horizontal-relative:text;mso-position-vertical:absolute;mso-position-vertical-relative:text" o:gfxdata="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">
                 <v:imagedata r:id="rId60" o:title=""/>
               </v:shape>
             </w:pict>
@@ -5801,7 +7594,7 @@
           </mc:Choice>
           <mc:Fallback>
             <w:pict>
-              <v:shape w14:anchorId="18C384F5" id="Ink 91" o:spid="_x0000_s1026" type="#_x0000_t75" style="position:absolute;margin-left:27.55pt;margin-top:214.5pt;width:13.25pt;height:1.75pt;z-index:251728896;visibility:visible;mso-wrap-style:square;mso-width-percent:0;mso-height-percent:0;mso-wrap-distance-left:9pt;mso-wrap-distance-top:0;mso-wrap-distance-right:9pt;mso-wrap-distance-bottom:0;mso-position-horizontal:absolute;mso-position-horizontal-relative:text;mso-position-vertical:absolute;mso-position-vertical-relative:text;mso-width-percent:0;mso-height-percent:0;mso-width-relative:margin;mso-height-relative:margin" o:gfxdata="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">
+              <v:shape w14:anchorId="48A905DC" id="Ink 91" o:spid="_x0000_s1026" type="#_x0000_t75" style="position:absolute;margin-left:27.55pt;margin-top:214.5pt;width:13.25pt;height:1.75pt;z-index:251728896;visibility:visible;mso-wrap-style:square;mso-width-percent:0;mso-height-percent:0;mso-wrap-distance-left:9pt;mso-wrap-distance-top:0;mso-wrap-distance-right:9pt;mso-wrap-distance-bottom:0;mso-position-horizontal:absolute;mso-position-horizontal-relative:text;mso-position-vertical:absolute;mso-position-vertical-relative:text;mso-width-percent:0;mso-height-percent:0;mso-width-relative:margin;mso-height-relative:margin" o:gfxdata="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">
                 <v:imagedata r:id="rId62" o:title=""/>
               </v:shape>
             </w:pict>
@@ -5846,7 +7639,7 @@
           </mc:Choice>
           <mc:Fallback>
             <w:pict>
-              <v:shape w14:anchorId="2510DDC7" id="Ink 89" o:spid="_x0000_s1026" type="#_x0000_t75" style="position:absolute;margin-left:-29.05pt;margin-top:156.65pt;width:36.85pt;height:112.35pt;z-index:251726848;visibility:visible;mso-wrap-style:square;mso-wrap-distance-left:9pt;mso-wrap-distance-top:0;mso-wrap-distance-right:9pt;mso-wrap-distance-bottom:0;mso-position-horizontal:absolute;mso-position-horizontal-relative:text;mso-position-vertical:absolute;mso-position-vertical-relative:text" o:gfxdata="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">
+              <v:shape w14:anchorId="53BCBB14" id="Ink 89" o:spid="_x0000_s1026" type="#_x0000_t75" style="position:absolute;margin-left:-29.05pt;margin-top:156.65pt;width:36.85pt;height:112.35pt;z-index:251726848;visibility:visible;mso-wrap-style:square;mso-wrap-distance-left:9pt;mso-wrap-distance-top:0;mso-wrap-distance-right:9pt;mso-wrap-distance-bottom:0;mso-position-horizontal:absolute;mso-position-horizontal-relative:text;mso-position-vertical:absolute;mso-position-vertical-relative:text" o:gfxdata="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">
                 <v:imagedata r:id="rId64" o:title=""/>
               </v:shape>
             </w:pict>
@@ -5891,7 +7684,7 @@
           </mc:Choice>
           <mc:Fallback>
             <w:pict>
-              <v:shape w14:anchorId="79880DFC" id="Ink 88" o:spid="_x0000_s1026" type="#_x0000_t75" style="position:absolute;margin-left:420.1pt;margin-top:133.8pt;width:6.4pt;height:10.95pt;z-index:251725824;visibility:visible;mso-wrap-style:square;mso-wrap-distance-left:9pt;mso-wrap-distance-top:0;mso-wrap-distance-right:9pt;mso-wrap-distance-bottom:0;mso-position-horizontal:absolute;mso-position-horizontal-relative:text;mso-position-vertical:absolute;mso-position-vertical-relative:text" o:gfxdata="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">
+              <v:shape w14:anchorId="62FC130A" id="Ink 88" o:spid="_x0000_s1026" type="#_x0000_t75" style="position:absolute;margin-left:420.1pt;margin-top:133.8pt;width:6.4pt;height:10.95pt;z-index:251725824;visibility:visible;mso-wrap-style:square;mso-wrap-distance-left:9pt;mso-wrap-distance-top:0;mso-wrap-distance-right:9pt;mso-wrap-distance-bottom:0;mso-position-horizontal:absolute;mso-position-horizontal-relative:text;mso-position-vertical:absolute;mso-position-vertical-relative:text" o:gfxdata="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">
                 <v:imagedata r:id="rId66" o:title=""/>
               </v:shape>
             </w:pict>
@@ -5936,7 +7729,7 @@
           </mc:Choice>
           <mc:Fallback>
             <w:pict>
-              <v:shape w14:anchorId="42335215" id="Ink 85" o:spid="_x0000_s1026" type="#_x0000_t75" style="position:absolute;margin-left:244.4pt;margin-top:92.05pt;width:181.9pt;height:49pt;z-index:251722752;visibility:visible;mso-wrap-style:square;mso-wrap-distance-left:9pt;mso-wrap-distance-top:0;mso-wrap-distance-right:9pt;mso-wrap-distance-bottom:0;mso-position-horizontal:absolute;mso-position-horizontal-relative:text;mso-position-vertical:absolute;mso-position-vertical-relative:text" o:gfxdata="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">
+              <v:shape w14:anchorId="491AAFE2" id="Ink 85" o:spid="_x0000_s1026" type="#_x0000_t75" style="position:absolute;margin-left:244.4pt;margin-top:92.05pt;width:181.9pt;height:49pt;z-index:251722752;visibility:visible;mso-wrap-style:square;mso-wrap-distance-left:9pt;mso-wrap-distance-top:0;mso-wrap-distance-right:9pt;mso-wrap-distance-bottom:0;mso-position-horizontal:absolute;mso-position-horizontal-relative:text;mso-position-vertical:absolute;mso-position-vertical-relative:text" o:gfxdata="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">
                 <v:imagedata r:id="rId68" o:title=""/>
               </v:shape>
             </w:pict>
@@ -5981,7 +7774,7 @@
           </mc:Choice>
           <mc:Fallback>
             <w:pict>
-              <v:shape w14:anchorId="317FC594" id="Ink 81" o:spid="_x0000_s1026" type="#_x0000_t75" style="position:absolute;margin-left:177.85pt;margin-top:380.95pt;width:6.15pt;height:6.4pt;z-index:251720704;visibility:visible;mso-wrap-style:square;mso-wrap-distance-left:9pt;mso-wrap-distance-top:0;mso-wrap-distance-right:9pt;mso-wrap-distance-bottom:0;mso-position-horizontal:absolute;mso-position-horizontal-relative:text;mso-position-vertical:absolute;mso-position-vertical-relative:text" o:gfxdata="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">
+              <v:shape w14:anchorId="2CC80FB0" id="Ink 81" o:spid="_x0000_s1026" type="#_x0000_t75" style="position:absolute;margin-left:177.85pt;margin-top:380.95pt;width:6.15pt;height:6.4pt;z-index:251720704;visibility:visible;mso-wrap-style:square;mso-wrap-distance-left:9pt;mso-wrap-distance-top:0;mso-wrap-distance-right:9pt;mso-wrap-distance-bottom:0;mso-position-horizontal:absolute;mso-position-horizontal-relative:text;mso-position-vertical:absolute;mso-position-vertical-relative:text" o:gfxdata="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">
                 <v:imagedata r:id="rId70" o:title=""/>
               </v:shape>
             </w:pict>
@@ -6026,7 +7819,7 @@
           </mc:Choice>
           <mc:Fallback>
             <w:pict>
-              <v:shape w14:anchorId="64A70AF4" id="Ink 80" o:spid="_x0000_s1026" type="#_x0000_t75" style="position:absolute;margin-left:167.55pt;margin-top:286.15pt;width:14.2pt;height:101.35pt;z-index:251719680;visibility:visible;mso-wrap-style:square;mso-wrap-distance-left:9pt;mso-wrap-distance-top:0;mso-wrap-distance-right:9pt;mso-wrap-distance-bottom:0;mso-position-horizontal:absolute;mso-position-horizontal-relative:text;mso-position-vertical:absolute;mso-position-vertical-relative:text" o:gfxdata="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">
+              <v:shape w14:anchorId="76611B63" id="Ink 80" o:spid="_x0000_s1026" type="#_x0000_t75" style="position:absolute;margin-left:167.55pt;margin-top:286.15pt;width:14.2pt;height:101.35pt;z-index:251719680;visibility:visible;mso-wrap-style:square;mso-wrap-distance-left:9pt;mso-wrap-distance-top:0;mso-wrap-distance-right:9pt;mso-wrap-distance-bottom:0;mso-position-horizontal:absolute;mso-position-horizontal-relative:text;mso-position-vertical:absolute;mso-position-vertical-relative:text" o:gfxdata="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">
                 <v:imagedata r:id="rId72" o:title=""/>
               </v:shape>
             </w:pict>
@@ -6071,7 +7864,7 @@
           </mc:Choice>
           <mc:Fallback>
             <w:pict>
-              <v:shape w14:anchorId="2C0DA55A" id="Ink 76" o:spid="_x0000_s1026" type="#_x0000_t75" style="position:absolute;margin-left:159.75pt;margin-top:217.9pt;width:24.7pt;height:1.2pt;z-index:251716608;visibility:visible;mso-wrap-style:square;mso-wrap-distance-left:9pt;mso-wrap-distance-top:0;mso-wrap-distance-right:9pt;mso-wrap-distance-bottom:0;mso-position-horizontal:absolute;mso-position-horizontal-relative:text;mso-position-vertical:absolute;mso-position-vertical-relative:text" o:gfxdata="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">
+              <v:shape w14:anchorId="651AF757" id="Ink 76" o:spid="_x0000_s1026" type="#_x0000_t75" style="position:absolute;margin-left:159.75pt;margin-top:217.9pt;width:24.7pt;height:1.2pt;z-index:251716608;visibility:visible;mso-wrap-style:square;mso-wrap-distance-left:9pt;mso-wrap-distance-top:0;mso-wrap-distance-right:9pt;mso-wrap-distance-bottom:0;mso-position-horizontal:absolute;mso-position-horizontal-relative:text;mso-position-vertical:absolute;mso-position-vertical-relative:text" o:gfxdata="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">
                 <v:imagedata r:id="rId74" o:title=""/>
               </v:shape>
             </w:pict>
@@ -6116,7 +7909,7 @@
           </mc:Choice>
           <mc:Fallback>
             <w:pict>
-              <v:shape w14:anchorId="07723421" id="Ink 74" o:spid="_x0000_s1026" type="#_x0000_t75" style="position:absolute;margin-left:186.25pt;margin-top:217.9pt;width:23.15pt;height:1.85pt;z-index:251714560;visibility:visible;mso-wrap-style:square;mso-wrap-distance-left:9pt;mso-wrap-distance-top:0;mso-wrap-distance-right:9pt;mso-wrap-distance-bottom:0;mso-position-horizontal:absolute;mso-position-horizontal-relative:text;mso-position-vertical:absolute;mso-position-vertical-relative:text" o:gfxdata="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">
+              <v:shape w14:anchorId="7EC05D5E" id="Ink 74" o:spid="_x0000_s1026" type="#_x0000_t75" style="position:absolute;margin-left:186.25pt;margin-top:217.9pt;width:23.15pt;height:1.85pt;z-index:251714560;visibility:visible;mso-wrap-style:square;mso-wrap-distance-left:9pt;mso-wrap-distance-top:0;mso-wrap-distance-right:9pt;mso-wrap-distance-bottom:0;mso-position-horizontal:absolute;mso-position-horizontal-relative:text;mso-position-vertical:absolute;mso-position-vertical-relative:text" o:gfxdata="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">
                 <v:imagedata r:id="rId76" o:title=""/>
               </v:shape>
             </w:pict>
@@ -6161,7 +7954,7 @@
           </mc:Choice>
           <mc:Fallback>
             <w:pict>
-              <v:shape w14:anchorId="24825CA9" id="Ink 71" o:spid="_x0000_s1026" type="#_x0000_t75" style="position:absolute;margin-left:245.5pt;margin-top:380.35pt;width:8.35pt;height:7.8pt;z-index:251712512;visibility:visible;mso-wrap-style:square;mso-wrap-distance-left:9pt;mso-wrap-distance-top:0;mso-wrap-distance-right:9pt;mso-wrap-distance-bottom:0;mso-position-horizontal:absolute;mso-position-horizontal-relative:text;mso-position-vertical:absolute;mso-position-vertical-relative:text" o:gfxdata="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">
+              <v:shape w14:anchorId="2785F74F" id="Ink 71" o:spid="_x0000_s1026" type="#_x0000_t75" style="position:absolute;margin-left:245.5pt;margin-top:380.35pt;width:8.35pt;height:7.8pt;z-index:251712512;visibility:visible;mso-wrap-style:square;mso-wrap-distance-left:9pt;mso-wrap-distance-top:0;mso-wrap-distance-right:9pt;mso-wrap-distance-bottom:0;mso-position-horizontal:absolute;mso-position-horizontal-relative:text;mso-position-vertical:absolute;mso-position-vertical-relative:text" o:gfxdata="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">
                 <v:imagedata r:id="rId78" o:title=""/>
               </v:shape>
             </w:pict>
@@ -6206,7 +7999,7 @@
           </mc:Choice>
           <mc:Fallback>
             <w:pict>
-              <v:shape w14:anchorId="2259961B" id="Ink 68" o:spid="_x0000_s1026" type="#_x0000_t75" style="position:absolute;margin-left:231.6pt;margin-top:317.9pt;width:20.25pt;height:68.55pt;z-index:251709440;visibility:visible;mso-wrap-style:square;mso-wrap-distance-left:9pt;mso-wrap-distance-top:0;mso-wrap-distance-right:9pt;mso-wrap-distance-bottom:0;mso-position-horizontal:absolute;mso-position-horizontal-relative:text;mso-position-vertical:absolute;mso-position-vertical-relative:text" o:gfxdata="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">
+              <v:shape w14:anchorId="4DF014E3" id="Ink 68" o:spid="_x0000_s1026" type="#_x0000_t75" style="position:absolute;margin-left:231.6pt;margin-top:317.9pt;width:20.25pt;height:68.55pt;z-index:251709440;visibility:visible;mso-wrap-style:square;mso-wrap-distance-left:9pt;mso-wrap-distance-top:0;mso-wrap-distance-right:9pt;mso-wrap-distance-bottom:0;mso-position-horizontal:absolute;mso-position-horizontal-relative:text;mso-position-vertical:absolute;mso-position-vertical-relative:text" o:gfxdata="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">
                 <v:imagedata r:id="rId80" o:title=""/>
               </v:shape>
             </w:pict>
@@ -6257,7 +8050,7 @@
           </mc:Choice>
           <mc:Fallback>
             <w:pict>
-              <v:shape w14:anchorId="0A4BEBBE" id="Ink 66" o:spid="_x0000_s1026" type="#_x0000_t75" style="position:absolute;margin-left:194.35pt;margin-top:317.2pt;width:41.5pt;height:2.5pt;z-index:251707392;visibility:visible;mso-wrap-style:square;mso-width-percent:0;mso-height-percent:0;mso-wrap-distance-left:9pt;mso-wrap-distance-top:0;mso-wrap-distance-right:9pt;mso-wrap-distance-bottom:0;mso-position-horizontal:absolute;mso-position-horizontal-relative:text;mso-position-vertical:absolute;mso-position-vertical-relative:text;mso-width-percent:0;mso-height-percent:0;mso-width-relative:margin;mso-height-relative:margin" o:gfxdata="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">
+              <v:shape w14:anchorId="2285186D" id="Ink 66" o:spid="_x0000_s1026" type="#_x0000_t75" style="position:absolute;margin-left:194.35pt;margin-top:317.2pt;width:41.5pt;height:2.5pt;z-index:251707392;visibility:visible;mso-wrap-style:square;mso-width-percent:0;mso-height-percent:0;mso-wrap-distance-left:9pt;mso-wrap-distance-top:0;mso-wrap-distance-right:9pt;mso-wrap-distance-bottom:0;mso-position-horizontal:absolute;mso-position-horizontal-relative:text;mso-position-vertical:absolute;mso-position-vertical-relative:text;mso-width-percent:0;mso-height-percent:0;mso-width-relative:margin;mso-height-relative:margin" o:gfxdata="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">
                 <v:imagedata r:id="rId82" o:title=""/>
               </v:shape>
             </w:pict>
@@ -6302,7 +8095,7 @@
           </mc:Choice>
           <mc:Fallback>
             <w:pict>
-              <v:shape w14:anchorId="3C6AD3DB" id="Ink 64" o:spid="_x0000_s1026" type="#_x0000_t75" style="position:absolute;margin-left:218.35pt;margin-top:263.2pt;width:7.65pt;height:7.15pt;z-index:251705344;visibility:visible;mso-wrap-style:square;mso-wrap-distance-left:9pt;mso-wrap-distance-top:0;mso-wrap-distance-right:9pt;mso-wrap-distance-bottom:0;mso-position-horizontal:absolute;mso-position-horizontal-relative:text;mso-position-vertical:absolute;mso-position-vertical-relative:text" o:gfxdata="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">
+              <v:shape w14:anchorId="17911818" id="Ink 64" o:spid="_x0000_s1026" type="#_x0000_t75" style="position:absolute;margin-left:218.35pt;margin-top:263.2pt;width:7.65pt;height:7.15pt;z-index:251705344;visibility:visible;mso-wrap-style:square;mso-wrap-distance-left:9pt;mso-wrap-distance-top:0;mso-wrap-distance-right:9pt;mso-wrap-distance-bottom:0;mso-position-horizontal:absolute;mso-position-horizontal-relative:text;mso-position-vertical:absolute;mso-position-vertical-relative:text" o:gfxdata="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">
                 <v:imagedata r:id="rId84" o:title=""/>
               </v:shape>
             </w:pict>
@@ -6347,7 +8140,7 @@
           </mc:Choice>
           <mc:Fallback>
             <w:pict>
-              <v:shape w14:anchorId="3E7F36D7" id="Ink 61" o:spid="_x0000_s1026" type="#_x0000_t75" style="position:absolute;margin-left:199.9pt;margin-top:218.5pt;width:24pt;height:50.9pt;z-index:251702272;visibility:visible;mso-wrap-style:square;mso-wrap-distance-left:9pt;mso-wrap-distance-top:0;mso-wrap-distance-right:9pt;mso-wrap-distance-bottom:0;mso-position-horizontal:absolute;mso-position-horizontal-relative:text;mso-position-vertical:absolute;mso-position-vertical-relative:text" o:gfxdata="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">
+              <v:shape w14:anchorId="1012B23F" id="Ink 61" o:spid="_x0000_s1026" type="#_x0000_t75" style="position:absolute;margin-left:199.9pt;margin-top:218.5pt;width:24pt;height:50.9pt;z-index:251702272;visibility:visible;mso-wrap-style:square;mso-wrap-distance-left:9pt;mso-wrap-distance-top:0;mso-wrap-distance-right:9pt;mso-wrap-distance-bottom:0;mso-position-horizontal:absolute;mso-position-horizontal-relative:text;mso-position-vertical:absolute;mso-position-vertical-relative:text" o:gfxdata="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">
                 <v:imagedata r:id="rId86" o:title=""/>
               </v:shape>
             </w:pict>
@@ -6392,7 +8185,7 @@
           </mc:Choice>
           <mc:Fallback>
             <w:pict>
-              <v:shape w14:anchorId="50BD7190" id="Ink 59" o:spid="_x0000_s1026" type="#_x0000_t75" style="position:absolute;margin-left:146.5pt;margin-top:262.65pt;width:7.2pt;height:5.9pt;z-index:251700224;visibility:visible;mso-wrap-style:square;mso-wrap-distance-left:9pt;mso-wrap-distance-top:0;mso-wrap-distance-right:9pt;mso-wrap-distance-bottom:0;mso-position-horizontal:absolute;mso-position-horizontal-relative:text;mso-position-vertical:absolute;mso-position-vertical-relative:text" o:gfxdata="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">
+              <v:shape w14:anchorId="4DE90EEA" id="Ink 59" o:spid="_x0000_s1026" type="#_x0000_t75" style="position:absolute;margin-left:146.5pt;margin-top:262.65pt;width:7.2pt;height:5.9pt;z-index:251700224;visibility:visible;mso-wrap-style:square;mso-wrap-distance-left:9pt;mso-wrap-distance-top:0;mso-wrap-distance-right:9pt;mso-wrap-distance-bottom:0;mso-position-horizontal:absolute;mso-position-horizontal-relative:text;mso-position-vertical:absolute;mso-position-vertical-relative:text" o:gfxdata="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">
                 <v:imagedata r:id="rId88" o:title=""/>
               </v:shape>
             </w:pict>
@@ -6437,7 +8230,7 @@
           </mc:Choice>
           <mc:Fallback>
             <w:pict>
-              <v:shape w14:anchorId="09A48057" id="Ink 56" o:spid="_x0000_s1026" type="#_x0000_t75" style="position:absolute;margin-left:147.85pt;margin-top:218.65pt;width:21.35pt;height:49.95pt;z-index:251697152;visibility:visible;mso-wrap-style:square;mso-wrap-distance-left:9pt;mso-wrap-distance-top:0;mso-wrap-distance-right:9pt;mso-wrap-distance-bottom:0;mso-position-horizontal:absolute;mso-position-horizontal-relative:text;mso-position-vertical:absolute;mso-position-vertical-relative:text" o:gfxdata="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">
+              <v:shape w14:anchorId="0C90713E" id="Ink 56" o:spid="_x0000_s1026" type="#_x0000_t75" style="position:absolute;margin-left:147.85pt;margin-top:218.65pt;width:21.35pt;height:49.95pt;z-index:251697152;visibility:visible;mso-wrap-style:square;mso-wrap-distance-left:9pt;mso-wrap-distance-top:0;mso-wrap-distance-right:9pt;mso-wrap-distance-bottom:0;mso-position-horizontal:absolute;mso-position-horizontal-relative:text;mso-position-vertical:absolute;mso-position-vertical-relative:text" o:gfxdata="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">
                 <v:imagedata r:id="rId90" o:title=""/>
               </v:shape>
             </w:pict>
@@ -6482,7 +8275,7 @@
           </mc:Choice>
           <mc:Fallback>
             <w:pict>
-              <v:shape w14:anchorId="4A6B6745" id="Ink 54" o:spid="_x0000_s1026" type="#_x0000_t75" style="position:absolute;margin-left:302.6pt;margin-top:134.95pt;width:5pt;height:5.6pt;z-index:251695104;visibility:visible;mso-wrap-style:square;mso-wrap-distance-left:9pt;mso-wrap-distance-top:0;mso-wrap-distance-right:9pt;mso-wrap-distance-bottom:0;mso-position-horizontal:absolute;mso-position-horizontal-relative:text;mso-position-vertical:absolute;mso-position-vertical-relative:text" o:gfxdata="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">
+              <v:shape w14:anchorId="44D1F15C" id="Ink 54" o:spid="_x0000_s1026" type="#_x0000_t75" style="position:absolute;margin-left:302.6pt;margin-top:134.95pt;width:5pt;height:5.6pt;z-index:251695104;visibility:visible;mso-wrap-style:square;mso-wrap-distance-left:9pt;mso-wrap-distance-top:0;mso-wrap-distance-right:9pt;mso-wrap-distance-bottom:0;mso-position-horizontal:absolute;mso-position-horizontal-relative:text;mso-position-vertical:absolute;mso-position-vertical-relative:text" o:gfxdata="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">
                 <v:imagedata r:id="rId92" o:title=""/>
               </v:shape>
             </w:pict>
@@ -6533,7 +8326,7 @@
           </mc:Choice>
           <mc:Fallback>
             <w:pict>
-              <v:shape w14:anchorId="3BE47258" id="Ink 51" o:spid="_x0000_s1026" type="#_x0000_t75" style="position:absolute;margin-left:243.35pt;margin-top:99.3pt;width:64pt;height:40.95pt;z-index:251692032;visibility:visible;mso-wrap-style:square;mso-width-percent:0;mso-height-percent:0;mso-wrap-distance-left:9pt;mso-wrap-distance-top:0;mso-wrap-distance-right:9pt;mso-wrap-distance-bottom:0;mso-position-horizontal:absolute;mso-position-horizontal-relative:text;mso-position-vertical:absolute;mso-position-vertical-relative:text;mso-width-percent:0;mso-height-percent:0;mso-width-relative:margin;mso-height-relative:margin" o:gfxdata="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">
+              <v:shape w14:anchorId="550F276A" id="Ink 51" o:spid="_x0000_s1026" type="#_x0000_t75" style="position:absolute;margin-left:243.35pt;margin-top:99.3pt;width:64pt;height:40.95pt;z-index:251692032;visibility:visible;mso-wrap-style:square;mso-width-percent:0;mso-height-percent:0;mso-wrap-distance-left:9pt;mso-wrap-distance-top:0;mso-wrap-distance-right:9pt;mso-wrap-distance-bottom:0;mso-position-horizontal:absolute;mso-position-horizontal-relative:text;mso-position-vertical:absolute;mso-position-vertical-relative:text;mso-width-percent:0;mso-height-percent:0;mso-width-relative:margin;mso-height-relative:margin" o:gfxdata="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">
                 <v:imagedata r:id="rId94" o:title=""/>
               </v:shape>
             </w:pict>
@@ -6578,7 +8371,7 @@
           </mc:Choice>
           <mc:Fallback>
             <w:pict>
-              <v:shape w14:anchorId="739EA40A" id="Ink 49" o:spid="_x0000_s1026" type="#_x0000_t75" style="position:absolute;margin-left:283.65pt;margin-top:157.2pt;width:22.25pt;height:110.8pt;z-index:251689984;visibility:visible;mso-wrap-style:square;mso-wrap-distance-left:9pt;mso-wrap-distance-top:0;mso-wrap-distance-right:9pt;mso-wrap-distance-bottom:0;mso-position-horizontal:absolute;mso-position-horizontal-relative:text;mso-position-vertical:absolute;mso-position-vertical-relative:text" o:gfxdata="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">
+              <v:shape w14:anchorId="229B1091" id="Ink 49" o:spid="_x0000_s1026" type="#_x0000_t75" style="position:absolute;margin-left:283.65pt;margin-top:157.2pt;width:22.25pt;height:110.8pt;z-index:251689984;visibility:visible;mso-wrap-style:square;mso-wrap-distance-left:9pt;mso-wrap-distance-top:0;mso-wrap-distance-right:9pt;mso-wrap-distance-bottom:0;mso-position-horizontal:absolute;mso-position-horizontal-relative:text;mso-position-vertical:absolute;mso-position-vertical-relative:text" o:gfxdata="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">
                 <v:imagedata r:id="rId96" o:title=""/>
               </v:shape>
             </w:pict>
@@ -6623,7 +8416,7 @@
           </mc:Choice>
           <mc:Fallback>
             <w:pict>
-              <v:shape w14:anchorId="7A3D6B7E" id="Ink 33" o:spid="_x0000_s1026" type="#_x0000_t75" style="position:absolute;margin-left:62.85pt;margin-top:143.25pt;width:6.4pt;height:2.3pt;z-index:251679744;visibility:visible;mso-wrap-style:square;mso-wrap-distance-left:9pt;mso-wrap-distance-top:0;mso-wrap-distance-right:9pt;mso-wrap-distance-bottom:0;mso-position-horizontal:absolute;mso-position-horizontal-relative:text;mso-position-vertical:absolute;mso-position-vertical-relative:text" o:gfxdata="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">
+              <v:shape w14:anchorId="5EA076C5" id="Ink 33" o:spid="_x0000_s1026" type="#_x0000_t75" style="position:absolute;margin-left:62.85pt;margin-top:143.25pt;width:6.4pt;height:2.3pt;z-index:251679744;visibility:visible;mso-wrap-style:square;mso-wrap-distance-left:9pt;mso-wrap-distance-top:0;mso-wrap-distance-right:9pt;mso-wrap-distance-bottom:0;mso-position-horizontal:absolute;mso-position-horizontal-relative:text;mso-position-vertical:absolute;mso-position-vertical-relative:text" o:gfxdata="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">
                 <v:imagedata r:id="rId98" o:title=""/>
               </v:shape>
             </w:pict>
@@ -6668,7 +8461,7 @@
           </mc:Choice>
           <mc:Fallback>
             <w:pict>
-              <v:shape w14:anchorId="4469FA16" id="Ink 30" o:spid="_x0000_s1026" type="#_x0000_t75" style="position:absolute;margin-left:62.35pt;margin-top:137.95pt;width:3.6pt;height:6.65pt;z-index:251678720;visibility:visible;mso-wrap-style:square;mso-wrap-distance-left:9pt;mso-wrap-distance-top:0;mso-wrap-distance-right:9pt;mso-wrap-distance-bottom:0;mso-position-horizontal:absolute;mso-position-horizontal-relative:text;mso-position-vertical:absolute;mso-position-vertical-relative:text" o:gfxdata="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">
+              <v:shape w14:anchorId="535EC46A" id="Ink 30" o:spid="_x0000_s1026" type="#_x0000_t75" style="position:absolute;margin-left:62.35pt;margin-top:137.95pt;width:3.6pt;height:6.65pt;z-index:251678720;visibility:visible;mso-wrap-style:square;mso-wrap-distance-left:9pt;mso-wrap-distance-top:0;mso-wrap-distance-right:9pt;mso-wrap-distance-bottom:0;mso-position-horizontal:absolute;mso-position-horizontal-relative:text;mso-position-vertical:absolute;mso-position-vertical-relative:text" o:gfxdata="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">
                 <v:imagedata r:id="rId100" o:title=""/>
               </v:shape>
             </w:pict>
@@ -6713,7 +8506,7 @@
           </mc:Choice>
           <mc:Fallback>
             <w:pict>
-              <v:shape w14:anchorId="6BB0DD84" id="Ink 29" o:spid="_x0000_s1026" type="#_x0000_t75" style="position:absolute;margin-left:187.8pt;margin-top:133.6pt;width:2.75pt;height:5.5pt;z-index:251677696;visibility:visible;mso-wrap-style:square;mso-wrap-distance-left:9pt;mso-wrap-distance-top:0;mso-wrap-distance-right:9pt;mso-wrap-distance-bottom:0;mso-position-horizontal:absolute;mso-position-horizontal-relative:text;mso-position-vertical:absolute;mso-position-vertical-relative:text" o:gfxdata="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">
+              <v:shape w14:anchorId="320F372F" id="Ink 29" o:spid="_x0000_s1026" type="#_x0000_t75" style="position:absolute;margin-left:187.8pt;margin-top:133.6pt;width:2.75pt;height:5.5pt;z-index:251677696;visibility:visible;mso-wrap-style:square;mso-wrap-distance-left:9pt;mso-wrap-distance-top:0;mso-wrap-distance-right:9pt;mso-wrap-distance-bottom:0;mso-position-horizontal:absolute;mso-position-horizontal-relative:text;mso-position-vertical:absolute;mso-position-vertical-relative:text" o:gfxdata="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">
                 <v:imagedata r:id="rId102" o:title=""/>
               </v:shape>
             </w:pict>
@@ -6758,7 +8551,7 @@
           </mc:Choice>
           <mc:Fallback>
             <w:pict>
-              <v:shape w14:anchorId="41F3AF03" id="Ink 26" o:spid="_x0000_s1026" type="#_x0000_t75" style="position:absolute;margin-left:189.4pt;margin-top:135.5pt;width:6.2pt;height:4.8pt;z-index:251676672;visibility:visible;mso-wrap-style:square;mso-wrap-distance-left:9pt;mso-wrap-distance-top:0;mso-wrap-distance-right:9pt;mso-wrap-distance-bottom:0;mso-position-horizontal:absolute;mso-position-horizontal-relative:text;mso-position-vertical:absolute;mso-position-vertical-relative:text" o:gfxdata="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">
+              <v:shape w14:anchorId="119EBDEB" id="Ink 26" o:spid="_x0000_s1026" type="#_x0000_t75" style="position:absolute;margin-left:189.4pt;margin-top:135.5pt;width:6.2pt;height:4.8pt;z-index:251676672;visibility:visible;mso-wrap-style:square;mso-wrap-distance-left:9pt;mso-wrap-distance-top:0;mso-wrap-distance-right:9pt;mso-wrap-distance-bottom:0;mso-position-horizontal:absolute;mso-position-horizontal-relative:text;mso-position-vertical:absolute;mso-position-vertical-relative:text" o:gfxdata="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">
                 <v:imagedata r:id="rId104" o:title=""/>
               </v:shape>
             </w:pict>
@@ -6803,7 +8596,7 @@
           </mc:Choice>
           <mc:Fallback>
             <w:pict>
-              <v:shape w14:anchorId="0E8D53C4" id="Ink 25" o:spid="_x0000_s1026" type="#_x0000_t75" style="position:absolute;margin-left:189.55pt;margin-top:100.95pt;width:11.65pt;height:38.4pt;z-index:251675648;visibility:visible;mso-wrap-style:square;mso-wrap-distance-left:9pt;mso-wrap-distance-top:0;mso-wrap-distance-right:9pt;mso-wrap-distance-bottom:0;mso-position-horizontal:absolute;mso-position-horizontal-relative:text;mso-position-vertical:absolute;mso-position-vertical-relative:text" o:gfxdata="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">
+              <v:shape w14:anchorId="05D5BB64" id="Ink 25" o:spid="_x0000_s1026" type="#_x0000_t75" style="position:absolute;margin-left:189.55pt;margin-top:100.95pt;width:11.65pt;height:38.4pt;z-index:251675648;visibility:visible;mso-wrap-style:square;mso-wrap-distance-left:9pt;mso-wrap-distance-top:0;mso-wrap-distance-right:9pt;mso-wrap-distance-bottom:0;mso-position-horizontal:absolute;mso-position-horizontal-relative:text;mso-position-vertical:absolute;mso-position-vertical-relative:text" o:gfxdata="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">
                 <v:imagedata r:id="rId106" o:title=""/>
               </v:shape>
             </w:pict>
@@ -6848,7 +8641,7 @@
           </mc:Choice>
           <mc:Fallback>
             <w:pict>
-              <v:shape w14:anchorId="157BBD27" id="Ink 23" o:spid="_x0000_s1026" type="#_x0000_t75" style="position:absolute;margin-left:62.7pt;margin-top:95.8pt;width:121.05pt;height:48.35pt;z-index:251673600;visibility:visible;mso-wrap-style:square;mso-wrap-distance-left:9pt;mso-wrap-distance-top:0;mso-wrap-distance-right:9pt;mso-wrap-distance-bottom:0;mso-position-horizontal:absolute;mso-position-horizontal-relative:text;mso-position-vertical:absolute;mso-position-vertical-relative:text" o:gfxdata="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">
+              <v:shape w14:anchorId="15D27F2D" id="Ink 23" o:spid="_x0000_s1026" type="#_x0000_t75" style="position:absolute;margin-left:62.7pt;margin-top:95.8pt;width:121.05pt;height:48.35pt;z-index:251673600;visibility:visible;mso-wrap-style:square;mso-wrap-distance-left:9pt;mso-wrap-distance-top:0;mso-wrap-distance-right:9pt;mso-wrap-distance-bottom:0;mso-position-horizontal:absolute;mso-position-horizontal-relative:text;mso-position-vertical:absolute;mso-position-vertical-relative:text" o:gfxdata="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">
                 <v:imagedata r:id="rId108" o:title=""/>
               </v:shape>
             </w:pict>
@@ -6893,7 +8686,7 @@
           </mc:Choice>
           <mc:Fallback>
             <w:pict>
-              <v:shape w14:anchorId="19D2FA55" id="Ink 20" o:spid="_x0000_s1026" type="#_x0000_t75" style="position:absolute;margin-left:259.9pt;margin-top:42.45pt;width:2.75pt;height:5.8pt;z-index:251671552;visibility:visible;mso-wrap-style:square;mso-wrap-distance-left:9pt;mso-wrap-distance-top:0;mso-wrap-distance-right:9pt;mso-wrap-distance-bottom:0;mso-position-horizontal:absolute;mso-position-horizontal-relative:text;mso-position-vertical:absolute;mso-position-vertical-relative:text" o:gfxdata="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">
+              <v:shape w14:anchorId="51EE2D16" id="Ink 20" o:spid="_x0000_s1026" type="#_x0000_t75" style="position:absolute;margin-left:259.9pt;margin-top:42.45pt;width:2.75pt;height:5.8pt;z-index:251671552;visibility:visible;mso-wrap-style:square;mso-wrap-distance-left:9pt;mso-wrap-distance-top:0;mso-wrap-distance-right:9pt;mso-wrap-distance-bottom:0;mso-position-horizontal:absolute;mso-position-horizontal-relative:text;mso-position-vertical:absolute;mso-position-vertical-relative:text" o:gfxdata="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">
                 <v:imagedata r:id="rId110" o:title=""/>
               </v:shape>
             </w:pict>
@@ -6938,7 +8731,7 @@
           </mc:Choice>
           <mc:Fallback>
             <w:pict>
-              <v:shape w14:anchorId="30177BC3" id="Ink 17" o:spid="_x0000_s1026" type="#_x0000_t75" style="position:absolute;margin-left:242.5pt;margin-top:44.85pt;width:20.3pt;height:1.15pt;z-index:251668480;visibility:visible;mso-wrap-style:square;mso-wrap-distance-left:9pt;mso-wrap-distance-top:0;mso-wrap-distance-right:9pt;mso-wrap-distance-bottom:0;mso-position-horizontal:absolute;mso-position-horizontal-relative:text;mso-position-vertical:absolute;mso-position-vertical-relative:text" o:gfxdata="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">
+              <v:shape w14:anchorId="33ED5342" id="Ink 17" o:spid="_x0000_s1026" type="#_x0000_t75" style="position:absolute;margin-left:242.5pt;margin-top:44.85pt;width:20.3pt;height:1.15pt;z-index:251668480;visibility:visible;mso-wrap-style:square;mso-wrap-distance-left:9pt;mso-wrap-distance-top:0;mso-wrap-distance-right:9pt;mso-wrap-distance-bottom:0;mso-position-horizontal:absolute;mso-position-horizontal-relative:text;mso-position-vertical:absolute;mso-position-vertical-relative:text" o:gfxdata="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">
                 <v:imagedata r:id="rId112" o:title=""/>
               </v:shape>
             </w:pict>
@@ -6983,7 +8776,7 @@
           </mc:Choice>
           <mc:Fallback>
             <w:pict>
-              <v:shape w14:anchorId="00FF311E" id="Ink 14" o:spid="_x0000_s1026" type="#_x0000_t75" style="position:absolute;margin-left:233.5pt;margin-top:41.2pt;width:9.5pt;height:9.5pt;z-index:251666432;visibility:visible;mso-wrap-style:square;mso-wrap-distance-left:9pt;mso-wrap-distance-top:0;mso-wrap-distance-right:9pt;mso-wrap-distance-bottom:0;mso-position-horizontal:absolute;mso-position-horizontal-relative:text;mso-position-vertical:absolute;mso-position-vertical-relative:text" o:gfxdata="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">
+              <v:shape w14:anchorId="29106846" id="Ink 14" o:spid="_x0000_s1026" type="#_x0000_t75" style="position:absolute;margin-left:233.5pt;margin-top:41.2pt;width:9.5pt;height:9.5pt;z-index:251666432;visibility:visible;mso-wrap-style:square;mso-wrap-distance-left:9pt;mso-wrap-distance-top:0;mso-wrap-distance-right:9pt;mso-wrap-distance-bottom:0;mso-position-horizontal:absolute;mso-position-horizontal-relative:text;mso-position-vertical:absolute;mso-position-vertical-relative:text" o:gfxdata="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">
                 <v:imagedata r:id="rId114" o:title=""/>
               </v:shape>
             </w:pict>
@@ -9184,6 +10977,9 @@
     </w:p>
     <w:p>
       <w:r>
+        <w:rPr>
+          <w:noProof/>
+        </w:rPr>
         <w:lastRenderedPageBreak/>
         <w:drawing>
           <wp:inline distT="0" distB="0" distL="0" distR="0" wp14:anchorId="7CFCA2F4" wp14:editId="57E8FBCE">
@@ -9224,6 +11020,9 @@
     </w:p>
     <w:p>
       <w:r>
+        <w:rPr>
+          <w:noProof/>
+        </w:rPr>
         <w:lastRenderedPageBreak/>
         <w:drawing>
           <wp:inline distT="0" distB="0" distL="0" distR="0" wp14:anchorId="473F82CD" wp14:editId="45C01018">
@@ -9289,6 +11088,9 @@
     </w:p>
     <w:p>
       <w:r>
+        <w:rPr>
+          <w:noProof/>
+        </w:rPr>
         <w:drawing>
           <wp:inline distT="0" distB="0" distL="0" distR="0" wp14:anchorId="39D5AFE0" wp14:editId="08818871">
             <wp:extent cx="6120130" cy="7167245"/>
@@ -10902,6 +12704,304 @@
     </w:lvl>
   </w:abstractNum>
   <w:abstractNum w:abstractNumId="3" w15:restartNumberingAfterBreak="0">
+    <w:nsid w:val="1EBA7AD2"/>
+    <w:multiLevelType w:val="multilevel"/>
+    <w:tmpl w:val="571AE2EA"/>
+    <w:lvl w:ilvl="0">
+      <w:start w:val="1"/>
+      <w:numFmt w:val="bullet"/>
+      <w:lvlText w:val=""/>
+      <w:lvlJc w:val="left"/>
+      <w:pPr>
+        <w:tabs>
+          <w:tab w:val="num" w:pos="1428"/>
+        </w:tabs>
+        <w:ind w:left="1428" w:hanging="360"/>
+      </w:pPr>
+      <w:rPr>
+        <w:rFonts w:ascii="Symbol" w:hAnsi="Symbol" w:hint="default"/>
+        <w:sz w:val="20"/>
+      </w:rPr>
+    </w:lvl>
+    <w:lvl w:ilvl="1" w:tentative="1">
+      <w:start w:val="1"/>
+      <w:numFmt w:val="bullet"/>
+      <w:lvlText w:val="o"/>
+      <w:lvlJc w:val="left"/>
+      <w:pPr>
+        <w:tabs>
+          <w:tab w:val="num" w:pos="2148"/>
+        </w:tabs>
+        <w:ind w:left="2148" w:hanging="360"/>
+      </w:pPr>
+      <w:rPr>
+        <w:rFonts w:ascii="Courier New" w:hAnsi="Courier New" w:hint="default"/>
+        <w:sz w:val="20"/>
+      </w:rPr>
+    </w:lvl>
+    <w:lvl w:ilvl="2" w:tentative="1">
+      <w:start w:val="1"/>
+      <w:numFmt w:val="bullet"/>
+      <w:lvlText w:val=""/>
+      <w:lvlJc w:val="left"/>
+      <w:pPr>
+        <w:tabs>
+          <w:tab w:val="num" w:pos="2868"/>
+        </w:tabs>
+        <w:ind w:left="2868" w:hanging="360"/>
+      </w:pPr>
+      <w:rPr>
+        <w:rFonts w:ascii="Wingdings" w:hAnsi="Wingdings" w:hint="default"/>
+        <w:sz w:val="20"/>
+      </w:rPr>
+    </w:lvl>
+    <w:lvl w:ilvl="3" w:tentative="1">
+      <w:start w:val="1"/>
+      <w:numFmt w:val="bullet"/>
+      <w:lvlText w:val=""/>
+      <w:lvlJc w:val="left"/>
+      <w:pPr>
+        <w:tabs>
+          <w:tab w:val="num" w:pos="3588"/>
+        </w:tabs>
+        <w:ind w:left="3588" w:hanging="360"/>
+      </w:pPr>
+      <w:rPr>
+        <w:rFonts w:ascii="Wingdings" w:hAnsi="Wingdings" w:hint="default"/>
+        <w:sz w:val="20"/>
+      </w:rPr>
+    </w:lvl>
+    <w:lvl w:ilvl="4" w:tentative="1">
+      <w:start w:val="1"/>
+      <w:numFmt w:val="bullet"/>
+      <w:lvlText w:val=""/>
+      <w:lvlJc w:val="left"/>
+      <w:pPr>
+        <w:tabs>
+          <w:tab w:val="num" w:pos="4308"/>
+        </w:tabs>
+        <w:ind w:left="4308" w:hanging="360"/>
+      </w:pPr>
+      <w:rPr>
+        <w:rFonts w:ascii="Wingdings" w:hAnsi="Wingdings" w:hint="default"/>
+        <w:sz w:val="20"/>
+      </w:rPr>
+    </w:lvl>
+    <w:lvl w:ilvl="5" w:tentative="1">
+      <w:start w:val="1"/>
+      <w:numFmt w:val="bullet"/>
+      <w:lvlText w:val=""/>
+      <w:lvlJc w:val="left"/>
+      <w:pPr>
+        <w:tabs>
+          <w:tab w:val="num" w:pos="5028"/>
+        </w:tabs>
+        <w:ind w:left="5028" w:hanging="360"/>
+      </w:pPr>
+      <w:rPr>
+        <w:rFonts w:ascii="Wingdings" w:hAnsi="Wingdings" w:hint="default"/>
+        <w:sz w:val="20"/>
+      </w:rPr>
+    </w:lvl>
+    <w:lvl w:ilvl="6" w:tentative="1">
+      <w:start w:val="1"/>
+      <w:numFmt w:val="bullet"/>
+      <w:lvlText w:val=""/>
+      <w:lvlJc w:val="left"/>
+      <w:pPr>
+        <w:tabs>
+          <w:tab w:val="num" w:pos="5748"/>
+        </w:tabs>
+        <w:ind w:left="5748" w:hanging="360"/>
+      </w:pPr>
+      <w:rPr>
+        <w:rFonts w:ascii="Wingdings" w:hAnsi="Wingdings" w:hint="default"/>
+        <w:sz w:val="20"/>
+      </w:rPr>
+    </w:lvl>
+    <w:lvl w:ilvl="7" w:tentative="1">
+      <w:start w:val="1"/>
+      <w:numFmt w:val="bullet"/>
+      <w:lvlText w:val=""/>
+      <w:lvlJc w:val="left"/>
+      <w:pPr>
+        <w:tabs>
+          <w:tab w:val="num" w:pos="6468"/>
+        </w:tabs>
+        <w:ind w:left="6468" w:hanging="360"/>
+      </w:pPr>
+      <w:rPr>
+        <w:rFonts w:ascii="Wingdings" w:hAnsi="Wingdings" w:hint="default"/>
+        <w:sz w:val="20"/>
+      </w:rPr>
+    </w:lvl>
+    <w:lvl w:ilvl="8" w:tentative="1">
+      <w:start w:val="1"/>
+      <w:numFmt w:val="bullet"/>
+      <w:lvlText w:val=""/>
+      <w:lvlJc w:val="left"/>
+      <w:pPr>
+        <w:tabs>
+          <w:tab w:val="num" w:pos="7188"/>
+        </w:tabs>
+        <w:ind w:left="7188" w:hanging="360"/>
+      </w:pPr>
+      <w:rPr>
+        <w:rFonts w:ascii="Wingdings" w:hAnsi="Wingdings" w:hint="default"/>
+        <w:sz w:val="20"/>
+      </w:rPr>
+    </w:lvl>
+  </w:abstractNum>
+  <w:abstractNum w:abstractNumId="4" w15:restartNumberingAfterBreak="0">
+    <w:nsid w:val="23036D71"/>
+    <w:multiLevelType w:val="multilevel"/>
+    <w:tmpl w:val="98349CAE"/>
+    <w:lvl w:ilvl="0">
+      <w:start w:val="1"/>
+      <w:numFmt w:val="bullet"/>
+      <w:lvlText w:val=""/>
+      <w:lvlJc w:val="left"/>
+      <w:pPr>
+        <w:tabs>
+          <w:tab w:val="num" w:pos="1068"/>
+        </w:tabs>
+        <w:ind w:left="1068" w:hanging="360"/>
+      </w:pPr>
+      <w:rPr>
+        <w:rFonts w:ascii="Symbol" w:hAnsi="Symbol" w:hint="default"/>
+        <w:sz w:val="20"/>
+      </w:rPr>
+    </w:lvl>
+    <w:lvl w:ilvl="1" w:tentative="1">
+      <w:start w:val="1"/>
+      <w:numFmt w:val="bullet"/>
+      <w:lvlText w:val="o"/>
+      <w:lvlJc w:val="left"/>
+      <w:pPr>
+        <w:tabs>
+          <w:tab w:val="num" w:pos="1788"/>
+        </w:tabs>
+        <w:ind w:left="1788" w:hanging="360"/>
+      </w:pPr>
+      <w:rPr>
+        <w:rFonts w:ascii="Courier New" w:hAnsi="Courier New" w:hint="default"/>
+        <w:sz w:val="20"/>
+      </w:rPr>
+    </w:lvl>
+    <w:lvl w:ilvl="2" w:tentative="1">
+      <w:start w:val="1"/>
+      <w:numFmt w:val="bullet"/>
+      <w:lvlText w:val=""/>
+      <w:lvlJc w:val="left"/>
+      <w:pPr>
+        <w:tabs>
+          <w:tab w:val="num" w:pos="2508"/>
+        </w:tabs>
+        <w:ind w:left="2508" w:hanging="360"/>
+      </w:pPr>
+      <w:rPr>
+        <w:rFonts w:ascii="Wingdings" w:hAnsi="Wingdings" w:hint="default"/>
+        <w:sz w:val="20"/>
+      </w:rPr>
+    </w:lvl>
+    <w:lvl w:ilvl="3" w:tentative="1">
+      <w:start w:val="1"/>
+      <w:numFmt w:val="bullet"/>
+      <w:lvlText w:val=""/>
+      <w:lvlJc w:val="left"/>
+      <w:pPr>
+        <w:tabs>
+          <w:tab w:val="num" w:pos="3228"/>
+        </w:tabs>
+        <w:ind w:left="3228" w:hanging="360"/>
+      </w:pPr>
+      <w:rPr>
+        <w:rFonts w:ascii="Wingdings" w:hAnsi="Wingdings" w:hint="default"/>
+        <w:sz w:val="20"/>
+      </w:rPr>
+    </w:lvl>
+    <w:lvl w:ilvl="4" w:tentative="1">
+      <w:start w:val="1"/>
+      <w:numFmt w:val="bullet"/>
+      <w:lvlText w:val=""/>
+      <w:lvlJc w:val="left"/>
+      <w:pPr>
+        <w:tabs>
+          <w:tab w:val="num" w:pos="3948"/>
+        </w:tabs>
+        <w:ind w:left="3948" w:hanging="360"/>
+      </w:pPr>
+      <w:rPr>
+        <w:rFonts w:ascii="Wingdings" w:hAnsi="Wingdings" w:hint="default"/>
+        <w:sz w:val="20"/>
+      </w:rPr>
+    </w:lvl>
+    <w:lvl w:ilvl="5" w:tentative="1">
+      <w:start w:val="1"/>
+      <w:numFmt w:val="bullet"/>
+      <w:lvlText w:val=""/>
+      <w:lvlJc w:val="left"/>
+      <w:pPr>
+        <w:tabs>
+          <w:tab w:val="num" w:pos="4668"/>
+        </w:tabs>
+        <w:ind w:left="4668" w:hanging="360"/>
+      </w:pPr>
+      <w:rPr>
+        <w:rFonts w:ascii="Wingdings" w:hAnsi="Wingdings" w:hint="default"/>
+        <w:sz w:val="20"/>
+      </w:rPr>
+    </w:lvl>
+    <w:lvl w:ilvl="6" w:tentative="1">
+      <w:start w:val="1"/>
+      <w:numFmt w:val="bullet"/>
+      <w:lvlText w:val=""/>
+      <w:lvlJc w:val="left"/>
+      <w:pPr>
+        <w:tabs>
+          <w:tab w:val="num" w:pos="5388"/>
+        </w:tabs>
+        <w:ind w:left="5388" w:hanging="360"/>
+      </w:pPr>
+      <w:rPr>
+        <w:rFonts w:ascii="Wingdings" w:hAnsi="Wingdings" w:hint="default"/>
+        <w:sz w:val="20"/>
+      </w:rPr>
+    </w:lvl>
+    <w:lvl w:ilvl="7" w:tentative="1">
+      <w:start w:val="1"/>
+      <w:numFmt w:val="bullet"/>
+      <w:lvlText w:val=""/>
+      <w:lvlJc w:val="left"/>
+      <w:pPr>
+        <w:tabs>
+          <w:tab w:val="num" w:pos="6108"/>
+        </w:tabs>
+        <w:ind w:left="6108" w:hanging="360"/>
+      </w:pPr>
+      <w:rPr>
+        <w:rFonts w:ascii="Wingdings" w:hAnsi="Wingdings" w:hint="default"/>
+        <w:sz w:val="20"/>
+      </w:rPr>
+    </w:lvl>
+    <w:lvl w:ilvl="8" w:tentative="1">
+      <w:start w:val="1"/>
+      <w:numFmt w:val="bullet"/>
+      <w:lvlText w:val=""/>
+      <w:lvlJc w:val="left"/>
+      <w:pPr>
+        <w:tabs>
+          <w:tab w:val="num" w:pos="6828"/>
+        </w:tabs>
+        <w:ind w:left="6828" w:hanging="360"/>
+      </w:pPr>
+      <w:rPr>
+        <w:rFonts w:ascii="Wingdings" w:hAnsi="Wingdings" w:hint="default"/>
+        <w:sz w:val="20"/>
+      </w:rPr>
+    </w:lvl>
+  </w:abstractNum>
+  <w:abstractNum w:abstractNumId="5" w15:restartNumberingAfterBreak="0">
     <w:nsid w:val="243E29DF"/>
     <w:multiLevelType w:val="hybridMultilevel"/>
     <w:tmpl w:val="9072114A"/>
@@ -11014,7 +13114,156 @@
       </w:rPr>
     </w:lvl>
   </w:abstractNum>
-  <w:abstractNum w:abstractNumId="4" w15:restartNumberingAfterBreak="0">
+  <w:abstractNum w:abstractNumId="6" w15:restartNumberingAfterBreak="0">
+    <w:nsid w:val="26BA61A4"/>
+    <w:multiLevelType w:val="multilevel"/>
+    <w:tmpl w:val="3DE4BE04"/>
+    <w:lvl w:ilvl="0">
+      <w:start w:val="1"/>
+      <w:numFmt w:val="bullet"/>
+      <w:lvlText w:val=""/>
+      <w:lvlJc w:val="left"/>
+      <w:pPr>
+        <w:tabs>
+          <w:tab w:val="num" w:pos="1068"/>
+        </w:tabs>
+        <w:ind w:left="1068" w:hanging="360"/>
+      </w:pPr>
+      <w:rPr>
+        <w:rFonts w:ascii="Symbol" w:hAnsi="Symbol" w:hint="default"/>
+        <w:sz w:val="20"/>
+      </w:rPr>
+    </w:lvl>
+    <w:lvl w:ilvl="1" w:tentative="1">
+      <w:start w:val="1"/>
+      <w:numFmt w:val="bullet"/>
+      <w:lvlText w:val="o"/>
+      <w:lvlJc w:val="left"/>
+      <w:pPr>
+        <w:tabs>
+          <w:tab w:val="num" w:pos="1788"/>
+        </w:tabs>
+        <w:ind w:left="1788" w:hanging="360"/>
+      </w:pPr>
+      <w:rPr>
+        <w:rFonts w:ascii="Courier New" w:hAnsi="Courier New" w:hint="default"/>
+        <w:sz w:val="20"/>
+      </w:rPr>
+    </w:lvl>
+    <w:lvl w:ilvl="2" w:tentative="1">
+      <w:start w:val="1"/>
+      <w:numFmt w:val="bullet"/>
+      <w:lvlText w:val=""/>
+      <w:lvlJc w:val="left"/>
+      <w:pPr>
+        <w:tabs>
+          <w:tab w:val="num" w:pos="2508"/>
+        </w:tabs>
+        <w:ind w:left="2508" w:hanging="360"/>
+      </w:pPr>
+      <w:rPr>
+        <w:rFonts w:ascii="Wingdings" w:hAnsi="Wingdings" w:hint="default"/>
+        <w:sz w:val="20"/>
+      </w:rPr>
+    </w:lvl>
+    <w:lvl w:ilvl="3" w:tentative="1">
+      <w:start w:val="1"/>
+      <w:numFmt w:val="bullet"/>
+      <w:lvlText w:val=""/>
+      <w:lvlJc w:val="left"/>
+      <w:pPr>
+        <w:tabs>
+          <w:tab w:val="num" w:pos="3228"/>
+        </w:tabs>
+        <w:ind w:left="3228" w:hanging="360"/>
+      </w:pPr>
+      <w:rPr>
+        <w:rFonts w:ascii="Wingdings" w:hAnsi="Wingdings" w:hint="default"/>
+        <w:sz w:val="20"/>
+      </w:rPr>
+    </w:lvl>
+    <w:lvl w:ilvl="4" w:tentative="1">
+      <w:start w:val="1"/>
+      <w:numFmt w:val="bullet"/>
+      <w:lvlText w:val=""/>
+      <w:lvlJc w:val="left"/>
+      <w:pPr>
+        <w:tabs>
+          <w:tab w:val="num" w:pos="3948"/>
+        </w:tabs>
+        <w:ind w:left="3948" w:hanging="360"/>
+      </w:pPr>
+      <w:rPr>
+        <w:rFonts w:ascii="Wingdings" w:hAnsi="Wingdings" w:hint="default"/>
+        <w:sz w:val="20"/>
+      </w:rPr>
+    </w:lvl>
+    <w:lvl w:ilvl="5" w:tentative="1">
+      <w:start w:val="1"/>
+      <w:numFmt w:val="bullet"/>
+      <w:lvlText w:val=""/>
+      <w:lvlJc w:val="left"/>
+      <w:pPr>
+        <w:tabs>
+          <w:tab w:val="num" w:pos="4668"/>
+        </w:tabs>
+        <w:ind w:left="4668" w:hanging="360"/>
+      </w:pPr>
+      <w:rPr>
+        <w:rFonts w:ascii="Wingdings" w:hAnsi="Wingdings" w:hint="default"/>
+        <w:sz w:val="20"/>
+      </w:rPr>
+    </w:lvl>
+    <w:lvl w:ilvl="6" w:tentative="1">
+      <w:start w:val="1"/>
+      <w:numFmt w:val="bullet"/>
+      <w:lvlText w:val=""/>
+      <w:lvlJc w:val="left"/>
+      <w:pPr>
+        <w:tabs>
+          <w:tab w:val="num" w:pos="5388"/>
+        </w:tabs>
+        <w:ind w:left="5388" w:hanging="360"/>
+      </w:pPr>
+      <w:rPr>
+        <w:rFonts w:ascii="Wingdings" w:hAnsi="Wingdings" w:hint="default"/>
+        <w:sz w:val="20"/>
+      </w:rPr>
+    </w:lvl>
+    <w:lvl w:ilvl="7" w:tentative="1">
+      <w:start w:val="1"/>
+      <w:numFmt w:val="bullet"/>
+      <w:lvlText w:val=""/>
+      <w:lvlJc w:val="left"/>
+      <w:pPr>
+        <w:tabs>
+          <w:tab w:val="num" w:pos="6108"/>
+        </w:tabs>
+        <w:ind w:left="6108" w:hanging="360"/>
+      </w:pPr>
+      <w:rPr>
+        <w:rFonts w:ascii="Wingdings" w:hAnsi="Wingdings" w:hint="default"/>
+        <w:sz w:val="20"/>
+      </w:rPr>
+    </w:lvl>
+    <w:lvl w:ilvl="8" w:tentative="1">
+      <w:start w:val="1"/>
+      <w:numFmt w:val="bullet"/>
+      <w:lvlText w:val=""/>
+      <w:lvlJc w:val="left"/>
+      <w:pPr>
+        <w:tabs>
+          <w:tab w:val="num" w:pos="6828"/>
+        </w:tabs>
+        <w:ind w:left="6828" w:hanging="360"/>
+      </w:pPr>
+      <w:rPr>
+        <w:rFonts w:ascii="Wingdings" w:hAnsi="Wingdings" w:hint="default"/>
+        <w:sz w:val="20"/>
+      </w:rPr>
+    </w:lvl>
+  </w:abstractNum>
+  <w:abstractNum w:abstractNumId="7" w15:restartNumberingAfterBreak="0">
     <w:nsid w:val="2728582B"/>
     <w:multiLevelType w:val="multilevel"/>
     <w:tmpl w:val="6BE479E2"/>
@@ -11163,7 +13412,7 @@
       </w:rPr>
     </w:lvl>
   </w:abstractNum>
-  <w:abstractNum w:abstractNumId="5" w15:restartNumberingAfterBreak="0">
+  <w:abstractNum w:abstractNumId="8" w15:restartNumberingAfterBreak="0">
     <w:nsid w:val="331B4B7C"/>
     <w:multiLevelType w:val="multilevel"/>
     <w:tmpl w:val="3466891E"/>
@@ -11256,7 +13505,156 @@
       </w:pPr>
     </w:lvl>
   </w:abstractNum>
-  <w:abstractNum w:abstractNumId="6" w15:restartNumberingAfterBreak="0">
+  <w:abstractNum w:abstractNumId="9" w15:restartNumberingAfterBreak="0">
+    <w:nsid w:val="45016CC0"/>
+    <w:multiLevelType w:val="multilevel"/>
+    <w:tmpl w:val="9CF85662"/>
+    <w:lvl w:ilvl="0">
+      <w:start w:val="1"/>
+      <w:numFmt w:val="bullet"/>
+      <w:lvlText w:val=""/>
+      <w:lvlJc w:val="left"/>
+      <w:pPr>
+        <w:tabs>
+          <w:tab w:val="num" w:pos="1068"/>
+        </w:tabs>
+        <w:ind w:left="1068" w:hanging="360"/>
+      </w:pPr>
+      <w:rPr>
+        <w:rFonts w:ascii="Symbol" w:hAnsi="Symbol" w:hint="default"/>
+        <w:sz w:val="20"/>
+      </w:rPr>
+    </w:lvl>
+    <w:lvl w:ilvl="1" w:tentative="1">
+      <w:start w:val="1"/>
+      <w:numFmt w:val="bullet"/>
+      <w:lvlText w:val="o"/>
+      <w:lvlJc w:val="left"/>
+      <w:pPr>
+        <w:tabs>
+          <w:tab w:val="num" w:pos="1788"/>
+        </w:tabs>
+        <w:ind w:left="1788" w:hanging="360"/>
+      </w:pPr>
+      <w:rPr>
+        <w:rFonts w:ascii="Courier New" w:hAnsi="Courier New" w:hint="default"/>
+        <w:sz w:val="20"/>
+      </w:rPr>
+    </w:lvl>
+    <w:lvl w:ilvl="2" w:tentative="1">
+      <w:start w:val="1"/>
+      <w:numFmt w:val="bullet"/>
+      <w:lvlText w:val=""/>
+      <w:lvlJc w:val="left"/>
+      <w:pPr>
+        <w:tabs>
+          <w:tab w:val="num" w:pos="2508"/>
+        </w:tabs>
+        <w:ind w:left="2508" w:hanging="360"/>
+      </w:pPr>
+      <w:rPr>
+        <w:rFonts w:ascii="Wingdings" w:hAnsi="Wingdings" w:hint="default"/>
+        <w:sz w:val="20"/>
+      </w:rPr>
+    </w:lvl>
+    <w:lvl w:ilvl="3" w:tentative="1">
+      <w:start w:val="1"/>
+      <w:numFmt w:val="bullet"/>
+      <w:lvlText w:val=""/>
+      <w:lvlJc w:val="left"/>
+      <w:pPr>
+        <w:tabs>
+          <w:tab w:val="num" w:pos="3228"/>
+        </w:tabs>
+        <w:ind w:left="3228" w:hanging="360"/>
+      </w:pPr>
+      <w:rPr>
+        <w:rFonts w:ascii="Wingdings" w:hAnsi="Wingdings" w:hint="default"/>
+        <w:sz w:val="20"/>
+      </w:rPr>
+    </w:lvl>
+    <w:lvl w:ilvl="4" w:tentative="1">
+      <w:start w:val="1"/>
+      <w:numFmt w:val="bullet"/>
+      <w:lvlText w:val=""/>
+      <w:lvlJc w:val="left"/>
+      <w:pPr>
+        <w:tabs>
+          <w:tab w:val="num" w:pos="3948"/>
+        </w:tabs>
+        <w:ind w:left="3948" w:hanging="360"/>
+      </w:pPr>
+      <w:rPr>
+        <w:rFonts w:ascii="Wingdings" w:hAnsi="Wingdings" w:hint="default"/>
+        <w:sz w:val="20"/>
+      </w:rPr>
+    </w:lvl>
+    <w:lvl w:ilvl="5" w:tentative="1">
+      <w:start w:val="1"/>
+      <w:numFmt w:val="bullet"/>
+      <w:lvlText w:val=""/>
+      <w:lvlJc w:val="left"/>
+      <w:pPr>
+        <w:tabs>
+          <w:tab w:val="num" w:pos="4668"/>
+        </w:tabs>
+        <w:ind w:left="4668" w:hanging="360"/>
+      </w:pPr>
+      <w:rPr>
+        <w:rFonts w:ascii="Wingdings" w:hAnsi="Wingdings" w:hint="default"/>
+        <w:sz w:val="20"/>
+      </w:rPr>
+    </w:lvl>
+    <w:lvl w:ilvl="6" w:tentative="1">
+      <w:start w:val="1"/>
+      <w:numFmt w:val="bullet"/>
+      <w:lvlText w:val=""/>
+      <w:lvlJc w:val="left"/>
+      <w:pPr>
+        <w:tabs>
+          <w:tab w:val="num" w:pos="5388"/>
+        </w:tabs>
+        <w:ind w:left="5388" w:hanging="360"/>
+      </w:pPr>
+      <w:rPr>
+        <w:rFonts w:ascii="Wingdings" w:hAnsi="Wingdings" w:hint="default"/>
+        <w:sz w:val="20"/>
+      </w:rPr>
+    </w:lvl>
+    <w:lvl w:ilvl="7" w:tentative="1">
+      <w:start w:val="1"/>
+      <w:numFmt w:val="bullet"/>
+      <w:lvlText w:val=""/>
+      <w:lvlJc w:val="left"/>
+      <w:pPr>
+        <w:tabs>
+          <w:tab w:val="num" w:pos="6108"/>
+        </w:tabs>
+        <w:ind w:left="6108" w:hanging="360"/>
+      </w:pPr>
+      <w:rPr>
+        <w:rFonts w:ascii="Wingdings" w:hAnsi="Wingdings" w:hint="default"/>
+        <w:sz w:val="20"/>
+      </w:rPr>
+    </w:lvl>
+    <w:lvl w:ilvl="8" w:tentative="1">
+      <w:start w:val="1"/>
+      <w:numFmt w:val="bullet"/>
+      <w:lvlText w:val=""/>
+      <w:lvlJc w:val="left"/>
+      <w:pPr>
+        <w:tabs>
+          <w:tab w:val="num" w:pos="6828"/>
+        </w:tabs>
+        <w:ind w:left="6828" w:hanging="360"/>
+      </w:pPr>
+      <w:rPr>
+        <w:rFonts w:ascii="Wingdings" w:hAnsi="Wingdings" w:hint="default"/>
+        <w:sz w:val="20"/>
+      </w:rPr>
+    </w:lvl>
+  </w:abstractNum>
+  <w:abstractNum w:abstractNumId="10" w15:restartNumberingAfterBreak="0">
     <w:nsid w:val="468C37D7"/>
     <w:multiLevelType w:val="multilevel"/>
     <w:tmpl w:val="D9EA967E"/>
@@ -11405,7 +13803,7 @@
       </w:rPr>
     </w:lvl>
   </w:abstractNum>
-  <w:abstractNum w:abstractNumId="7" w15:restartNumberingAfterBreak="0">
+  <w:abstractNum w:abstractNumId="11" w15:restartNumberingAfterBreak="0">
     <w:nsid w:val="4B801F43"/>
     <w:multiLevelType w:val="hybridMultilevel"/>
     <w:tmpl w:val="2A6E26A6"/>
@@ -11491,7 +13889,7 @@
       </w:pPr>
     </w:lvl>
   </w:abstractNum>
-  <w:abstractNum w:abstractNumId="8" w15:restartNumberingAfterBreak="0">
+  <w:abstractNum w:abstractNumId="12" w15:restartNumberingAfterBreak="0">
     <w:nsid w:val="50CF6BF5"/>
     <w:multiLevelType w:val="multilevel"/>
     <w:tmpl w:val="3466891E"/>
@@ -11584,7 +13982,7 @@
       </w:pPr>
     </w:lvl>
   </w:abstractNum>
-  <w:abstractNum w:abstractNumId="9" w15:restartNumberingAfterBreak="0">
+  <w:abstractNum w:abstractNumId="13" w15:restartNumberingAfterBreak="0">
     <w:nsid w:val="5CFF5B0F"/>
     <w:multiLevelType w:val="multilevel"/>
     <w:tmpl w:val="18B2BA4E"/>
@@ -11733,7 +14131,7 @@
       </w:rPr>
     </w:lvl>
   </w:abstractNum>
-  <w:abstractNum w:abstractNumId="10" w15:restartNumberingAfterBreak="0">
+  <w:abstractNum w:abstractNumId="14" w15:restartNumberingAfterBreak="0">
     <w:nsid w:val="5D391984"/>
     <w:multiLevelType w:val="hybridMultilevel"/>
     <w:tmpl w:val="26B0BB56"/>
@@ -11846,7 +14244,305 @@
       </w:rPr>
     </w:lvl>
   </w:abstractNum>
-  <w:abstractNum w:abstractNumId="11" w15:restartNumberingAfterBreak="0">
+  <w:abstractNum w:abstractNumId="15" w15:restartNumberingAfterBreak="0">
+    <w:nsid w:val="60E738E3"/>
+    <w:multiLevelType w:val="multilevel"/>
+    <w:tmpl w:val="3398A7D0"/>
+    <w:lvl w:ilvl="0">
+      <w:start w:val="1"/>
+      <w:numFmt w:val="bullet"/>
+      <w:lvlText w:val=""/>
+      <w:lvlJc w:val="left"/>
+      <w:pPr>
+        <w:tabs>
+          <w:tab w:val="num" w:pos="1068"/>
+        </w:tabs>
+        <w:ind w:left="1068" w:hanging="360"/>
+      </w:pPr>
+      <w:rPr>
+        <w:rFonts w:ascii="Symbol" w:hAnsi="Symbol" w:hint="default"/>
+        <w:sz w:val="20"/>
+      </w:rPr>
+    </w:lvl>
+    <w:lvl w:ilvl="1" w:tentative="1">
+      <w:start w:val="1"/>
+      <w:numFmt w:val="bullet"/>
+      <w:lvlText w:val="o"/>
+      <w:lvlJc w:val="left"/>
+      <w:pPr>
+        <w:tabs>
+          <w:tab w:val="num" w:pos="1788"/>
+        </w:tabs>
+        <w:ind w:left="1788" w:hanging="360"/>
+      </w:pPr>
+      <w:rPr>
+        <w:rFonts w:ascii="Courier New" w:hAnsi="Courier New" w:hint="default"/>
+        <w:sz w:val="20"/>
+      </w:rPr>
+    </w:lvl>
+    <w:lvl w:ilvl="2" w:tentative="1">
+      <w:start w:val="1"/>
+      <w:numFmt w:val="bullet"/>
+      <w:lvlText w:val=""/>
+      <w:lvlJc w:val="left"/>
+      <w:pPr>
+        <w:tabs>
+          <w:tab w:val="num" w:pos="2508"/>
+        </w:tabs>
+        <w:ind w:left="2508" w:hanging="360"/>
+      </w:pPr>
+      <w:rPr>
+        <w:rFonts w:ascii="Wingdings" w:hAnsi="Wingdings" w:hint="default"/>
+        <w:sz w:val="20"/>
+      </w:rPr>
+    </w:lvl>
+    <w:lvl w:ilvl="3" w:tentative="1">
+      <w:start w:val="1"/>
+      <w:numFmt w:val="bullet"/>
+      <w:lvlText w:val=""/>
+      <w:lvlJc w:val="left"/>
+      <w:pPr>
+        <w:tabs>
+          <w:tab w:val="num" w:pos="3228"/>
+        </w:tabs>
+        <w:ind w:left="3228" w:hanging="360"/>
+      </w:pPr>
+      <w:rPr>
+        <w:rFonts w:ascii="Wingdings" w:hAnsi="Wingdings" w:hint="default"/>
+        <w:sz w:val="20"/>
+      </w:rPr>
+    </w:lvl>
+    <w:lvl w:ilvl="4" w:tentative="1">
+      <w:start w:val="1"/>
+      <w:numFmt w:val="bullet"/>
+      <w:lvlText w:val=""/>
+      <w:lvlJc w:val="left"/>
+      <w:pPr>
+        <w:tabs>
+          <w:tab w:val="num" w:pos="3948"/>
+        </w:tabs>
+        <w:ind w:left="3948" w:hanging="360"/>
+      </w:pPr>
+      <w:rPr>
+        <w:rFonts w:ascii="Wingdings" w:hAnsi="Wingdings" w:hint="default"/>
+        <w:sz w:val="20"/>
+      </w:rPr>
+    </w:lvl>
+    <w:lvl w:ilvl="5" w:tentative="1">
+      <w:start w:val="1"/>
+      <w:numFmt w:val="bullet"/>
+      <w:lvlText w:val=""/>
+      <w:lvlJc w:val="left"/>
+      <w:pPr>
+        <w:tabs>
+          <w:tab w:val="num" w:pos="4668"/>
+        </w:tabs>
+        <w:ind w:left="4668" w:hanging="360"/>
+      </w:pPr>
+      <w:rPr>
+        <w:rFonts w:ascii="Wingdings" w:hAnsi="Wingdings" w:hint="default"/>
+        <w:sz w:val="20"/>
+      </w:rPr>
+    </w:lvl>
+    <w:lvl w:ilvl="6" w:tentative="1">
+      <w:start w:val="1"/>
+      <w:numFmt w:val="bullet"/>
+      <w:lvlText w:val=""/>
+      <w:lvlJc w:val="left"/>
+      <w:pPr>
+        <w:tabs>
+          <w:tab w:val="num" w:pos="5388"/>
+        </w:tabs>
+        <w:ind w:left="5388" w:hanging="360"/>
+      </w:pPr>
+      <w:rPr>
+        <w:rFonts w:ascii="Wingdings" w:hAnsi="Wingdings" w:hint="default"/>
+        <w:sz w:val="20"/>
+      </w:rPr>
+    </w:lvl>
+    <w:lvl w:ilvl="7" w:tentative="1">
+      <w:start w:val="1"/>
+      <w:numFmt w:val="bullet"/>
+      <w:lvlText w:val=""/>
+      <w:lvlJc w:val="left"/>
+      <w:pPr>
+        <w:tabs>
+          <w:tab w:val="num" w:pos="6108"/>
+        </w:tabs>
+        <w:ind w:left="6108" w:hanging="360"/>
+      </w:pPr>
+      <w:rPr>
+        <w:rFonts w:ascii="Wingdings" w:hAnsi="Wingdings" w:hint="default"/>
+        <w:sz w:val="20"/>
+      </w:rPr>
+    </w:lvl>
+    <w:lvl w:ilvl="8" w:tentative="1">
+      <w:start w:val="1"/>
+      <w:numFmt w:val="bullet"/>
+      <w:lvlText w:val=""/>
+      <w:lvlJc w:val="left"/>
+      <w:pPr>
+        <w:tabs>
+          <w:tab w:val="num" w:pos="6828"/>
+        </w:tabs>
+        <w:ind w:left="6828" w:hanging="360"/>
+      </w:pPr>
+      <w:rPr>
+        <w:rFonts w:ascii="Wingdings" w:hAnsi="Wingdings" w:hint="default"/>
+        <w:sz w:val="20"/>
+      </w:rPr>
+    </w:lvl>
+  </w:abstractNum>
+  <w:abstractNum w:abstractNumId="16" w15:restartNumberingAfterBreak="0">
+    <w:nsid w:val="66092B5B"/>
+    <w:multiLevelType w:val="multilevel"/>
+    <w:tmpl w:val="FA3686B4"/>
+    <w:lvl w:ilvl="0">
+      <w:start w:val="1"/>
+      <w:numFmt w:val="bullet"/>
+      <w:lvlText w:val=""/>
+      <w:lvlJc w:val="left"/>
+      <w:pPr>
+        <w:tabs>
+          <w:tab w:val="num" w:pos="1068"/>
+        </w:tabs>
+        <w:ind w:left="1068" w:hanging="360"/>
+      </w:pPr>
+      <w:rPr>
+        <w:rFonts w:ascii="Symbol" w:hAnsi="Symbol" w:hint="default"/>
+        <w:sz w:val="20"/>
+      </w:rPr>
+    </w:lvl>
+    <w:lvl w:ilvl="1" w:tentative="1">
+      <w:start w:val="1"/>
+      <w:numFmt w:val="bullet"/>
+      <w:lvlText w:val="o"/>
+      <w:lvlJc w:val="left"/>
+      <w:pPr>
+        <w:tabs>
+          <w:tab w:val="num" w:pos="1788"/>
+        </w:tabs>
+        <w:ind w:left="1788" w:hanging="360"/>
+      </w:pPr>
+      <w:rPr>
+        <w:rFonts w:ascii="Courier New" w:hAnsi="Courier New" w:hint="default"/>
+        <w:sz w:val="20"/>
+      </w:rPr>
+    </w:lvl>
+    <w:lvl w:ilvl="2" w:tentative="1">
+      <w:start w:val="1"/>
+      <w:numFmt w:val="bullet"/>
+      <w:lvlText w:val=""/>
+      <w:lvlJc w:val="left"/>
+      <w:pPr>
+        <w:tabs>
+          <w:tab w:val="num" w:pos="2508"/>
+        </w:tabs>
+        <w:ind w:left="2508" w:hanging="360"/>
+      </w:pPr>
+      <w:rPr>
+        <w:rFonts w:ascii="Wingdings" w:hAnsi="Wingdings" w:hint="default"/>
+        <w:sz w:val="20"/>
+      </w:rPr>
+    </w:lvl>
+    <w:lvl w:ilvl="3" w:tentative="1">
+      <w:start w:val="1"/>
+      <w:numFmt w:val="bullet"/>
+      <w:lvlText w:val=""/>
+      <w:lvlJc w:val="left"/>
+      <w:pPr>
+        <w:tabs>
+          <w:tab w:val="num" w:pos="3228"/>
+        </w:tabs>
+        <w:ind w:left="3228" w:hanging="360"/>
+      </w:pPr>
+      <w:rPr>
+        <w:rFonts w:ascii="Wingdings" w:hAnsi="Wingdings" w:hint="default"/>
+        <w:sz w:val="20"/>
+      </w:rPr>
+    </w:lvl>
+    <w:lvl w:ilvl="4" w:tentative="1">
+      <w:start w:val="1"/>
+      <w:numFmt w:val="bullet"/>
+      <w:lvlText w:val=""/>
+      <w:lvlJc w:val="left"/>
+      <w:pPr>
+        <w:tabs>
+          <w:tab w:val="num" w:pos="3948"/>
+        </w:tabs>
+        <w:ind w:left="3948" w:hanging="360"/>
+      </w:pPr>
+      <w:rPr>
+        <w:rFonts w:ascii="Wingdings" w:hAnsi="Wingdings" w:hint="default"/>
+        <w:sz w:val="20"/>
+      </w:rPr>
+    </w:lvl>
+    <w:lvl w:ilvl="5" w:tentative="1">
+      <w:start w:val="1"/>
+      <w:numFmt w:val="bullet"/>
+      <w:lvlText w:val=""/>
+      <w:lvlJc w:val="left"/>
+      <w:pPr>
+        <w:tabs>
+          <w:tab w:val="num" w:pos="4668"/>
+        </w:tabs>
+        <w:ind w:left="4668" w:hanging="360"/>
+      </w:pPr>
+      <w:rPr>
+        <w:rFonts w:ascii="Wingdings" w:hAnsi="Wingdings" w:hint="default"/>
+        <w:sz w:val="20"/>
+      </w:rPr>
+    </w:lvl>
+    <w:lvl w:ilvl="6" w:tentative="1">
+      <w:start w:val="1"/>
+      <w:numFmt w:val="bullet"/>
+      <w:lvlText w:val=""/>
+      <w:lvlJc w:val="left"/>
+      <w:pPr>
+        <w:tabs>
+          <w:tab w:val="num" w:pos="5388"/>
+        </w:tabs>
+        <w:ind w:left="5388" w:hanging="360"/>
+      </w:pPr>
+      <w:rPr>
+        <w:rFonts w:ascii="Wingdings" w:hAnsi="Wingdings" w:hint="default"/>
+        <w:sz w:val="20"/>
+      </w:rPr>
+    </w:lvl>
+    <w:lvl w:ilvl="7" w:tentative="1">
+      <w:start w:val="1"/>
+      <w:numFmt w:val="bullet"/>
+      <w:lvlText w:val=""/>
+      <w:lvlJc w:val="left"/>
+      <w:pPr>
+        <w:tabs>
+          <w:tab w:val="num" w:pos="6108"/>
+        </w:tabs>
+        <w:ind w:left="6108" w:hanging="360"/>
+      </w:pPr>
+      <w:rPr>
+        <w:rFonts w:ascii="Wingdings" w:hAnsi="Wingdings" w:hint="default"/>
+        <w:sz w:val="20"/>
+      </w:rPr>
+    </w:lvl>
+    <w:lvl w:ilvl="8" w:tentative="1">
+      <w:start w:val="1"/>
+      <w:numFmt w:val="bullet"/>
+      <w:lvlText w:val=""/>
+      <w:lvlJc w:val="left"/>
+      <w:pPr>
+        <w:tabs>
+          <w:tab w:val="num" w:pos="6828"/>
+        </w:tabs>
+        <w:ind w:left="6828" w:hanging="360"/>
+      </w:pPr>
+      <w:rPr>
+        <w:rFonts w:ascii="Wingdings" w:hAnsi="Wingdings" w:hint="default"/>
+        <w:sz w:val="20"/>
+      </w:rPr>
+    </w:lvl>
+  </w:abstractNum>
+  <w:abstractNum w:abstractNumId="17" w15:restartNumberingAfterBreak="0">
     <w:nsid w:val="694D06C3"/>
     <w:multiLevelType w:val="hybridMultilevel"/>
     <w:tmpl w:val="17FC8710"/>
@@ -11959,7 +14655,7 @@
       </w:rPr>
     </w:lvl>
   </w:abstractNum>
-  <w:abstractNum w:abstractNumId="12" w15:restartNumberingAfterBreak="0">
+  <w:abstractNum w:abstractNumId="18" w15:restartNumberingAfterBreak="0">
     <w:nsid w:val="6D826BC6"/>
     <w:multiLevelType w:val="hybridMultilevel"/>
     <w:tmpl w:val="8F4E1B50"/>
@@ -12045,7 +14741,7 @@
       </w:pPr>
     </w:lvl>
   </w:abstractNum>
-  <w:abstractNum w:abstractNumId="13" w15:restartNumberingAfterBreak="0">
+  <w:abstractNum w:abstractNumId="19" w15:restartNumberingAfterBreak="0">
     <w:nsid w:val="71192F08"/>
     <w:multiLevelType w:val="multilevel"/>
     <w:tmpl w:val="B100ED28"/>
@@ -12138,7 +14834,7 @@
       </w:pPr>
     </w:lvl>
   </w:abstractNum>
-  <w:abstractNum w:abstractNumId="14" w15:restartNumberingAfterBreak="0">
+  <w:abstractNum w:abstractNumId="20" w15:restartNumberingAfterBreak="0">
     <w:nsid w:val="7E06776B"/>
     <w:multiLevelType w:val="multilevel"/>
     <w:tmpl w:val="B100ED28"/>
@@ -12231,7 +14927,7 @@
       </w:pPr>
     </w:lvl>
   </w:abstractNum>
-  <w:abstractNum w:abstractNumId="15" w15:restartNumberingAfterBreak="0">
+  <w:abstractNum w:abstractNumId="21" w15:restartNumberingAfterBreak="0">
     <w:nsid w:val="7E654CCA"/>
     <w:multiLevelType w:val="multilevel"/>
     <w:tmpl w:val="3466891E"/>
@@ -12325,52 +15021,70 @@
     </w:lvl>
   </w:abstractNum>
   <w:num w:numId="1" w16cid:durableId="834759375">
-    <w:abstractNumId w:val="10"/>
+    <w:abstractNumId w:val="14"/>
   </w:num>
   <w:num w:numId="2" w16cid:durableId="2007197831">
-    <w:abstractNumId w:val="9"/>
+    <w:abstractNumId w:val="13"/>
   </w:num>
   <w:num w:numId="3" w16cid:durableId="1404333806">
+    <w:abstractNumId w:val="17"/>
+  </w:num>
+  <w:num w:numId="4" w16cid:durableId="1690831416">
+    <w:abstractNumId w:val="8"/>
+  </w:num>
+  <w:num w:numId="5" w16cid:durableId="1748959530">
+    <w:abstractNumId w:val="12"/>
+  </w:num>
+  <w:num w:numId="6" w16cid:durableId="925647647">
     <w:abstractNumId w:val="11"/>
   </w:num>
-  <w:num w:numId="4" w16cid:durableId="1690831416">
+  <w:num w:numId="7" w16cid:durableId="1088037153">
     <w:abstractNumId w:val="5"/>
   </w:num>
-  <w:num w:numId="5" w16cid:durableId="1748959530">
-    <w:abstractNumId w:val="8"/>
-  </w:num>
-  <w:num w:numId="6" w16cid:durableId="925647647">
-    <w:abstractNumId w:val="7"/>
-  </w:num>
-  <w:num w:numId="7" w16cid:durableId="1088037153">
-    <w:abstractNumId w:val="3"/>
-  </w:num>
   <w:num w:numId="8" w16cid:durableId="1703245834">
-    <w:abstractNumId w:val="12"/>
+    <w:abstractNumId w:val="18"/>
   </w:num>
   <w:num w:numId="9" w16cid:durableId="272328964">
     <w:abstractNumId w:val="2"/>
   </w:num>
   <w:num w:numId="10" w16cid:durableId="836305359">
-    <w:abstractNumId w:val="15"/>
+    <w:abstractNumId w:val="21"/>
   </w:num>
   <w:num w:numId="11" w16cid:durableId="263421532">
-    <w:abstractNumId w:val="13"/>
+    <w:abstractNumId w:val="19"/>
   </w:num>
   <w:num w:numId="12" w16cid:durableId="594479257">
-    <w:abstractNumId w:val="14"/>
+    <w:abstractNumId w:val="20"/>
   </w:num>
   <w:num w:numId="13" w16cid:durableId="1368675583">
     <w:abstractNumId w:val="0"/>
   </w:num>
   <w:num w:numId="14" w16cid:durableId="546457859">
-    <w:abstractNumId w:val="4"/>
+    <w:abstractNumId w:val="7"/>
   </w:num>
   <w:num w:numId="15" w16cid:durableId="1747412153">
-    <w:abstractNumId w:val="6"/>
+    <w:abstractNumId w:val="10"/>
   </w:num>
   <w:num w:numId="16" w16cid:durableId="1959020870">
     <w:abstractNumId w:val="1"/>
+  </w:num>
+  <w:num w:numId="17" w16cid:durableId="635377759">
+    <w:abstractNumId w:val="6"/>
+  </w:num>
+  <w:num w:numId="18" w16cid:durableId="601373796">
+    <w:abstractNumId w:val="4"/>
+  </w:num>
+  <w:num w:numId="19" w16cid:durableId="1138763223">
+    <w:abstractNumId w:val="15"/>
+  </w:num>
+  <w:num w:numId="20" w16cid:durableId="382094915">
+    <w:abstractNumId w:val="16"/>
+  </w:num>
+  <w:num w:numId="21" w16cid:durableId="1506550270">
+    <w:abstractNumId w:val="3"/>
+  </w:num>
+  <w:num w:numId="22" w16cid:durableId="868686858">
+    <w:abstractNumId w:val="9"/>
   </w:num>
 </w:numbering>
 </file>

</xml_diff>